<commit_message>
fix: Nuremberg guide photos (DB Museum, station, St Lorenz, fountain, cover)
Co-Authored-By: Claude Opus 5.5 <noreply@anthropic.com>
Claude-Session: https://claude.ai/code/session_01KbRqmNBFKCFFpD46r7T4m7
</commit_message>
<xml_diff>
--- a/new/guides/nuremberg/Nuremberg_Guide.docx
+++ b/new/guides/nuremberg/Nuremberg_Guide.docx
@@ -711,7 +711,7 @@
             </w:r>
           </w:p>
           <w:p>
-            <w:hyperlink w:history="1" r:id="rIdbuo5tvk-d97yl4fjzut6f">
+            <w:hyperlink w:history="1" r:id="rId2yob2auu6otgsc09qo4qq">
               <w:r>
                 <w:rPr>
                   <w:rStyle w:val="Hyperlink"/>
@@ -819,7 +819,7 @@
       </w:r>
     </w:p>
     <w:p>
-      <w:hyperlink w:history="1" r:id="rIdh4fok3hzdydj27tbhl5ia">
+      <w:hyperlink w:history="1" r:id="rIds7jqonnrtvajuoqsxci47">
         <w:r>
           <w:rPr>
             <w:rStyle w:val="Hyperlink"/>
@@ -840,7 +840,7 @@
         </w:rPr>
         <w:t xml:space="preserve">Via </w:t>
       </w:r>
-      <w:hyperlink w:history="1" r:id="rIdejtqwr-xz0yaef9tf8amy">
+      <w:hyperlink w:history="1" r:id="rIdoalhcnhnojkofrkxxnxri">
         <w:r>
           <w:rPr>
             <w:color w:val="EA2E00"/>
@@ -858,7 +858,7 @@
         </w:rPr>
         <w:t xml:space="preserve">, </w:t>
       </w:r>
-      <w:hyperlink w:history="1" r:id="rIdxfif_rnyfqc5tkewfduw1">
+      <w:hyperlink w:history="1" r:id="rId3smtemkpjcaixxqzmvisq">
         <w:r>
           <w:rPr>
             <w:color w:val="EA2E00"/>
@@ -876,7 +876,7 @@
         </w:rPr>
         <w:t xml:space="preserve">, </w:t>
       </w:r>
-      <w:hyperlink w:history="1" r:id="rIdoutqyf7rbekekp3jrzk07">
+      <w:hyperlink w:history="1" r:id="rIdzoojvnoarbmubgxnerfnv">
         <w:r>
           <w:rPr>
             <w:color w:val="EA2E00"/>
@@ -894,7 +894,7 @@
         </w:rPr>
         <w:t xml:space="preserve">, </w:t>
       </w:r>
-      <w:hyperlink w:history="1" r:id="rIdt7vwuprxf-7khohqakmlz">
+      <w:hyperlink w:history="1" r:id="rIdci0uawacexfcdpj2mi1jd">
         <w:r>
           <w:rPr>
             <w:color w:val="EA2E00"/>
@@ -912,7 +912,7 @@
         </w:rPr>
         <w:t xml:space="preserve">, </w:t>
       </w:r>
-      <w:hyperlink w:history="1" r:id="rId4phwotnfulsoipn2entw8">
+      <w:hyperlink w:history="1" r:id="rIdtexgecwm07t1gjlglwmhs">
         <w:r>
           <w:rPr>
             <w:color w:val="EA2E00"/>
@@ -930,7 +930,7 @@
         </w:rPr>
         <w:t xml:space="preserve">, </w:t>
       </w:r>
-      <w:hyperlink w:history="1" r:id="rId5q3kgpy0bxmrbukjup15k">
+      <w:hyperlink w:history="1" r:id="rIdnxpisilvxjcom8k0f--rh">
         <w:r>
           <w:rPr>
             <w:color w:val="EA2E00"/>
@@ -948,7 +948,7 @@
         </w:rPr>
         <w:t xml:space="preserve">, </w:t>
       </w:r>
-      <w:hyperlink w:history="1" r:id="rId6rj4bcr7tgbg6hfhuximw">
+      <w:hyperlink w:history="1" r:id="rIdrsmbi43wqb3vnt8bv_52a">
         <w:r>
           <w:rPr>
             <w:color w:val="EA2E00"/>
@@ -966,7 +966,7 @@
         </w:rPr>
         <w:t xml:space="preserve">, </w:t>
       </w:r>
-      <w:hyperlink w:history="1" r:id="rIdxszblgrn9dmmq0a0brqwd">
+      <w:hyperlink w:history="1" r:id="rIdp8vjeptuckmryddarwtxg">
         <w:r>
           <w:rPr>
             <w:color w:val="EA2E00"/>
@@ -984,7 +984,7 @@
         </w:rPr>
         <w:t xml:space="preserve">, </w:t>
       </w:r>
-      <w:hyperlink w:history="1" r:id="rIdsjecx9vc7kmvhuk4xdb8k">
+      <w:hyperlink w:history="1" r:id="rIdcxjkog6rbiti9i5wmenea">
         <w:r>
           <w:rPr>
             <w:color w:val="EA2E00"/>
@@ -1002,7 +1002,7 @@
         </w:rPr>
         <w:t xml:space="preserve">, </w:t>
       </w:r>
-      <w:hyperlink w:history="1" r:id="rIdg767_d4oeg8izgvjmasb3">
+      <w:hyperlink w:history="1" r:id="rIdv7xqgs2vlbhul1rcxxkhw">
         <w:r>
           <w:rPr>
             <w:color w:val="EA2E00"/>
@@ -1064,7 +1064,7 @@
       </w:r>
     </w:p>
     <w:p>
-      <w:hyperlink w:history="1" r:id="rIdy-xwxqfjultfgfcnv95ad">
+      <w:hyperlink w:history="1" r:id="rId5-wp0cridpthuemhu1lsw">
         <w:r>
           <w:rPr>
             <w:rStyle w:val="Hyperlink"/>
@@ -1085,7 +1085,7 @@
         </w:rPr>
         <w:t xml:space="preserve">Via </w:t>
       </w:r>
-      <w:hyperlink w:history="1" r:id="rId-_wi0lu1j_pz8zp-nkpxv">
+      <w:hyperlink w:history="1" r:id="rIddpda4rj1jifstuattyic-">
         <w:r>
           <w:rPr>
             <w:color w:val="EA2E00"/>
@@ -1103,7 +1103,7 @@
         </w:rPr>
         <w:t xml:space="preserve">, </w:t>
       </w:r>
-      <w:hyperlink w:history="1" r:id="rIdwlww6tkbz0_z-lwfzvvgt">
+      <w:hyperlink w:history="1" r:id="rIddiya2ihawpq-vnappzfpj">
         <w:r>
           <w:rPr>
             <w:color w:val="EA2E00"/>
@@ -1121,7 +1121,7 @@
         </w:rPr>
         <w:t xml:space="preserve">, </w:t>
       </w:r>
-      <w:hyperlink w:history="1" r:id="rIdomumzujug4so1zhyazti9">
+      <w:hyperlink w:history="1" r:id="rId6tuu85l6rth3k0wjusknp">
         <w:r>
           <w:rPr>
             <w:color w:val="EA2E00"/>
@@ -1139,7 +1139,7 @@
         </w:rPr>
         <w:t xml:space="preserve">, </w:t>
       </w:r>
-      <w:hyperlink w:history="1" r:id="rIdfradownsazvhypzdzk2fy">
+      <w:hyperlink w:history="1" r:id="rId09zhyafgs4aajy4_r-9qk">
         <w:r>
           <w:rPr>
             <w:color w:val="EA2E00"/>
@@ -1157,7 +1157,7 @@
         </w:rPr>
         <w:t xml:space="preserve">, </w:t>
       </w:r>
-      <w:hyperlink w:history="1" r:id="rIdthwxu1a6ggvbne-mzn5hr">
+      <w:hyperlink w:history="1" r:id="rIdto2wykyqxldixulfij7xq">
         <w:r>
           <w:rPr>
             <w:color w:val="EA2E00"/>
@@ -1175,7 +1175,7 @@
         </w:rPr>
         <w:t xml:space="preserve">, </w:t>
       </w:r>
-      <w:hyperlink w:history="1" r:id="rIdsufzvhtbvvwxdd-ekzshn">
+      <w:hyperlink w:history="1" r:id="rIdxiihh-puqf8ztr__kko4_">
         <w:r>
           <w:rPr>
             <w:color w:val="EA2E00"/>
@@ -1193,7 +1193,7 @@
         </w:rPr>
         <w:t xml:space="preserve">, </w:t>
       </w:r>
-      <w:hyperlink w:history="1" r:id="rIdch_-l1arp-4gehq1vwu8d">
+      <w:hyperlink w:history="1" r:id="rIdqtvx0kcj8bpaub6vrwcdd">
         <w:r>
           <w:rPr>
             <w:color w:val="EA2E00"/>
@@ -1211,7 +1211,7 @@
         </w:rPr>
         <w:t xml:space="preserve">, </w:t>
       </w:r>
-      <w:hyperlink w:history="1" r:id="rIdjgdtk8srakd_s9_vskegt">
+      <w:hyperlink w:history="1" r:id="rIdocibu2mhjmjckh-ptijuq">
         <w:r>
           <w:rPr>
             <w:color w:val="EA2E00"/>
@@ -1273,7 +1273,7 @@
       </w:r>
     </w:p>
     <w:p>
-      <w:hyperlink w:history="1" r:id="rIdz8o8imdwybgxifuqlqu5h">
+      <w:hyperlink w:history="1" r:id="rIdffroqwsvkbsq0z4nbnmuq">
         <w:r>
           <w:rPr>
             <w:rStyle w:val="Hyperlink"/>
@@ -1294,7 +1294,7 @@
         </w:rPr>
         <w:t xml:space="preserve">Via </w:t>
       </w:r>
-      <w:hyperlink w:history="1" r:id="rIdcf8kfcx30a5smgua2wbzq">
+      <w:hyperlink w:history="1" r:id="rIdhllym1h9qpzj_h8gbyk3e">
         <w:r>
           <w:rPr>
             <w:color w:val="EA2E00"/>
@@ -1312,7 +1312,7 @@
         </w:rPr>
         <w:t xml:space="preserve">, </w:t>
       </w:r>
-      <w:hyperlink w:history="1" r:id="rIdouqcxr0eqjwpvvibjpugp">
+      <w:hyperlink w:history="1" r:id="rId9ze0ait3o2an1nntubj4d">
         <w:r>
           <w:rPr>
             <w:color w:val="EA2E00"/>
@@ -1330,7 +1330,7 @@
         </w:rPr>
         <w:t xml:space="preserve">, </w:t>
       </w:r>
-      <w:hyperlink w:history="1" r:id="rIdsv6too0moj7mbpag5j7ml">
+      <w:hyperlink w:history="1" r:id="rIdho-soh8y3uyscg-lc0a-u">
         <w:r>
           <w:rPr>
             <w:color w:val="EA2E00"/>
@@ -1348,7 +1348,7 @@
         </w:rPr>
         <w:t xml:space="preserve">, </w:t>
       </w:r>
-      <w:hyperlink w:history="1" r:id="rIdwzrhtt8fodo7j3snudlme">
+      <w:hyperlink w:history="1" r:id="rIdo9l6423m8vs98ccmmhtva">
         <w:r>
           <w:rPr>
             <w:color w:val="EA2E00"/>
@@ -1366,7 +1366,7 @@
         </w:rPr>
         <w:t xml:space="preserve">, </w:t>
       </w:r>
-      <w:hyperlink w:history="1" r:id="rIdyzefxv79ntyhmlz0vuqzs">
+      <w:hyperlink w:history="1" r:id="rIdlox3redmlxqygxbl6iyvm">
         <w:r>
           <w:rPr>
             <w:color w:val="EA2E00"/>
@@ -1384,7 +1384,7 @@
         </w:rPr>
         <w:t xml:space="preserve">, </w:t>
       </w:r>
-      <w:hyperlink w:history="1" r:id="rIdrcb5dd7or5xp91jgxjhof">
+      <w:hyperlink w:history="1" r:id="rIdnr9slid1hukpd_g6hrad-">
         <w:r>
           <w:rPr>
             <w:color w:val="EA2E00"/>
@@ -1446,7 +1446,7 @@
       </w:r>
     </w:p>
     <w:p>
-      <w:hyperlink w:history="1" r:id="rIduuk4aizvfuesz0hs4bnbk">
+      <w:hyperlink w:history="1" r:id="rIdnzrxdefs8ykxyzdjpc4jy">
         <w:r>
           <w:rPr>
             <w:rStyle w:val="Hyperlink"/>
@@ -1467,7 +1467,7 @@
         </w:rPr>
         <w:t xml:space="preserve">Via </w:t>
       </w:r>
-      <w:hyperlink w:history="1" r:id="rIddgz65bdyfbpa4dw3not2i">
+      <w:hyperlink w:history="1" r:id="rIdd2ka3zr2vs27mixthlzim">
         <w:r>
           <w:rPr>
             <w:color w:val="EA2E00"/>
@@ -1485,7 +1485,7 @@
         </w:rPr>
         <w:t xml:space="preserve">, </w:t>
       </w:r>
-      <w:hyperlink w:history="1" r:id="rIdtx8lvefsyri96dedkxsmk">
+      <w:hyperlink w:history="1" r:id="rIdasgb_xsji_gktgj5fsm5u">
         <w:r>
           <w:rPr>
             <w:color w:val="EA2E00"/>
@@ -1503,7 +1503,7 @@
         </w:rPr>
         <w:t xml:space="preserve">, </w:t>
       </w:r>
-      <w:hyperlink w:history="1" r:id="rIdvzi8eaczu2t_ryk1iqzcp">
+      <w:hyperlink w:history="1" r:id="rIdhmnbu4cotr4hargtc5ot9">
         <w:r>
           <w:rPr>
             <w:color w:val="EA2E00"/>
@@ -1565,7 +1565,7 @@
       </w:r>
     </w:p>
     <w:p>
-      <w:hyperlink w:history="1" r:id="rIdsmyvnmtdmqiklg1gxqebi">
+      <w:hyperlink w:history="1" r:id="rIdze7s1g0fjb1wcgrlffo2g">
         <w:r>
           <w:rPr>
             <w:rStyle w:val="Hyperlink"/>
@@ -1586,7 +1586,7 @@
         </w:rPr>
         <w:t xml:space="preserve">Via </w:t>
       </w:r>
-      <w:hyperlink w:history="1" r:id="rIdbwjrvjbrxklu5ium_msvq">
+      <w:hyperlink w:history="1" r:id="rIdjqcdwgi9bffhclubo_x3r">
         <w:r>
           <w:rPr>
             <w:color w:val="EA2E00"/>
@@ -1604,7 +1604,7 @@
         </w:rPr>
         <w:t xml:space="preserve">, </w:t>
       </w:r>
-      <w:hyperlink w:history="1" r:id="rIdcriw4uz4claaqxjmcolgy">
+      <w:hyperlink w:history="1" r:id="rIdumocq0x-r6z1qcrvi61ej">
         <w:r>
           <w:rPr>
             <w:color w:val="EA2E00"/>
@@ -1622,7 +1622,7 @@
         </w:rPr>
         <w:t xml:space="preserve">, </w:t>
       </w:r>
-      <w:hyperlink w:history="1" r:id="rId4jygrmb1e9qpewcglajtf">
+      <w:hyperlink w:history="1" r:id="rIdyhbce8upzw9jkazqkce27">
         <w:r>
           <w:rPr>
             <w:color w:val="EA2E00"/>
@@ -1640,7 +1640,7 @@
         </w:rPr>
         <w:t xml:space="preserve">, </w:t>
       </w:r>
-      <w:hyperlink w:history="1" r:id="rId3qsg9x1bjs79ttywzbjro">
+      <w:hyperlink w:history="1" r:id="rIdsmcffaiqvjozvb5ik7d4l">
         <w:r>
           <w:rPr>
             <w:color w:val="EA2E00"/>
@@ -1658,7 +1658,7 @@
         </w:rPr>
         <w:t xml:space="preserve">, </w:t>
       </w:r>
-      <w:hyperlink w:history="1" r:id="rId6ycp17-znugbamieax6kk">
+      <w:hyperlink w:history="1" r:id="rIdkwfjisyllid1mpeozn_ed">
         <w:r>
           <w:rPr>
             <w:color w:val="EA2E00"/>
@@ -1676,7 +1676,7 @@
         </w:rPr>
         <w:t xml:space="preserve">, </w:t>
       </w:r>
-      <w:hyperlink w:history="1" r:id="rIdqif-cx93yhi_7gfkrp7ja">
+      <w:hyperlink w:history="1" r:id="rIdrtknkftessjr2wrmdpqwj">
         <w:r>
           <w:rPr>
             <w:color w:val="EA2E00"/>
@@ -1738,7 +1738,7 @@
       </w:r>
     </w:p>
     <w:p>
-      <w:hyperlink w:history="1" r:id="rIdrseabmsg-7csb0kqgoit9">
+      <w:hyperlink w:history="1" r:id="rId7qytjpnvs0_yidnhyt7ci">
         <w:r>
           <w:rPr>
             <w:rStyle w:val="Hyperlink"/>
@@ -1759,7 +1759,7 @@
         </w:rPr>
         <w:t xml:space="preserve">Via </w:t>
       </w:r>
-      <w:hyperlink w:history="1" r:id="rIdtnzazk31fvjhuvmmlehqp">
+      <w:hyperlink w:history="1" r:id="rIdmhixosfanaiu50e5aey7z">
         <w:r>
           <w:rPr>
             <w:color w:val="EA2E00"/>
@@ -1777,7 +1777,7 @@
         </w:rPr>
         <w:t xml:space="preserve">, </w:t>
       </w:r>
-      <w:hyperlink w:history="1" r:id="rIdpzted_atjp3tijecufxhw">
+      <w:hyperlink w:history="1" r:id="rIdbf67yu-ryss1grb7ydz2f">
         <w:r>
           <w:rPr>
             <w:color w:val="EA2E00"/>
@@ -1795,7 +1795,7 @@
         </w:rPr>
         <w:t xml:space="preserve">, </w:t>
       </w:r>
-      <w:hyperlink w:history="1" r:id="rId2dhgpt0kadncol-il9n9g">
+      <w:hyperlink w:history="1" r:id="rIdp4mygpugl-dspm24z4xra">
         <w:r>
           <w:rPr>
             <w:color w:val="EA2E00"/>
@@ -1865,7 +1865,7 @@
       </w:r>
     </w:p>
     <w:p>
-      <w:hyperlink w:history="1" r:id="rIdqup7os6tkszsh6tejqzww">
+      <w:hyperlink w:history="1" r:id="rIdlv6z_5zg3lxqe41e4u20w">
         <w:r>
           <w:rPr>
             <w:rStyle w:val="Hyperlink"/>
@@ -1886,7 +1886,7 @@
         </w:rPr>
         <w:t xml:space="preserve">Via </w:t>
       </w:r>
-      <w:hyperlink w:history="1" r:id="rIdjbqn1in7ar5gdqa1wsi9s">
+      <w:hyperlink w:history="1" r:id="rIdllwchgxumvar_4uqtw3n7">
         <w:r>
           <w:rPr>
             <w:color w:val="EA2E00"/>
@@ -1904,7 +1904,7 @@
         </w:rPr>
         <w:t xml:space="preserve">, </w:t>
       </w:r>
-      <w:hyperlink w:history="1" r:id="rId_b1phe8banor4zb5n_wsb">
+      <w:hyperlink w:history="1" r:id="rIduig_vg3nbxecl7vmcborn">
         <w:r>
           <w:rPr>
             <w:color w:val="EA2E00"/>
@@ -1922,7 +1922,7 @@
         </w:rPr>
         <w:t xml:space="preserve">, </w:t>
       </w:r>
-      <w:hyperlink w:history="1" r:id="rIdaf9hmwh63pulz5ouduxlz">
+      <w:hyperlink w:history="1" r:id="rIdwnjtsbtaknymofnvxxtzg">
         <w:r>
           <w:rPr>
             <w:color w:val="EA2E00"/>
@@ -1940,7 +1940,7 @@
         </w:rPr>
         <w:t xml:space="preserve">, </w:t>
       </w:r>
-      <w:hyperlink w:history="1" r:id="rId4oxiew3y8brwejz5csr_z">
+      <w:hyperlink w:history="1" r:id="rIdasxz7tkms6azrdulxcngu">
         <w:r>
           <w:rPr>
             <w:color w:val="EA2E00"/>
@@ -1958,7 +1958,7 @@
         </w:rPr>
         <w:t xml:space="preserve">, </w:t>
       </w:r>
-      <w:hyperlink w:history="1" r:id="rIdj42xbsqunljf234j9d89k">
+      <w:hyperlink w:history="1" r:id="rIdygiiedoh8tun1x-c7zkj2">
         <w:r>
           <w:rPr>
             <w:color w:val="EA2E00"/>
@@ -2020,7 +2020,7 @@
       </w:r>
     </w:p>
     <w:p>
-      <w:hyperlink w:history="1" r:id="rIdng_ydfzuqnu795w_y-qus">
+      <w:hyperlink w:history="1" r:id="rIdo1mc0vrhg854ps8qyqrfs">
         <w:r>
           <w:rPr>
             <w:rStyle w:val="Hyperlink"/>
@@ -2041,7 +2041,7 @@
         </w:rPr>
         <w:t xml:space="preserve">Via </w:t>
       </w:r>
-      <w:hyperlink w:history="1" r:id="rIderlsonrqdzb74m57zwxx1">
+      <w:hyperlink w:history="1" r:id="rId47dz9k_353mynnw-bj6zg">
         <w:r>
           <w:rPr>
             <w:color w:val="EA2E00"/>
@@ -2059,7 +2059,7 @@
         </w:rPr>
         <w:t xml:space="preserve">, </w:t>
       </w:r>
-      <w:hyperlink w:history="1" r:id="rIdgbpr8gj7sga2bbyihewjs">
+      <w:hyperlink w:history="1" r:id="rIdaglwer_kk4hg1r88cdnaz">
         <w:r>
           <w:rPr>
             <w:color w:val="EA2E00"/>
@@ -2077,7 +2077,7 @@
         </w:rPr>
         <w:t xml:space="preserve">, </w:t>
       </w:r>
-      <w:hyperlink w:history="1" r:id="rIdsk2cgamtpnfz2akaea-eg">
+      <w:hyperlink w:history="1" r:id="rIdgfzu3pymklu-mk7gw4qw9">
         <w:r>
           <w:rPr>
             <w:color w:val="EA2E00"/>
@@ -2095,7 +2095,7 @@
         </w:rPr>
         <w:t xml:space="preserve">, </w:t>
       </w:r>
-      <w:hyperlink w:history="1" r:id="rIdkr9sypjvghlgbnl_1j0jo">
+      <w:hyperlink w:history="1" r:id="rIdgbcalxieeomm5mjjk_22i">
         <w:r>
           <w:rPr>
             <w:color w:val="EA2E00"/>
@@ -2113,7 +2113,7 @@
         </w:rPr>
         <w:t xml:space="preserve">, </w:t>
       </w:r>
-      <w:hyperlink w:history="1" r:id="rIdj4en1r8b68hxhruvyztep">
+      <w:hyperlink w:history="1" r:id="rId-245afriqiodqfh_uhtd0">
         <w:r>
           <w:rPr>
             <w:color w:val="EA2E00"/>
@@ -2186,7 +2186,7 @@
         </w:rPr>
         <w:t xml:space="preserve">Via </w:t>
       </w:r>
-      <w:hyperlink w:history="1" r:id="rId0tpl64h60oeccwkaqod2n">
+      <w:hyperlink w:history="1" r:id="rIdj1crg6kvpotmr2zmg0dc4">
         <w:r>
           <w:rPr>
             <w:color w:val="EA2E00"/>
@@ -2204,7 +2204,7 @@
         </w:rPr>
         <w:t xml:space="preserve">, </w:t>
       </w:r>
-      <w:hyperlink w:history="1" r:id="rId7qajqisoofn4vstmgt8g8">
+      <w:hyperlink w:history="1" r:id="rId-hssan6vheb2gmbzh8h6r">
         <w:r>
           <w:rPr>
             <w:color w:val="EA2E00"/>
@@ -2222,7 +2222,7 @@
         </w:rPr>
         <w:t xml:space="preserve">, </w:t>
       </w:r>
-      <w:hyperlink w:history="1" r:id="rIdkl6zsv1wslbdluycbujrj">
+      <w:hyperlink w:history="1" r:id="rIdqak_6ipkqutzm8_s3jd62">
         <w:r>
           <w:rPr>
             <w:color w:val="EA2E00"/>
@@ -2240,7 +2240,7 @@
         </w:rPr>
         <w:t xml:space="preserve">, </w:t>
       </w:r>
-      <w:hyperlink w:history="1" r:id="rIdptu5fbudiohpim6-trqxs">
+      <w:hyperlink w:history="1" r:id="rIdnmj_ywplsnlavcux6by0c">
         <w:r>
           <w:rPr>
             <w:color w:val="EA2E00"/>
@@ -2258,7 +2258,7 @@
         </w:rPr>
         <w:t xml:space="preserve">, </w:t>
       </w:r>
-      <w:hyperlink w:history="1" r:id="rIdueijthyvp2zu9snnp6c9w">
+      <w:hyperlink w:history="1" r:id="rId6hmdklsnlt5w2pi-0cqii">
         <w:r>
           <w:rPr>
             <w:color w:val="EA2E00"/>
@@ -2276,7 +2276,7 @@
         </w:rPr>
         <w:t xml:space="preserve">, </w:t>
       </w:r>
-      <w:hyperlink w:history="1" r:id="rIduywo9dwzilcfqfahwflcn">
+      <w:hyperlink w:history="1" r:id="rIdcnpeynuo8jigjgpm4cp38">
         <w:r>
           <w:rPr>
             <w:color w:val="EA2E00"/>
@@ -2294,7 +2294,7 @@
         </w:rPr>
         <w:t xml:space="preserve">, </w:t>
       </w:r>
-      <w:hyperlink w:history="1" r:id="rIdsc_mjfjpxipqsy6vb-vrh">
+      <w:hyperlink w:history="1" r:id="rIdoapcmazjz6rw4d78uktjn">
         <w:r>
           <w:rPr>
             <w:color w:val="EA2E00"/>
@@ -2367,7 +2367,7 @@
         </w:rPr>
         <w:t xml:space="preserve">Via </w:t>
       </w:r>
-      <w:hyperlink w:history="1" r:id="rIdm9mljfvfxl257iy4eimbp">
+      <w:hyperlink w:history="1" r:id="rId8gf0tospjyj7jcegq2n9t">
         <w:r>
           <w:rPr>
             <w:color w:val="EA2E00"/>
@@ -2385,7 +2385,7 @@
         </w:rPr>
         <w:t xml:space="preserve">, </w:t>
       </w:r>
-      <w:hyperlink w:history="1" r:id="rIdsvximw8y_fvkpwog10zhh">
+      <w:hyperlink w:history="1" r:id="rIdk0kr5nuwyebmhvjyykqpz">
         <w:r>
           <w:rPr>
             <w:color w:val="EA2E00"/>
@@ -2403,7 +2403,7 @@
         </w:rPr>
         <w:t xml:space="preserve">, </w:t>
       </w:r>
-      <w:hyperlink w:history="1" r:id="rIdxlwld-p-sgfjsi9g84pcj">
+      <w:hyperlink w:history="1" r:id="rIdarjt9ybiulwzhcxkxoi3f">
         <w:r>
           <w:rPr>
             <w:color w:val="EA2E00"/>
@@ -2421,7 +2421,7 @@
         </w:rPr>
         <w:t xml:space="preserve">, </w:t>
       </w:r>
-      <w:hyperlink w:history="1" r:id="rIdoq11kgyjjvh7wsflnksjx">
+      <w:hyperlink w:history="1" r:id="rIdgpzjbcl07cgeuscwhbf98">
         <w:r>
           <w:rPr>
             <w:color w:val="EA2E00"/>
@@ -2439,7 +2439,7 @@
         </w:rPr>
         <w:t xml:space="preserve">, </w:t>
       </w:r>
-      <w:hyperlink w:history="1" r:id="rIdltocgi0zsfjkhrjir8c8x">
+      <w:hyperlink w:history="1" r:id="rIdyswtfomkqd6vzsveqqzg8">
         <w:r>
           <w:rPr>
             <w:color w:val="EA2E00"/>
@@ -2457,7 +2457,7 @@
         </w:rPr>
         <w:t xml:space="preserve">, </w:t>
       </w:r>
-      <w:hyperlink w:history="1" r:id="rIdpyvd738qiwub19zzhnuo3">
+      <w:hyperlink w:history="1" r:id="rIdm7dpszlpv1isaiynqor2x">
         <w:r>
           <w:rPr>
             <w:color w:val="EA2E00"/>
@@ -2475,7 +2475,7 @@
         </w:rPr>
         <w:t xml:space="preserve">, </w:t>
       </w:r>
-      <w:hyperlink w:history="1" r:id="rIdbuer9afhfaour_wi-li2a">
+      <w:hyperlink w:history="1" r:id="rIdoy7lmxipbzx0ayu0dy2mb">
         <w:r>
           <w:rPr>
             <w:color w:val="EA2E00"/>
@@ -2493,7 +2493,7 @@
         </w:rPr>
         <w:t xml:space="preserve">, </w:t>
       </w:r>
-      <w:hyperlink w:history="1" r:id="rId4kqjllij37ygdt0a9olxh">
+      <w:hyperlink w:history="1" r:id="rIdw4fljit1whivcaitzozwx">
         <w:r>
           <w:rPr>
             <w:color w:val="EA2E00"/>
@@ -2555,7 +2555,7 @@
       </w:r>
     </w:p>
     <w:p>
-      <w:hyperlink w:history="1" r:id="rIdulqoj5se5gdgfhpbb2mni">
+      <w:hyperlink w:history="1" r:id="rIdjjicdq2n1giqkekwmm3t0">
         <w:r>
           <w:rPr>
             <w:rStyle w:val="Hyperlink"/>
@@ -2576,7 +2576,7 @@
         </w:rPr>
         <w:t xml:space="preserve">Via </w:t>
       </w:r>
-      <w:hyperlink w:history="1" r:id="rId68yi-pgzj4eemav8mrzu0">
+      <w:hyperlink w:history="1" r:id="rIdra8k7ytsgtopuqztuxuph">
         <w:r>
           <w:rPr>
             <w:color w:val="EA2E00"/>
@@ -2594,7 +2594,7 @@
         </w:rPr>
         <w:t xml:space="preserve">, </w:t>
       </w:r>
-      <w:hyperlink w:history="1" r:id="rIdv-ywjagmf5kvcn8s2gnqz">
+      <w:hyperlink w:history="1" r:id="rIdpwjebzfclbp2m3-hhkfm6">
         <w:r>
           <w:rPr>
             <w:color w:val="EA2E00"/>
@@ -2612,7 +2612,7 @@
         </w:rPr>
         <w:t xml:space="preserve">, </w:t>
       </w:r>
-      <w:hyperlink w:history="1" r:id="rIdnwvzzplprtjzzjpam2ujt">
+      <w:hyperlink w:history="1" r:id="rIdmmvpdzopxbat5nzlmxkp2">
         <w:r>
           <w:rPr>
             <w:color w:val="EA2E00"/>
@@ -2685,7 +2685,7 @@
         </w:rPr>
         <w:t xml:space="preserve">Via </w:t>
       </w:r>
-      <w:hyperlink w:history="1" r:id="rIdrk64jan3anssn4vsvm1cb">
+      <w:hyperlink w:history="1" r:id="rIddfwowfnoww1px11qqm7fv">
         <w:r>
           <w:rPr>
             <w:color w:val="EA2E00"/>
@@ -2703,7 +2703,7 @@
         </w:rPr>
         <w:t xml:space="preserve">, </w:t>
       </w:r>
-      <w:hyperlink w:history="1" r:id="rIdikr9jsv4h1_7hw_mnysau">
+      <w:hyperlink w:history="1" r:id="rIdynyvzk8njwllpirflznzy">
         <w:r>
           <w:rPr>
             <w:color w:val="EA2E00"/>
@@ -2776,7 +2776,7 @@
         </w:rPr>
         <w:t xml:space="preserve">Via </w:t>
       </w:r>
-      <w:hyperlink w:history="1" r:id="rIdfa03gr8gqgvgmwipiq6v3">
+      <w:hyperlink w:history="1" r:id="rIdwskymteihrwqdsboui2pw">
         <w:r>
           <w:rPr>
             <w:color w:val="EA2E00"/>
@@ -2794,7 +2794,7 @@
         </w:rPr>
         <w:t xml:space="preserve">, </w:t>
       </w:r>
-      <w:hyperlink w:history="1" r:id="rIdvy_8f31xyyz6nwbfi3tlr">
+      <w:hyperlink w:history="1" r:id="rIdu5_ifl3_0-dxha9wpbzj9">
         <w:r>
           <w:rPr>
             <w:color w:val="EA2E00"/>
@@ -2812,7 +2812,7 @@
         </w:rPr>
         <w:t xml:space="preserve">, </w:t>
       </w:r>
-      <w:hyperlink w:history="1" r:id="rIdy70regg7cpzwcfgsbdagp">
+      <w:hyperlink w:history="1" r:id="rIdfbubasbp_kehdlzk5lsfh">
         <w:r>
           <w:rPr>
             <w:color w:val="EA2E00"/>
@@ -2830,7 +2830,7 @@
         </w:rPr>
         <w:t xml:space="preserve">, </w:t>
       </w:r>
-      <w:hyperlink w:history="1" r:id="rId4pthm7uz3w03haaute-pz">
+      <w:hyperlink w:history="1" r:id="rIdsj5q8e5m9ln2zejt_fbal">
         <w:r>
           <w:rPr>
             <w:color w:val="EA2E00"/>
@@ -2848,7 +2848,7 @@
         </w:rPr>
         <w:t xml:space="preserve">, </w:t>
       </w:r>
-      <w:hyperlink w:history="1" r:id="rIdws4juy4amjlrpoa--hspr">
+      <w:hyperlink w:history="1" r:id="rIdgv7tt-alkfi61npmv9dzw">
         <w:r>
           <w:rPr>
             <w:color w:val="EA2E00"/>
@@ -2899,7 +2899,7 @@
         </w:rPr>
         <w:t xml:space="preserve">Via </w:t>
       </w:r>
-      <w:hyperlink w:history="1" r:id="rIdrmywawovg0vanfz2gwho7">
+      <w:hyperlink w:history="1" r:id="rId4d18fkyunli1h0fmcdmaz">
         <w:r>
           <w:rPr>
             <w:color w:val="EA2E00"/>
@@ -2917,7 +2917,7 @@
         </w:rPr>
         <w:t xml:space="preserve">, </w:t>
       </w:r>
-      <w:hyperlink w:history="1" r:id="rIdzidpai0mtoki58_rndtcl">
+      <w:hyperlink w:history="1" r:id="rIdh5paszh7wdumer1hxdw1i">
         <w:r>
           <w:rPr>
             <w:color w:val="EA2E00"/>
@@ -2935,7 +2935,7 @@
         </w:rPr>
         <w:t xml:space="preserve">, </w:t>
       </w:r>
-      <w:hyperlink w:history="1" r:id="rIdl_xf1nr5taukcdf8wlnks">
+      <w:hyperlink w:history="1" r:id="rIdsot08padr7o0-ud91bkd9">
         <w:r>
           <w:rPr>
             <w:color w:val="EA2E00"/>
@@ -2953,7 +2953,7 @@
         </w:rPr>
         <w:t xml:space="preserve">, </w:t>
       </w:r>
-      <w:hyperlink w:history="1" r:id="rIdwkpnyp1vz5jotatzao1nf">
+      <w:hyperlink w:history="1" r:id="rId00bcr2vojxnhfulu9dzzj">
         <w:r>
           <w:rPr>
             <w:color w:val="EA2E00"/>
@@ -2971,7 +2971,7 @@
         </w:rPr>
         <w:t xml:space="preserve">, </w:t>
       </w:r>
-      <w:hyperlink w:history="1" r:id="rIduas5clpyrjswjx8t07qct">
+      <w:hyperlink w:history="1" r:id="rIdxb9tvaoyfqwtvok7lzmus">
         <w:r>
           <w:rPr>
             <w:color w:val="EA2E00"/>
@@ -3014,7 +3014,7 @@
         </w:rPr>
         <w:t xml:space="preserve">Via </w:t>
       </w:r>
-      <w:hyperlink w:history="1" r:id="rIdzm6fyf42muvfyzqphm21g">
+      <w:hyperlink w:history="1" r:id="rIdqa4vajw86p2atuvsqjgm8">
         <w:r>
           <w:rPr>
             <w:color w:val="EA2E00"/>
@@ -3057,7 +3057,7 @@
         </w:rPr>
         <w:t xml:space="preserve">Via </w:t>
       </w:r>
-      <w:hyperlink w:history="1" r:id="rId8fz-dlvlozjlr8cqmodg3">
+      <w:hyperlink w:history="1" r:id="rIdaj-b_k2g0yarwj5mcil8r">
         <w:r>
           <w:rPr>
             <w:color w:val="EA2E00"/>
@@ -3075,7 +3075,7 @@
         </w:rPr>
         <w:t xml:space="preserve">, </w:t>
       </w:r>
-      <w:hyperlink w:history="1" r:id="rId3m5x_mhtgwvjycczgs4m3">
+      <w:hyperlink w:history="1" r:id="rIdi7obfk4agnsua4ulwmpaa">
         <w:r>
           <w:rPr>
             <w:color w:val="EA2E00"/>
@@ -3093,7 +3093,7 @@
         </w:rPr>
         <w:t xml:space="preserve">, </w:t>
       </w:r>
-      <w:hyperlink w:history="1" r:id="rIdkhmlwzbbpnbqkoj-pvq6n">
+      <w:hyperlink w:history="1" r:id="rIdepocs5lzegih6ie_pu863">
         <w:r>
           <w:rPr>
             <w:color w:val="EA2E00"/>
@@ -3111,7 +3111,7 @@
         </w:rPr>
         <w:t xml:space="preserve">, </w:t>
       </w:r>
-      <w:hyperlink w:history="1" r:id="rIduuxdsjn8ymxyyh7hzyejp">
+      <w:hyperlink w:history="1" r:id="rIdiwgieepcp6wkcfl0harls">
         <w:r>
           <w:rPr>
             <w:color w:val="EA2E00"/>
@@ -3129,7 +3129,7 @@
         </w:rPr>
         <w:t xml:space="preserve">, </w:t>
       </w:r>
-      <w:hyperlink w:history="1" r:id="rIdetekaebsaec23nzes3oj6">
+      <w:hyperlink w:history="1" r:id="rId9dudyd2qx2k-dbwnuuqcb">
         <w:r>
           <w:rPr>
             <w:color w:val="EA2E00"/>
@@ -3172,7 +3172,7 @@
         </w:rPr>
         <w:t xml:space="preserve">Via </w:t>
       </w:r>
-      <w:hyperlink w:history="1" r:id="rId1iaq64bkdwhruwyseurde">
+      <w:hyperlink w:history="1" r:id="rIdlroxzf2eqg_vveirmj92s">
         <w:r>
           <w:rPr>
             <w:color w:val="EA2E00"/>
@@ -3190,7 +3190,7 @@
         </w:rPr>
         <w:t xml:space="preserve">, </w:t>
       </w:r>
-      <w:hyperlink w:history="1" r:id="rId_-1qdzh1dwyavk3xoejea">
+      <w:hyperlink w:history="1" r:id="rIdbbewxadcmhmo_3tn1h2b8">
         <w:r>
           <w:rPr>
             <w:color w:val="EA2E00"/>
@@ -3208,7 +3208,7 @@
         </w:rPr>
         <w:t xml:space="preserve">, </w:t>
       </w:r>
-      <w:hyperlink w:history="1" r:id="rIdeefnjwiyz-529vzgk5zvk">
+      <w:hyperlink w:history="1" r:id="rId0kibzzh2jkoki8yoay-oe">
         <w:r>
           <w:rPr>
             <w:color w:val="EA2E00"/>
@@ -3226,7 +3226,7 @@
         </w:rPr>
         <w:t xml:space="preserve">, </w:t>
       </w:r>
-      <w:hyperlink w:history="1" r:id="rIdeezseugv-plkbkv61n6fx">
+      <w:hyperlink w:history="1" r:id="rIdjprewrie9idxztwpttf1i">
         <w:r>
           <w:rPr>
             <w:color w:val="EA2E00"/>
@@ -3244,7 +3244,7 @@
         </w:rPr>
         <w:t xml:space="preserve">, </w:t>
       </w:r>
-      <w:hyperlink w:history="1" r:id="rId4fe4-6b6zhdjkluatra1q">
+      <w:hyperlink w:history="1" r:id="rId8ovfmuowxlx3kqhlzmf0r">
         <w:r>
           <w:rPr>
             <w:color w:val="EA2E00"/>
@@ -3262,7 +3262,7 @@
         </w:rPr>
         <w:t xml:space="preserve">, </w:t>
       </w:r>
-      <w:hyperlink w:history="1" r:id="rIduqe4i1ygvkvo3orstvlfh">
+      <w:hyperlink w:history="1" r:id="rIdn5bz0hltotlm1fswzktzs">
         <w:r>
           <w:rPr>
             <w:color w:val="EA2E00"/>
@@ -3280,7 +3280,7 @@
         </w:rPr>
         <w:t xml:space="preserve">, </w:t>
       </w:r>
-      <w:hyperlink w:history="1" r:id="rIdcgrx7vy7beruh12dxwfts">
+      <w:hyperlink w:history="1" r:id="rId-4e4qt2mdldimnnzyx-2r">
         <w:r>
           <w:rPr>
             <w:color w:val="EA2E00"/>
@@ -3323,7 +3323,7 @@
         </w:rPr>
         <w:t xml:space="preserve">Via </w:t>
       </w:r>
-      <w:hyperlink w:history="1" r:id="rIdzltci-xtu2k-azfvcywje">
+      <w:hyperlink w:history="1" r:id="rIdryn_zcey34juivrem83aa">
         <w:r>
           <w:rPr>
             <w:color w:val="EA2E00"/>
@@ -3366,7 +3366,7 @@
         </w:rPr>
         <w:t xml:space="preserve">Via </w:t>
       </w:r>
-      <w:hyperlink w:history="1" r:id="rIdyq-es4i2g5ztxxikabuxe">
+      <w:hyperlink w:history="1" r:id="rIdmapjbwb92w0y7ftonjtvt">
         <w:r>
           <w:rPr>
             <w:color w:val="EA2E00"/>
@@ -3448,7 +3448,7 @@
             </w:r>
           </w:p>
           <w:p>
-            <w:hyperlink w:history="1" r:id="rIdbqurmajlwuu2hfd68e3v2">
+            <w:hyperlink w:history="1" r:id="rIdshbwh891fajp3tipgdx3y">
               <w:r>
                 <w:rPr>
                   <w:rStyle w:val="Hyperlink"/>
@@ -3713,7 +3713,7 @@
         </w:rPr>
         <w:t xml:space="preserve">Via </w:t>
       </w:r>
-      <w:hyperlink w:history="1" r:id="rIdylmeu74uu6m1au7oxzfv-">
+      <w:hyperlink w:history="1" r:id="rId36zjk7yipnrxs8ud2hqod">
         <w:r>
           <w:rPr>
             <w:color w:val="EA2E00"/>
@@ -3819,7 +3819,7 @@
         </w:rPr>
         <w:t xml:space="preserve">Via </w:t>
       </w:r>
-      <w:hyperlink w:history="1" r:id="rIduplw8axbgy50blvcbbaq2">
+      <w:hyperlink w:history="1" r:id="rIdanrlg-mgika8fjhkfkixt">
         <w:r>
           <w:rPr>
             <w:color w:val="EA2E00"/>
@@ -3837,7 +3837,7 @@
         </w:rPr>
         <w:t xml:space="preserve">, </w:t>
       </w:r>
-      <w:hyperlink w:history="1" r:id="rIdfs5tbdxe_9d5pbt81o4ch">
+      <w:hyperlink w:history="1" r:id="rIdtf2emjlfk7homzkrt4k9_">
         <w:r>
           <w:rPr>
             <w:color w:val="EA2E00"/>
@@ -3855,7 +3855,7 @@
         </w:rPr>
         <w:t xml:space="preserve">, </w:t>
       </w:r>
-      <w:hyperlink w:history="1" r:id="rIdu1ylqtorx0a-wm9syprva">
+      <w:hyperlink w:history="1" r:id="rIdmmy9r1s8y4r4hkp6z0rfi">
         <w:r>
           <w:rPr>
             <w:color w:val="EA2E00"/>
@@ -3873,7 +3873,7 @@
         </w:rPr>
         <w:t xml:space="preserve">, </w:t>
       </w:r>
-      <w:hyperlink w:history="1" r:id="rIdjj-zzhqjnm1fcbaxstofj">
+      <w:hyperlink w:history="1" r:id="rIdyxrjsctmzcbsuapx8yjq0">
         <w:r>
           <w:rPr>
             <w:color w:val="EA2E00"/>
@@ -3891,7 +3891,7 @@
         </w:rPr>
         <w:t xml:space="preserve">, </w:t>
       </w:r>
-      <w:hyperlink w:history="1" r:id="rIdwwdhk_k25uxfdskzx1fab">
+      <w:hyperlink w:history="1" r:id="rIdl-cfsz6tbuvtfc5xbq3p0">
         <w:r>
           <w:rPr>
             <w:color w:val="EA2E00"/>
@@ -3949,7 +3949,7 @@
         </w:rPr>
         <w:t xml:space="preserve">Via </w:t>
       </w:r>
-      <w:hyperlink w:history="1" r:id="rIdgfkutlxhoih4w2odar4yj">
+      <w:hyperlink w:history="1" r:id="rIdnehqbokdarxftxmesw6ck">
         <w:r>
           <w:rPr>
             <w:color w:val="EA2E00"/>
@@ -3967,7 +3967,7 @@
         </w:rPr>
         <w:t xml:space="preserve">, </w:t>
       </w:r>
-      <w:hyperlink w:history="1" r:id="rIdkviprhmynarag6gbhhq0l">
+      <w:hyperlink w:history="1" r:id="rIdv-byd_5rmavjjv5eq5pew">
         <w:r>
           <w:rPr>
             <w:color w:val="EA2E00"/>
@@ -3985,7 +3985,7 @@
         </w:rPr>
         <w:t xml:space="preserve">, </w:t>
       </w:r>
-      <w:hyperlink w:history="1" r:id="rId3g5q38crqviu6if6a43qb">
+      <w:hyperlink w:history="1" r:id="rIdvksdeqykbf_nb3ahvzgo3">
         <w:r>
           <w:rPr>
             <w:color w:val="EA2E00"/>
@@ -4003,7 +4003,7 @@
         </w:rPr>
         <w:t xml:space="preserve">, </w:t>
       </w:r>
-      <w:hyperlink w:history="1" r:id="rIdsacqyu6kzgrzxcjsqxzfv">
+      <w:hyperlink w:history="1" r:id="rIdbjiwaark0-whibfpdcor5">
         <w:r>
           <w:rPr>
             <w:color w:val="EA2E00"/>
@@ -4021,7 +4021,7 @@
         </w:rPr>
         <w:t xml:space="preserve">, </w:t>
       </w:r>
-      <w:hyperlink w:history="1" r:id="rId58xjj8zvqiinbpk3r7nh7">
+      <w:hyperlink w:history="1" r:id="rIda3tiictjctxro83rlrfew">
         <w:r>
           <w:rPr>
             <w:color w:val="EA2E00"/>
@@ -4079,7 +4079,7 @@
         </w:rPr>
         <w:t xml:space="preserve">Via </w:t>
       </w:r>
-      <w:hyperlink w:history="1" r:id="rIdfybvaoxdk43pz64cc_3yh">
+      <w:hyperlink w:history="1" r:id="rIdj1zxegn1zh2tympsdjgox">
         <w:r>
           <w:rPr>
             <w:color w:val="EA2E00"/>
@@ -4097,7 +4097,7 @@
         </w:rPr>
         <w:t xml:space="preserve">, </w:t>
       </w:r>
-      <w:hyperlink w:history="1" r:id="rIdcblpiqu89oagusby3fado">
+      <w:hyperlink w:history="1" r:id="rIda0hheyhn7aabonvsgsf-x">
         <w:r>
           <w:rPr>
             <w:color w:val="EA2E00"/>
@@ -4115,7 +4115,7 @@
         </w:rPr>
         <w:t xml:space="preserve">, </w:t>
       </w:r>
-      <w:hyperlink w:history="1" r:id="rIdgpagpy1vato7tvucj9kfz">
+      <w:hyperlink w:history="1" r:id="rIdhpfzunk7dybljluysbvqw">
         <w:r>
           <w:rPr>
             <w:color w:val="EA2E00"/>
@@ -4133,7 +4133,7 @@
         </w:rPr>
         <w:t xml:space="preserve">, </w:t>
       </w:r>
-      <w:hyperlink w:history="1" r:id="rIdhdm8x44i1b-razwjgbpap">
+      <w:hyperlink w:history="1" r:id="rId6vicp-njy1jmkj_uk9pva">
         <w:r>
           <w:rPr>
             <w:color w:val="EA2E00"/>
@@ -4197,7 +4197,7 @@
             </w:r>
           </w:p>
           <w:p>
-            <w:hyperlink w:history="1" r:id="rId9vepzqmxoj2hbgvhnixlc">
+            <w:hyperlink w:history="1" r:id="rIdxja6pae-kkwrqp9hmeii-">
               <w:r>
                 <w:rPr>
                   <w:rStyle w:val="Hyperlink"/>
@@ -4249,7 +4249,7 @@
         </w:rPr>
         <w:t xml:space="preserve">Via </w:t>
       </w:r>
-      <w:hyperlink w:history="1" r:id="rId1pcifmimz4k3ilrsim_qw">
+      <w:hyperlink w:history="1" r:id="rIdkc7djp21hc8tkviizsssd">
         <w:r>
           <w:rPr>
             <w:color w:val="EA2E00"/>
@@ -4292,7 +4292,7 @@
         </w:rPr>
         <w:t xml:space="preserve">Via </w:t>
       </w:r>
-      <w:hyperlink w:history="1" r:id="rId7wlrzag08_kqow0qp_6we">
+      <w:hyperlink w:history="1" r:id="rIdyvcxmpjdgwacqned18dj-">
         <w:r>
           <w:rPr>
             <w:color w:val="EA2E00"/>
@@ -4335,7 +4335,7 @@
         </w:rPr>
         <w:t xml:space="preserve">Via </w:t>
       </w:r>
-      <w:hyperlink w:history="1" r:id="rIdbfcjhzahwb2g7qfh7gb49">
+      <w:hyperlink w:history="1" r:id="rIdr42s2hessj5ra694nmfv_">
         <w:r>
           <w:rPr>
             <w:color w:val="EA2E00"/>
@@ -4353,7 +4353,7 @@
         </w:rPr>
         <w:t xml:space="preserve">, </w:t>
       </w:r>
-      <w:hyperlink w:history="1" r:id="rIdupxzawowbfb3y4s70e0dw">
+      <w:hyperlink w:history="1" r:id="rId6xdb9ffzzmwvwiinphyc7">
         <w:r>
           <w:rPr>
             <w:color w:val="EA2E00"/>
@@ -4371,7 +4371,7 @@
         </w:rPr>
         <w:t xml:space="preserve">, </w:t>
       </w:r>
-      <w:hyperlink w:history="1" r:id="rIdwcor2nejgwpzyv1s-9q1l">
+      <w:hyperlink w:history="1" r:id="rIdzz7jmt09nikjghhnwdrx8">
         <w:r>
           <w:rPr>
             <w:color w:val="EA2E00"/>
@@ -4389,7 +4389,7 @@
         </w:rPr>
         <w:t xml:space="preserve">, </w:t>
       </w:r>
-      <w:hyperlink w:history="1" r:id="rIdbq2dorozpyalesutr4jtf">
+      <w:hyperlink w:history="1" r:id="rId2krwqzmewlfg9shflwmkg">
         <w:r>
           <w:rPr>
             <w:color w:val="EA2E00"/>
@@ -4407,7 +4407,7 @@
         </w:rPr>
         <w:t xml:space="preserve">, </w:t>
       </w:r>
-      <w:hyperlink w:history="1" r:id="rIdryrxj8ilkiufpu41qzdxz">
+      <w:hyperlink w:history="1" r:id="rIdkz73ddwpdnzkc49j-f3tf">
         <w:r>
           <w:rPr>
             <w:color w:val="EA2E00"/>
@@ -4450,7 +4450,7 @@
         </w:rPr>
         <w:t xml:space="preserve">Via </w:t>
       </w:r>
-      <w:hyperlink w:history="1" r:id="rIdhjcebr0gbtwzogjiapbpk">
+      <w:hyperlink w:history="1" r:id="rIdqej7whu12myju06nn4rwd">
         <w:r>
           <w:rPr>
             <w:color w:val="EA2E00"/>
@@ -4468,7 +4468,7 @@
         </w:rPr>
         <w:t xml:space="preserve">, </w:t>
       </w:r>
-      <w:hyperlink w:history="1" r:id="rIdgn-4ubffldtzt0pbayvsy">
+      <w:hyperlink w:history="1" r:id="rIdrliswnxbl5jzww_opmmtv">
         <w:r>
           <w:rPr>
             <w:color w:val="EA2E00"/>
@@ -4486,7 +4486,7 @@
         </w:rPr>
         <w:t xml:space="preserve">, </w:t>
       </w:r>
-      <w:hyperlink w:history="1" r:id="rIdczb7ch5gsc9mkg-_cxhli">
+      <w:hyperlink w:history="1" r:id="rIdjxk_mk7jviwkx6_m-wt9l">
         <w:r>
           <w:rPr>
             <w:color w:val="EA2E00"/>
@@ -4504,7 +4504,7 @@
         </w:rPr>
         <w:t xml:space="preserve">, </w:t>
       </w:r>
-      <w:hyperlink w:history="1" r:id="rIdkdnmwfk6nt3uqcqnypfr6">
+      <w:hyperlink w:history="1" r:id="rIdajkkw_efpbzkirtuwcpzw">
         <w:r>
           <w:rPr>
             <w:color w:val="EA2E00"/>
@@ -4547,7 +4547,7 @@
         </w:rPr>
         <w:t xml:space="preserve">Via </w:t>
       </w:r>
-      <w:hyperlink w:history="1" r:id="rIdzq_f-bt5tvytsqs3ubjrf">
+      <w:hyperlink w:history="1" r:id="rIdbddikmxtjv9fvh1dlvipa">
         <w:r>
           <w:rPr>
             <w:color w:val="EA2E00"/>
@@ -4565,7 +4565,7 @@
         </w:rPr>
         <w:t xml:space="preserve">, </w:t>
       </w:r>
-      <w:hyperlink w:history="1" r:id="rIdui1j56jr9pqatmhaeklgu">
+      <w:hyperlink w:history="1" r:id="rIdxcquks-em3u4v7sjcwrke">
         <w:r>
           <w:rPr>
             <w:color w:val="EA2E00"/>
@@ -4583,7 +4583,7 @@
         </w:rPr>
         <w:t xml:space="preserve">, </w:t>
       </w:r>
-      <w:hyperlink w:history="1" r:id="rIdjwsvv1ux2b7lzoct5u71n">
+      <w:hyperlink w:history="1" r:id="rId0_lijmtdbapsafxirk5e7">
         <w:r>
           <w:rPr>
             <w:color w:val="EA2E00"/>
@@ -4681,7 +4681,7 @@
         </w:rPr>
         <w:t xml:space="preserve">Via </w:t>
       </w:r>
-      <w:hyperlink w:history="1" r:id="rIdu84ntvfotaex5ix17hjka">
+      <w:hyperlink w:history="1" r:id="rId2fez6ghrjmd8fbdatd3tk">
         <w:r>
           <w:rPr>
             <w:color w:val="EA2E00"/>
@@ -4699,7 +4699,7 @@
         </w:rPr>
         <w:t xml:space="preserve">, </w:t>
       </w:r>
-      <w:hyperlink w:history="1" r:id="rIdp4cw3bxvnklsd5lgoxpm5">
+      <w:hyperlink w:history="1" r:id="rId4_b9_zbkuxzl65noxtsnp">
         <w:r>
           <w:rPr>
             <w:color w:val="EA2E00"/>
@@ -4717,7 +4717,7 @@
         </w:rPr>
         <w:t xml:space="preserve">, </w:t>
       </w:r>
-      <w:hyperlink w:history="1" r:id="rIdx6gb0muxedpymbg8nljx9">
+      <w:hyperlink w:history="1" r:id="rIdzcmwendve9tqrdq4tai2k">
         <w:r>
           <w:rPr>
             <w:color w:val="EA2E00"/>
@@ -4735,7 +4735,7 @@
         </w:rPr>
         <w:t xml:space="preserve">, </w:t>
       </w:r>
-      <w:hyperlink w:history="1" r:id="rIdrbeeuxw_wt-t_3mclrwjo">
+      <w:hyperlink w:history="1" r:id="rIdm8z92c1bcd8jh-gkpqa8e">
         <w:r>
           <w:rPr>
             <w:color w:val="EA2E00"/>
@@ -4753,7 +4753,7 @@
         </w:rPr>
         <w:t xml:space="preserve">, </w:t>
       </w:r>
-      <w:hyperlink w:history="1" r:id="rIdahjq9_bfs3-3zr8wxcoqu">
+      <w:hyperlink w:history="1" r:id="rIdjw3pclp7foqeytnirahmg">
         <w:r>
           <w:rPr>
             <w:color w:val="EA2E00"/>
@@ -4814,7 +4814,7 @@
         </w:rPr>
         <w:t xml:space="preserve">Via </w:t>
       </w:r>
-      <w:hyperlink w:history="1" r:id="rIdiunfjl7zw5ukwqd8vbskq">
+      <w:hyperlink w:history="1" r:id="rIdyiy13htfywvr8sblpr4xs">
         <w:r>
           <w:rPr>
             <w:color w:val="EA2E00"/>
@@ -4832,7 +4832,7 @@
         </w:rPr>
         <w:t xml:space="preserve">, </w:t>
       </w:r>
-      <w:hyperlink w:history="1" r:id="rId2im6rn6wss_bwchamvkfo">
+      <w:hyperlink w:history="1" r:id="rIdfoiuqnjs-wmm-rifetcjy">
         <w:r>
           <w:rPr>
             <w:color w:val="EA2E00"/>
@@ -4850,7 +4850,7 @@
         </w:rPr>
         <w:t xml:space="preserve">, </w:t>
       </w:r>
-      <w:hyperlink w:history="1" r:id="rIdvn11md6b8s3mlmqolsrdp">
+      <w:hyperlink w:history="1" r:id="rIda8gqqplbkcjn1wm5g4xkq">
         <w:r>
           <w:rPr>
             <w:color w:val="EA2E00"/>
@@ -4868,7 +4868,7 @@
         </w:rPr>
         <w:t xml:space="preserve">, </w:t>
       </w:r>
-      <w:hyperlink w:history="1" r:id="rId2azdsx_bxadmhm8qhwtjp">
+      <w:hyperlink w:history="1" r:id="rId4bulz6tshoc2y3yr_i0ol">
         <w:r>
           <w:rPr>
             <w:color w:val="EA2E00"/>
@@ -4886,7 +4886,7 @@
         </w:rPr>
         <w:t xml:space="preserve">, </w:t>
       </w:r>
-      <w:hyperlink w:history="1" r:id="rIdbpqz7gfj1dzgtjeajovil">
+      <w:hyperlink w:history="1" r:id="rIdpplxv6acr2b_c0smvkkkw">
         <w:r>
           <w:rPr>
             <w:color w:val="EA2E00"/>
@@ -4947,7 +4947,7 @@
         </w:rPr>
         <w:t xml:space="preserve">Via </w:t>
       </w:r>
-      <w:hyperlink w:history="1" r:id="rIdwdfwedojxzbulfrboualm">
+      <w:hyperlink w:history="1" r:id="rId7ktimaebhu46n-fgka8k6">
         <w:r>
           <w:rPr>
             <w:color w:val="EA2E00"/>
@@ -4965,7 +4965,7 @@
         </w:rPr>
         <w:t xml:space="preserve">, </w:t>
       </w:r>
-      <w:hyperlink w:history="1" r:id="rIdg8dgdchfpfk4iulzusxrv">
+      <w:hyperlink w:history="1" r:id="rIdeiixqwoy2iaittppqraee">
         <w:r>
           <w:rPr>
             <w:color w:val="EA2E00"/>
@@ -4983,7 +4983,7 @@
         </w:rPr>
         <w:t xml:space="preserve">, </w:t>
       </w:r>
-      <w:hyperlink w:history="1" r:id="rId2mjduwp-2gz0zhmalf8yd">
+      <w:hyperlink w:history="1" r:id="rIdvbkw47wa9mavoqzumdvco">
         <w:r>
           <w:rPr>
             <w:color w:val="EA2E00"/>
@@ -5001,7 +5001,7 @@
         </w:rPr>
         <w:t xml:space="preserve">, </w:t>
       </w:r>
-      <w:hyperlink w:history="1" r:id="rIdweks2qw1bhlklqsklinks">
+      <w:hyperlink w:history="1" r:id="rIddmd2rbhrxrtm5-seybz6k">
         <w:r>
           <w:rPr>
             <w:color w:val="EA2E00"/>
@@ -5062,7 +5062,7 @@
         </w:rPr>
         <w:t xml:space="preserve">Via </w:t>
       </w:r>
-      <w:hyperlink w:history="1" r:id="rIdbpxnxflu8bvlpiqshm3np">
+      <w:hyperlink w:history="1" r:id="rIdxged2g8qbiotqbuenmq3j">
         <w:r>
           <w:rPr>
             <w:color w:val="EA2E00"/>
@@ -5080,7 +5080,7 @@
         </w:rPr>
         <w:t xml:space="preserve">, </w:t>
       </w:r>
-      <w:hyperlink w:history="1" r:id="rIdtsy4b5xvwb2wkupsb9yva">
+      <w:hyperlink w:history="1" r:id="rId2bjtdoktc0dhtqw45qsgg">
         <w:r>
           <w:rPr>
             <w:color w:val="EA2E00"/>
@@ -5098,7 +5098,7 @@
         </w:rPr>
         <w:t xml:space="preserve">, </w:t>
       </w:r>
-      <w:hyperlink w:history="1" r:id="rIdadee4s_shawjolahzckpc">
+      <w:hyperlink w:history="1" r:id="rIdb-uhvnbb28o1y3t-6tnam">
         <w:r>
           <w:rPr>
             <w:color w:val="EA2E00"/>
@@ -5116,7 +5116,7 @@
         </w:rPr>
         <w:t xml:space="preserve">, </w:t>
       </w:r>
-      <w:hyperlink w:history="1" r:id="rId0clvdyklqiaijrlmrl_er">
+      <w:hyperlink w:history="1" r:id="rIduwfg7aio_szuh5tjygfy8">
         <w:r>
           <w:rPr>
             <w:color w:val="EA2E00"/>
@@ -5177,7 +5177,7 @@
         </w:rPr>
         <w:t xml:space="preserve">Via </w:t>
       </w:r>
-      <w:hyperlink w:history="1" r:id="rIddwtdwrlwffvif-jtxma3o">
+      <w:hyperlink w:history="1" r:id="rId45dwsfw2jfrko3asnde2e">
         <w:r>
           <w:rPr>
             <w:color w:val="EA2E00"/>
@@ -5195,7 +5195,7 @@
         </w:rPr>
         <w:t xml:space="preserve">, </w:t>
       </w:r>
-      <w:hyperlink w:history="1" r:id="rIdhzwwjdo1tcgrnet9uf5vb">
+      <w:hyperlink w:history="1" r:id="rIdcxmoxttqketba5dg-lxzb">
         <w:r>
           <w:rPr>
             <w:color w:val="EA2E00"/>
@@ -5213,7 +5213,7 @@
         </w:rPr>
         <w:t xml:space="preserve">, </w:t>
       </w:r>
-      <w:hyperlink w:history="1" r:id="rId-_y5zqd5epsih_-w6wchi">
+      <w:hyperlink w:history="1" r:id="rIdqqtgqylnqumz7hsag1ym3">
         <w:r>
           <w:rPr>
             <w:color w:val="EA2E00"/>
@@ -5496,7 +5496,7 @@
             </w:tcMar>
           </w:tcPr>
           <w:p>
-            <w:hyperlink w:history="1" r:id="rIdg3pdxla3hlw_xx2qf3cmh">
+            <w:hyperlink w:history="1" r:id="rIdfsexzymweuibge38ud625">
               <w:r>
                 <w:rPr>
                   <w:rStyle w:val="Hyperlink"/>
@@ -5615,7 +5615,7 @@
             </w:tcMar>
           </w:tcPr>
           <w:p>
-            <w:hyperlink w:history="1" r:id="rIdslwquakdykcqanqvzozd1">
+            <w:hyperlink w:history="1" r:id="rIdzwegieuhz9vnc-u9is2a-">
               <w:r>
                 <w:rPr>
                   <w:rStyle w:val="Hyperlink"/>
@@ -5734,7 +5734,7 @@
             </w:tcMar>
           </w:tcPr>
           <w:p>
-            <w:hyperlink w:history="1" r:id="rIdy3pugcv1d-3lqf9ssmjhk">
+            <w:hyperlink w:history="1" r:id="rIdu3xhbqxl2q9hfl_sj6nm0">
               <w:r>
                 <w:rPr>
                   <w:rStyle w:val="Hyperlink"/>
@@ -5853,7 +5853,7 @@
             </w:tcMar>
           </w:tcPr>
           <w:p>
-            <w:hyperlink w:history="1" r:id="rIdfanovxt2p6jke9i4hq7rt">
+            <w:hyperlink w:history="1" r:id="rId5v1j7ksrodhym1kumncj2">
               <w:r>
                 <w:rPr>
                   <w:rStyle w:val="Hyperlink"/>
@@ -5923,7 +5923,7 @@
             </w:r>
           </w:p>
           <w:p>
-            <w:hyperlink w:history="1" r:id="rIdynudv1pew3t9uxc7ntg8q">
+            <w:hyperlink w:history="1" r:id="rIdu-i_ao35dfvz6c2iaswre">
               <w:r>
                 <w:rPr>
                   <w:rStyle w:val="Hyperlink"/>
@@ -6014,7 +6014,7 @@
       </w:r>
     </w:p>
     <w:p>
-      <w:hyperlink w:history="1" r:id="rId8texbr21tjrraqtk66a0g">
+      <w:hyperlink w:history="1" r:id="rIdb5u1jm0mknzkmcip3axtq">
         <w:r>
           <w:rPr>
             <w:rStyle w:val="Hyperlink"/>
@@ -6035,7 +6035,7 @@
         </w:rPr>
         <w:t xml:space="preserve">Via </w:t>
       </w:r>
-      <w:hyperlink w:history="1" r:id="rIdokprgpccoeejeqdcjy06n">
+      <w:hyperlink w:history="1" r:id="rIdicxt5debons5uuwraio0l">
         <w:r>
           <w:rPr>
             <w:color w:val="EA2E00"/>
@@ -6053,7 +6053,7 @@
         </w:rPr>
         <w:t xml:space="preserve">, </w:t>
       </w:r>
-      <w:hyperlink w:history="1" r:id="rIduk0hng47fsxsuujsrobjw">
+      <w:hyperlink w:history="1" r:id="rId1eybsweqmqrhkw_xggqxo">
         <w:r>
           <w:rPr>
             <w:color w:val="EA2E00"/>
@@ -6071,7 +6071,7 @@
         </w:rPr>
         <w:t xml:space="preserve">, </w:t>
       </w:r>
-      <w:hyperlink w:history="1" r:id="rIddwxu5b9rmpitmlcqsirit">
+      <w:hyperlink w:history="1" r:id="rIdlclsfe_d8bri8kxj24lzu">
         <w:r>
           <w:rPr>
             <w:color w:val="EA2E00"/>
@@ -6089,7 +6089,7 @@
         </w:rPr>
         <w:t xml:space="preserve">, </w:t>
       </w:r>
-      <w:hyperlink w:history="1" r:id="rIdv6hbd_waqd8gupgaftdwm">
+      <w:hyperlink w:history="1" r:id="rIdtganakfphvlmnneo1sx7k">
         <w:r>
           <w:rPr>
             <w:color w:val="EA2E00"/>
@@ -6107,7 +6107,7 @@
         </w:rPr>
         <w:t xml:space="preserve">, </w:t>
       </w:r>
-      <w:hyperlink w:history="1" r:id="rIdrpymy4gpbmsowp1hj2n25">
+      <w:hyperlink w:history="1" r:id="rId1g_pzuvxxkiakbbhrlbce">
         <w:r>
           <w:rPr>
             <w:color w:val="EA2E00"/>
@@ -6125,7 +6125,7 @@
         </w:rPr>
         <w:t xml:space="preserve">, </w:t>
       </w:r>
-      <w:hyperlink w:history="1" r:id="rId9bknbzj15ijtsfnjij2_c">
+      <w:hyperlink w:history="1" r:id="rIday1jruimdjlpf6bryiu5h">
         <w:r>
           <w:rPr>
             <w:color w:val="EA2E00"/>
@@ -6143,7 +6143,7 @@
         </w:rPr>
         <w:t xml:space="preserve">, </w:t>
       </w:r>
-      <w:hyperlink w:history="1" r:id="rIdw6y4i9fcghcayalxykoso">
+      <w:hyperlink w:history="1" r:id="rIdygs_lpr9sdlvqqcrafdtx">
         <w:r>
           <w:rPr>
             <w:color w:val="EA2E00"/>
@@ -6161,7 +6161,7 @@
         </w:rPr>
         <w:t xml:space="preserve">, </w:t>
       </w:r>
-      <w:hyperlink w:history="1" r:id="rIdkpvcnlynk5nntzm0hi7br">
+      <w:hyperlink w:history="1" r:id="rIdm1cagqyejfnvn3nan49dk">
         <w:r>
           <w:rPr>
             <w:color w:val="EA2E00"/>
@@ -6179,7 +6179,7 @@
         </w:rPr>
         <w:t xml:space="preserve">, </w:t>
       </w:r>
-      <w:hyperlink w:history="1" r:id="rIdx86ibwmcltiwavahpz-x2">
+      <w:hyperlink w:history="1" r:id="rIdzghgs51fjaensio84sa98">
         <w:r>
           <w:rPr>
             <w:color w:val="EA2E00"/>
@@ -6240,7 +6240,7 @@
       </w:r>
     </w:p>
     <w:p>
-      <w:hyperlink w:history="1" r:id="rIdkopprjrggflr1q_xunqd1">
+      <w:hyperlink w:history="1" r:id="rIdmqbxwcq1k8gtkc6lqhhjq">
         <w:r>
           <w:rPr>
             <w:rStyle w:val="Hyperlink"/>
@@ -6261,7 +6261,7 @@
         </w:rPr>
         <w:t xml:space="preserve">Via </w:t>
       </w:r>
-      <w:hyperlink w:history="1" r:id="rId-ce0d5jorr8pw4xlvvyso">
+      <w:hyperlink w:history="1" r:id="rIdxjuuueynhfgnwz9zk--at">
         <w:r>
           <w:rPr>
             <w:color w:val="EA2E00"/>
@@ -6279,7 +6279,7 @@
         </w:rPr>
         <w:t xml:space="preserve">, </w:t>
       </w:r>
-      <w:hyperlink w:history="1" r:id="rIdnmhvuiy0d_ymfgeyx4n5l">
+      <w:hyperlink w:history="1" r:id="rIdpe92l_9owsaq2_ul4mp6t">
         <w:r>
           <w:rPr>
             <w:color w:val="EA2E00"/>
@@ -6297,7 +6297,7 @@
         </w:rPr>
         <w:t xml:space="preserve">, </w:t>
       </w:r>
-      <w:hyperlink w:history="1" r:id="rIdraarkfnmgueyvointy2nm">
+      <w:hyperlink w:history="1" r:id="rIdm_7v-2kvflczcamfgvsl9">
         <w:r>
           <w:rPr>
             <w:color w:val="EA2E00"/>
@@ -6315,7 +6315,7 @@
         </w:rPr>
         <w:t xml:space="preserve">, </w:t>
       </w:r>
-      <w:hyperlink w:history="1" r:id="rId_g3qmf8q0y706d-narxbt">
+      <w:hyperlink w:history="1" r:id="rId5vhs30wmdx5v1har9ucs8">
         <w:r>
           <w:rPr>
             <w:color w:val="EA2E00"/>
@@ -6333,7 +6333,7 @@
         </w:rPr>
         <w:t xml:space="preserve">, </w:t>
       </w:r>
-      <w:hyperlink w:history="1" r:id="rIdr8k1tccvb4ue40jayfdac">
+      <w:hyperlink w:history="1" r:id="rIdm8zcqr0jgmgjohfclzajq">
         <w:r>
           <w:rPr>
             <w:color w:val="EA2E00"/>
@@ -6351,7 +6351,7 @@
         </w:rPr>
         <w:t xml:space="preserve">, </w:t>
       </w:r>
-      <w:hyperlink w:history="1" r:id="rIdgk_n-zbsmbzdy1l96ul93">
+      <w:hyperlink w:history="1" r:id="rIdsa8tqvizl2b1w4jmwltd3">
         <w:r>
           <w:rPr>
             <w:color w:val="EA2E00"/>
@@ -6369,7 +6369,7 @@
         </w:rPr>
         <w:t xml:space="preserve">, </w:t>
       </w:r>
-      <w:hyperlink w:history="1" r:id="rIdn7xskkdyv19_qewmytiux">
+      <w:hyperlink w:history="1" r:id="rIdnaxcovvfkxbcx_eetqvzb">
         <w:r>
           <w:rPr>
             <w:color w:val="EA2E00"/>
@@ -6387,7 +6387,7 @@
         </w:rPr>
         <w:t xml:space="preserve">, </w:t>
       </w:r>
-      <w:hyperlink w:history="1" r:id="rIdvkwsdme5todzthpjzyxt3">
+      <w:hyperlink w:history="1" r:id="rIdpaoa3kgfustpb_ee1mcjn">
         <w:r>
           <w:rPr>
             <w:color w:val="EA2E00"/>
@@ -6448,7 +6448,7 @@
       </w:r>
     </w:p>
     <w:p>
-      <w:hyperlink w:history="1" r:id="rIdqewi7i3euyysuk7qheknz">
+      <w:hyperlink w:history="1" r:id="rIdl_nnsx4bo0sqa-kgwzwx4">
         <w:r>
           <w:rPr>
             <w:rStyle w:val="Hyperlink"/>
@@ -6469,7 +6469,7 @@
         </w:rPr>
         <w:t xml:space="preserve">Via </w:t>
       </w:r>
-      <w:hyperlink w:history="1" r:id="rIdvwtwxe20sc-hiiyt8fhz9">
+      <w:hyperlink w:history="1" r:id="rIdnzvv9ngpeyc10fpswgnko">
         <w:r>
           <w:rPr>
             <w:color w:val="EA2E00"/>
@@ -6487,7 +6487,7 @@
         </w:rPr>
         <w:t xml:space="preserve">, </w:t>
       </w:r>
-      <w:hyperlink w:history="1" r:id="rIdbfy84ilqxkmnet8dw1apu">
+      <w:hyperlink w:history="1" r:id="rIdqcgr799ksxjffc7axll8i">
         <w:r>
           <w:rPr>
             <w:color w:val="EA2E00"/>
@@ -6505,7 +6505,7 @@
         </w:rPr>
         <w:t xml:space="preserve">, </w:t>
       </w:r>
-      <w:hyperlink w:history="1" r:id="rIdzkyewwmi5bzsaicxvvama">
+      <w:hyperlink w:history="1" r:id="rIdahmlcwdiyyzikvg-cb00m">
         <w:r>
           <w:rPr>
             <w:color w:val="EA2E00"/>
@@ -6523,7 +6523,7 @@
         </w:rPr>
         <w:t xml:space="preserve">, </w:t>
       </w:r>
-      <w:hyperlink w:history="1" r:id="rId6h_uzdlpicctm1hb4u0fv">
+      <w:hyperlink w:history="1" r:id="rIddvhe0xrgsjxwhxjldsrjk">
         <w:r>
           <w:rPr>
             <w:color w:val="EA2E00"/>
@@ -6541,7 +6541,7 @@
         </w:rPr>
         <w:t xml:space="preserve">, </w:t>
       </w:r>
-      <w:hyperlink w:history="1" r:id="rIdq24qpauiiled_nhx1ewoy">
+      <w:hyperlink w:history="1" r:id="rIdp1jhlvlai_dmbhaezezpn">
         <w:r>
           <w:rPr>
             <w:color w:val="EA2E00"/>
@@ -6559,7 +6559,7 @@
         </w:rPr>
         <w:t xml:space="preserve">, </w:t>
       </w:r>
-      <w:hyperlink w:history="1" r:id="rIdhvkkjamqppcj566ev4hxv">
+      <w:hyperlink w:history="1" r:id="rIdl2dbj0x07ptjk0ttmgz1k">
         <w:r>
           <w:rPr>
             <w:color w:val="EA2E00"/>
@@ -6577,7 +6577,7 @@
         </w:rPr>
         <w:t xml:space="preserve">, </w:t>
       </w:r>
-      <w:hyperlink w:history="1" r:id="rId-bbag8wuuowcbr0rzdfbx">
+      <w:hyperlink w:history="1" r:id="rIdnpvfw-ta6x_hkgybfyrch">
         <w:r>
           <w:rPr>
             <w:color w:val="EA2E00"/>
@@ -6595,7 +6595,7 @@
         </w:rPr>
         <w:t xml:space="preserve">, </w:t>
       </w:r>
-      <w:hyperlink w:history="1" r:id="rId-ih3r6lrouisicphipiru">
+      <w:hyperlink w:history="1" r:id="rIdu2z4alnwg9evc3l7u2hw5">
         <w:r>
           <w:rPr>
             <w:color w:val="EA2E00"/>
@@ -6656,7 +6656,7 @@
       </w:r>
     </w:p>
     <w:p>
-      <w:hyperlink w:history="1" r:id="rIdzgcmq6is6s62gzuuyhe_g">
+      <w:hyperlink w:history="1" r:id="rIdomzfnu_bkg6-gc_00lwlf">
         <w:r>
           <w:rPr>
             <w:rStyle w:val="Hyperlink"/>
@@ -6677,7 +6677,7 @@
         </w:rPr>
         <w:t xml:space="preserve">Via </w:t>
       </w:r>
-      <w:hyperlink w:history="1" r:id="rIdusez4lpoxh7adjwixor2c">
+      <w:hyperlink w:history="1" r:id="rIdwwo1oc5wkpgo0r3tdoijy">
         <w:r>
           <w:rPr>
             <w:color w:val="EA2E00"/>
@@ -6695,7 +6695,7 @@
         </w:rPr>
         <w:t xml:space="preserve">, </w:t>
       </w:r>
-      <w:hyperlink w:history="1" r:id="rId61n6xrbswxd-lqde0czmo">
+      <w:hyperlink w:history="1" r:id="rIdjs35c9idlgdwxxgzakcr6">
         <w:r>
           <w:rPr>
             <w:color w:val="EA2E00"/>
@@ -6713,7 +6713,7 @@
         </w:rPr>
         <w:t xml:space="preserve">, </w:t>
       </w:r>
-      <w:hyperlink w:history="1" r:id="rIdoaugxx32uxucvtwja9d3i">
+      <w:hyperlink w:history="1" r:id="rIdfttqlrvlrp2yq4fnvxkdy">
         <w:r>
           <w:rPr>
             <w:color w:val="EA2E00"/>
@@ -6731,7 +6731,7 @@
         </w:rPr>
         <w:t xml:space="preserve">, </w:t>
       </w:r>
-      <w:hyperlink w:history="1" r:id="rIdgb0rjepvm0citi6h6yeye">
+      <w:hyperlink w:history="1" r:id="rIdeg5rcl-wa4d7fnhkfcg3f">
         <w:r>
           <w:rPr>
             <w:color w:val="EA2E00"/>
@@ -6749,7 +6749,7 @@
         </w:rPr>
         <w:t xml:space="preserve">, </w:t>
       </w:r>
-      <w:hyperlink w:history="1" r:id="rId_hs85n1ubfrv-uszvrp54">
+      <w:hyperlink w:history="1" r:id="rId7ng9as3aru0odmwywo1np">
         <w:r>
           <w:rPr>
             <w:color w:val="EA2E00"/>
@@ -6767,7 +6767,7 @@
         </w:rPr>
         <w:t xml:space="preserve">, </w:t>
       </w:r>
-      <w:hyperlink w:history="1" r:id="rIdxocgmwcechxc5gu8whn27">
+      <w:hyperlink w:history="1" r:id="rIduufi2mi1j_pj_doe48daf">
         <w:r>
           <w:rPr>
             <w:color w:val="EA2E00"/>
@@ -6785,7 +6785,7 @@
         </w:rPr>
         <w:t xml:space="preserve">, </w:t>
       </w:r>
-      <w:hyperlink w:history="1" r:id="rIdevcmtqxqpbddlliauhpf-">
+      <w:hyperlink w:history="1" r:id="rIddeubfsanzjjfupn3ajw-g">
         <w:r>
           <w:rPr>
             <w:color w:val="EA2E00"/>
@@ -6803,7 +6803,7 @@
         </w:rPr>
         <w:t xml:space="preserve">, </w:t>
       </w:r>
-      <w:hyperlink w:history="1" r:id="rId9o5ljzmebjj91b2racsna">
+      <w:hyperlink w:history="1" r:id="rIdn-7s3e2molhwlwzfxkxvj">
         <w:r>
           <w:rPr>
             <w:color w:val="EA2E00"/>
@@ -6821,7 +6821,7 @@
         </w:rPr>
         <w:t xml:space="preserve">, </w:t>
       </w:r>
-      <w:hyperlink w:history="1" r:id="rIdpp_jt-juovjygazwgdqvq">
+      <w:hyperlink w:history="1" r:id="rIdjr6osejwsuzs-wvbtqgzs">
         <w:r>
           <w:rPr>
             <w:color w:val="EA2E00"/>
@@ -6882,7 +6882,7 @@
       </w:r>
     </w:p>
     <w:p>
-      <w:hyperlink w:history="1" r:id="rId74qetbc2rokv6lj89-lhx">
+      <w:hyperlink w:history="1" r:id="rIdgpbu1w6r5-jmfitccvn5q">
         <w:r>
           <w:rPr>
             <w:rStyle w:val="Hyperlink"/>
@@ -6903,7 +6903,7 @@
         </w:rPr>
         <w:t xml:space="preserve">Via </w:t>
       </w:r>
-      <w:hyperlink w:history="1" r:id="rIdvh-hiejizi8_7nujevehb">
+      <w:hyperlink w:history="1" r:id="rIdcwzwnxsa99omnythzexoc">
         <w:r>
           <w:rPr>
             <w:color w:val="EA2E00"/>
@@ -6921,7 +6921,7 @@
         </w:rPr>
         <w:t xml:space="preserve">, </w:t>
       </w:r>
-      <w:hyperlink w:history="1" r:id="rIdi4fn9tjke-50mpe0xknwn">
+      <w:hyperlink w:history="1" r:id="rIdabqysalny3eqz8_kgpmrs">
         <w:r>
           <w:rPr>
             <w:color w:val="EA2E00"/>
@@ -6939,7 +6939,7 @@
         </w:rPr>
         <w:t xml:space="preserve">, </w:t>
       </w:r>
-      <w:hyperlink w:history="1" r:id="rIdnnoig-vj08j1r4zypdrvx">
+      <w:hyperlink w:history="1" r:id="rIdgckzzryhdxqms5t_yneyz">
         <w:r>
           <w:rPr>
             <w:color w:val="EA2E00"/>
@@ -6957,7 +6957,7 @@
         </w:rPr>
         <w:t xml:space="preserve">, </w:t>
       </w:r>
-      <w:hyperlink w:history="1" r:id="rIdrq1uiuapsjplajhvqnkl8">
+      <w:hyperlink w:history="1" r:id="rIdxyl3-dhncm_jzjrjlarvu">
         <w:r>
           <w:rPr>
             <w:color w:val="EA2E00"/>
@@ -6975,7 +6975,7 @@
         </w:rPr>
         <w:t xml:space="preserve">, </w:t>
       </w:r>
-      <w:hyperlink w:history="1" r:id="rIdz2csohseofasvf_syyvtt">
+      <w:hyperlink w:history="1" r:id="rIduf2lwzbje_20xq6r3cggj">
         <w:r>
           <w:rPr>
             <w:color w:val="EA2E00"/>
@@ -7036,7 +7036,7 @@
       </w:r>
     </w:p>
     <w:p>
-      <w:hyperlink w:history="1" r:id="rIdiw8mnyt1h_bdfp07gszuu">
+      <w:hyperlink w:history="1" r:id="rIdgfq_myxpepdeurrwhgojp">
         <w:r>
           <w:rPr>
             <w:rStyle w:val="Hyperlink"/>
@@ -7057,7 +7057,7 @@
         </w:rPr>
         <w:t xml:space="preserve">Via </w:t>
       </w:r>
-      <w:hyperlink w:history="1" r:id="rIdewlbczx14-cjhbd4jxyfm">
+      <w:hyperlink w:history="1" r:id="rIdsfydf41sjnsv4pnbzcth8">
         <w:r>
           <w:rPr>
             <w:color w:val="EA2E00"/>
@@ -7075,7 +7075,7 @@
         </w:rPr>
         <w:t xml:space="preserve">, </w:t>
       </w:r>
-      <w:hyperlink w:history="1" r:id="rId95jtxod0fsfsujx-2czkn">
+      <w:hyperlink w:history="1" r:id="rIdeuvbt4k6uw3tehi2i0-sw">
         <w:r>
           <w:rPr>
             <w:color w:val="EA2E00"/>
@@ -7093,7 +7093,7 @@
         </w:rPr>
         <w:t xml:space="preserve">, </w:t>
       </w:r>
-      <w:hyperlink w:history="1" r:id="rIdvjdywylybayalg1z9xa4a">
+      <w:hyperlink w:history="1" r:id="rIdq5ftwgdukddeotbrzo-4p">
         <w:r>
           <w:rPr>
             <w:color w:val="EA2E00"/>
@@ -7111,7 +7111,7 @@
         </w:rPr>
         <w:t xml:space="preserve">, </w:t>
       </w:r>
-      <w:hyperlink w:history="1" r:id="rId-xuu4b80y_uori1b_82vw">
+      <w:hyperlink w:history="1" r:id="rIdudajnsi3dvltawvnno1ee">
         <w:r>
           <w:rPr>
             <w:color w:val="EA2E00"/>
@@ -7129,7 +7129,7 @@
         </w:rPr>
         <w:t xml:space="preserve">, </w:t>
       </w:r>
-      <w:hyperlink w:history="1" r:id="rId-5e5mdn1qza421gyoj2pj">
+      <w:hyperlink w:history="1" r:id="rIdpdz_e7hnnf9swjuzehruq">
         <w:r>
           <w:rPr>
             <w:color w:val="EA2E00"/>
@@ -7190,7 +7190,7 @@
       </w:r>
     </w:p>
     <w:p>
-      <w:hyperlink w:history="1" r:id="rIdl2pqcekfa2gozsmferecz">
+      <w:hyperlink w:history="1" r:id="rId_ymxfvf2wdsxtt430ju2n">
         <w:r>
           <w:rPr>
             <w:rStyle w:val="Hyperlink"/>
@@ -7211,7 +7211,7 @@
         </w:rPr>
         <w:t xml:space="preserve">Via </w:t>
       </w:r>
-      <w:hyperlink w:history="1" r:id="rIdqwnw9ifquzvfm-onwkulj">
+      <w:hyperlink w:history="1" r:id="rId91yfrwn22bjyhkdfbfsqj">
         <w:r>
           <w:rPr>
             <w:color w:val="EA2E00"/>
@@ -7229,7 +7229,7 @@
         </w:rPr>
         <w:t xml:space="preserve">, </w:t>
       </w:r>
-      <w:hyperlink w:history="1" r:id="rIdtn9ghxpczs6ais6uoawyu">
+      <w:hyperlink w:history="1" r:id="rIdejwfwuhrgyl8mia86am9u">
         <w:r>
           <w:rPr>
             <w:color w:val="EA2E00"/>
@@ -7247,7 +7247,7 @@
         </w:rPr>
         <w:t xml:space="preserve">, </w:t>
       </w:r>
-      <w:hyperlink w:history="1" r:id="rIdry4tbv-1bp_7opykzhlqu">
+      <w:hyperlink w:history="1" r:id="rIdisvvqofjhvuyfssb3lzm0">
         <w:r>
           <w:rPr>
             <w:color w:val="EA2E00"/>
@@ -7265,7 +7265,7 @@
         </w:rPr>
         <w:t xml:space="preserve">, </w:t>
       </w:r>
-      <w:hyperlink w:history="1" r:id="rId8rtnvjlterxqxa3iyym3v">
+      <w:hyperlink w:history="1" r:id="rIdbzwvt1nf_8dgdsjirisyn">
         <w:r>
           <w:rPr>
             <w:color w:val="EA2E00"/>
@@ -7283,7 +7283,7 @@
         </w:rPr>
         <w:t xml:space="preserve">, </w:t>
       </w:r>
-      <w:hyperlink w:history="1" r:id="rIdnf6zkfl4yek_as7p9b7zp">
+      <w:hyperlink w:history="1" r:id="rId_tmihs8bqwgliks3eosex">
         <w:r>
           <w:rPr>
             <w:color w:val="EA2E00"/>
@@ -7301,7 +7301,7 @@
         </w:rPr>
         <w:t xml:space="preserve">, </w:t>
       </w:r>
-      <w:hyperlink w:history="1" r:id="rIdw-b6zc4-3carxbvm3cv9j">
+      <w:hyperlink w:history="1" r:id="rIdvimsdgfwa4kl5pfyuvaub">
         <w:r>
           <w:rPr>
             <w:color w:val="EA2E00"/>
@@ -7362,7 +7362,7 @@
       </w:r>
     </w:p>
     <w:p>
-      <w:hyperlink w:history="1" r:id="rIdrmjn54x2wtg0hsealjuo9">
+      <w:hyperlink w:history="1" r:id="rId-ribtw_vdjgo6y-yk_xqx">
         <w:r>
           <w:rPr>
             <w:rStyle w:val="Hyperlink"/>
@@ -7383,7 +7383,7 @@
         </w:rPr>
         <w:t xml:space="preserve">Via </w:t>
       </w:r>
-      <w:hyperlink w:history="1" r:id="rIdpft5gt2itwgvizek-bt0a">
+      <w:hyperlink w:history="1" r:id="rIdjs2_lhogzc_b_p7qv5gz4">
         <w:r>
           <w:rPr>
             <w:color w:val="EA2E00"/>
@@ -7401,7 +7401,7 @@
         </w:rPr>
         <w:t xml:space="preserve">, </w:t>
       </w:r>
-      <w:hyperlink w:history="1" r:id="rIdtpsm8i6mo4lpzfks0gmjm">
+      <w:hyperlink w:history="1" r:id="rIdskbf69pdf3iiv9t6gjnx1">
         <w:r>
           <w:rPr>
             <w:color w:val="EA2E00"/>
@@ -7419,7 +7419,7 @@
         </w:rPr>
         <w:t xml:space="preserve">, </w:t>
       </w:r>
-      <w:hyperlink w:history="1" r:id="rIdxubwelhbzr4esjimylxfi">
+      <w:hyperlink w:history="1" r:id="rId_wbniapbusrdv9n3ki_z_">
         <w:r>
           <w:rPr>
             <w:color w:val="EA2E00"/>
@@ -7437,7 +7437,7 @@
         </w:rPr>
         <w:t xml:space="preserve">, </w:t>
       </w:r>
-      <w:hyperlink w:history="1" r:id="rIdlj3ysctdwpga20rd6xdbb">
+      <w:hyperlink w:history="1" r:id="rIdrugc9cpupyid5avs1gh9z">
         <w:r>
           <w:rPr>
             <w:color w:val="EA2E00"/>
@@ -7455,7 +7455,7 @@
         </w:rPr>
         <w:t xml:space="preserve">, </w:t>
       </w:r>
-      <w:hyperlink w:history="1" r:id="rId_2ruhyzlkeqn5pjcbjguz">
+      <w:hyperlink w:history="1" r:id="rId50jceo0p3zuvv6kyzae8d">
         <w:r>
           <w:rPr>
             <w:color w:val="EA2E00"/>
@@ -7473,7 +7473,7 @@
         </w:rPr>
         <w:t xml:space="preserve">, </w:t>
       </w:r>
-      <w:hyperlink w:history="1" r:id="rIdg0aetqcs3tduysjetb263">
+      <w:hyperlink w:history="1" r:id="rIdnqis5pp3cce-y6zgetznk">
         <w:r>
           <w:rPr>
             <w:color w:val="EA2E00"/>
@@ -7491,7 +7491,7 @@
         </w:rPr>
         <w:t xml:space="preserve">, </w:t>
       </w:r>
-      <w:hyperlink w:history="1" r:id="rIdwjqwchps49xc9neem7hmo">
+      <w:hyperlink w:history="1" r:id="rIdxesb0ph7fhzp4s_l1jw6k">
         <w:r>
           <w:rPr>
             <w:color w:val="EA2E00"/>
@@ -7509,7 +7509,7 @@
         </w:rPr>
         <w:t xml:space="preserve">, </w:t>
       </w:r>
-      <w:hyperlink w:history="1" r:id="rIdhl48zavu0hcmoxa-jq3vn">
+      <w:hyperlink w:history="1" r:id="rIdqohahysurfteoeg9hv7u5">
         <w:r>
           <w:rPr>
             <w:color w:val="EA2E00"/>
@@ -7527,7 +7527,7 @@
         </w:rPr>
         <w:t xml:space="preserve">, </w:t>
       </w:r>
-      <w:hyperlink w:history="1" r:id="rIdkmc6t2thyf_-egn1khvbo">
+      <w:hyperlink w:history="1" r:id="rIdyrogmdkp2pcu7izxlpt3f">
         <w:r>
           <w:rPr>
             <w:color w:val="EA2E00"/>
@@ -7588,7 +7588,7 @@
       </w:r>
     </w:p>
     <w:p>
-      <w:hyperlink w:history="1" r:id="rIdsaggdtkhc96rstvv0vrwe">
+      <w:hyperlink w:history="1" r:id="rIdifvtehs0c_lxpzftoye41">
         <w:r>
           <w:rPr>
             <w:rStyle w:val="Hyperlink"/>
@@ -7609,7 +7609,7 @@
         </w:rPr>
         <w:t xml:space="preserve">Via </w:t>
       </w:r>
-      <w:hyperlink w:history="1" r:id="rId9eeiwfu61owonu8rc4e7n">
+      <w:hyperlink w:history="1" r:id="rIdfbtw8ltqttrgx5zbn8nyi">
         <w:r>
           <w:rPr>
             <w:color w:val="EA2E00"/>
@@ -7627,7 +7627,7 @@
         </w:rPr>
         <w:t xml:space="preserve">, </w:t>
       </w:r>
-      <w:hyperlink w:history="1" r:id="rId7rpo_3ikwypcpwlp4kt1q">
+      <w:hyperlink w:history="1" r:id="rIdmus2y5_zjksvksyizbhyy">
         <w:r>
           <w:rPr>
             <w:color w:val="EA2E00"/>
@@ -7645,7 +7645,7 @@
         </w:rPr>
         <w:t xml:space="preserve">, </w:t>
       </w:r>
-      <w:hyperlink w:history="1" r:id="rIdw8npm2__zjckyhnyenrjz">
+      <w:hyperlink w:history="1" r:id="rId__qr3crdl4jiijtwxlnng">
         <w:r>
           <w:rPr>
             <w:color w:val="EA2E00"/>
@@ -7663,7 +7663,7 @@
         </w:rPr>
         <w:t xml:space="preserve">, </w:t>
       </w:r>
-      <w:hyperlink w:history="1" r:id="rIdu_-kbbcy8nhym-fo2z56o">
+      <w:hyperlink w:history="1" r:id="rIdblmaew9vuafctgyq5tp_v">
         <w:r>
           <w:rPr>
             <w:color w:val="EA2E00"/>
@@ -7681,7 +7681,7 @@
         </w:rPr>
         <w:t xml:space="preserve">, </w:t>
       </w:r>
-      <w:hyperlink w:history="1" r:id="rIdxyrt40rzyq3-arzvsjnnc">
+      <w:hyperlink w:history="1" r:id="rId9fe_hmdor1qdsmk0576gi">
         <w:r>
           <w:rPr>
             <w:color w:val="EA2E00"/>
@@ -7742,7 +7742,7 @@
       </w:r>
     </w:p>
     <w:p>
-      <w:hyperlink w:history="1" r:id="rIdgvdodjrakb-znnbfgpgkb">
+      <w:hyperlink w:history="1" r:id="rIdmszwngoy0eaymu4hkzc0c">
         <w:r>
           <w:rPr>
             <w:rStyle w:val="Hyperlink"/>
@@ -7763,7 +7763,7 @@
         </w:rPr>
         <w:t xml:space="preserve">Via </w:t>
       </w:r>
-      <w:hyperlink w:history="1" r:id="rIdx0bkigcarehmvh9rgtqj_">
+      <w:hyperlink w:history="1" r:id="rIdn0zmkzok3ahxgjn0i5jqe">
         <w:r>
           <w:rPr>
             <w:color w:val="EA2E00"/>
@@ -7781,7 +7781,7 @@
         </w:rPr>
         <w:t xml:space="preserve">, </w:t>
       </w:r>
-      <w:hyperlink w:history="1" r:id="rIddqu9tmcnm20h8tnkbt7_l">
+      <w:hyperlink w:history="1" r:id="rIdq2qyjei1usrgzaefgxrkj">
         <w:r>
           <w:rPr>
             <w:color w:val="EA2E00"/>
@@ -7799,7 +7799,7 @@
         </w:rPr>
         <w:t xml:space="preserve">, </w:t>
       </w:r>
-      <w:hyperlink w:history="1" r:id="rIdcrm6mi9pabknbymbatlbp">
+      <w:hyperlink w:history="1" r:id="rIdijnd3if8ozo4sr1hgnnbc">
         <w:r>
           <w:rPr>
             <w:color w:val="EA2E00"/>
@@ -7817,7 +7817,7 @@
         </w:rPr>
         <w:t xml:space="preserve">, </w:t>
       </w:r>
-      <w:hyperlink w:history="1" r:id="rIdsapshdiiocc_-zxrkjltf">
+      <w:hyperlink w:history="1" r:id="rIdlblbqgohgytf5tkujuscm">
         <w:r>
           <w:rPr>
             <w:color w:val="EA2E00"/>
@@ -7835,7 +7835,7 @@
         </w:rPr>
         <w:t xml:space="preserve">, </w:t>
       </w:r>
-      <w:hyperlink w:history="1" r:id="rIdyeak6g2f7nh0stx2qgnk1">
+      <w:hyperlink w:history="1" r:id="rIdzkw9f8trl4priw3sa8cyz">
         <w:r>
           <w:rPr>
             <w:color w:val="EA2E00"/>
@@ -8416,7 +8416,7 @@
             </w:tcMar>
           </w:tcPr>
           <w:p>
-            <w:hyperlink w:history="1" r:id="rIdyadeavqpusdy7lxzx6pmi">
+            <w:hyperlink w:history="1" r:id="rIduij4dmoj3rauhfeoedfta">
               <w:r>
                 <w:rPr>
                   <w:b/>
@@ -8537,7 +8537,7 @@
             </w:tcMar>
           </w:tcPr>
           <w:p>
-            <w:hyperlink w:history="1" r:id="rIdtlq5q96aiix_pgufxnjg7">
+            <w:hyperlink w:history="1" r:id="rIdyk9vt1osw3hbyh6x150eq">
               <w:r>
                 <w:rPr>
                   <w:b/>
@@ -8658,7 +8658,7 @@
             </w:tcMar>
           </w:tcPr>
           <w:p>
-            <w:hyperlink w:history="1" r:id="rIdp3csxgcioi7edxaw59lv4">
+            <w:hyperlink w:history="1" r:id="rIdws_kvfm5ij5llsibhx_4e">
               <w:r>
                 <w:rPr>
                   <w:b/>
@@ -8779,7 +8779,7 @@
             </w:tcMar>
           </w:tcPr>
           <w:p>
-            <w:hyperlink w:history="1" r:id="rIdtmlzn6tqiqt-4wlk4bbuj">
+            <w:hyperlink w:history="1" r:id="rIdezn2j4r4johbmupdp2cu-">
               <w:r>
                 <w:rPr>
                   <w:b/>
@@ -8900,7 +8900,7 @@
             </w:tcMar>
           </w:tcPr>
           <w:p>
-            <w:hyperlink w:history="1" r:id="rIdme7uqallywqkwvooe-lug">
+            <w:hyperlink w:history="1" r:id="rIdmlwau-5hmk_enn64hwyyl">
               <w:r>
                 <w:rPr>
                   <w:b/>
@@ -9021,7 +9021,7 @@
             </w:tcMar>
           </w:tcPr>
           <w:p>
-            <w:hyperlink w:history="1" r:id="rIdksbp2lm8vtixixnsufcut">
+            <w:hyperlink w:history="1" r:id="rId-i4ytlop1eogrgqzdfnld">
               <w:r>
                 <w:rPr>
                   <w:b/>
@@ -9142,7 +9142,7 @@
             </w:tcMar>
           </w:tcPr>
           <w:p>
-            <w:hyperlink w:history="1" r:id="rIdjycsk20kte-h7mqx-xrvi">
+            <w:hyperlink w:history="1" r:id="rIdlcfuvpur66vl-osugbord">
               <w:r>
                 <w:rPr>
                   <w:b/>
@@ -9263,7 +9263,7 @@
             </w:tcMar>
           </w:tcPr>
           <w:p>
-            <w:hyperlink w:history="1" r:id="rIdoo0zyh02en4hqbblzkhhq">
+            <w:hyperlink w:history="1" r:id="rId7m8r1npxg3nheatkdvpw3">
               <w:r>
                 <w:rPr>
                   <w:b/>
@@ -9384,7 +9384,7 @@
             </w:tcMar>
           </w:tcPr>
           <w:p>
-            <w:hyperlink w:history="1" r:id="rIdfnnpoakkl04fdetdy07c6">
+            <w:hyperlink w:history="1" r:id="rIdxbekjhrahujsud5u5-xl-">
               <w:r>
                 <w:rPr>
                   <w:b/>
@@ -9505,7 +9505,7 @@
             </w:tcMar>
           </w:tcPr>
           <w:p>
-            <w:hyperlink w:history="1" r:id="rIdn47cqmrrcetun6vjjjm9o">
+            <w:hyperlink w:history="1" r:id="rId1nw7fhnawmfwzggs_1cvi">
               <w:r>
                 <w:rPr>
                   <w:b/>
@@ -9626,7 +9626,7 @@
             </w:tcMar>
           </w:tcPr>
           <w:p>
-            <w:hyperlink w:history="1" r:id="rIdybivfxa-isncag0ugvzpf">
+            <w:hyperlink w:history="1" r:id="rIdco5kjunwbatrat0hicjwj">
               <w:r>
                 <w:rPr>
                   <w:b/>
@@ -9747,7 +9747,7 @@
             </w:tcMar>
           </w:tcPr>
           <w:p>
-            <w:hyperlink w:history="1" r:id="rIdjw_ydmnpdc5bytgs0ayoz">
+            <w:hyperlink w:history="1" r:id="rIdc3upp5zsqvt0buedutwb2">
               <w:r>
                 <w:rPr>
                   <w:b/>
@@ -9930,7 +9930,7 @@
         </w:rPr>
         <w:t xml:space="preserve">Via </w:t>
       </w:r>
-      <w:hyperlink w:history="1" r:id="rIdqcsaaya2z5xhgektsqv0g">
+      <w:hyperlink w:history="1" r:id="rId0uwt6ai3zbd1mguadag4h">
         <w:r>
           <w:rPr>
             <w:color w:val="EA2E00"/>
@@ -9948,7 +9948,7 @@
         </w:rPr>
         <w:t xml:space="preserve">, </w:t>
       </w:r>
-      <w:hyperlink w:history="1" r:id="rId5rhsupalpdm9o8epfqqpt">
+      <w:hyperlink w:history="1" r:id="rIdjndns1kwvg0a-2qzeyxgy">
         <w:r>
           <w:rPr>
             <w:color w:val="EA2E00"/>
@@ -9991,7 +9991,7 @@
         </w:rPr>
         <w:t xml:space="preserve">Via </w:t>
       </w:r>
-      <w:hyperlink w:history="1" r:id="rIdbuo7qa_w_j2l9ilpms9a_">
+      <w:hyperlink w:history="1" r:id="rIda9rjqwojsmukg0cnzexqn">
         <w:r>
           <w:rPr>
             <w:color w:val="EA2E00"/>
@@ -10009,7 +10009,7 @@
         </w:rPr>
         <w:t xml:space="preserve">, </w:t>
       </w:r>
-      <w:hyperlink w:history="1" r:id="rId7jzgbgwpaqn5zna9f7jdr">
+      <w:hyperlink w:history="1" r:id="rIdnavmj9tl81p_f-5gdnngu">
         <w:r>
           <w:rPr>
             <w:color w:val="EA2E00"/>
@@ -10027,7 +10027,7 @@
         </w:rPr>
         <w:t xml:space="preserve">, </w:t>
       </w:r>
-      <w:hyperlink w:history="1" r:id="rIdxra-5tfr218d0q--nu6fb">
+      <w:hyperlink w:history="1" r:id="rIdnxzvxcfu730ezvp1vx7lw">
         <w:r>
           <w:rPr>
             <w:color w:val="EA2E00"/>
@@ -10045,7 +10045,7 @@
         </w:rPr>
         <w:t xml:space="preserve">, </w:t>
       </w:r>
-      <w:hyperlink w:history="1" r:id="rIdw5pg_t9ryx5sze8cs7tju">
+      <w:hyperlink w:history="1" r:id="rIdwe_zosgbhephmsuig2i65">
         <w:r>
           <w:rPr>
             <w:color w:val="EA2E00"/>
@@ -10063,7 +10063,7 @@
         </w:rPr>
         <w:t xml:space="preserve">, </w:t>
       </w:r>
-      <w:hyperlink w:history="1" r:id="rIdruzo8h3voozfauhntucqi">
+      <w:hyperlink w:history="1" r:id="rIdg7erhkwks4kconn2nrfsy">
         <w:r>
           <w:rPr>
             <w:color w:val="EA2E00"/>
@@ -10081,7 +10081,7 @@
         </w:rPr>
         <w:t xml:space="preserve">, </w:t>
       </w:r>
-      <w:hyperlink w:history="1" r:id="rIdpcnpc4sm98qbnd2cztmne">
+      <w:hyperlink w:history="1" r:id="rIdpfvq1h-d0anf7bhrv1d2k">
         <w:r>
           <w:rPr>
             <w:color w:val="EA2E00"/>
@@ -10124,7 +10124,7 @@
         </w:rPr>
         <w:t xml:space="preserve">Via </w:t>
       </w:r>
-      <w:hyperlink w:history="1" r:id="rIdqqxzpc2qm68tlob73lvv1">
+      <w:hyperlink w:history="1" r:id="rIdhkdy1prkbk76x7aapclyr">
         <w:r>
           <w:rPr>
             <w:color w:val="EA2E00"/>
@@ -10142,7 +10142,7 @@
         </w:rPr>
         <w:t xml:space="preserve">, </w:t>
       </w:r>
-      <w:hyperlink w:history="1" r:id="rIdfue5hqdvut1ikp9o3gyo8">
+      <w:hyperlink w:history="1" r:id="rId5wm-ym4t659nfdqtch8_2">
         <w:r>
           <w:rPr>
             <w:color w:val="EA2E00"/>
@@ -10160,7 +10160,7 @@
         </w:rPr>
         <w:t xml:space="preserve">, </w:t>
       </w:r>
-      <w:hyperlink w:history="1" r:id="rIdojnnhey-wsi--p75tvccd">
+      <w:hyperlink w:history="1" r:id="rIdimdgfd5gkqsslemcxbtz9">
         <w:r>
           <w:rPr>
             <w:color w:val="EA2E00"/>
@@ -10178,7 +10178,7 @@
         </w:rPr>
         <w:t xml:space="preserve">, </w:t>
       </w:r>
-      <w:hyperlink w:history="1" r:id="rIdhuenzrktamvepy1lodcsh">
+      <w:hyperlink w:history="1" r:id="rIdwff6dz4qc7wvujec_-klg">
         <w:r>
           <w:rPr>
             <w:color w:val="EA2E00"/>
@@ -10196,7 +10196,7 @@
         </w:rPr>
         <w:t xml:space="preserve">, </w:t>
       </w:r>
-      <w:hyperlink w:history="1" r:id="rIdu97jmptaof4voinf_dpvy">
+      <w:hyperlink w:history="1" r:id="rIdnedfmvgrzsripi3fkzr1t">
         <w:r>
           <w:rPr>
             <w:color w:val="EA2E00"/>
@@ -10239,7 +10239,7 @@
         </w:rPr>
         <w:t xml:space="preserve">Via </w:t>
       </w:r>
-      <w:hyperlink w:history="1" r:id="rIdbdnfdd5vasdq_iicsfrof">
+      <w:hyperlink w:history="1" r:id="rId-f-tsgrpoxduvyvotk3zj">
         <w:r>
           <w:rPr>
             <w:color w:val="EA2E00"/>
@@ -10257,7 +10257,7 @@
         </w:rPr>
         <w:t xml:space="preserve">, </w:t>
       </w:r>
-      <w:hyperlink w:history="1" r:id="rIdf8uhwj5rpmtprxhc2h055">
+      <w:hyperlink w:history="1" r:id="rIdorxccb-h_h4x0igjeytrn">
         <w:r>
           <w:rPr>
             <w:color w:val="EA2E00"/>
@@ -10275,7 +10275,7 @@
         </w:rPr>
         <w:t xml:space="preserve">, </w:t>
       </w:r>
-      <w:hyperlink w:history="1" r:id="rIds7tkdyyomy-0pa2kge31o">
+      <w:hyperlink w:history="1" r:id="rIdanjbtlqmg1qwg-wr67qtz">
         <w:r>
           <w:rPr>
             <w:color w:val="EA2E00"/>
@@ -10293,7 +10293,7 @@
         </w:rPr>
         <w:t xml:space="preserve">, </w:t>
       </w:r>
-      <w:hyperlink w:history="1" r:id="rId3jdv3rllixacnup7pmcap">
+      <w:hyperlink w:history="1" r:id="rIdrsrza8joqtur5b6h5xcww">
         <w:r>
           <w:rPr>
             <w:color w:val="EA2E00"/>
@@ -10336,7 +10336,7 @@
         </w:rPr>
         <w:t xml:space="preserve">Via </w:t>
       </w:r>
-      <w:hyperlink w:history="1" r:id="rId3sunclxkcqrqfkjy6kgqv">
+      <w:hyperlink w:history="1" r:id="rIdknxyxnrwh3xfzfrw2peu_">
         <w:r>
           <w:rPr>
             <w:color w:val="EA2E00"/>
@@ -10354,7 +10354,7 @@
         </w:rPr>
         <w:t xml:space="preserve">, </w:t>
       </w:r>
-      <w:hyperlink w:history="1" r:id="rIdd2gagzdyk41fzsnornw1m">
+      <w:hyperlink w:history="1" r:id="rIdeal2ncmof3gcrsrusv7_5">
         <w:r>
           <w:rPr>
             <w:color w:val="EA2E00"/>
@@ -10372,7 +10372,7 @@
         </w:rPr>
         <w:t xml:space="preserve">, </w:t>
       </w:r>
-      <w:hyperlink w:history="1" r:id="rIdrs_hpebyfmzhcpeboj7zg">
+      <w:hyperlink w:history="1" r:id="rIdtdgtp5efa-kllwnwlxbhd">
         <w:r>
           <w:rPr>
             <w:color w:val="EA2E00"/>
@@ -10390,7 +10390,7 @@
         </w:rPr>
         <w:t xml:space="preserve">, </w:t>
       </w:r>
-      <w:hyperlink w:history="1" r:id="rIdvbwjjrdcucq-00e_cbfkj">
+      <w:hyperlink w:history="1" r:id="rIdxn6klupuqil-hmrnxjtm5">
         <w:r>
           <w:rPr>
             <w:color w:val="EA2E00"/>
@@ -10433,7 +10433,7 @@
         </w:rPr>
         <w:t xml:space="preserve">Via </w:t>
       </w:r>
-      <w:hyperlink w:history="1" r:id="rIdyflnsow35metcy5_pcodu">
+      <w:hyperlink w:history="1" r:id="rIdowtvkxkl9_f0pnrc_qz1r">
         <w:r>
           <w:rPr>
             <w:color w:val="EA2E00"/>
@@ -10451,7 +10451,7 @@
         </w:rPr>
         <w:t xml:space="preserve">, </w:t>
       </w:r>
-      <w:hyperlink w:history="1" r:id="rIdsczxt6mjsehzzg_kfzoeg">
+      <w:hyperlink w:history="1" r:id="rIdikidtbxl_cmdbvjrwleoo">
         <w:r>
           <w:rPr>
             <w:color w:val="EA2E00"/>
@@ -10469,7 +10469,7 @@
         </w:rPr>
         <w:t xml:space="preserve">, </w:t>
       </w:r>
-      <w:hyperlink w:history="1" r:id="rIdkiwcg8uqifaikodzjx1n4">
+      <w:hyperlink w:history="1" r:id="rIdft3-ogdvohy7tljqf8vbd">
         <w:r>
           <w:rPr>
             <w:color w:val="EA2E00"/>
@@ -10545,7 +10545,7 @@
         </w:rPr>
         <w:t xml:space="preserve">Via </w:t>
       </w:r>
-      <w:hyperlink w:history="1" r:id="rIdxsmtkuvswk6hzaxvbcrc-">
+      <w:hyperlink w:history="1" r:id="rIdknggt6jddvk1s0-2iohco">
         <w:r>
           <w:rPr>
             <w:color w:val="EA2E00"/>
@@ -10563,7 +10563,7 @@
         </w:rPr>
         <w:t xml:space="preserve">, </w:t>
       </w:r>
-      <w:hyperlink w:history="1" r:id="rIdfcmchfrro5nab3i4bkvna">
+      <w:hyperlink w:history="1" r:id="rIdl2rqtk2_baml81p87m0hs">
         <w:r>
           <w:rPr>
             <w:color w:val="EA2E00"/>
@@ -10581,7 +10581,7 @@
         </w:rPr>
         <w:t xml:space="preserve">, </w:t>
       </w:r>
-      <w:hyperlink w:history="1" r:id="rIdtlrmktkn8zzfz-ijsxqc9">
+      <w:hyperlink w:history="1" r:id="rIdipredgxs-nlwy1jnbvq9g">
         <w:r>
           <w:rPr>
             <w:color w:val="EA2E00"/>
@@ -11552,7 +11552,7 @@
             </w:r>
           </w:p>
           <w:p>
-            <w:hyperlink w:history="1" r:id="rIdsmrnltonrvz-pk6ob0ul1">
+            <w:hyperlink w:history="1" r:id="rIdtudngim69xj-xqaeiaq4b">
               <w:r>
                 <w:rPr>
                   <w:rStyle w:val="Hyperlink"/>
@@ -11639,7 +11639,7 @@
         <w:spacing w:after="80"/>
         <w:ind w:left="620"/>
       </w:pPr>
-      <w:hyperlink w:history="1" r:id="rId1tbp2xuhams4y2nv1mjqa">
+      <w:hyperlink w:history="1" r:id="rIdoeuygjwojugyjzaomh3nh">
         <w:r>
           <w:rPr>
             <w:sz w:val="16"/>
@@ -11675,7 +11675,7 @@
         <w:spacing w:after="80"/>
         <w:ind w:left="620"/>
       </w:pPr>
-      <w:hyperlink w:history="1" r:id="rIdkg4d5nolaebaclz7v3qsk">
+      <w:hyperlink w:history="1" r:id="rIdkxrlxdeunuh2telntds4t">
         <w:r>
           <w:rPr>
             <w:sz w:val="16"/>
@@ -11711,7 +11711,7 @@
         <w:spacing w:after="80"/>
         <w:ind w:left="620"/>
       </w:pPr>
-      <w:hyperlink w:history="1" r:id="rIdkhkebv0zjpp0sdr33_cqx">
+      <w:hyperlink w:history="1" r:id="rIdgjnqwmbqmzhldn_mj7jgg">
         <w:r>
           <w:rPr>
             <w:sz w:val="16"/>
@@ -11747,7 +11747,7 @@
         <w:spacing w:after="80"/>
         <w:ind w:left="620"/>
       </w:pPr>
-      <w:hyperlink w:history="1" r:id="rIdv34o8gdoqlqg0bvydfhnr">
+      <w:hyperlink w:history="1" r:id="rIduhnwuyqdszochdcdps58g">
         <w:r>
           <w:rPr>
             <w:sz w:val="16"/>
@@ -11783,7 +11783,7 @@
         <w:spacing w:after="80"/>
         <w:ind w:left="620"/>
       </w:pPr>
-      <w:hyperlink w:history="1" r:id="rId8un1kxnu1voagdyxvlvlz">
+      <w:hyperlink w:history="1" r:id="rIdxczxv2d-15wlcqklvnttf">
         <w:r>
           <w:rPr>
             <w:sz w:val="16"/>
@@ -11819,7 +11819,7 @@
         <w:spacing w:after="80"/>
         <w:ind w:left="620"/>
       </w:pPr>
-      <w:hyperlink w:history="1" r:id="rIdfaggjh4wsqapnial8ptvn">
+      <w:hyperlink w:history="1" r:id="rIdxzu19a9d68r-nktiscr8d">
         <w:r>
           <w:rPr>
             <w:sz w:val="16"/>
@@ -11855,7 +11855,7 @@
         <w:spacing w:after="80"/>
         <w:ind w:left="620"/>
       </w:pPr>
-      <w:hyperlink w:history="1" r:id="rId4bya3_tht7heymtgzlpte">
+      <w:hyperlink w:history="1" r:id="rIdrmz4poqfjm0fjgycn2yh9">
         <w:r>
           <w:rPr>
             <w:sz w:val="16"/>
@@ -11899,7 +11899,7 @@
         <w:spacing w:after="80"/>
         <w:ind w:left="620"/>
       </w:pPr>
-      <w:hyperlink w:history="1" r:id="rId_yjggk4jtqugn2yidaevb">
+      <w:hyperlink w:history="1" r:id="rIdw49kbs5ap16rb5-fs8djc">
         <w:r>
           <w:rPr>
             <w:sz w:val="16"/>
@@ -11935,7 +11935,7 @@
         <w:spacing w:after="80"/>
         <w:ind w:left="620"/>
       </w:pPr>
-      <w:hyperlink w:history="1" r:id="rIdheukdgacek8folijqlkuw">
+      <w:hyperlink w:history="1" r:id="rIdk8tvqeavqwz5jzsxtncpg">
         <w:r>
           <w:rPr>
             <w:sz w:val="16"/>
@@ -11971,7 +11971,7 @@
         <w:spacing w:after="80"/>
         <w:ind w:left="620"/>
       </w:pPr>
-      <w:hyperlink w:history="1" r:id="rIditrxbum9tckwwsrsoou79">
+      <w:hyperlink w:history="1" r:id="rId9ila1ieeqqiwcztkwqenq">
         <w:r>
           <w:rPr>
             <w:sz w:val="16"/>
@@ -12007,7 +12007,7 @@
         <w:spacing w:after="80"/>
         <w:ind w:left="620"/>
       </w:pPr>
-      <w:hyperlink w:history="1" r:id="rIdqwdhnhluf0huyzwsx_rcm">
+      <w:hyperlink w:history="1" r:id="rId3_v3uwggplcl-tosfbghv">
         <w:r>
           <w:rPr>
             <w:sz w:val="16"/>
@@ -12051,7 +12051,7 @@
         <w:spacing w:after="80"/>
         <w:ind w:left="620"/>
       </w:pPr>
-      <w:hyperlink w:history="1" r:id="rIdp6og-hv0_cnxpq3wiax6o">
+      <w:hyperlink w:history="1" r:id="rIdwp96ykyro7ta2d9thlp_c">
         <w:r>
           <w:rPr>
             <w:sz w:val="16"/>
@@ -12087,7 +12087,7 @@
         <w:spacing w:after="80"/>
         <w:ind w:left="620"/>
       </w:pPr>
-      <w:hyperlink w:history="1" r:id="rIdhgn5nyswtkijub8bs_vsv">
+      <w:hyperlink w:history="1" r:id="rIdweevw1lgtw-qgdn30ttwa">
         <w:r>
           <w:rPr>
             <w:sz w:val="16"/>
@@ -12123,7 +12123,7 @@
         <w:spacing w:after="80"/>
         <w:ind w:left="620"/>
       </w:pPr>
-      <w:hyperlink w:history="1" r:id="rIdkqngtz01tcb-rvydssieu">
+      <w:hyperlink w:history="1" r:id="rId-pyq8dqum0tmwfevir7xb">
         <w:r>
           <w:rPr>
             <w:sz w:val="16"/>
@@ -12167,7 +12167,7 @@
         <w:spacing w:after="80"/>
         <w:ind w:left="620"/>
       </w:pPr>
-      <w:hyperlink w:history="1" r:id="rIdx9r-hmyzsdke58gu2dcqa">
+      <w:hyperlink w:history="1" r:id="rId3jhlpvydzq2vinqx9uuh7">
         <w:r>
           <w:rPr>
             <w:sz w:val="16"/>
@@ -12203,7 +12203,7 @@
         <w:spacing w:after="80"/>
         <w:ind w:left="620"/>
       </w:pPr>
-      <w:hyperlink w:history="1" r:id="rIdhtyyskc10-y8lebfndkki">
+      <w:hyperlink w:history="1" r:id="rIdc6nxhtdikeghtg5fsay95">
         <w:r>
           <w:rPr>
             <w:sz w:val="16"/>
@@ -12239,7 +12239,7 @@
         <w:spacing w:after="80"/>
         <w:ind w:left="620"/>
       </w:pPr>
-      <w:hyperlink w:history="1" r:id="rIdxlb9ac8tzyq4zrhgljjt0">
+      <w:hyperlink w:history="1" r:id="rIda8eanncjpoobijx9jr0tl">
         <w:r>
           <w:rPr>
             <w:sz w:val="16"/>
@@ -12283,7 +12283,7 @@
         <w:spacing w:after="80"/>
         <w:ind w:left="620"/>
       </w:pPr>
-      <w:hyperlink w:history="1" r:id="rIdvaq-nwudkuxzjmfn4cx9x">
+      <w:hyperlink w:history="1" r:id="rId5yy2nkzbvpcj9b5-mu3s2">
         <w:r>
           <w:rPr>
             <w:sz w:val="16"/>
@@ -12319,7 +12319,7 @@
         <w:spacing w:after="80"/>
         <w:ind w:left="620"/>
       </w:pPr>
-      <w:hyperlink w:history="1" r:id="rId42-rf53iw_9hqpcqxilpy">
+      <w:hyperlink w:history="1" r:id="rId9vgb8y4fathvh8wyiisip">
         <w:r>
           <w:rPr>
             <w:sz w:val="16"/>
@@ -12363,7 +12363,7 @@
         <w:spacing w:after="80"/>
         <w:ind w:left="620"/>
       </w:pPr>
-      <w:hyperlink w:history="1" r:id="rIdarwiya9ezoaqgiikdblp6">
+      <w:hyperlink w:history="1" r:id="rId1jq7nng_xbkivjdwrhwyz">
         <w:r>
           <w:rPr>
             <w:sz w:val="16"/>
@@ -12399,7 +12399,7 @@
         <w:spacing w:after="80"/>
         <w:ind w:left="620"/>
       </w:pPr>
-      <w:hyperlink w:history="1" r:id="rIdarmsuiwg19ff-nbum2eif">
+      <w:hyperlink w:history="1" r:id="rId6y8zygdzgqlb-jfvtyzym">
         <w:r>
           <w:rPr>
             <w:sz w:val="16"/>
@@ -12435,7 +12435,7 @@
         <w:spacing w:after="80"/>
         <w:ind w:left="620"/>
       </w:pPr>
-      <w:hyperlink w:history="1" r:id="rIda6ardfytlteonskvygzfs">
+      <w:hyperlink w:history="1" r:id="rIdktok4u4chwduaqgz6h3il">
         <w:r>
           <w:rPr>
             <w:sz w:val="16"/>
@@ -12479,7 +12479,7 @@
         <w:spacing w:after="80"/>
         <w:ind w:left="620"/>
       </w:pPr>
-      <w:hyperlink w:history="1" r:id="rId-n9d5cguoetls6cm8rojh">
+      <w:hyperlink w:history="1" r:id="rIdqffzd0pquxkjh_1zvhylw">
         <w:r>
           <w:rPr>
             <w:sz w:val="16"/>
@@ -12515,7 +12515,7 @@
         <w:spacing w:after="80"/>
         <w:ind w:left="620"/>
       </w:pPr>
-      <w:hyperlink w:history="1" r:id="rIdbgtdhnovpe5gskwslhpef">
+      <w:hyperlink w:history="1" r:id="rIdy_fyz5fgklw_qdpykf8nn">
         <w:r>
           <w:rPr>
             <w:sz w:val="16"/>
@@ -12551,7 +12551,7 @@
         <w:spacing w:after="80"/>
         <w:ind w:left="620"/>
       </w:pPr>
-      <w:hyperlink w:history="1" r:id="rIduruhvqofkuk0hyuongjxg">
+      <w:hyperlink w:history="1" r:id="rIdu5ifkd6gddxhtj7nl2lr-">
         <w:r>
           <w:rPr>
             <w:sz w:val="16"/>
@@ -12587,7 +12587,7 @@
         <w:spacing w:after="80"/>
         <w:ind w:left="620"/>
       </w:pPr>
-      <w:hyperlink w:history="1" r:id="rIdtj8rlhs4qf0ybyajoedfl">
+      <w:hyperlink w:history="1" r:id="rIdbrcyqmfu_423q-phs523d">
         <w:r>
           <w:rPr>
             <w:sz w:val="16"/>
@@ -12631,7 +12631,7 @@
         <w:spacing w:after="80"/>
         <w:ind w:left="620"/>
       </w:pPr>
-      <w:hyperlink w:history="1" r:id="rIdis_yml4hjzgcozun49wfs">
+      <w:hyperlink w:history="1" r:id="rIdrk4eg33lqxgqglrexrual">
         <w:r>
           <w:rPr>
             <w:sz w:val="16"/>
@@ -12667,7 +12667,7 @@
         <w:spacing w:after="80"/>
         <w:ind w:left="620"/>
       </w:pPr>
-      <w:hyperlink w:history="1" r:id="rIdgfyeb3cshg029k0qb8zvo">
+      <w:hyperlink w:history="1" r:id="rIdc7yqzvd84fc3unb88htd4">
         <w:r>
           <w:rPr>
             <w:sz w:val="16"/>
@@ -12703,7 +12703,7 @@
         <w:spacing w:after="80"/>
         <w:ind w:left="620"/>
       </w:pPr>
-      <w:hyperlink w:history="1" r:id="rId1ay66skckmqxvs5gfthf5">
+      <w:hyperlink w:history="1" r:id="rIdcowrtjxacvtmq7e9okyu3">
         <w:r>
           <w:rPr>
             <w:sz w:val="16"/>
@@ -12739,7 +12739,7 @@
         <w:spacing w:after="80"/>
         <w:ind w:left="620"/>
       </w:pPr>
-      <w:hyperlink w:history="1" r:id="rIdljz9zsrhfbcenijm31-ga">
+      <w:hyperlink w:history="1" r:id="rId8ds_t-t4nlkkb11t4quqk">
         <w:r>
           <w:rPr>
             <w:sz w:val="16"/>
@@ -12775,7 +12775,7 @@
         <w:spacing w:after="80"/>
         <w:ind w:left="620"/>
       </w:pPr>
-      <w:hyperlink w:history="1" r:id="rIdysooh85xpw52ojxdaxuru">
+      <w:hyperlink w:history="1" r:id="rIdebwkcmtl4_xvfuygkghs1">
         <w:r>
           <w:rPr>
             <w:sz w:val="16"/>
@@ -12811,7 +12811,7 @@
         <w:spacing w:after="80"/>
         <w:ind w:left="620"/>
       </w:pPr>
-      <w:hyperlink w:history="1" r:id="rIddi7uv1dqmd9bixrn0kgt_">
+      <w:hyperlink w:history="1" r:id="rIdlazbjfcy9p8zeb9vp5kqv">
         <w:r>
           <w:rPr>
             <w:sz w:val="16"/>
@@ -12847,7 +12847,7 @@
         <w:spacing w:after="80"/>
         <w:ind w:left="620"/>
       </w:pPr>
-      <w:hyperlink w:history="1" r:id="rIdezy21r36lmgvosiwcn1je">
+      <w:hyperlink w:history="1" r:id="rIdwaahhgspncl65pohzd-py">
         <w:r>
           <w:rPr>
             <w:sz w:val="16"/>
@@ -12909,7 +12909,7 @@
         </w:numPr>
         <w:spacing w:after="60"/>
       </w:pPr>
-      <w:hyperlink w:history="1" r:id="rIddiqmglo41oaauldyikhiv">
+      <w:hyperlink w:history="1" r:id="rIdrn-0bit9qlfu_bses8m1k">
         <w:r>
           <w:rPr>
             <w:sz w:val="18"/>
@@ -12937,7 +12937,7 @@
         </w:numPr>
         <w:spacing w:after="60"/>
       </w:pPr>
-      <w:hyperlink w:history="1" r:id="rId6qwysgyclkc8kjjgnp6de">
+      <w:hyperlink w:history="1" r:id="rIdwjez10bpbh3xuzff7fp-q">
         <w:r>
           <w:rPr>
             <w:sz w:val="18"/>
@@ -12965,7 +12965,7 @@
         </w:numPr>
         <w:spacing w:after="60"/>
       </w:pPr>
-      <w:hyperlink w:history="1" r:id="rIdgfoopqpiz8ju4q_dvzaq_">
+      <w:hyperlink w:history="1" r:id="rIdrwxnckhu6moohl7qrvz01">
         <w:r>
           <w:rPr>
             <w:sz w:val="18"/>
@@ -12993,7 +12993,7 @@
         </w:numPr>
         <w:spacing w:after="60"/>
       </w:pPr>
-      <w:hyperlink w:history="1" r:id="rId7vgxdv2r7fjlksqmqczcd">
+      <w:hyperlink w:history="1" r:id="rIdvz0htvpt8soi7upkv9vw2">
         <w:r>
           <w:rPr>
             <w:sz w:val="18"/>
@@ -13021,7 +13021,7 @@
         </w:numPr>
         <w:spacing w:after="60"/>
       </w:pPr>
-      <w:hyperlink w:history="1" r:id="rIdszpshx0bg_uias54us9ou">
+      <w:hyperlink w:history="1" r:id="rIdblvbumwv4xwgm9rh6tm0n">
         <w:r>
           <w:rPr>
             <w:sz w:val="18"/>
@@ -13049,7 +13049,7 @@
         </w:numPr>
         <w:spacing w:after="60"/>
       </w:pPr>
-      <w:hyperlink w:history="1" r:id="rIdhqx_ixr9qpdzszflbntez">
+      <w:hyperlink w:history="1" r:id="rIdjiy2__jy5hun-he7dxxdi">
         <w:r>
           <w:rPr>
             <w:sz w:val="18"/>
@@ -13077,7 +13077,7 @@
         </w:numPr>
         <w:spacing w:after="60"/>
       </w:pPr>
-      <w:hyperlink w:history="1" r:id="rId_icbnqzadxewxkj7kfgyo">
+      <w:hyperlink w:history="1" r:id="rIdz3z2ntw7gi8kji6b9yv5r">
         <w:r>
           <w:rPr>
             <w:sz w:val="18"/>
@@ -13105,7 +13105,7 @@
         </w:numPr>
         <w:spacing w:after="60"/>
       </w:pPr>
-      <w:hyperlink w:history="1" r:id="rIdcnl-gem6kxp11edaltkg_">
+      <w:hyperlink w:history="1" r:id="rIdsr17gcr3mzot3gbkfo3cp">
         <w:r>
           <w:rPr>
             <w:sz w:val="18"/>
@@ -13133,7 +13133,7 @@
         </w:numPr>
         <w:spacing w:after="60"/>
       </w:pPr>
-      <w:hyperlink w:history="1" r:id="rIdandksesue2rhcoicrgumj">
+      <w:hyperlink w:history="1" r:id="rIdc65hgaacsjylifdbheedt">
         <w:r>
           <w:rPr>
             <w:sz w:val="18"/>
@@ -13161,7 +13161,7 @@
         </w:numPr>
         <w:spacing w:after="60"/>
       </w:pPr>
-      <w:hyperlink w:history="1" r:id="rIdod_60q_hbrnpeoir1cpre">
+      <w:hyperlink w:history="1" r:id="rIddghwrsxxtjhwssyduribw">
         <w:r>
           <w:rPr>
             <w:sz w:val="18"/>
@@ -13189,7 +13189,7 @@
         </w:numPr>
         <w:spacing w:after="60"/>
       </w:pPr>
-      <w:hyperlink w:history="1" r:id="rIdbdoljbqfrt5waiyvj184t">
+      <w:hyperlink w:history="1" r:id="rId9vcekgppftskslq53p4vy">
         <w:r>
           <w:rPr>
             <w:sz w:val="18"/>
@@ -13217,7 +13217,7 @@
         </w:numPr>
         <w:spacing w:after="60"/>
       </w:pPr>
-      <w:hyperlink w:history="1" r:id="rIdpmxre7_ooi8nldp09uefz">
+      <w:hyperlink w:history="1" r:id="rIdr4slb9gnqlup4mw9eujna">
         <w:r>
           <w:rPr>
             <w:sz w:val="18"/>
@@ -13245,7 +13245,7 @@
         </w:numPr>
         <w:spacing w:after="60"/>
       </w:pPr>
-      <w:hyperlink w:history="1" r:id="rIdmo-zpjizitpil7wefwhtj">
+      <w:hyperlink w:history="1" r:id="rIdup58lhduv_bbmbtnqfglw">
         <w:r>
           <w:rPr>
             <w:sz w:val="18"/>
@@ -13273,7 +13273,7 @@
         </w:numPr>
         <w:spacing w:after="60"/>
       </w:pPr>
-      <w:hyperlink w:history="1" r:id="rIdori5pfd0z01dnvoli3spp">
+      <w:hyperlink w:history="1" r:id="rIdou_ofg1rehy9qgu-u6ts0">
         <w:r>
           <w:rPr>
             <w:sz w:val="18"/>
@@ -13301,7 +13301,7 @@
         </w:numPr>
         <w:spacing w:after="60"/>
       </w:pPr>
-      <w:hyperlink w:history="1" r:id="rIdpwvbhv_a5id1fzw-mkfs2">
+      <w:hyperlink w:history="1" r:id="rIdkhh7onfks8y15rnmfh652">
         <w:r>
           <w:rPr>
             <w:sz w:val="18"/>
@@ -13329,7 +13329,7 @@
         </w:numPr>
         <w:spacing w:after="60"/>
       </w:pPr>
-      <w:hyperlink w:history="1" r:id="rIdkknl4bmuwzizjmw7ijpde">
+      <w:hyperlink w:history="1" r:id="rIdbxkzfrnqoi1sc24r0mjsx">
         <w:r>
           <w:rPr>
             <w:sz w:val="18"/>
@@ -13357,7 +13357,7 @@
         </w:numPr>
         <w:spacing w:after="60"/>
       </w:pPr>
-      <w:hyperlink w:history="1" r:id="rIdoks5c1sbj07bpc2uewiki">
+      <w:hyperlink w:history="1" r:id="rIdu4lhj2yu9rce2bvnsidcu">
         <w:r>
           <w:rPr>
             <w:sz w:val="18"/>
@@ -13385,7 +13385,7 @@
         </w:numPr>
         <w:spacing w:after="60"/>
       </w:pPr>
-      <w:hyperlink w:history="1" r:id="rIdewvdblidqcwguwy81lbb-">
+      <w:hyperlink w:history="1" r:id="rIdido6qfflf6a1ayyywqwru">
         <w:r>
           <w:rPr>
             <w:sz w:val="18"/>
@@ -13413,7 +13413,7 @@
         </w:numPr>
         <w:spacing w:after="60"/>
       </w:pPr>
-      <w:hyperlink w:history="1" r:id="rIdexpl60zq_lwupj1ian1cv">
+      <w:hyperlink w:history="1" r:id="rIdnhybzxoe5fnkkq0fpc2wl">
         <w:r>
           <w:rPr>
             <w:sz w:val="18"/>
@@ -13441,7 +13441,7 @@
         </w:numPr>
         <w:spacing w:after="60"/>
       </w:pPr>
-      <w:hyperlink w:history="1" r:id="rIdrncuodj35hnrdl0n7wafu">
+      <w:hyperlink w:history="1" r:id="rId9nlmaqkek0v5vta56eu3z">
         <w:r>
           <w:rPr>
             <w:sz w:val="18"/>
@@ -13469,7 +13469,7 @@
         </w:numPr>
         <w:spacing w:after="60"/>
       </w:pPr>
-      <w:hyperlink w:history="1" r:id="rIdd3115wadmvxoqing0lyq2">
+      <w:hyperlink w:history="1" r:id="rIdjbbekziwk4e3su4nzopt8">
         <w:r>
           <w:rPr>
             <w:sz w:val="18"/>
@@ -13497,7 +13497,7 @@
         </w:numPr>
         <w:spacing w:after="60"/>
       </w:pPr>
-      <w:hyperlink w:history="1" r:id="rIdow3z5rqsaevnezbmmni_x">
+      <w:hyperlink w:history="1" r:id="rIdaxvjypaz2lmqw15ugf7bf">
         <w:r>
           <w:rPr>
             <w:sz w:val="18"/>
@@ -13525,7 +13525,7 @@
         </w:numPr>
         <w:spacing w:after="60"/>
       </w:pPr>
-      <w:hyperlink w:history="1" r:id="rIdvzpjjc7rvdetdfnxbsakv">
+      <w:hyperlink w:history="1" r:id="rId8x8vu1ouhhv5kj48mhxoe">
         <w:r>
           <w:rPr>
             <w:sz w:val="18"/>
@@ -13553,7 +13553,7 @@
         </w:numPr>
         <w:spacing w:after="60"/>
       </w:pPr>
-      <w:hyperlink w:history="1" r:id="rIdnk6c3r5hiipc_7tr4drqv">
+      <w:hyperlink w:history="1" r:id="rIdh6oxia5zpqwzhyjbrv--j">
         <w:r>
           <w:rPr>
             <w:sz w:val="18"/>
@@ -13581,7 +13581,7 @@
         </w:numPr>
         <w:spacing w:after="60"/>
       </w:pPr>
-      <w:hyperlink w:history="1" r:id="rIdtanwcvq3waold_tolgn4k">
+      <w:hyperlink w:history="1" r:id="rIdk9afy0ng3x9xvo90rhn1v">
         <w:r>
           <w:rPr>
             <w:sz w:val="18"/>
@@ -13609,7 +13609,7 @@
         </w:numPr>
         <w:spacing w:after="60"/>
       </w:pPr>
-      <w:hyperlink w:history="1" r:id="rId98kkkpygopqd-bvsclefq">
+      <w:hyperlink w:history="1" r:id="rId3elxglc6n6awothw3tjaz">
         <w:r>
           <w:rPr>
             <w:sz w:val="18"/>
@@ -13637,7 +13637,7 @@
         </w:numPr>
         <w:spacing w:after="60"/>
       </w:pPr>
-      <w:hyperlink w:history="1" r:id="rIdajyfblutycjivox9w4dlq">
+      <w:hyperlink w:history="1" r:id="rIdn4lkkbs0avljo3k3-7fhy">
         <w:r>
           <w:rPr>
             <w:sz w:val="18"/>
@@ -13665,7 +13665,7 @@
         </w:numPr>
         <w:spacing w:after="60"/>
       </w:pPr>
-      <w:hyperlink w:history="1" r:id="rIdfmb4_quvbewwmhcnertz-">
+      <w:hyperlink w:history="1" r:id="rIdzqq7j_zdgr37or0lxpmdm">
         <w:r>
           <w:rPr>
             <w:sz w:val="18"/>
@@ -13693,7 +13693,7 @@
         </w:numPr>
         <w:spacing w:after="60"/>
       </w:pPr>
-      <w:hyperlink w:history="1" r:id="rIdmvmptzxv62xzrbx6sac7l">
+      <w:hyperlink w:history="1" r:id="rIdkzf0jvze_1eqtfhie63ui">
         <w:r>
           <w:rPr>
             <w:sz w:val="18"/>
@@ -13721,7 +13721,7 @@
         </w:numPr>
         <w:spacing w:after="60"/>
       </w:pPr>
-      <w:hyperlink w:history="1" r:id="rIdp8r8zk92yfokeywy4tjng">
+      <w:hyperlink w:history="1" r:id="rIdwd50oireula8n-i1cxp61">
         <w:r>
           <w:rPr>
             <w:sz w:val="18"/>
@@ -13749,7 +13749,7 @@
         </w:numPr>
         <w:spacing w:after="60"/>
       </w:pPr>
-      <w:hyperlink w:history="1" r:id="rIdccjonddvwojx4mszweyi7">
+      <w:hyperlink w:history="1" r:id="rIdiceo3iywtt-m5a0pcriq1">
         <w:r>
           <w:rPr>
             <w:sz w:val="18"/>
@@ -13777,7 +13777,7 @@
         </w:numPr>
         <w:spacing w:after="60"/>
       </w:pPr>
-      <w:hyperlink w:history="1" r:id="rId4bn0e7sq6acny351rcted">
+      <w:hyperlink w:history="1" r:id="rIdwoiuy6cuyg0xjhizpykyr">
         <w:r>
           <w:rPr>
             <w:sz w:val="18"/>
@@ -13805,7 +13805,7 @@
         </w:numPr>
         <w:spacing w:after="60"/>
       </w:pPr>
-      <w:hyperlink w:history="1" r:id="rId32clvbjulbzd-jp3bro34">
+      <w:hyperlink w:history="1" r:id="rIdmpjdplhnv63w1kozyljlu">
         <w:r>
           <w:rPr>
             <w:sz w:val="18"/>
@@ -13833,7 +13833,7 @@
         </w:numPr>
         <w:spacing w:after="60"/>
       </w:pPr>
-      <w:hyperlink w:history="1" r:id="rIdx_dkau0szbingpd0rm37g">
+      <w:hyperlink w:history="1" r:id="rIdtxxukoylfulmwcncxa2lw">
         <w:r>
           <w:rPr>
             <w:sz w:val="18"/>
@@ -13861,7 +13861,7 @@
         </w:numPr>
         <w:spacing w:after="60"/>
       </w:pPr>
-      <w:hyperlink w:history="1" r:id="rId5m7onwspyranptatergin">
+      <w:hyperlink w:history="1" r:id="rIdwdewxpvrp-loj5ybmlbxl">
         <w:r>
           <w:rPr>
             <w:sz w:val="18"/>
@@ -13889,7 +13889,7 @@
         </w:numPr>
         <w:spacing w:after="60"/>
       </w:pPr>
-      <w:hyperlink w:history="1" r:id="rIdirpwa6s_mfpnkl7hdfydt">
+      <w:hyperlink w:history="1" r:id="rIdwqspf-nnltzbadd7uq_i7">
         <w:r>
           <w:rPr>
             <w:sz w:val="18"/>
@@ -13917,7 +13917,7 @@
         </w:numPr>
         <w:spacing w:after="60"/>
       </w:pPr>
-      <w:hyperlink w:history="1" r:id="rIdirc-i-x_1gng39hiv_30f">
+      <w:hyperlink w:history="1" r:id="rIdtg-ywvan9yhuvrwd-up5y">
         <w:r>
           <w:rPr>
             <w:sz w:val="18"/>
@@ -13945,7 +13945,7 @@
         </w:numPr>
         <w:spacing w:after="60"/>
       </w:pPr>
-      <w:hyperlink w:history="1" r:id="rIdnfu2_dnsevyh-edowi3eg">
+      <w:hyperlink w:history="1" r:id="rIdyqqzeu1ag-uvd0ezdj3ov">
         <w:r>
           <w:rPr>
             <w:sz w:val="18"/>
@@ -13973,7 +13973,7 @@
         </w:numPr>
         <w:spacing w:after="60"/>
       </w:pPr>
-      <w:hyperlink w:history="1" r:id="rIdeia6xwyez84lfx1ucodmf">
+      <w:hyperlink w:history="1" r:id="rIdxsut3ig7t4qgdqcptlzks">
         <w:r>
           <w:rPr>
             <w:sz w:val="18"/>
@@ -14001,7 +14001,7 @@
         </w:numPr>
         <w:spacing w:after="60"/>
       </w:pPr>
-      <w:hyperlink w:history="1" r:id="rIdp9nsuwb1mhm8nvcp2clbv">
+      <w:hyperlink w:history="1" r:id="rId3b6dyxvrueasrbpvru2v5">
         <w:r>
           <w:rPr>
             <w:sz w:val="18"/>
@@ -14029,7 +14029,7 @@
         </w:numPr>
         <w:spacing w:after="60"/>
       </w:pPr>
-      <w:hyperlink w:history="1" r:id="rIdn0pg6gfqe6sqmakho4fg7">
+      <w:hyperlink w:history="1" r:id="rIdahyutco4gmies8lvktefn">
         <w:r>
           <w:rPr>
             <w:sz w:val="18"/>
@@ -14057,7 +14057,7 @@
         </w:numPr>
         <w:spacing w:after="60"/>
       </w:pPr>
-      <w:hyperlink w:history="1" r:id="rIdcqpup8pgr6v0kduts0bur">
+      <w:hyperlink w:history="1" r:id="rIdr-nwipsxi3lt65i4xudyw">
         <w:r>
           <w:rPr>
             <w:sz w:val="18"/>
@@ -14085,7 +14085,7 @@
         </w:numPr>
         <w:spacing w:after="60"/>
       </w:pPr>
-      <w:hyperlink w:history="1" r:id="rIdgfavxb-ypdllthmjhkxia">
+      <w:hyperlink w:history="1" r:id="rIdpurkuki1afc-tghg2ss8p">
         <w:r>
           <w:rPr>
             <w:sz w:val="18"/>
@@ -14113,7 +14113,7 @@
         </w:numPr>
         <w:spacing w:after="60"/>
       </w:pPr>
-      <w:hyperlink w:history="1" r:id="rIdbps5frwahoephtuy_fj5h">
+      <w:hyperlink w:history="1" r:id="rIdxgntpslfndvhj_pccauwf">
         <w:r>
           <w:rPr>
             <w:sz w:val="18"/>
@@ -14141,7 +14141,7 @@
         </w:numPr>
         <w:spacing w:after="60"/>
       </w:pPr>
-      <w:hyperlink w:history="1" r:id="rIddv-bo-iorrgizxbmqnd-d">
+      <w:hyperlink w:history="1" r:id="rIduknvmqhtr0mhdifkz2-3r">
         <w:r>
           <w:rPr>
             <w:sz w:val="18"/>
@@ -14169,7 +14169,7 @@
         </w:numPr>
         <w:spacing w:after="60"/>
       </w:pPr>
-      <w:hyperlink w:history="1" r:id="rIdewvga67vufonddqtx_fqa">
+      <w:hyperlink w:history="1" r:id="rIdywekbmgzmhvtm98nekg_e">
         <w:r>
           <w:rPr>
             <w:sz w:val="18"/>
@@ -14197,7 +14197,7 @@
         </w:numPr>
         <w:spacing w:after="60"/>
       </w:pPr>
-      <w:hyperlink w:history="1" r:id="rIdsufdfk1qathfuezbr7cmb">
+      <w:hyperlink w:history="1" r:id="rIdmzzovvuok2aqd1qf0qxxa">
         <w:r>
           <w:rPr>
             <w:sz w:val="18"/>
@@ -14225,7 +14225,7 @@
         </w:numPr>
         <w:spacing w:after="60"/>
       </w:pPr>
-      <w:hyperlink w:history="1" r:id="rIdthyqsboze0xrkdg5iqadp">
+      <w:hyperlink w:history="1" r:id="rIdqkquuhrwdn3dnofa-3miv">
         <w:r>
           <w:rPr>
             <w:sz w:val="18"/>
@@ -14253,7 +14253,7 @@
         </w:numPr>
         <w:spacing w:after="60"/>
       </w:pPr>
-      <w:hyperlink w:history="1" r:id="rIdlmu1lt8yjj2iebs0m7oqa">
+      <w:hyperlink w:history="1" r:id="rIdbk2f4vxuzjqngcvz2udtm">
         <w:r>
           <w:rPr>
             <w:sz w:val="18"/>
@@ -14281,7 +14281,7 @@
         </w:numPr>
         <w:spacing w:after="60"/>
       </w:pPr>
-      <w:hyperlink w:history="1" r:id="rIdwnnkk6nyzgkh4ez-jx6ik">
+      <w:hyperlink w:history="1" r:id="rIdh8pjh7gd1fgxnfrjt0isp">
         <w:r>
           <w:rPr>
             <w:sz w:val="18"/>
@@ -14309,7 +14309,7 @@
         </w:numPr>
         <w:spacing w:after="60"/>
       </w:pPr>
-      <w:hyperlink w:history="1" r:id="rIdfdmuvafxor3vua3kuabis">
+      <w:hyperlink w:history="1" r:id="rIdrff3n6shu-mwxxc-xibcu">
         <w:r>
           <w:rPr>
             <w:sz w:val="18"/>
@@ -14337,7 +14337,7 @@
         </w:numPr>
         <w:spacing w:after="60"/>
       </w:pPr>
-      <w:hyperlink w:history="1" r:id="rIdlzfsw3ubhj6us7-qysa_l">
+      <w:hyperlink w:history="1" r:id="rIdph5p3h-fcx11vospiqxpj">
         <w:r>
           <w:rPr>
             <w:sz w:val="18"/>
@@ -14365,7 +14365,7 @@
         </w:numPr>
         <w:spacing w:after="60"/>
       </w:pPr>
-      <w:hyperlink w:history="1" r:id="rId49mozrmbtb_-lrr7xq1bn">
+      <w:hyperlink w:history="1" r:id="rIdtvl62mn0shidbmatkzdch">
         <w:r>
           <w:rPr>
             <w:sz w:val="18"/>
@@ -14393,7 +14393,7 @@
         </w:numPr>
         <w:spacing w:after="60"/>
       </w:pPr>
-      <w:hyperlink w:history="1" r:id="rIdcorx5kc6fbwumkl8wqbul">
+      <w:hyperlink w:history="1" r:id="rIdynd8varrqglvdcwrhhszh">
         <w:r>
           <w:rPr>
             <w:sz w:val="18"/>
@@ -14421,7 +14421,7 @@
         </w:numPr>
         <w:spacing w:after="60"/>
       </w:pPr>
-      <w:hyperlink w:history="1" r:id="rIdgofsm_cbs3oawkn0xqwnu">
+      <w:hyperlink w:history="1" r:id="rId1amuek5smf5kocgus68gi">
         <w:r>
           <w:rPr>
             <w:sz w:val="18"/>
@@ -14449,7 +14449,7 @@
         </w:numPr>
         <w:spacing w:after="60"/>
       </w:pPr>
-      <w:hyperlink w:history="1" r:id="rId7r9kgagtisboscavg2h2j">
+      <w:hyperlink w:history="1" r:id="rIdv2nyss2qkdvcmeondyepm">
         <w:r>
           <w:rPr>
             <w:sz w:val="18"/>
@@ -14477,7 +14477,7 @@
         </w:numPr>
         <w:spacing w:after="60"/>
       </w:pPr>
-      <w:hyperlink w:history="1" r:id="rIdxfhjclvage1mwytzdojne">
+      <w:hyperlink w:history="1" r:id="rIdtdkbvqt6mgadocr8fdooj">
         <w:r>
           <w:rPr>
             <w:sz w:val="18"/>
@@ -14505,7 +14505,7 @@
         </w:numPr>
         <w:spacing w:after="60"/>
       </w:pPr>
-      <w:hyperlink w:history="1" r:id="rIdphpv_mc_kbq-aqj9ar9k1">
+      <w:hyperlink w:history="1" r:id="rIdwqtnb2lutvsxqop69p73e">
         <w:r>
           <w:rPr>
             <w:sz w:val="18"/>
@@ -14533,7 +14533,7 @@
         </w:numPr>
         <w:spacing w:after="60"/>
       </w:pPr>
-      <w:hyperlink w:history="1" r:id="rId0lagqzmunpkorgpy1ovff">
+      <w:hyperlink w:history="1" r:id="rIdzxfo0mddxhrgv0oacva6n">
         <w:r>
           <w:rPr>
             <w:sz w:val="18"/>
@@ -14561,7 +14561,7 @@
         </w:numPr>
         <w:spacing w:after="60"/>
       </w:pPr>
-      <w:hyperlink w:history="1" r:id="rIdyfzsgck_thnghqkjgskvc">
+      <w:hyperlink w:history="1" r:id="rIdw-imwqpd32ww7gg3aohxd">
         <w:r>
           <w:rPr>
             <w:sz w:val="18"/>
@@ -14589,7 +14589,7 @@
         </w:numPr>
         <w:spacing w:after="60"/>
       </w:pPr>
-      <w:hyperlink w:history="1" r:id="rIdqhxrhalqfdla8nhuth4sa">
+      <w:hyperlink w:history="1" r:id="rIdbqisbcyf-7tdlcrn9upev">
         <w:r>
           <w:rPr>
             <w:sz w:val="18"/>
@@ -14617,7 +14617,7 @@
         </w:numPr>
         <w:spacing w:after="60"/>
       </w:pPr>
-      <w:hyperlink w:history="1" r:id="rIdmfcke_u-dz1ifiihqk5wr">
+      <w:hyperlink w:history="1" r:id="rIdxflevnh4stwwsause9fqb">
         <w:r>
           <w:rPr>
             <w:sz w:val="18"/>
@@ -14645,7 +14645,7 @@
         </w:numPr>
         <w:spacing w:after="60"/>
       </w:pPr>
-      <w:hyperlink w:history="1" r:id="rIdkzjegmfcjhgihfdnoylrc">
+      <w:hyperlink w:history="1" r:id="rIdytr6kpnyrwin1j7xkndra">
         <w:r>
           <w:rPr>
             <w:sz w:val="18"/>
@@ -14673,7 +14673,7 @@
         </w:numPr>
         <w:spacing w:after="60"/>
       </w:pPr>
-      <w:hyperlink w:history="1" r:id="rIdvw1cw7q2swa-1o6kxqi4s">
+      <w:hyperlink w:history="1" r:id="rIdsqlxjx4os82lx6wfb22vr">
         <w:r>
           <w:rPr>
             <w:sz w:val="18"/>
@@ -14701,7 +14701,7 @@
         </w:numPr>
         <w:spacing w:after="60"/>
       </w:pPr>
-      <w:hyperlink w:history="1" r:id="rIdffdpoprtn0quxpgx0rnnu">
+      <w:hyperlink w:history="1" r:id="rIdv_vjddalawrdmdr2wv0b2">
         <w:r>
           <w:rPr>
             <w:sz w:val="18"/>
@@ -14729,7 +14729,7 @@
         </w:numPr>
         <w:spacing w:after="60"/>
       </w:pPr>
-      <w:hyperlink w:history="1" r:id="rIdh-6wzbd0njkgirik26uwr">
+      <w:hyperlink w:history="1" r:id="rIdnzwa2garu8lzt1dd-b5rx">
         <w:r>
           <w:rPr>
             <w:sz w:val="18"/>
@@ -14757,7 +14757,7 @@
         </w:numPr>
         <w:spacing w:after="60"/>
       </w:pPr>
-      <w:hyperlink w:history="1" r:id="rIdc0mbhj69z0wbfed8mqe8f">
+      <w:hyperlink w:history="1" r:id="rId6gwb1w8rly9qzytjffsmw">
         <w:r>
           <w:rPr>
             <w:sz w:val="18"/>
@@ -14785,7 +14785,7 @@
         </w:numPr>
         <w:spacing w:after="60"/>
       </w:pPr>
-      <w:hyperlink w:history="1" r:id="rIdivcfxm6gu5kdtsxsycnc7">
+      <w:hyperlink w:history="1" r:id="rId8p_1vnwtwqeaehbtn-nde">
         <w:r>
           <w:rPr>
             <w:sz w:val="18"/>
@@ -14813,7 +14813,7 @@
         </w:numPr>
         <w:spacing w:after="60"/>
       </w:pPr>
-      <w:hyperlink w:history="1" r:id="rIdhqgqfnhh6x0yk6cadgh5t">
+      <w:hyperlink w:history="1" r:id="rIdoib3d4-ygccipawa_rmmx">
         <w:r>
           <w:rPr>
             <w:sz w:val="18"/>
@@ -14841,7 +14841,7 @@
         </w:numPr>
         <w:spacing w:after="60"/>
       </w:pPr>
-      <w:hyperlink w:history="1" r:id="rIdaotk6y-ybskm6nvub7tuc">
+      <w:hyperlink w:history="1" r:id="rIdqzcujchcleloevh6kzjwc">
         <w:r>
           <w:rPr>
             <w:sz w:val="18"/>
@@ -14869,7 +14869,7 @@
         </w:numPr>
         <w:spacing w:after="60"/>
       </w:pPr>
-      <w:hyperlink w:history="1" r:id="rIdbhubhkgg7aqwqlashzex3">
+      <w:hyperlink w:history="1" r:id="rId7bqjlwssd2f_kkn41tcag">
         <w:r>
           <w:rPr>
             <w:sz w:val="18"/>
@@ -14897,7 +14897,7 @@
         </w:numPr>
         <w:spacing w:after="60"/>
       </w:pPr>
-      <w:hyperlink w:history="1" r:id="rId2tnfoznk-jthhcdn8_hqu">
+      <w:hyperlink w:history="1" r:id="rIdemnj-czxuse1grxwclyvy">
         <w:r>
           <w:rPr>
             <w:sz w:val="18"/>
@@ -14925,7 +14925,7 @@
         </w:numPr>
         <w:spacing w:after="60"/>
       </w:pPr>
-      <w:hyperlink w:history="1" r:id="rIdrcgzciirfuhwgulbrdipo">
+      <w:hyperlink w:history="1" r:id="rIdj40snr-wsm7dapltes73e">
         <w:r>
           <w:rPr>
             <w:sz w:val="18"/>
@@ -14953,7 +14953,7 @@
         </w:numPr>
         <w:spacing w:after="60"/>
       </w:pPr>
-      <w:hyperlink w:history="1" r:id="rId07raafpytywbpuqxuzcoh">
+      <w:hyperlink w:history="1" r:id="rIdakudnzwrnwjpkiyq8dims">
         <w:r>
           <w:rPr>
             <w:sz w:val="18"/>
@@ -14981,7 +14981,7 @@
         </w:numPr>
         <w:spacing w:after="60"/>
       </w:pPr>
-      <w:hyperlink w:history="1" r:id="rIdkkvhgljq73vdsgcetvc-r">
+      <w:hyperlink w:history="1" r:id="rIdvmqpaunzuyiy9v0kjwcpr">
         <w:r>
           <w:rPr>
             <w:sz w:val="18"/>
@@ -15009,7 +15009,7 @@
         </w:numPr>
         <w:spacing w:after="60"/>
       </w:pPr>
-      <w:hyperlink w:history="1" r:id="rIdtmtv6ddpdcbamdxl7lq6r">
+      <w:hyperlink w:history="1" r:id="rIdcjdhz3nr0juobjkm3qtbw">
         <w:r>
           <w:rPr>
             <w:sz w:val="18"/>
@@ -15037,7 +15037,7 @@
         </w:numPr>
         <w:spacing w:after="60"/>
       </w:pPr>
-      <w:hyperlink w:history="1" r:id="rIdybumfjwexnkjktziv3pry">
+      <w:hyperlink w:history="1" r:id="rIdqjkqzaapz-jgzpagn7kqc">
         <w:r>
           <w:rPr>
             <w:sz w:val="18"/>
@@ -15065,7 +15065,7 @@
         </w:numPr>
         <w:spacing w:after="60"/>
       </w:pPr>
-      <w:hyperlink w:history="1" r:id="rIdhyisa32iy-flp2cgrrxur">
+      <w:hyperlink w:history="1" r:id="rId9uxe8xf5njipr5xyraorp">
         <w:r>
           <w:rPr>
             <w:sz w:val="18"/>
@@ -15093,7 +15093,7 @@
         </w:numPr>
         <w:spacing w:after="60"/>
       </w:pPr>
-      <w:hyperlink w:history="1" r:id="rIdv2n9f58guwfjyar2ook-l">
+      <w:hyperlink w:history="1" r:id="rIdf1ktfk_fi6xgx3t4tbi3u">
         <w:r>
           <w:rPr>
             <w:sz w:val="18"/>
@@ -15121,7 +15121,7 @@
         </w:numPr>
         <w:spacing w:after="60"/>
       </w:pPr>
-      <w:hyperlink w:history="1" r:id="rIdifjvsslj8cfxootjs7aek">
+      <w:hyperlink w:history="1" r:id="rIdczbxtcr5njk7qfudma29n">
         <w:r>
           <w:rPr>
             <w:sz w:val="18"/>
@@ -15149,7 +15149,7 @@
         </w:numPr>
         <w:spacing w:after="60"/>
       </w:pPr>
-      <w:hyperlink w:history="1" r:id="rId64zijedbkyynn77bq_hyq">
+      <w:hyperlink w:history="1" r:id="rIdawjosmmtklqnesqbozyqy">
         <w:r>
           <w:rPr>
             <w:sz w:val="18"/>
@@ -15177,7 +15177,7 @@
         </w:numPr>
         <w:spacing w:after="60"/>
       </w:pPr>
-      <w:hyperlink w:history="1" r:id="rIdelizjvf3uod5zaz3h52fg">
+      <w:hyperlink w:history="1" r:id="rIdpfoshji3a8y0bcf4iyenc">
         <w:r>
           <w:rPr>
             <w:sz w:val="18"/>
@@ -15205,7 +15205,7 @@
         </w:numPr>
         <w:spacing w:after="60"/>
       </w:pPr>
-      <w:hyperlink w:history="1" r:id="rIdar5b1ljqzdcbyuaaiykwn">
+      <w:hyperlink w:history="1" r:id="rIdrcirila4eqzxp4llpum1p">
         <w:r>
           <w:rPr>
             <w:sz w:val="18"/>

</xml_diff>

<commit_message>
fix: Nuremberg guide - DB Museum photo shows the museum building
Co-Authored-By: Claude Opus 5.5 <noreply@anthropic.com>
Claude-Session: https://claude.ai/code/session_01KbRqmNBFKCFFpD46r7T4m7
</commit_message>
<xml_diff>
--- a/new/guides/nuremberg/Nuremberg_Guide.docx
+++ b/new/guides/nuremberg/Nuremberg_Guide.docx
@@ -711,7 +711,7 @@
             </w:r>
           </w:p>
           <w:p>
-            <w:hyperlink w:history="1" r:id="rId2yob2auu6otgsc09qo4qq">
+            <w:hyperlink w:history="1" r:id="rIdmtqolny0ofkgktykp1qae">
               <w:r>
                 <w:rPr>
                   <w:rStyle w:val="Hyperlink"/>
@@ -819,7 +819,7 @@
       </w:r>
     </w:p>
     <w:p>
-      <w:hyperlink w:history="1" r:id="rIds7jqonnrtvajuoqsxci47">
+      <w:hyperlink w:history="1" r:id="rIdlsxtlfi1-rxogksy-rpwn">
         <w:r>
           <w:rPr>
             <w:rStyle w:val="Hyperlink"/>
@@ -840,7 +840,7 @@
         </w:rPr>
         <w:t xml:space="preserve">Via </w:t>
       </w:r>
-      <w:hyperlink w:history="1" r:id="rIdoalhcnhnojkofrkxxnxri">
+      <w:hyperlink w:history="1" r:id="rIdtolgtfpe4m9yugoyomjav">
         <w:r>
           <w:rPr>
             <w:color w:val="EA2E00"/>
@@ -858,7 +858,7 @@
         </w:rPr>
         <w:t xml:space="preserve">, </w:t>
       </w:r>
-      <w:hyperlink w:history="1" r:id="rId3smtemkpjcaixxqzmvisq">
+      <w:hyperlink w:history="1" r:id="rIdmwssnwxcq2nvpa_-a3pqv">
         <w:r>
           <w:rPr>
             <w:color w:val="EA2E00"/>
@@ -876,7 +876,7 @@
         </w:rPr>
         <w:t xml:space="preserve">, </w:t>
       </w:r>
-      <w:hyperlink w:history="1" r:id="rIdzoojvnoarbmubgxnerfnv">
+      <w:hyperlink w:history="1" r:id="rIdwyjfzjmdngpegls0l3jw4">
         <w:r>
           <w:rPr>
             <w:color w:val="EA2E00"/>
@@ -894,7 +894,7 @@
         </w:rPr>
         <w:t xml:space="preserve">, </w:t>
       </w:r>
-      <w:hyperlink w:history="1" r:id="rIdci0uawacexfcdpj2mi1jd">
+      <w:hyperlink w:history="1" r:id="rIdwp4tgadm2iw9vbfmubffr">
         <w:r>
           <w:rPr>
             <w:color w:val="EA2E00"/>
@@ -912,7 +912,7 @@
         </w:rPr>
         <w:t xml:space="preserve">, </w:t>
       </w:r>
-      <w:hyperlink w:history="1" r:id="rIdtexgecwm07t1gjlglwmhs">
+      <w:hyperlink w:history="1" r:id="rIdje-zsfzy49thcy9u6otds">
         <w:r>
           <w:rPr>
             <w:color w:val="EA2E00"/>
@@ -930,7 +930,7 @@
         </w:rPr>
         <w:t xml:space="preserve">, </w:t>
       </w:r>
-      <w:hyperlink w:history="1" r:id="rIdnxpisilvxjcom8k0f--rh">
+      <w:hyperlink w:history="1" r:id="rIdqf2g4dlsbuvtn3r813rnw">
         <w:r>
           <w:rPr>
             <w:color w:val="EA2E00"/>
@@ -948,7 +948,7 @@
         </w:rPr>
         <w:t xml:space="preserve">, </w:t>
       </w:r>
-      <w:hyperlink w:history="1" r:id="rIdrsmbi43wqb3vnt8bv_52a">
+      <w:hyperlink w:history="1" r:id="rIdfydnsjvmu8ffwk744c2_x">
         <w:r>
           <w:rPr>
             <w:color w:val="EA2E00"/>
@@ -966,7 +966,7 @@
         </w:rPr>
         <w:t xml:space="preserve">, </w:t>
       </w:r>
-      <w:hyperlink w:history="1" r:id="rIdp8vjeptuckmryddarwtxg">
+      <w:hyperlink w:history="1" r:id="rIdofxqjeysieeysdgjutolm">
         <w:r>
           <w:rPr>
             <w:color w:val="EA2E00"/>
@@ -984,7 +984,7 @@
         </w:rPr>
         <w:t xml:space="preserve">, </w:t>
       </w:r>
-      <w:hyperlink w:history="1" r:id="rIdcxjkog6rbiti9i5wmenea">
+      <w:hyperlink w:history="1" r:id="rId7tzgxbzolr-55x0x2veck">
         <w:r>
           <w:rPr>
             <w:color w:val="EA2E00"/>
@@ -1002,7 +1002,7 @@
         </w:rPr>
         <w:t xml:space="preserve">, </w:t>
       </w:r>
-      <w:hyperlink w:history="1" r:id="rIdv7xqgs2vlbhul1rcxxkhw">
+      <w:hyperlink w:history="1" r:id="rId3dtspxpwcvqj_zhl-rbnw">
         <w:r>
           <w:rPr>
             <w:color w:val="EA2E00"/>
@@ -1064,7 +1064,7 @@
       </w:r>
     </w:p>
     <w:p>
-      <w:hyperlink w:history="1" r:id="rId5-wp0cridpthuemhu1lsw">
+      <w:hyperlink w:history="1" r:id="rIdazscd-gwazdyilnq5v6yj">
         <w:r>
           <w:rPr>
             <w:rStyle w:val="Hyperlink"/>
@@ -1085,7 +1085,7 @@
         </w:rPr>
         <w:t xml:space="preserve">Via </w:t>
       </w:r>
-      <w:hyperlink w:history="1" r:id="rIddpda4rj1jifstuattyic-">
+      <w:hyperlink w:history="1" r:id="rIdogvriey68dp1hotqvt3bl">
         <w:r>
           <w:rPr>
             <w:color w:val="EA2E00"/>
@@ -1103,7 +1103,7 @@
         </w:rPr>
         <w:t xml:space="preserve">, </w:t>
       </w:r>
-      <w:hyperlink w:history="1" r:id="rIddiya2ihawpq-vnappzfpj">
+      <w:hyperlink w:history="1" r:id="rIdygxoolmyhn84aaun0dptu">
         <w:r>
           <w:rPr>
             <w:color w:val="EA2E00"/>
@@ -1121,7 +1121,7 @@
         </w:rPr>
         <w:t xml:space="preserve">, </w:t>
       </w:r>
-      <w:hyperlink w:history="1" r:id="rId6tuu85l6rth3k0wjusknp">
+      <w:hyperlink w:history="1" r:id="rIdh7ykerlg2usl-o6kkd1lm">
         <w:r>
           <w:rPr>
             <w:color w:val="EA2E00"/>
@@ -1139,7 +1139,7 @@
         </w:rPr>
         <w:t xml:space="preserve">, </w:t>
       </w:r>
-      <w:hyperlink w:history="1" r:id="rId09zhyafgs4aajy4_r-9qk">
+      <w:hyperlink w:history="1" r:id="rId2n3nwky93caggf7c3dqip">
         <w:r>
           <w:rPr>
             <w:color w:val="EA2E00"/>
@@ -1157,7 +1157,7 @@
         </w:rPr>
         <w:t xml:space="preserve">, </w:t>
       </w:r>
-      <w:hyperlink w:history="1" r:id="rIdto2wykyqxldixulfij7xq">
+      <w:hyperlink w:history="1" r:id="rIdhy-1cnu4ora7sgqiwhhi_">
         <w:r>
           <w:rPr>
             <w:color w:val="EA2E00"/>
@@ -1175,7 +1175,7 @@
         </w:rPr>
         <w:t xml:space="preserve">, </w:t>
       </w:r>
-      <w:hyperlink w:history="1" r:id="rIdxiihh-puqf8ztr__kko4_">
+      <w:hyperlink w:history="1" r:id="rIdebz04mb17blkh2dr2dqps">
         <w:r>
           <w:rPr>
             <w:color w:val="EA2E00"/>
@@ -1193,7 +1193,7 @@
         </w:rPr>
         <w:t xml:space="preserve">, </w:t>
       </w:r>
-      <w:hyperlink w:history="1" r:id="rIdqtvx0kcj8bpaub6vrwcdd">
+      <w:hyperlink w:history="1" r:id="rId_8szutlw0wehb3g3i5cij">
         <w:r>
           <w:rPr>
             <w:color w:val="EA2E00"/>
@@ -1211,7 +1211,7 @@
         </w:rPr>
         <w:t xml:space="preserve">, </w:t>
       </w:r>
-      <w:hyperlink w:history="1" r:id="rIdocibu2mhjmjckh-ptijuq">
+      <w:hyperlink w:history="1" r:id="rIdsdvgsx3hysw2ajjwowlgx">
         <w:r>
           <w:rPr>
             <w:color w:val="EA2E00"/>
@@ -1273,7 +1273,7 @@
       </w:r>
     </w:p>
     <w:p>
-      <w:hyperlink w:history="1" r:id="rIdffroqwsvkbsq0z4nbnmuq">
+      <w:hyperlink w:history="1" r:id="rIdmjks0sdbirt2_07y4slcs">
         <w:r>
           <w:rPr>
             <w:rStyle w:val="Hyperlink"/>
@@ -1294,7 +1294,7 @@
         </w:rPr>
         <w:t xml:space="preserve">Via </w:t>
       </w:r>
-      <w:hyperlink w:history="1" r:id="rIdhllym1h9qpzj_h8gbyk3e">
+      <w:hyperlink w:history="1" r:id="rIdumdipdfdykryj_n6q5ljl">
         <w:r>
           <w:rPr>
             <w:color w:val="EA2E00"/>
@@ -1312,7 +1312,7 @@
         </w:rPr>
         <w:t xml:space="preserve">, </w:t>
       </w:r>
-      <w:hyperlink w:history="1" r:id="rId9ze0ait3o2an1nntubj4d">
+      <w:hyperlink w:history="1" r:id="rIdiaqb4dweyqvvxo2dhuhc5">
         <w:r>
           <w:rPr>
             <w:color w:val="EA2E00"/>
@@ -1330,7 +1330,7 @@
         </w:rPr>
         <w:t xml:space="preserve">, </w:t>
       </w:r>
-      <w:hyperlink w:history="1" r:id="rIdho-soh8y3uyscg-lc0a-u">
+      <w:hyperlink w:history="1" r:id="rIdgf95x-ueu2qud9tzncfly">
         <w:r>
           <w:rPr>
             <w:color w:val="EA2E00"/>
@@ -1348,7 +1348,7 @@
         </w:rPr>
         <w:t xml:space="preserve">, </w:t>
       </w:r>
-      <w:hyperlink w:history="1" r:id="rIdo9l6423m8vs98ccmmhtva">
+      <w:hyperlink w:history="1" r:id="rIdghnumuwiasyl6plyzksrg">
         <w:r>
           <w:rPr>
             <w:color w:val="EA2E00"/>
@@ -1366,7 +1366,7 @@
         </w:rPr>
         <w:t xml:space="preserve">, </w:t>
       </w:r>
-      <w:hyperlink w:history="1" r:id="rIdlox3redmlxqygxbl6iyvm">
+      <w:hyperlink w:history="1" r:id="rId7kymtw_m3el9beiden0ed">
         <w:r>
           <w:rPr>
             <w:color w:val="EA2E00"/>
@@ -1384,7 +1384,7 @@
         </w:rPr>
         <w:t xml:space="preserve">, </w:t>
       </w:r>
-      <w:hyperlink w:history="1" r:id="rIdnr9slid1hukpd_g6hrad-">
+      <w:hyperlink w:history="1" r:id="rIdvgmfcmogtjhz7exiulmrq">
         <w:r>
           <w:rPr>
             <w:color w:val="EA2E00"/>
@@ -1446,7 +1446,7 @@
       </w:r>
     </w:p>
     <w:p>
-      <w:hyperlink w:history="1" r:id="rIdnzrxdefs8ykxyzdjpc4jy">
+      <w:hyperlink w:history="1" r:id="rId1u7zrg35i4i0fgoomo4wp">
         <w:r>
           <w:rPr>
             <w:rStyle w:val="Hyperlink"/>
@@ -1467,7 +1467,7 @@
         </w:rPr>
         <w:t xml:space="preserve">Via </w:t>
       </w:r>
-      <w:hyperlink w:history="1" r:id="rIdd2ka3zr2vs27mixthlzim">
+      <w:hyperlink w:history="1" r:id="rIdyia9qf_rr3qi6cyw25umq">
         <w:r>
           <w:rPr>
             <w:color w:val="EA2E00"/>
@@ -1485,7 +1485,7 @@
         </w:rPr>
         <w:t xml:space="preserve">, </w:t>
       </w:r>
-      <w:hyperlink w:history="1" r:id="rIdasgb_xsji_gktgj5fsm5u">
+      <w:hyperlink w:history="1" r:id="rIdadtzesd1wa4tbuuphgfbb">
         <w:r>
           <w:rPr>
             <w:color w:val="EA2E00"/>
@@ -1503,7 +1503,7 @@
         </w:rPr>
         <w:t xml:space="preserve">, </w:t>
       </w:r>
-      <w:hyperlink w:history="1" r:id="rIdhmnbu4cotr4hargtc5ot9">
+      <w:hyperlink w:history="1" r:id="rIdbtrysg-rdnzhphr_oljj8">
         <w:r>
           <w:rPr>
             <w:color w:val="EA2E00"/>
@@ -1565,7 +1565,7 @@
       </w:r>
     </w:p>
     <w:p>
-      <w:hyperlink w:history="1" r:id="rIdze7s1g0fjb1wcgrlffo2g">
+      <w:hyperlink w:history="1" r:id="rId1ra6hyqphwwf4atorjgib">
         <w:r>
           <w:rPr>
             <w:rStyle w:val="Hyperlink"/>
@@ -1586,7 +1586,7 @@
         </w:rPr>
         <w:t xml:space="preserve">Via </w:t>
       </w:r>
-      <w:hyperlink w:history="1" r:id="rIdjqcdwgi9bffhclubo_x3r">
+      <w:hyperlink w:history="1" r:id="rIdyvp_b8het0k4n1isbc_ow">
         <w:r>
           <w:rPr>
             <w:color w:val="EA2E00"/>
@@ -1604,7 +1604,7 @@
         </w:rPr>
         <w:t xml:space="preserve">, </w:t>
       </w:r>
-      <w:hyperlink w:history="1" r:id="rIdumocq0x-r6z1qcrvi61ej">
+      <w:hyperlink w:history="1" r:id="rIdmbrkjoqwc3syhxtqqethd">
         <w:r>
           <w:rPr>
             <w:color w:val="EA2E00"/>
@@ -1622,7 +1622,7 @@
         </w:rPr>
         <w:t xml:space="preserve">, </w:t>
       </w:r>
-      <w:hyperlink w:history="1" r:id="rIdyhbce8upzw9jkazqkce27">
+      <w:hyperlink w:history="1" r:id="rIdxup1ps7hjoof14w_5g1nn">
         <w:r>
           <w:rPr>
             <w:color w:val="EA2E00"/>
@@ -1640,7 +1640,7 @@
         </w:rPr>
         <w:t xml:space="preserve">, </w:t>
       </w:r>
-      <w:hyperlink w:history="1" r:id="rIdsmcffaiqvjozvb5ik7d4l">
+      <w:hyperlink w:history="1" r:id="rIdl2jpuwgovqo8anut6x_gb">
         <w:r>
           <w:rPr>
             <w:color w:val="EA2E00"/>
@@ -1658,7 +1658,7 @@
         </w:rPr>
         <w:t xml:space="preserve">, </w:t>
       </w:r>
-      <w:hyperlink w:history="1" r:id="rIdkwfjisyllid1mpeozn_ed">
+      <w:hyperlink w:history="1" r:id="rIdihl5bdk6fwvrgmopuk8na">
         <w:r>
           <w:rPr>
             <w:color w:val="EA2E00"/>
@@ -1676,7 +1676,7 @@
         </w:rPr>
         <w:t xml:space="preserve">, </w:t>
       </w:r>
-      <w:hyperlink w:history="1" r:id="rIdrtknkftessjr2wrmdpqwj">
+      <w:hyperlink w:history="1" r:id="rIdbubutdefyv478fdcdxc3a">
         <w:r>
           <w:rPr>
             <w:color w:val="EA2E00"/>
@@ -1738,7 +1738,7 @@
       </w:r>
     </w:p>
     <w:p>
-      <w:hyperlink w:history="1" r:id="rId7qytjpnvs0_yidnhyt7ci">
+      <w:hyperlink w:history="1" r:id="rIdlkpe0m0zflowimvxvtxs2">
         <w:r>
           <w:rPr>
             <w:rStyle w:val="Hyperlink"/>
@@ -1759,7 +1759,7 @@
         </w:rPr>
         <w:t xml:space="preserve">Via </w:t>
       </w:r>
-      <w:hyperlink w:history="1" r:id="rIdmhixosfanaiu50e5aey7z">
+      <w:hyperlink w:history="1" r:id="rIdo9jxr58j77u5ppz-ugutr">
         <w:r>
           <w:rPr>
             <w:color w:val="EA2E00"/>
@@ -1777,7 +1777,7 @@
         </w:rPr>
         <w:t xml:space="preserve">, </w:t>
       </w:r>
-      <w:hyperlink w:history="1" r:id="rIdbf67yu-ryss1grb7ydz2f">
+      <w:hyperlink w:history="1" r:id="rIdt3fqoxuyb95kvcu2xsqwn">
         <w:r>
           <w:rPr>
             <w:color w:val="EA2E00"/>
@@ -1795,7 +1795,7 @@
         </w:rPr>
         <w:t xml:space="preserve">, </w:t>
       </w:r>
-      <w:hyperlink w:history="1" r:id="rIdp4mygpugl-dspm24z4xra">
+      <w:hyperlink w:history="1" r:id="rId_ppcji3d8r78pgwywqgps">
         <w:r>
           <w:rPr>
             <w:color w:val="EA2E00"/>
@@ -1865,7 +1865,7 @@
       </w:r>
     </w:p>
     <w:p>
-      <w:hyperlink w:history="1" r:id="rIdlv6z_5zg3lxqe41e4u20w">
+      <w:hyperlink w:history="1" r:id="rIdo-dej1f5m_lh86p9nrz3q">
         <w:r>
           <w:rPr>
             <w:rStyle w:val="Hyperlink"/>
@@ -1886,7 +1886,7 @@
         </w:rPr>
         <w:t xml:space="preserve">Via </w:t>
       </w:r>
-      <w:hyperlink w:history="1" r:id="rIdllwchgxumvar_4uqtw3n7">
+      <w:hyperlink w:history="1" r:id="rIdvznucdilfnpridgsw8jvc">
         <w:r>
           <w:rPr>
             <w:color w:val="EA2E00"/>
@@ -1904,7 +1904,7 @@
         </w:rPr>
         <w:t xml:space="preserve">, </w:t>
       </w:r>
-      <w:hyperlink w:history="1" r:id="rIduig_vg3nbxecl7vmcborn">
+      <w:hyperlink w:history="1" r:id="rIdokhxzzn177rh7vujqmwx1">
         <w:r>
           <w:rPr>
             <w:color w:val="EA2E00"/>
@@ -1922,7 +1922,7 @@
         </w:rPr>
         <w:t xml:space="preserve">, </w:t>
       </w:r>
-      <w:hyperlink w:history="1" r:id="rIdwnjtsbtaknymofnvxxtzg">
+      <w:hyperlink w:history="1" r:id="rId49yt2imq3v0dw40trp0jb">
         <w:r>
           <w:rPr>
             <w:color w:val="EA2E00"/>
@@ -1940,7 +1940,7 @@
         </w:rPr>
         <w:t xml:space="preserve">, </w:t>
       </w:r>
-      <w:hyperlink w:history="1" r:id="rIdasxz7tkms6azrdulxcngu">
+      <w:hyperlink w:history="1" r:id="rIdtltfekxzm6vy_scqgyoc-">
         <w:r>
           <w:rPr>
             <w:color w:val="EA2E00"/>
@@ -1958,7 +1958,7 @@
         </w:rPr>
         <w:t xml:space="preserve">, </w:t>
       </w:r>
-      <w:hyperlink w:history="1" r:id="rIdygiiedoh8tun1x-c7zkj2">
+      <w:hyperlink w:history="1" r:id="rId_xfudn8pcjb0hxjwsvg2c">
         <w:r>
           <w:rPr>
             <w:color w:val="EA2E00"/>
@@ -2020,7 +2020,7 @@
       </w:r>
     </w:p>
     <w:p>
-      <w:hyperlink w:history="1" r:id="rIdo1mc0vrhg854ps8qyqrfs">
+      <w:hyperlink w:history="1" r:id="rIdihiebkf78m2581jslqnlw">
         <w:r>
           <w:rPr>
             <w:rStyle w:val="Hyperlink"/>
@@ -2041,7 +2041,7 @@
         </w:rPr>
         <w:t xml:space="preserve">Via </w:t>
       </w:r>
-      <w:hyperlink w:history="1" r:id="rId47dz9k_353mynnw-bj6zg">
+      <w:hyperlink w:history="1" r:id="rIdpdrsg4afabmxli0vurtsf">
         <w:r>
           <w:rPr>
             <w:color w:val="EA2E00"/>
@@ -2059,7 +2059,7 @@
         </w:rPr>
         <w:t xml:space="preserve">, </w:t>
       </w:r>
-      <w:hyperlink w:history="1" r:id="rIdaglwer_kk4hg1r88cdnaz">
+      <w:hyperlink w:history="1" r:id="rIderajcljj8y5mwnnutl0ua">
         <w:r>
           <w:rPr>
             <w:color w:val="EA2E00"/>
@@ -2077,7 +2077,7 @@
         </w:rPr>
         <w:t xml:space="preserve">, </w:t>
       </w:r>
-      <w:hyperlink w:history="1" r:id="rIdgfzu3pymklu-mk7gw4qw9">
+      <w:hyperlink w:history="1" r:id="rId5xjpsrnjgtszyfdmyjipp">
         <w:r>
           <w:rPr>
             <w:color w:val="EA2E00"/>
@@ -2095,7 +2095,7 @@
         </w:rPr>
         <w:t xml:space="preserve">, </w:t>
       </w:r>
-      <w:hyperlink w:history="1" r:id="rIdgbcalxieeomm5mjjk_22i">
+      <w:hyperlink w:history="1" r:id="rIdfyhoxn2k4yh1dq_i6s2wx">
         <w:r>
           <w:rPr>
             <w:color w:val="EA2E00"/>
@@ -2113,7 +2113,7 @@
         </w:rPr>
         <w:t xml:space="preserve">, </w:t>
       </w:r>
-      <w:hyperlink w:history="1" r:id="rId-245afriqiodqfh_uhtd0">
+      <w:hyperlink w:history="1" r:id="rId_xrp2gh_cj5zvmgxjr_vr">
         <w:r>
           <w:rPr>
             <w:color w:val="EA2E00"/>
@@ -2186,7 +2186,7 @@
         </w:rPr>
         <w:t xml:space="preserve">Via </w:t>
       </w:r>
-      <w:hyperlink w:history="1" r:id="rIdj1crg6kvpotmr2zmg0dc4">
+      <w:hyperlink w:history="1" r:id="rId1mw5grfm_linqsreyf0cj">
         <w:r>
           <w:rPr>
             <w:color w:val="EA2E00"/>
@@ -2204,7 +2204,7 @@
         </w:rPr>
         <w:t xml:space="preserve">, </w:t>
       </w:r>
-      <w:hyperlink w:history="1" r:id="rId-hssan6vheb2gmbzh8h6r">
+      <w:hyperlink w:history="1" r:id="rId-cmvn99gtrj5nf-vx_seh">
         <w:r>
           <w:rPr>
             <w:color w:val="EA2E00"/>
@@ -2222,7 +2222,7 @@
         </w:rPr>
         <w:t xml:space="preserve">, </w:t>
       </w:r>
-      <w:hyperlink w:history="1" r:id="rIdqak_6ipkqutzm8_s3jd62">
+      <w:hyperlink w:history="1" r:id="rIdtqggsju2rt_6kgk5u0kjg">
         <w:r>
           <w:rPr>
             <w:color w:val="EA2E00"/>
@@ -2240,7 +2240,7 @@
         </w:rPr>
         <w:t xml:space="preserve">, </w:t>
       </w:r>
-      <w:hyperlink w:history="1" r:id="rIdnmj_ywplsnlavcux6by0c">
+      <w:hyperlink w:history="1" r:id="rIdkf2vkfnltitpn1xaipik6">
         <w:r>
           <w:rPr>
             <w:color w:val="EA2E00"/>
@@ -2258,7 +2258,7 @@
         </w:rPr>
         <w:t xml:space="preserve">, </w:t>
       </w:r>
-      <w:hyperlink w:history="1" r:id="rId6hmdklsnlt5w2pi-0cqii">
+      <w:hyperlink w:history="1" r:id="rIdgmhvgvf4xzi6y9drdyoj6">
         <w:r>
           <w:rPr>
             <w:color w:val="EA2E00"/>
@@ -2276,7 +2276,7 @@
         </w:rPr>
         <w:t xml:space="preserve">, </w:t>
       </w:r>
-      <w:hyperlink w:history="1" r:id="rIdcnpeynuo8jigjgpm4cp38">
+      <w:hyperlink w:history="1" r:id="rIdnj4ofkgzv4nspvr48e-r1">
         <w:r>
           <w:rPr>
             <w:color w:val="EA2E00"/>
@@ -2294,7 +2294,7 @@
         </w:rPr>
         <w:t xml:space="preserve">, </w:t>
       </w:r>
-      <w:hyperlink w:history="1" r:id="rIdoapcmazjz6rw4d78uktjn">
+      <w:hyperlink w:history="1" r:id="rIdwuoq3bhxosgdpzc4xstf9">
         <w:r>
           <w:rPr>
             <w:color w:val="EA2E00"/>
@@ -2367,7 +2367,7 @@
         </w:rPr>
         <w:t xml:space="preserve">Via </w:t>
       </w:r>
-      <w:hyperlink w:history="1" r:id="rId8gf0tospjyj7jcegq2n9t">
+      <w:hyperlink w:history="1" r:id="rId8j8llikszzazbyrsgf91t">
         <w:r>
           <w:rPr>
             <w:color w:val="EA2E00"/>
@@ -2385,7 +2385,7 @@
         </w:rPr>
         <w:t xml:space="preserve">, </w:t>
       </w:r>
-      <w:hyperlink w:history="1" r:id="rIdk0kr5nuwyebmhvjyykqpz">
+      <w:hyperlink w:history="1" r:id="rIded_ytjep0mycccf7hm5yz">
         <w:r>
           <w:rPr>
             <w:color w:val="EA2E00"/>
@@ -2403,7 +2403,7 @@
         </w:rPr>
         <w:t xml:space="preserve">, </w:t>
       </w:r>
-      <w:hyperlink w:history="1" r:id="rIdarjt9ybiulwzhcxkxoi3f">
+      <w:hyperlink w:history="1" r:id="rIdu99qsjvdmjgyyvlmpkryb">
         <w:r>
           <w:rPr>
             <w:color w:val="EA2E00"/>
@@ -2421,7 +2421,7 @@
         </w:rPr>
         <w:t xml:space="preserve">, </w:t>
       </w:r>
-      <w:hyperlink w:history="1" r:id="rIdgpzjbcl07cgeuscwhbf98">
+      <w:hyperlink w:history="1" r:id="rIdjjiskuognowkrkiq4rnsi">
         <w:r>
           <w:rPr>
             <w:color w:val="EA2E00"/>
@@ -2439,7 +2439,7 @@
         </w:rPr>
         <w:t xml:space="preserve">, </w:t>
       </w:r>
-      <w:hyperlink w:history="1" r:id="rIdyswtfomkqd6vzsveqqzg8">
+      <w:hyperlink w:history="1" r:id="rIdywvvp_vfswwzu18xqe308">
         <w:r>
           <w:rPr>
             <w:color w:val="EA2E00"/>
@@ -2457,7 +2457,7 @@
         </w:rPr>
         <w:t xml:space="preserve">, </w:t>
       </w:r>
-      <w:hyperlink w:history="1" r:id="rIdm7dpszlpv1isaiynqor2x">
+      <w:hyperlink w:history="1" r:id="rId2cubrz2z6s9tpodcgvoga">
         <w:r>
           <w:rPr>
             <w:color w:val="EA2E00"/>
@@ -2475,7 +2475,7 @@
         </w:rPr>
         <w:t xml:space="preserve">, </w:t>
       </w:r>
-      <w:hyperlink w:history="1" r:id="rIdoy7lmxipbzx0ayu0dy2mb">
+      <w:hyperlink w:history="1" r:id="rIdxqbgqobit7yjj6imcv4es">
         <w:r>
           <w:rPr>
             <w:color w:val="EA2E00"/>
@@ -2493,7 +2493,7 @@
         </w:rPr>
         <w:t xml:space="preserve">, </w:t>
       </w:r>
-      <w:hyperlink w:history="1" r:id="rIdw4fljit1whivcaitzozwx">
+      <w:hyperlink w:history="1" r:id="rIdndr0lq8jw-1ygsf8e-0pp">
         <w:r>
           <w:rPr>
             <w:color w:val="EA2E00"/>
@@ -2555,7 +2555,7 @@
       </w:r>
     </w:p>
     <w:p>
-      <w:hyperlink w:history="1" r:id="rIdjjicdq2n1giqkekwmm3t0">
+      <w:hyperlink w:history="1" r:id="rIdsakgkboiixft8ky3y5vqn">
         <w:r>
           <w:rPr>
             <w:rStyle w:val="Hyperlink"/>
@@ -2576,7 +2576,7 @@
         </w:rPr>
         <w:t xml:space="preserve">Via </w:t>
       </w:r>
-      <w:hyperlink w:history="1" r:id="rIdra8k7ytsgtopuqztuxuph">
+      <w:hyperlink w:history="1" r:id="rIdd_dtk_x55zxpvanfjwb2h">
         <w:r>
           <w:rPr>
             <w:color w:val="EA2E00"/>
@@ -2594,7 +2594,7 @@
         </w:rPr>
         <w:t xml:space="preserve">, </w:t>
       </w:r>
-      <w:hyperlink w:history="1" r:id="rIdpwjebzfclbp2m3-hhkfm6">
+      <w:hyperlink w:history="1" r:id="rIdpbzunvmhu2hanvcasdjn_">
         <w:r>
           <w:rPr>
             <w:color w:val="EA2E00"/>
@@ -2612,7 +2612,7 @@
         </w:rPr>
         <w:t xml:space="preserve">, </w:t>
       </w:r>
-      <w:hyperlink w:history="1" r:id="rIdmmvpdzopxbat5nzlmxkp2">
+      <w:hyperlink w:history="1" r:id="rIdyji0x3m0e6z4vqu1mzcwc">
         <w:r>
           <w:rPr>
             <w:color w:val="EA2E00"/>
@@ -2685,7 +2685,7 @@
         </w:rPr>
         <w:t xml:space="preserve">Via </w:t>
       </w:r>
-      <w:hyperlink w:history="1" r:id="rIddfwowfnoww1px11qqm7fv">
+      <w:hyperlink w:history="1" r:id="rIdjvlv8yqutud2d_sdfjdc8">
         <w:r>
           <w:rPr>
             <w:color w:val="EA2E00"/>
@@ -2703,7 +2703,7 @@
         </w:rPr>
         <w:t xml:space="preserve">, </w:t>
       </w:r>
-      <w:hyperlink w:history="1" r:id="rIdynyvzk8njwllpirflznzy">
+      <w:hyperlink w:history="1" r:id="rIdshrjs1_1v18e5gwqkja3t">
         <w:r>
           <w:rPr>
             <w:color w:val="EA2E00"/>
@@ -2776,7 +2776,7 @@
         </w:rPr>
         <w:t xml:space="preserve">Via </w:t>
       </w:r>
-      <w:hyperlink w:history="1" r:id="rIdwskymteihrwqdsboui2pw">
+      <w:hyperlink w:history="1" r:id="rIdhn_1gglmy50i2pk0gejqk">
         <w:r>
           <w:rPr>
             <w:color w:val="EA2E00"/>
@@ -2794,7 +2794,7 @@
         </w:rPr>
         <w:t xml:space="preserve">, </w:t>
       </w:r>
-      <w:hyperlink w:history="1" r:id="rIdu5_ifl3_0-dxha9wpbzj9">
+      <w:hyperlink w:history="1" r:id="rIdsmwuipamg7nwwkxx25nwc">
         <w:r>
           <w:rPr>
             <w:color w:val="EA2E00"/>
@@ -2812,7 +2812,7 @@
         </w:rPr>
         <w:t xml:space="preserve">, </w:t>
       </w:r>
-      <w:hyperlink w:history="1" r:id="rIdfbubasbp_kehdlzk5lsfh">
+      <w:hyperlink w:history="1" r:id="rIdztenwqgqii-46oo2zkvl-">
         <w:r>
           <w:rPr>
             <w:color w:val="EA2E00"/>
@@ -2830,7 +2830,7 @@
         </w:rPr>
         <w:t xml:space="preserve">, </w:t>
       </w:r>
-      <w:hyperlink w:history="1" r:id="rIdsj5q8e5m9ln2zejt_fbal">
+      <w:hyperlink w:history="1" r:id="rIddwpfbvb5umpoywd36yu_b">
         <w:r>
           <w:rPr>
             <w:color w:val="EA2E00"/>
@@ -2848,7 +2848,7 @@
         </w:rPr>
         <w:t xml:space="preserve">, </w:t>
       </w:r>
-      <w:hyperlink w:history="1" r:id="rIdgv7tt-alkfi61npmv9dzw">
+      <w:hyperlink w:history="1" r:id="rId-a7xojzcki0ctlgzhtm9i">
         <w:r>
           <w:rPr>
             <w:color w:val="EA2E00"/>
@@ -2899,7 +2899,7 @@
         </w:rPr>
         <w:t xml:space="preserve">Via </w:t>
       </w:r>
-      <w:hyperlink w:history="1" r:id="rId4d18fkyunli1h0fmcdmaz">
+      <w:hyperlink w:history="1" r:id="rId5fxced4keoyeffpj5gsuu">
         <w:r>
           <w:rPr>
             <w:color w:val="EA2E00"/>
@@ -2917,7 +2917,7 @@
         </w:rPr>
         <w:t xml:space="preserve">, </w:t>
       </w:r>
-      <w:hyperlink w:history="1" r:id="rIdh5paszh7wdumer1hxdw1i">
+      <w:hyperlink w:history="1" r:id="rId3wjyddvf_3ml8iazkbhyk">
         <w:r>
           <w:rPr>
             <w:color w:val="EA2E00"/>
@@ -2935,7 +2935,7 @@
         </w:rPr>
         <w:t xml:space="preserve">, </w:t>
       </w:r>
-      <w:hyperlink w:history="1" r:id="rIdsot08padr7o0-ud91bkd9">
+      <w:hyperlink w:history="1" r:id="rIdrgk3t_tckkkc4mv17ioli">
         <w:r>
           <w:rPr>
             <w:color w:val="EA2E00"/>
@@ -2953,7 +2953,7 @@
         </w:rPr>
         <w:t xml:space="preserve">, </w:t>
       </w:r>
-      <w:hyperlink w:history="1" r:id="rId00bcr2vojxnhfulu9dzzj">
+      <w:hyperlink w:history="1" r:id="rIdk_4ngixethpj_g2txxhnl">
         <w:r>
           <w:rPr>
             <w:color w:val="EA2E00"/>
@@ -2971,7 +2971,7 @@
         </w:rPr>
         <w:t xml:space="preserve">, </w:t>
       </w:r>
-      <w:hyperlink w:history="1" r:id="rIdxb9tvaoyfqwtvok7lzmus">
+      <w:hyperlink w:history="1" r:id="rIdbwotcdye2d2qpefkady4e">
         <w:r>
           <w:rPr>
             <w:color w:val="EA2E00"/>
@@ -3014,7 +3014,7 @@
         </w:rPr>
         <w:t xml:space="preserve">Via </w:t>
       </w:r>
-      <w:hyperlink w:history="1" r:id="rIdqa4vajw86p2atuvsqjgm8">
+      <w:hyperlink w:history="1" r:id="rIdyqtfxdpsaibpwxbfv_j8m">
         <w:r>
           <w:rPr>
             <w:color w:val="EA2E00"/>
@@ -3057,7 +3057,7 @@
         </w:rPr>
         <w:t xml:space="preserve">Via </w:t>
       </w:r>
-      <w:hyperlink w:history="1" r:id="rIdaj-b_k2g0yarwj5mcil8r">
+      <w:hyperlink w:history="1" r:id="rIdrzduh1lf_xuvnrohkj-mp">
         <w:r>
           <w:rPr>
             <w:color w:val="EA2E00"/>
@@ -3075,7 +3075,7 @@
         </w:rPr>
         <w:t xml:space="preserve">, </w:t>
       </w:r>
-      <w:hyperlink w:history="1" r:id="rIdi7obfk4agnsua4ulwmpaa">
+      <w:hyperlink w:history="1" r:id="rIdlzhzi2gkgmvi-sjbj1hto">
         <w:r>
           <w:rPr>
             <w:color w:val="EA2E00"/>
@@ -3093,7 +3093,7 @@
         </w:rPr>
         <w:t xml:space="preserve">, </w:t>
       </w:r>
-      <w:hyperlink w:history="1" r:id="rIdepocs5lzegih6ie_pu863">
+      <w:hyperlink w:history="1" r:id="rId8-rocdnq-rtakf4ahbbl8">
         <w:r>
           <w:rPr>
             <w:color w:val="EA2E00"/>
@@ -3111,7 +3111,7 @@
         </w:rPr>
         <w:t xml:space="preserve">, </w:t>
       </w:r>
-      <w:hyperlink w:history="1" r:id="rIdiwgieepcp6wkcfl0harls">
+      <w:hyperlink w:history="1" r:id="rIdkntxcaikvgeacju-qecmp">
         <w:r>
           <w:rPr>
             <w:color w:val="EA2E00"/>
@@ -3129,7 +3129,7 @@
         </w:rPr>
         <w:t xml:space="preserve">, </w:t>
       </w:r>
-      <w:hyperlink w:history="1" r:id="rId9dudyd2qx2k-dbwnuuqcb">
+      <w:hyperlink w:history="1" r:id="rIdzgdp9oyqcoqf4yxy-t7zk">
         <w:r>
           <w:rPr>
             <w:color w:val="EA2E00"/>
@@ -3172,7 +3172,7 @@
         </w:rPr>
         <w:t xml:space="preserve">Via </w:t>
       </w:r>
-      <w:hyperlink w:history="1" r:id="rIdlroxzf2eqg_vveirmj92s">
+      <w:hyperlink w:history="1" r:id="rIdmuzjgvbcjtov8w3hkvu_z">
         <w:r>
           <w:rPr>
             <w:color w:val="EA2E00"/>
@@ -3190,7 +3190,7 @@
         </w:rPr>
         <w:t xml:space="preserve">, </w:t>
       </w:r>
-      <w:hyperlink w:history="1" r:id="rIdbbewxadcmhmo_3tn1h2b8">
+      <w:hyperlink w:history="1" r:id="rId8-nhnawzubjvzzvazimxs">
         <w:r>
           <w:rPr>
             <w:color w:val="EA2E00"/>
@@ -3208,7 +3208,7 @@
         </w:rPr>
         <w:t xml:space="preserve">, </w:t>
       </w:r>
-      <w:hyperlink w:history="1" r:id="rId0kibzzh2jkoki8yoay-oe">
+      <w:hyperlink w:history="1" r:id="rIdz-0fqlzoef8jua2mlpd5x">
         <w:r>
           <w:rPr>
             <w:color w:val="EA2E00"/>
@@ -3226,7 +3226,7 @@
         </w:rPr>
         <w:t xml:space="preserve">, </w:t>
       </w:r>
-      <w:hyperlink w:history="1" r:id="rIdjprewrie9idxztwpttf1i">
+      <w:hyperlink w:history="1" r:id="rIdy3vk-yixw3xcqiot1a_2j">
         <w:r>
           <w:rPr>
             <w:color w:val="EA2E00"/>
@@ -3244,7 +3244,7 @@
         </w:rPr>
         <w:t xml:space="preserve">, </w:t>
       </w:r>
-      <w:hyperlink w:history="1" r:id="rId8ovfmuowxlx3kqhlzmf0r">
+      <w:hyperlink w:history="1" r:id="rIdkugmuptpx4yd3heaihtl0">
         <w:r>
           <w:rPr>
             <w:color w:val="EA2E00"/>
@@ -3262,7 +3262,7 @@
         </w:rPr>
         <w:t xml:space="preserve">, </w:t>
       </w:r>
-      <w:hyperlink w:history="1" r:id="rIdn5bz0hltotlm1fswzktzs">
+      <w:hyperlink w:history="1" r:id="rIdesoym3ycuerfxfsyf2inu">
         <w:r>
           <w:rPr>
             <w:color w:val="EA2E00"/>
@@ -3280,7 +3280,7 @@
         </w:rPr>
         <w:t xml:space="preserve">, </w:t>
       </w:r>
-      <w:hyperlink w:history="1" r:id="rId-4e4qt2mdldimnnzyx-2r">
+      <w:hyperlink w:history="1" r:id="rIdpnjvbqqztetbilbqxxnxn">
         <w:r>
           <w:rPr>
             <w:color w:val="EA2E00"/>
@@ -3323,7 +3323,7 @@
         </w:rPr>
         <w:t xml:space="preserve">Via </w:t>
       </w:r>
-      <w:hyperlink w:history="1" r:id="rIdryn_zcey34juivrem83aa">
+      <w:hyperlink w:history="1" r:id="rIdlimzvgpsev_mexml4sv9l">
         <w:r>
           <w:rPr>
             <w:color w:val="EA2E00"/>
@@ -3366,7 +3366,7 @@
         </w:rPr>
         <w:t xml:space="preserve">Via </w:t>
       </w:r>
-      <w:hyperlink w:history="1" r:id="rIdmapjbwb92w0y7ftonjtvt">
+      <w:hyperlink w:history="1" r:id="rIdlqveq2nbqz8cqyontkf2y">
         <w:r>
           <w:rPr>
             <w:color w:val="EA2E00"/>
@@ -3448,7 +3448,7 @@
             </w:r>
           </w:p>
           <w:p>
-            <w:hyperlink w:history="1" r:id="rIdshbwh891fajp3tipgdx3y">
+            <w:hyperlink w:history="1" r:id="rIdcjykp5ecqbd3zlp5_c6rz">
               <w:r>
                 <w:rPr>
                   <w:rStyle w:val="Hyperlink"/>
@@ -3713,7 +3713,7 @@
         </w:rPr>
         <w:t xml:space="preserve">Via </w:t>
       </w:r>
-      <w:hyperlink w:history="1" r:id="rId36zjk7yipnrxs8ud2hqod">
+      <w:hyperlink w:history="1" r:id="rIdt2inhhmxsqjmgvknj0e0e">
         <w:r>
           <w:rPr>
             <w:color w:val="EA2E00"/>
@@ -3819,7 +3819,7 @@
         </w:rPr>
         <w:t xml:space="preserve">Via </w:t>
       </w:r>
-      <w:hyperlink w:history="1" r:id="rIdanrlg-mgika8fjhkfkixt">
+      <w:hyperlink w:history="1" r:id="rIdk8dxpfpwrr6g0hvd3unfi">
         <w:r>
           <w:rPr>
             <w:color w:val="EA2E00"/>
@@ -3837,7 +3837,7 @@
         </w:rPr>
         <w:t xml:space="preserve">, </w:t>
       </w:r>
-      <w:hyperlink w:history="1" r:id="rIdtf2emjlfk7homzkrt4k9_">
+      <w:hyperlink w:history="1" r:id="rIdl7gygektwkwkjx9m_6ol5">
         <w:r>
           <w:rPr>
             <w:color w:val="EA2E00"/>
@@ -3855,7 +3855,7 @@
         </w:rPr>
         <w:t xml:space="preserve">, </w:t>
       </w:r>
-      <w:hyperlink w:history="1" r:id="rIdmmy9r1s8y4r4hkp6z0rfi">
+      <w:hyperlink w:history="1" r:id="rIdc4uhim-vybyoriqhbmyoy">
         <w:r>
           <w:rPr>
             <w:color w:val="EA2E00"/>
@@ -3873,7 +3873,7 @@
         </w:rPr>
         <w:t xml:space="preserve">, </w:t>
       </w:r>
-      <w:hyperlink w:history="1" r:id="rIdyxrjsctmzcbsuapx8yjq0">
+      <w:hyperlink w:history="1" r:id="rIdar5iam5hsee2vfsba0vo8">
         <w:r>
           <w:rPr>
             <w:color w:val="EA2E00"/>
@@ -3891,7 +3891,7 @@
         </w:rPr>
         <w:t xml:space="preserve">, </w:t>
       </w:r>
-      <w:hyperlink w:history="1" r:id="rIdl-cfsz6tbuvtfc5xbq3p0">
+      <w:hyperlink w:history="1" r:id="rIdqvsacd2wa25tdd-cctafe">
         <w:r>
           <w:rPr>
             <w:color w:val="EA2E00"/>
@@ -3949,7 +3949,7 @@
         </w:rPr>
         <w:t xml:space="preserve">Via </w:t>
       </w:r>
-      <w:hyperlink w:history="1" r:id="rIdnehqbokdarxftxmesw6ck">
+      <w:hyperlink w:history="1" r:id="rId-4c4fbd7oq8dxy7jva-y4">
         <w:r>
           <w:rPr>
             <w:color w:val="EA2E00"/>
@@ -3967,7 +3967,7 @@
         </w:rPr>
         <w:t xml:space="preserve">, </w:t>
       </w:r>
-      <w:hyperlink w:history="1" r:id="rIdv-byd_5rmavjjv5eq5pew">
+      <w:hyperlink w:history="1" r:id="rId2kpr2j4vosgwziffb8ber">
         <w:r>
           <w:rPr>
             <w:color w:val="EA2E00"/>
@@ -3985,7 +3985,7 @@
         </w:rPr>
         <w:t xml:space="preserve">, </w:t>
       </w:r>
-      <w:hyperlink w:history="1" r:id="rIdvksdeqykbf_nb3ahvzgo3">
+      <w:hyperlink w:history="1" r:id="rIdasq_4e_btx_wqbphgpghu">
         <w:r>
           <w:rPr>
             <w:color w:val="EA2E00"/>
@@ -4003,7 +4003,7 @@
         </w:rPr>
         <w:t xml:space="preserve">, </w:t>
       </w:r>
-      <w:hyperlink w:history="1" r:id="rIdbjiwaark0-whibfpdcor5">
+      <w:hyperlink w:history="1" r:id="rIdn9gknysbjolcjt9q2bn2y">
         <w:r>
           <w:rPr>
             <w:color w:val="EA2E00"/>
@@ -4021,7 +4021,7 @@
         </w:rPr>
         <w:t xml:space="preserve">, </w:t>
       </w:r>
-      <w:hyperlink w:history="1" r:id="rIda3tiictjctxro83rlrfew">
+      <w:hyperlink w:history="1" r:id="rIdb1eblafmqswhrjartniqc">
         <w:r>
           <w:rPr>
             <w:color w:val="EA2E00"/>
@@ -4079,7 +4079,7 @@
         </w:rPr>
         <w:t xml:space="preserve">Via </w:t>
       </w:r>
-      <w:hyperlink w:history="1" r:id="rIdj1zxegn1zh2tympsdjgox">
+      <w:hyperlink w:history="1" r:id="rIdiaoqxhqvkt960nsiyc8_l">
         <w:r>
           <w:rPr>
             <w:color w:val="EA2E00"/>
@@ -4097,7 +4097,7 @@
         </w:rPr>
         <w:t xml:space="preserve">, </w:t>
       </w:r>
-      <w:hyperlink w:history="1" r:id="rIda0hheyhn7aabonvsgsf-x">
+      <w:hyperlink w:history="1" r:id="rId4flpo-srac7c9ef-23oz4">
         <w:r>
           <w:rPr>
             <w:color w:val="EA2E00"/>
@@ -4115,7 +4115,7 @@
         </w:rPr>
         <w:t xml:space="preserve">, </w:t>
       </w:r>
-      <w:hyperlink w:history="1" r:id="rIdhpfzunk7dybljluysbvqw">
+      <w:hyperlink w:history="1" r:id="rIdmsm8phz4akgsmyhupqb5f">
         <w:r>
           <w:rPr>
             <w:color w:val="EA2E00"/>
@@ -4133,7 +4133,7 @@
         </w:rPr>
         <w:t xml:space="preserve">, </w:t>
       </w:r>
-      <w:hyperlink w:history="1" r:id="rId6vicp-njy1jmkj_uk9pva">
+      <w:hyperlink w:history="1" r:id="rIdt83olvppndht6vlh4gglt">
         <w:r>
           <w:rPr>
             <w:color w:val="EA2E00"/>
@@ -4197,7 +4197,7 @@
             </w:r>
           </w:p>
           <w:p>
-            <w:hyperlink w:history="1" r:id="rIdxja6pae-kkwrqp9hmeii-">
+            <w:hyperlink w:history="1" r:id="rIdlba3sbgs4karnwa3p_gxh">
               <w:r>
                 <w:rPr>
                   <w:rStyle w:val="Hyperlink"/>
@@ -4249,7 +4249,7 @@
         </w:rPr>
         <w:t xml:space="preserve">Via </w:t>
       </w:r>
-      <w:hyperlink w:history="1" r:id="rIdkc7djp21hc8tkviizsssd">
+      <w:hyperlink w:history="1" r:id="rIdchgyesjtmdzia5p1xgjen">
         <w:r>
           <w:rPr>
             <w:color w:val="EA2E00"/>
@@ -4292,7 +4292,7 @@
         </w:rPr>
         <w:t xml:space="preserve">Via </w:t>
       </w:r>
-      <w:hyperlink w:history="1" r:id="rIdyvcxmpjdgwacqned18dj-">
+      <w:hyperlink w:history="1" r:id="rIdvrpbts36q1xujktnckwlw">
         <w:r>
           <w:rPr>
             <w:color w:val="EA2E00"/>
@@ -4335,7 +4335,7 @@
         </w:rPr>
         <w:t xml:space="preserve">Via </w:t>
       </w:r>
-      <w:hyperlink w:history="1" r:id="rIdr42s2hessj5ra694nmfv_">
+      <w:hyperlink w:history="1" r:id="rIdpzmsnkxjmesa4y19m-pye">
         <w:r>
           <w:rPr>
             <w:color w:val="EA2E00"/>
@@ -4353,7 +4353,7 @@
         </w:rPr>
         <w:t xml:space="preserve">, </w:t>
       </w:r>
-      <w:hyperlink w:history="1" r:id="rId6xdb9ffzzmwvwiinphyc7">
+      <w:hyperlink w:history="1" r:id="rIdhfunb5lqhblgoxjtb7umm">
         <w:r>
           <w:rPr>
             <w:color w:val="EA2E00"/>
@@ -4371,7 +4371,7 @@
         </w:rPr>
         <w:t xml:space="preserve">, </w:t>
       </w:r>
-      <w:hyperlink w:history="1" r:id="rIdzz7jmt09nikjghhnwdrx8">
+      <w:hyperlink w:history="1" r:id="rIdqxobhjcmljilprupwbywz">
         <w:r>
           <w:rPr>
             <w:color w:val="EA2E00"/>
@@ -4389,7 +4389,7 @@
         </w:rPr>
         <w:t xml:space="preserve">, </w:t>
       </w:r>
-      <w:hyperlink w:history="1" r:id="rId2krwqzmewlfg9shflwmkg">
+      <w:hyperlink w:history="1" r:id="rIdu4xe1mtgtjkpypfwmwhuk">
         <w:r>
           <w:rPr>
             <w:color w:val="EA2E00"/>
@@ -4407,7 +4407,7 @@
         </w:rPr>
         <w:t xml:space="preserve">, </w:t>
       </w:r>
-      <w:hyperlink w:history="1" r:id="rIdkz73ddwpdnzkc49j-f3tf">
+      <w:hyperlink w:history="1" r:id="rIdp7m5trlahveq6clokgey1">
         <w:r>
           <w:rPr>
             <w:color w:val="EA2E00"/>
@@ -4450,7 +4450,7 @@
         </w:rPr>
         <w:t xml:space="preserve">Via </w:t>
       </w:r>
-      <w:hyperlink w:history="1" r:id="rIdqej7whu12myju06nn4rwd">
+      <w:hyperlink w:history="1" r:id="rIdzmzyfn4eq5h6ogb9ebuad">
         <w:r>
           <w:rPr>
             <w:color w:val="EA2E00"/>
@@ -4468,7 +4468,7 @@
         </w:rPr>
         <w:t xml:space="preserve">, </w:t>
       </w:r>
-      <w:hyperlink w:history="1" r:id="rIdrliswnxbl5jzww_opmmtv">
+      <w:hyperlink w:history="1" r:id="rId6a7gfvkquujw_zlfnh3lo">
         <w:r>
           <w:rPr>
             <w:color w:val="EA2E00"/>
@@ -4486,7 +4486,7 @@
         </w:rPr>
         <w:t xml:space="preserve">, </w:t>
       </w:r>
-      <w:hyperlink w:history="1" r:id="rIdjxk_mk7jviwkx6_m-wt9l">
+      <w:hyperlink w:history="1" r:id="rIdcqnai5elgnv32ras_fcg_">
         <w:r>
           <w:rPr>
             <w:color w:val="EA2E00"/>
@@ -4504,7 +4504,7 @@
         </w:rPr>
         <w:t xml:space="preserve">, </w:t>
       </w:r>
-      <w:hyperlink w:history="1" r:id="rIdajkkw_efpbzkirtuwcpzw">
+      <w:hyperlink w:history="1" r:id="rIdj2fnlrkc-cbx0vrjmetlq">
         <w:r>
           <w:rPr>
             <w:color w:val="EA2E00"/>
@@ -4547,7 +4547,7 @@
         </w:rPr>
         <w:t xml:space="preserve">Via </w:t>
       </w:r>
-      <w:hyperlink w:history="1" r:id="rIdbddikmxtjv9fvh1dlvipa">
+      <w:hyperlink w:history="1" r:id="rId1dwt1njyfrr_tcnoikh1-">
         <w:r>
           <w:rPr>
             <w:color w:val="EA2E00"/>
@@ -4565,7 +4565,7 @@
         </w:rPr>
         <w:t xml:space="preserve">, </w:t>
       </w:r>
-      <w:hyperlink w:history="1" r:id="rIdxcquks-em3u4v7sjcwrke">
+      <w:hyperlink w:history="1" r:id="rIdrwgquydoporszpirjay_b">
         <w:r>
           <w:rPr>
             <w:color w:val="EA2E00"/>
@@ -4583,7 +4583,7 @@
         </w:rPr>
         <w:t xml:space="preserve">, </w:t>
       </w:r>
-      <w:hyperlink w:history="1" r:id="rId0_lijmtdbapsafxirk5e7">
+      <w:hyperlink w:history="1" r:id="rIdv1m6l-0vboqza8ys21esv">
         <w:r>
           <w:rPr>
             <w:color w:val="EA2E00"/>
@@ -4681,7 +4681,7 @@
         </w:rPr>
         <w:t xml:space="preserve">Via </w:t>
       </w:r>
-      <w:hyperlink w:history="1" r:id="rId2fez6ghrjmd8fbdatd3tk">
+      <w:hyperlink w:history="1" r:id="rIdf3qsdjhctyjux-ccmlclu">
         <w:r>
           <w:rPr>
             <w:color w:val="EA2E00"/>
@@ -4699,7 +4699,7 @@
         </w:rPr>
         <w:t xml:space="preserve">, </w:t>
       </w:r>
-      <w:hyperlink w:history="1" r:id="rId4_b9_zbkuxzl65noxtsnp">
+      <w:hyperlink w:history="1" r:id="rId3ndr3eti-rd9ayqvdwxmb">
         <w:r>
           <w:rPr>
             <w:color w:val="EA2E00"/>
@@ -4717,7 +4717,7 @@
         </w:rPr>
         <w:t xml:space="preserve">, </w:t>
       </w:r>
-      <w:hyperlink w:history="1" r:id="rIdzcmwendve9tqrdq4tai2k">
+      <w:hyperlink w:history="1" r:id="rIdos2epiarqcvcsdvnvfh1_">
         <w:r>
           <w:rPr>
             <w:color w:val="EA2E00"/>
@@ -4735,7 +4735,7 @@
         </w:rPr>
         <w:t xml:space="preserve">, </w:t>
       </w:r>
-      <w:hyperlink w:history="1" r:id="rIdm8z92c1bcd8jh-gkpqa8e">
+      <w:hyperlink w:history="1" r:id="rIdezcsqs4lgnbxsvwkupqvo">
         <w:r>
           <w:rPr>
             <w:color w:val="EA2E00"/>
@@ -4753,7 +4753,7 @@
         </w:rPr>
         <w:t xml:space="preserve">, </w:t>
       </w:r>
-      <w:hyperlink w:history="1" r:id="rIdjw3pclp7foqeytnirahmg">
+      <w:hyperlink w:history="1" r:id="rId6tzjt9omtcq_tlmcew_vl">
         <w:r>
           <w:rPr>
             <w:color w:val="EA2E00"/>
@@ -4814,7 +4814,7 @@
         </w:rPr>
         <w:t xml:space="preserve">Via </w:t>
       </w:r>
-      <w:hyperlink w:history="1" r:id="rIdyiy13htfywvr8sblpr4xs">
+      <w:hyperlink w:history="1" r:id="rIdnmausxrwvwuud2tgveyz5">
         <w:r>
           <w:rPr>
             <w:color w:val="EA2E00"/>
@@ -4832,7 +4832,7 @@
         </w:rPr>
         <w:t xml:space="preserve">, </w:t>
       </w:r>
-      <w:hyperlink w:history="1" r:id="rIdfoiuqnjs-wmm-rifetcjy">
+      <w:hyperlink w:history="1" r:id="rIdqwbpqmh-grfgcluuypl7j">
         <w:r>
           <w:rPr>
             <w:color w:val="EA2E00"/>
@@ -4850,7 +4850,7 @@
         </w:rPr>
         <w:t xml:space="preserve">, </w:t>
       </w:r>
-      <w:hyperlink w:history="1" r:id="rIda8gqqplbkcjn1wm5g4xkq">
+      <w:hyperlink w:history="1" r:id="rId3oovrh0yjzg3mbtqrkku3">
         <w:r>
           <w:rPr>
             <w:color w:val="EA2E00"/>
@@ -4868,7 +4868,7 @@
         </w:rPr>
         <w:t xml:space="preserve">, </w:t>
       </w:r>
-      <w:hyperlink w:history="1" r:id="rId4bulz6tshoc2y3yr_i0ol">
+      <w:hyperlink w:history="1" r:id="rIdqehbl7jk265kcivbznfyw">
         <w:r>
           <w:rPr>
             <w:color w:val="EA2E00"/>
@@ -4886,7 +4886,7 @@
         </w:rPr>
         <w:t xml:space="preserve">, </w:t>
       </w:r>
-      <w:hyperlink w:history="1" r:id="rIdpplxv6acr2b_c0smvkkkw">
+      <w:hyperlink w:history="1" r:id="rId7htoubutz5epgtiyqbi-a">
         <w:r>
           <w:rPr>
             <w:color w:val="EA2E00"/>
@@ -4947,7 +4947,7 @@
         </w:rPr>
         <w:t xml:space="preserve">Via </w:t>
       </w:r>
-      <w:hyperlink w:history="1" r:id="rId7ktimaebhu46n-fgka8k6">
+      <w:hyperlink w:history="1" r:id="rIdofdcckouvth4akpnnq47w">
         <w:r>
           <w:rPr>
             <w:color w:val="EA2E00"/>
@@ -4965,7 +4965,7 @@
         </w:rPr>
         <w:t xml:space="preserve">, </w:t>
       </w:r>
-      <w:hyperlink w:history="1" r:id="rIdeiixqwoy2iaittppqraee">
+      <w:hyperlink w:history="1" r:id="rId92ww297kg-eb6fdxrxua5">
         <w:r>
           <w:rPr>
             <w:color w:val="EA2E00"/>
@@ -4983,7 +4983,7 @@
         </w:rPr>
         <w:t xml:space="preserve">, </w:t>
       </w:r>
-      <w:hyperlink w:history="1" r:id="rIdvbkw47wa9mavoqzumdvco">
+      <w:hyperlink w:history="1" r:id="rId4x0v45flizrsd4ohffovx">
         <w:r>
           <w:rPr>
             <w:color w:val="EA2E00"/>
@@ -5001,7 +5001,7 @@
         </w:rPr>
         <w:t xml:space="preserve">, </w:t>
       </w:r>
-      <w:hyperlink w:history="1" r:id="rIddmd2rbhrxrtm5-seybz6k">
+      <w:hyperlink w:history="1" r:id="rId_vd4-fhmeuyjinzffdais">
         <w:r>
           <w:rPr>
             <w:color w:val="EA2E00"/>
@@ -5062,7 +5062,7 @@
         </w:rPr>
         <w:t xml:space="preserve">Via </w:t>
       </w:r>
-      <w:hyperlink w:history="1" r:id="rIdxged2g8qbiotqbuenmq3j">
+      <w:hyperlink w:history="1" r:id="rIdaonlbkzr5294kbuxrqm7i">
         <w:r>
           <w:rPr>
             <w:color w:val="EA2E00"/>
@@ -5080,7 +5080,7 @@
         </w:rPr>
         <w:t xml:space="preserve">, </w:t>
       </w:r>
-      <w:hyperlink w:history="1" r:id="rId2bjtdoktc0dhtqw45qsgg">
+      <w:hyperlink w:history="1" r:id="rIdqzuxreoak56hxahne8drk">
         <w:r>
           <w:rPr>
             <w:color w:val="EA2E00"/>
@@ -5098,7 +5098,7 @@
         </w:rPr>
         <w:t xml:space="preserve">, </w:t>
       </w:r>
-      <w:hyperlink w:history="1" r:id="rIdb-uhvnbb28o1y3t-6tnam">
+      <w:hyperlink w:history="1" r:id="rIdg-oon_629-13bn7tywhfr">
         <w:r>
           <w:rPr>
             <w:color w:val="EA2E00"/>
@@ -5116,7 +5116,7 @@
         </w:rPr>
         <w:t xml:space="preserve">, </w:t>
       </w:r>
-      <w:hyperlink w:history="1" r:id="rIduwfg7aio_szuh5tjygfy8">
+      <w:hyperlink w:history="1" r:id="rIdjlsfbdqyurlfaaocj910o">
         <w:r>
           <w:rPr>
             <w:color w:val="EA2E00"/>
@@ -5177,7 +5177,7 @@
         </w:rPr>
         <w:t xml:space="preserve">Via </w:t>
       </w:r>
-      <w:hyperlink w:history="1" r:id="rId45dwsfw2jfrko3asnde2e">
+      <w:hyperlink w:history="1" r:id="rIdkozlrv847eka6xiu4hrhh">
         <w:r>
           <w:rPr>
             <w:color w:val="EA2E00"/>
@@ -5195,7 +5195,7 @@
         </w:rPr>
         <w:t xml:space="preserve">, </w:t>
       </w:r>
-      <w:hyperlink w:history="1" r:id="rIdcxmoxttqketba5dg-lxzb">
+      <w:hyperlink w:history="1" r:id="rIdhadwfzqqvfqub0c_8ryao">
         <w:r>
           <w:rPr>
             <w:color w:val="EA2E00"/>
@@ -5213,7 +5213,7 @@
         </w:rPr>
         <w:t xml:space="preserve">, </w:t>
       </w:r>
-      <w:hyperlink w:history="1" r:id="rIdqqtgqylnqumz7hsag1ym3">
+      <w:hyperlink w:history="1" r:id="rIdfdcrhbuhvn4ghz15lzlhv">
         <w:r>
           <w:rPr>
             <w:color w:val="EA2E00"/>
@@ -5496,7 +5496,7 @@
             </w:tcMar>
           </w:tcPr>
           <w:p>
-            <w:hyperlink w:history="1" r:id="rIdfsexzymweuibge38ud625">
+            <w:hyperlink w:history="1" r:id="rIdfrofnfylzrsc5xbeawkg4">
               <w:r>
                 <w:rPr>
                   <w:rStyle w:val="Hyperlink"/>
@@ -5615,7 +5615,7 @@
             </w:tcMar>
           </w:tcPr>
           <w:p>
-            <w:hyperlink w:history="1" r:id="rIdzwegieuhz9vnc-u9is2a-">
+            <w:hyperlink w:history="1" r:id="rIdpovzneou44yjjwzrkjean">
               <w:r>
                 <w:rPr>
                   <w:rStyle w:val="Hyperlink"/>
@@ -5734,7 +5734,7 @@
             </w:tcMar>
           </w:tcPr>
           <w:p>
-            <w:hyperlink w:history="1" r:id="rIdu3xhbqxl2q9hfl_sj6nm0">
+            <w:hyperlink w:history="1" r:id="rId4b3ffyfgnk017xxnrt4mg">
               <w:r>
                 <w:rPr>
                   <w:rStyle w:val="Hyperlink"/>
@@ -5853,7 +5853,7 @@
             </w:tcMar>
           </w:tcPr>
           <w:p>
-            <w:hyperlink w:history="1" r:id="rId5v1j7ksrodhym1kumncj2">
+            <w:hyperlink w:history="1" r:id="rIdoiy8ir87e-qumxfj78nni">
               <w:r>
                 <w:rPr>
                   <w:rStyle w:val="Hyperlink"/>
@@ -5923,7 +5923,7 @@
             </w:r>
           </w:p>
           <w:p>
-            <w:hyperlink w:history="1" r:id="rIdu-i_ao35dfvz6c2iaswre">
+            <w:hyperlink w:history="1" r:id="rIdzypp_sqgx0j2yv9pssgel">
               <w:r>
                 <w:rPr>
                   <w:rStyle w:val="Hyperlink"/>
@@ -6014,7 +6014,7 @@
       </w:r>
     </w:p>
     <w:p>
-      <w:hyperlink w:history="1" r:id="rIdb5u1jm0mknzkmcip3axtq">
+      <w:hyperlink w:history="1" r:id="rIdbu3c5d74mzghh5kssb3mj">
         <w:r>
           <w:rPr>
             <w:rStyle w:val="Hyperlink"/>
@@ -6035,7 +6035,7 @@
         </w:rPr>
         <w:t xml:space="preserve">Via </w:t>
       </w:r>
-      <w:hyperlink w:history="1" r:id="rIdicxt5debons5uuwraio0l">
+      <w:hyperlink w:history="1" r:id="rId5vm6sv0j24_epy1ldcbds">
         <w:r>
           <w:rPr>
             <w:color w:val="EA2E00"/>
@@ -6053,7 +6053,7 @@
         </w:rPr>
         <w:t xml:space="preserve">, </w:t>
       </w:r>
-      <w:hyperlink w:history="1" r:id="rId1eybsweqmqrhkw_xggqxo">
+      <w:hyperlink w:history="1" r:id="rIdvhnxjea6tugpksifej7x0">
         <w:r>
           <w:rPr>
             <w:color w:val="EA2E00"/>
@@ -6071,7 +6071,7 @@
         </w:rPr>
         <w:t xml:space="preserve">, </w:t>
       </w:r>
-      <w:hyperlink w:history="1" r:id="rIdlclsfe_d8bri8kxj24lzu">
+      <w:hyperlink w:history="1" r:id="rIdpjghtzq81nso0tlvbchus">
         <w:r>
           <w:rPr>
             <w:color w:val="EA2E00"/>
@@ -6089,7 +6089,7 @@
         </w:rPr>
         <w:t xml:space="preserve">, </w:t>
       </w:r>
-      <w:hyperlink w:history="1" r:id="rIdtganakfphvlmnneo1sx7k">
+      <w:hyperlink w:history="1" r:id="rIdeg5rhdbrdq2i14graseve">
         <w:r>
           <w:rPr>
             <w:color w:val="EA2E00"/>
@@ -6107,7 +6107,7 @@
         </w:rPr>
         <w:t xml:space="preserve">, </w:t>
       </w:r>
-      <w:hyperlink w:history="1" r:id="rId1g_pzuvxxkiakbbhrlbce">
+      <w:hyperlink w:history="1" r:id="rIdbzhqxsgvabfuvehyewoip">
         <w:r>
           <w:rPr>
             <w:color w:val="EA2E00"/>
@@ -6125,7 +6125,7 @@
         </w:rPr>
         <w:t xml:space="preserve">, </w:t>
       </w:r>
-      <w:hyperlink w:history="1" r:id="rIday1jruimdjlpf6bryiu5h">
+      <w:hyperlink w:history="1" r:id="rId8pkduzzhpsnenan1hqmxb">
         <w:r>
           <w:rPr>
             <w:color w:val="EA2E00"/>
@@ -6143,7 +6143,7 @@
         </w:rPr>
         <w:t xml:space="preserve">, </w:t>
       </w:r>
-      <w:hyperlink w:history="1" r:id="rIdygs_lpr9sdlvqqcrafdtx">
+      <w:hyperlink w:history="1" r:id="rIdzuo3mu6vqrhbw5wbylmht">
         <w:r>
           <w:rPr>
             <w:color w:val="EA2E00"/>
@@ -6161,7 +6161,7 @@
         </w:rPr>
         <w:t xml:space="preserve">, </w:t>
       </w:r>
-      <w:hyperlink w:history="1" r:id="rIdm1cagqyejfnvn3nan49dk">
+      <w:hyperlink w:history="1" r:id="rIdmfowolipl2rq15qyty6jm">
         <w:r>
           <w:rPr>
             <w:color w:val="EA2E00"/>
@@ -6179,7 +6179,7 @@
         </w:rPr>
         <w:t xml:space="preserve">, </w:t>
       </w:r>
-      <w:hyperlink w:history="1" r:id="rIdzghgs51fjaensio84sa98">
+      <w:hyperlink w:history="1" r:id="rIdpih8fmyaonnk3wozz7agx">
         <w:r>
           <w:rPr>
             <w:color w:val="EA2E00"/>
@@ -6240,7 +6240,7 @@
       </w:r>
     </w:p>
     <w:p>
-      <w:hyperlink w:history="1" r:id="rIdmqbxwcq1k8gtkc6lqhhjq">
+      <w:hyperlink w:history="1" r:id="rIdoawgqgpxgzzmhi5ucofcc">
         <w:r>
           <w:rPr>
             <w:rStyle w:val="Hyperlink"/>
@@ -6261,7 +6261,7 @@
         </w:rPr>
         <w:t xml:space="preserve">Via </w:t>
       </w:r>
-      <w:hyperlink w:history="1" r:id="rIdxjuuueynhfgnwz9zk--at">
+      <w:hyperlink w:history="1" r:id="rId1imaxnd6djbwuaxz04w8l">
         <w:r>
           <w:rPr>
             <w:color w:val="EA2E00"/>
@@ -6279,7 +6279,7 @@
         </w:rPr>
         <w:t xml:space="preserve">, </w:t>
       </w:r>
-      <w:hyperlink w:history="1" r:id="rIdpe92l_9owsaq2_ul4mp6t">
+      <w:hyperlink w:history="1" r:id="rIddk_bdciguthxsiozrindp">
         <w:r>
           <w:rPr>
             <w:color w:val="EA2E00"/>
@@ -6297,7 +6297,7 @@
         </w:rPr>
         <w:t xml:space="preserve">, </w:t>
       </w:r>
-      <w:hyperlink w:history="1" r:id="rIdm_7v-2kvflczcamfgvsl9">
+      <w:hyperlink w:history="1" r:id="rIdlsfon8dpbhjyckn2vvkyf">
         <w:r>
           <w:rPr>
             <w:color w:val="EA2E00"/>
@@ -6315,7 +6315,7 @@
         </w:rPr>
         <w:t xml:space="preserve">, </w:t>
       </w:r>
-      <w:hyperlink w:history="1" r:id="rId5vhs30wmdx5v1har9ucs8">
+      <w:hyperlink w:history="1" r:id="rIdap2qcfp4vdwc9oig2x9u9">
         <w:r>
           <w:rPr>
             <w:color w:val="EA2E00"/>
@@ -6333,7 +6333,7 @@
         </w:rPr>
         <w:t xml:space="preserve">, </w:t>
       </w:r>
-      <w:hyperlink w:history="1" r:id="rIdm8zcqr0jgmgjohfclzajq">
+      <w:hyperlink w:history="1" r:id="rIdq2eahsvjv2zcvzjonljr4">
         <w:r>
           <w:rPr>
             <w:color w:val="EA2E00"/>
@@ -6351,7 +6351,7 @@
         </w:rPr>
         <w:t xml:space="preserve">, </w:t>
       </w:r>
-      <w:hyperlink w:history="1" r:id="rIdsa8tqvizl2b1w4jmwltd3">
+      <w:hyperlink w:history="1" r:id="rIdvbh8loe7c0qtcmzbcgxxb">
         <w:r>
           <w:rPr>
             <w:color w:val="EA2E00"/>
@@ -6369,7 +6369,7 @@
         </w:rPr>
         <w:t xml:space="preserve">, </w:t>
       </w:r>
-      <w:hyperlink w:history="1" r:id="rIdnaxcovvfkxbcx_eetqvzb">
+      <w:hyperlink w:history="1" r:id="rId82roikzpvvrlrr9nycjxv">
         <w:r>
           <w:rPr>
             <w:color w:val="EA2E00"/>
@@ -6387,7 +6387,7 @@
         </w:rPr>
         <w:t xml:space="preserve">, </w:t>
       </w:r>
-      <w:hyperlink w:history="1" r:id="rIdpaoa3kgfustpb_ee1mcjn">
+      <w:hyperlink w:history="1" r:id="rIdgxow6gefamispjx2i6n_k">
         <w:r>
           <w:rPr>
             <w:color w:val="EA2E00"/>
@@ -6448,7 +6448,7 @@
       </w:r>
     </w:p>
     <w:p>
-      <w:hyperlink w:history="1" r:id="rIdl_nnsx4bo0sqa-kgwzwx4">
+      <w:hyperlink w:history="1" r:id="rIdxtftvaiw_ijcoyiu1qtdb">
         <w:r>
           <w:rPr>
             <w:rStyle w:val="Hyperlink"/>
@@ -6469,7 +6469,7 @@
         </w:rPr>
         <w:t xml:space="preserve">Via </w:t>
       </w:r>
-      <w:hyperlink w:history="1" r:id="rIdnzvv9ngpeyc10fpswgnko">
+      <w:hyperlink w:history="1" r:id="rIdcyekbrziw3awmhbi-nhma">
         <w:r>
           <w:rPr>
             <w:color w:val="EA2E00"/>
@@ -6487,7 +6487,7 @@
         </w:rPr>
         <w:t xml:space="preserve">, </w:t>
       </w:r>
-      <w:hyperlink w:history="1" r:id="rIdqcgr799ksxjffc7axll8i">
+      <w:hyperlink w:history="1" r:id="rIdw1xcoh6o1kwj0jo0gua0-">
         <w:r>
           <w:rPr>
             <w:color w:val="EA2E00"/>
@@ -6505,7 +6505,7 @@
         </w:rPr>
         <w:t xml:space="preserve">, </w:t>
       </w:r>
-      <w:hyperlink w:history="1" r:id="rIdahmlcwdiyyzikvg-cb00m">
+      <w:hyperlink w:history="1" r:id="rIdswiby-0lushxa06yr7g4m">
         <w:r>
           <w:rPr>
             <w:color w:val="EA2E00"/>
@@ -6523,7 +6523,7 @@
         </w:rPr>
         <w:t xml:space="preserve">, </w:t>
       </w:r>
-      <w:hyperlink w:history="1" r:id="rIddvhe0xrgsjxwhxjldsrjk">
+      <w:hyperlink w:history="1" r:id="rIdsem2-ls6qapqbvnb5feju">
         <w:r>
           <w:rPr>
             <w:color w:val="EA2E00"/>
@@ -6541,7 +6541,7 @@
         </w:rPr>
         <w:t xml:space="preserve">, </w:t>
       </w:r>
-      <w:hyperlink w:history="1" r:id="rIdp1jhlvlai_dmbhaezezpn">
+      <w:hyperlink w:history="1" r:id="rIdcegekm3fjiuz1se8wyoyr">
         <w:r>
           <w:rPr>
             <w:color w:val="EA2E00"/>
@@ -6559,7 +6559,7 @@
         </w:rPr>
         <w:t xml:space="preserve">, </w:t>
       </w:r>
-      <w:hyperlink w:history="1" r:id="rIdl2dbj0x07ptjk0ttmgz1k">
+      <w:hyperlink w:history="1" r:id="rIduvhqll3wni4iztbnt9pts">
         <w:r>
           <w:rPr>
             <w:color w:val="EA2E00"/>
@@ -6577,7 +6577,7 @@
         </w:rPr>
         <w:t xml:space="preserve">, </w:t>
       </w:r>
-      <w:hyperlink w:history="1" r:id="rIdnpvfw-ta6x_hkgybfyrch">
+      <w:hyperlink w:history="1" r:id="rIdfo8aeeqbgelk5u6xjcht9">
         <w:r>
           <w:rPr>
             <w:color w:val="EA2E00"/>
@@ -6595,7 +6595,7 @@
         </w:rPr>
         <w:t xml:space="preserve">, </w:t>
       </w:r>
-      <w:hyperlink w:history="1" r:id="rIdu2z4alnwg9evc3l7u2hw5">
+      <w:hyperlink w:history="1" r:id="rIdbsibmiqupf_rtyfcewvc0">
         <w:r>
           <w:rPr>
             <w:color w:val="EA2E00"/>
@@ -6656,7 +6656,7 @@
       </w:r>
     </w:p>
     <w:p>
-      <w:hyperlink w:history="1" r:id="rIdomzfnu_bkg6-gc_00lwlf">
+      <w:hyperlink w:history="1" r:id="rIdgsiatowybbwxr8wowkqng">
         <w:r>
           <w:rPr>
             <w:rStyle w:val="Hyperlink"/>
@@ -6677,7 +6677,7 @@
         </w:rPr>
         <w:t xml:space="preserve">Via </w:t>
       </w:r>
-      <w:hyperlink w:history="1" r:id="rIdwwo1oc5wkpgo0r3tdoijy">
+      <w:hyperlink w:history="1" r:id="rId2orndy2khsnsnew4nhaaq">
         <w:r>
           <w:rPr>
             <w:color w:val="EA2E00"/>
@@ -6695,7 +6695,7 @@
         </w:rPr>
         <w:t xml:space="preserve">, </w:t>
       </w:r>
-      <w:hyperlink w:history="1" r:id="rIdjs35c9idlgdwxxgzakcr6">
+      <w:hyperlink w:history="1" r:id="rId_zayq2fitx6nrjmoti0bd">
         <w:r>
           <w:rPr>
             <w:color w:val="EA2E00"/>
@@ -6713,7 +6713,7 @@
         </w:rPr>
         <w:t xml:space="preserve">, </w:t>
       </w:r>
-      <w:hyperlink w:history="1" r:id="rIdfttqlrvlrp2yq4fnvxkdy">
+      <w:hyperlink w:history="1" r:id="rIdhun1rraii4apz-ry0ydco">
         <w:r>
           <w:rPr>
             <w:color w:val="EA2E00"/>
@@ -6731,7 +6731,7 @@
         </w:rPr>
         <w:t xml:space="preserve">, </w:t>
       </w:r>
-      <w:hyperlink w:history="1" r:id="rIdeg5rcl-wa4d7fnhkfcg3f">
+      <w:hyperlink w:history="1" r:id="rIdhtc92ckqptulm6tqoz2rp">
         <w:r>
           <w:rPr>
             <w:color w:val="EA2E00"/>
@@ -6749,7 +6749,7 @@
         </w:rPr>
         <w:t xml:space="preserve">, </w:t>
       </w:r>
-      <w:hyperlink w:history="1" r:id="rId7ng9as3aru0odmwywo1np">
+      <w:hyperlink w:history="1" r:id="rIdqcz1vx2rib-wvaaknbmby">
         <w:r>
           <w:rPr>
             <w:color w:val="EA2E00"/>
@@ -6767,7 +6767,7 @@
         </w:rPr>
         <w:t xml:space="preserve">, </w:t>
       </w:r>
-      <w:hyperlink w:history="1" r:id="rIduufi2mi1j_pj_doe48daf">
+      <w:hyperlink w:history="1" r:id="rIdgeh_bl2arbvjnepynvpo7">
         <w:r>
           <w:rPr>
             <w:color w:val="EA2E00"/>
@@ -6785,7 +6785,7 @@
         </w:rPr>
         <w:t xml:space="preserve">, </w:t>
       </w:r>
-      <w:hyperlink w:history="1" r:id="rIddeubfsanzjjfupn3ajw-g">
+      <w:hyperlink w:history="1" r:id="rIdeopcieh7mi6berc-w4tod">
         <w:r>
           <w:rPr>
             <w:color w:val="EA2E00"/>
@@ -6803,7 +6803,7 @@
         </w:rPr>
         <w:t xml:space="preserve">, </w:t>
       </w:r>
-      <w:hyperlink w:history="1" r:id="rIdn-7s3e2molhwlwzfxkxvj">
+      <w:hyperlink w:history="1" r:id="rIdudtpyb25kroc7ezsmxts0">
         <w:r>
           <w:rPr>
             <w:color w:val="EA2E00"/>
@@ -6821,7 +6821,7 @@
         </w:rPr>
         <w:t xml:space="preserve">, </w:t>
       </w:r>
-      <w:hyperlink w:history="1" r:id="rIdjr6osejwsuzs-wvbtqgzs">
+      <w:hyperlink w:history="1" r:id="rId1dmjdejq6flxfkr9aoaxh">
         <w:r>
           <w:rPr>
             <w:color w:val="EA2E00"/>
@@ -6882,7 +6882,7 @@
       </w:r>
     </w:p>
     <w:p>
-      <w:hyperlink w:history="1" r:id="rIdgpbu1w6r5-jmfitccvn5q">
+      <w:hyperlink w:history="1" r:id="rIdmfdtppgjcljeybvdldpco">
         <w:r>
           <w:rPr>
             <w:rStyle w:val="Hyperlink"/>
@@ -6903,7 +6903,7 @@
         </w:rPr>
         <w:t xml:space="preserve">Via </w:t>
       </w:r>
-      <w:hyperlink w:history="1" r:id="rIdcwzwnxsa99omnythzexoc">
+      <w:hyperlink w:history="1" r:id="rIddei2ulrmt3wi6kqgh_gio">
         <w:r>
           <w:rPr>
             <w:color w:val="EA2E00"/>
@@ -6921,7 +6921,7 @@
         </w:rPr>
         <w:t xml:space="preserve">, </w:t>
       </w:r>
-      <w:hyperlink w:history="1" r:id="rIdabqysalny3eqz8_kgpmrs">
+      <w:hyperlink w:history="1" r:id="rIdh-qlcllodoejfdbeiptcw">
         <w:r>
           <w:rPr>
             <w:color w:val="EA2E00"/>
@@ -6939,7 +6939,7 @@
         </w:rPr>
         <w:t xml:space="preserve">, </w:t>
       </w:r>
-      <w:hyperlink w:history="1" r:id="rIdgckzzryhdxqms5t_yneyz">
+      <w:hyperlink w:history="1" r:id="rIdwjprvchiqnmdpnvlebeor">
         <w:r>
           <w:rPr>
             <w:color w:val="EA2E00"/>
@@ -6957,7 +6957,7 @@
         </w:rPr>
         <w:t xml:space="preserve">, </w:t>
       </w:r>
-      <w:hyperlink w:history="1" r:id="rIdxyl3-dhncm_jzjrjlarvu">
+      <w:hyperlink w:history="1" r:id="rIdlwslcwcoqhojerlhrzo5w">
         <w:r>
           <w:rPr>
             <w:color w:val="EA2E00"/>
@@ -6975,7 +6975,7 @@
         </w:rPr>
         <w:t xml:space="preserve">, </w:t>
       </w:r>
-      <w:hyperlink w:history="1" r:id="rIduf2lwzbje_20xq6r3cggj">
+      <w:hyperlink w:history="1" r:id="rIdc4z4pukxojce58oocf-kb">
         <w:r>
           <w:rPr>
             <w:color w:val="EA2E00"/>
@@ -7036,7 +7036,7 @@
       </w:r>
     </w:p>
     <w:p>
-      <w:hyperlink w:history="1" r:id="rIdgfq_myxpepdeurrwhgojp">
+      <w:hyperlink w:history="1" r:id="rIdrr-2h0_8odjks9iv2cjtx">
         <w:r>
           <w:rPr>
             <w:rStyle w:val="Hyperlink"/>
@@ -7057,7 +7057,7 @@
         </w:rPr>
         <w:t xml:space="preserve">Via </w:t>
       </w:r>
-      <w:hyperlink w:history="1" r:id="rIdsfydf41sjnsv4pnbzcth8">
+      <w:hyperlink w:history="1" r:id="rIdtfcc38onwpp9umpquzg99">
         <w:r>
           <w:rPr>
             <w:color w:val="EA2E00"/>
@@ -7075,7 +7075,7 @@
         </w:rPr>
         <w:t xml:space="preserve">, </w:t>
       </w:r>
-      <w:hyperlink w:history="1" r:id="rIdeuvbt4k6uw3tehi2i0-sw">
+      <w:hyperlink w:history="1" r:id="rId3d1anrhn54qwdjnbswscg">
         <w:r>
           <w:rPr>
             <w:color w:val="EA2E00"/>
@@ -7093,7 +7093,7 @@
         </w:rPr>
         <w:t xml:space="preserve">, </w:t>
       </w:r>
-      <w:hyperlink w:history="1" r:id="rIdq5ftwgdukddeotbrzo-4p">
+      <w:hyperlink w:history="1" r:id="rId0crv-mpoczvvlvbh7cq4c">
         <w:r>
           <w:rPr>
             <w:color w:val="EA2E00"/>
@@ -7111,7 +7111,7 @@
         </w:rPr>
         <w:t xml:space="preserve">, </w:t>
       </w:r>
-      <w:hyperlink w:history="1" r:id="rIdudajnsi3dvltawvnno1ee">
+      <w:hyperlink w:history="1" r:id="rIdnpzxwt8bpnau_ol_rzqox">
         <w:r>
           <w:rPr>
             <w:color w:val="EA2E00"/>
@@ -7129,7 +7129,7 @@
         </w:rPr>
         <w:t xml:space="preserve">, </w:t>
       </w:r>
-      <w:hyperlink w:history="1" r:id="rIdpdz_e7hnnf9swjuzehruq">
+      <w:hyperlink w:history="1" r:id="rIdp0glt8iquumr0u4gsj4ns">
         <w:r>
           <w:rPr>
             <w:color w:val="EA2E00"/>
@@ -7190,7 +7190,7 @@
       </w:r>
     </w:p>
     <w:p>
-      <w:hyperlink w:history="1" r:id="rId_ymxfvf2wdsxtt430ju2n">
+      <w:hyperlink w:history="1" r:id="rIdzaydnonpiirmyqy7sltgq">
         <w:r>
           <w:rPr>
             <w:rStyle w:val="Hyperlink"/>
@@ -7211,7 +7211,7 @@
         </w:rPr>
         <w:t xml:space="preserve">Via </w:t>
       </w:r>
-      <w:hyperlink w:history="1" r:id="rId91yfrwn22bjyhkdfbfsqj">
+      <w:hyperlink w:history="1" r:id="rId72cxv8-5jrdda-eezqggq">
         <w:r>
           <w:rPr>
             <w:color w:val="EA2E00"/>
@@ -7229,7 +7229,7 @@
         </w:rPr>
         <w:t xml:space="preserve">, </w:t>
       </w:r>
-      <w:hyperlink w:history="1" r:id="rIdejwfwuhrgyl8mia86am9u">
+      <w:hyperlink w:history="1" r:id="rIdrjfvvmejoh2wrwvixdymc">
         <w:r>
           <w:rPr>
             <w:color w:val="EA2E00"/>
@@ -7247,7 +7247,7 @@
         </w:rPr>
         <w:t xml:space="preserve">, </w:t>
       </w:r>
-      <w:hyperlink w:history="1" r:id="rIdisvvqofjhvuyfssb3lzm0">
+      <w:hyperlink w:history="1" r:id="rIdqlemil87uee81bwcctbbd">
         <w:r>
           <w:rPr>
             <w:color w:val="EA2E00"/>
@@ -7265,7 +7265,7 @@
         </w:rPr>
         <w:t xml:space="preserve">, </w:t>
       </w:r>
-      <w:hyperlink w:history="1" r:id="rIdbzwvt1nf_8dgdsjirisyn">
+      <w:hyperlink w:history="1" r:id="rIdc0qrfazbuxyyiqxkrsomh">
         <w:r>
           <w:rPr>
             <w:color w:val="EA2E00"/>
@@ -7283,7 +7283,7 @@
         </w:rPr>
         <w:t xml:space="preserve">, </w:t>
       </w:r>
-      <w:hyperlink w:history="1" r:id="rId_tmihs8bqwgliks3eosex">
+      <w:hyperlink w:history="1" r:id="rIdx4b7ekd_ausvwwai-xfm3">
         <w:r>
           <w:rPr>
             <w:color w:val="EA2E00"/>
@@ -7301,7 +7301,7 @@
         </w:rPr>
         <w:t xml:space="preserve">, </w:t>
       </w:r>
-      <w:hyperlink w:history="1" r:id="rIdvimsdgfwa4kl5pfyuvaub">
+      <w:hyperlink w:history="1" r:id="rIdv2tefbp-94qlsaxcti9dx">
         <w:r>
           <w:rPr>
             <w:color w:val="EA2E00"/>
@@ -7362,7 +7362,7 @@
       </w:r>
     </w:p>
     <w:p>
-      <w:hyperlink w:history="1" r:id="rId-ribtw_vdjgo6y-yk_xqx">
+      <w:hyperlink w:history="1" r:id="rIdpohgwy7wyvlgejkjn7bxx">
         <w:r>
           <w:rPr>
             <w:rStyle w:val="Hyperlink"/>
@@ -7383,7 +7383,7 @@
         </w:rPr>
         <w:t xml:space="preserve">Via </w:t>
       </w:r>
-      <w:hyperlink w:history="1" r:id="rIdjs2_lhogzc_b_p7qv5gz4">
+      <w:hyperlink w:history="1" r:id="rIdqs5c-fgyzcnzfdyll6n1c">
         <w:r>
           <w:rPr>
             <w:color w:val="EA2E00"/>
@@ -7401,7 +7401,7 @@
         </w:rPr>
         <w:t xml:space="preserve">, </w:t>
       </w:r>
-      <w:hyperlink w:history="1" r:id="rIdskbf69pdf3iiv9t6gjnx1">
+      <w:hyperlink w:history="1" r:id="rIdo90t6lw5tooefd_ho0zmj">
         <w:r>
           <w:rPr>
             <w:color w:val="EA2E00"/>
@@ -7419,7 +7419,7 @@
         </w:rPr>
         <w:t xml:space="preserve">, </w:t>
       </w:r>
-      <w:hyperlink w:history="1" r:id="rId_wbniapbusrdv9n3ki_z_">
+      <w:hyperlink w:history="1" r:id="rIduxn5wujrfol3t64e5rqzv">
         <w:r>
           <w:rPr>
             <w:color w:val="EA2E00"/>
@@ -7437,7 +7437,7 @@
         </w:rPr>
         <w:t xml:space="preserve">, </w:t>
       </w:r>
-      <w:hyperlink w:history="1" r:id="rIdrugc9cpupyid5avs1gh9z">
+      <w:hyperlink w:history="1" r:id="rIdlgcskggahawq_6rowauos">
         <w:r>
           <w:rPr>
             <w:color w:val="EA2E00"/>
@@ -7455,7 +7455,7 @@
         </w:rPr>
         <w:t xml:space="preserve">, </w:t>
       </w:r>
-      <w:hyperlink w:history="1" r:id="rId50jceo0p3zuvv6kyzae8d">
+      <w:hyperlink w:history="1" r:id="rIdtpcf9qvfwrvncwrx1hqu2">
         <w:r>
           <w:rPr>
             <w:color w:val="EA2E00"/>
@@ -7473,7 +7473,7 @@
         </w:rPr>
         <w:t xml:space="preserve">, </w:t>
       </w:r>
-      <w:hyperlink w:history="1" r:id="rIdnqis5pp3cce-y6zgetznk">
+      <w:hyperlink w:history="1" r:id="rIdc2oiqgp1xabofmzhzj0e3">
         <w:r>
           <w:rPr>
             <w:color w:val="EA2E00"/>
@@ -7491,7 +7491,7 @@
         </w:rPr>
         <w:t xml:space="preserve">, </w:t>
       </w:r>
-      <w:hyperlink w:history="1" r:id="rIdxesb0ph7fhzp4s_l1jw6k">
+      <w:hyperlink w:history="1" r:id="rIdbh-lseojhnnhnffjmkf8n">
         <w:r>
           <w:rPr>
             <w:color w:val="EA2E00"/>
@@ -7509,7 +7509,7 @@
         </w:rPr>
         <w:t xml:space="preserve">, </w:t>
       </w:r>
-      <w:hyperlink w:history="1" r:id="rIdqohahysurfteoeg9hv7u5">
+      <w:hyperlink w:history="1" r:id="rIdq6tih4wckxkcmqiublcow">
         <w:r>
           <w:rPr>
             <w:color w:val="EA2E00"/>
@@ -7527,7 +7527,7 @@
         </w:rPr>
         <w:t xml:space="preserve">, </w:t>
       </w:r>
-      <w:hyperlink w:history="1" r:id="rIdyrogmdkp2pcu7izxlpt3f">
+      <w:hyperlink w:history="1" r:id="rIdzbiproqfbhhy1-sejf_t7">
         <w:r>
           <w:rPr>
             <w:color w:val="EA2E00"/>
@@ -7588,7 +7588,7 @@
       </w:r>
     </w:p>
     <w:p>
-      <w:hyperlink w:history="1" r:id="rIdifvtehs0c_lxpzftoye41">
+      <w:hyperlink w:history="1" r:id="rIdvmzmataacsoyi0i-xgixk">
         <w:r>
           <w:rPr>
             <w:rStyle w:val="Hyperlink"/>
@@ -7609,7 +7609,7 @@
         </w:rPr>
         <w:t xml:space="preserve">Via </w:t>
       </w:r>
-      <w:hyperlink w:history="1" r:id="rIdfbtw8ltqttrgx5zbn8nyi">
+      <w:hyperlink w:history="1" r:id="rIddeshjvth-zixzzldmgcnk">
         <w:r>
           <w:rPr>
             <w:color w:val="EA2E00"/>
@@ -7627,7 +7627,7 @@
         </w:rPr>
         <w:t xml:space="preserve">, </w:t>
       </w:r>
-      <w:hyperlink w:history="1" r:id="rIdmus2y5_zjksvksyizbhyy">
+      <w:hyperlink w:history="1" r:id="rIdz5s2srowc4e48skc1mbvd">
         <w:r>
           <w:rPr>
             <w:color w:val="EA2E00"/>
@@ -7645,7 +7645,7 @@
         </w:rPr>
         <w:t xml:space="preserve">, </w:t>
       </w:r>
-      <w:hyperlink w:history="1" r:id="rId__qr3crdl4jiijtwxlnng">
+      <w:hyperlink w:history="1" r:id="rIdypxhffepsvvm2xgwsfmo0">
         <w:r>
           <w:rPr>
             <w:color w:val="EA2E00"/>
@@ -7663,7 +7663,7 @@
         </w:rPr>
         <w:t xml:space="preserve">, </w:t>
       </w:r>
-      <w:hyperlink w:history="1" r:id="rIdblmaew9vuafctgyq5tp_v">
+      <w:hyperlink w:history="1" r:id="rIdbvenhpt-6f46m5ss2u_qg">
         <w:r>
           <w:rPr>
             <w:color w:val="EA2E00"/>
@@ -7681,7 +7681,7 @@
         </w:rPr>
         <w:t xml:space="preserve">, </w:t>
       </w:r>
-      <w:hyperlink w:history="1" r:id="rId9fe_hmdor1qdsmk0576gi">
+      <w:hyperlink w:history="1" r:id="rIddkddgnevcrbhsbhmbw91v">
         <w:r>
           <w:rPr>
             <w:color w:val="EA2E00"/>
@@ -7742,7 +7742,7 @@
       </w:r>
     </w:p>
     <w:p>
-      <w:hyperlink w:history="1" r:id="rIdmszwngoy0eaymu4hkzc0c">
+      <w:hyperlink w:history="1" r:id="rIdmnduaj69zhzu0y_6fwrwb">
         <w:r>
           <w:rPr>
             <w:rStyle w:val="Hyperlink"/>
@@ -7763,7 +7763,7 @@
         </w:rPr>
         <w:t xml:space="preserve">Via </w:t>
       </w:r>
-      <w:hyperlink w:history="1" r:id="rIdn0zmkzok3ahxgjn0i5jqe">
+      <w:hyperlink w:history="1" r:id="rIdklxi2nr5tfa5oe8321yoj">
         <w:r>
           <w:rPr>
             <w:color w:val="EA2E00"/>
@@ -7781,7 +7781,7 @@
         </w:rPr>
         <w:t xml:space="preserve">, </w:t>
       </w:r>
-      <w:hyperlink w:history="1" r:id="rIdq2qyjei1usrgzaefgxrkj">
+      <w:hyperlink w:history="1" r:id="rIdgay4uzjrex7vy8zzc803n">
         <w:r>
           <w:rPr>
             <w:color w:val="EA2E00"/>
@@ -7799,7 +7799,7 @@
         </w:rPr>
         <w:t xml:space="preserve">, </w:t>
       </w:r>
-      <w:hyperlink w:history="1" r:id="rIdijnd3if8ozo4sr1hgnnbc">
+      <w:hyperlink w:history="1" r:id="rId5mkup6lay_p6cu5_97fqz">
         <w:r>
           <w:rPr>
             <w:color w:val="EA2E00"/>
@@ -7817,7 +7817,7 @@
         </w:rPr>
         <w:t xml:space="preserve">, </w:t>
       </w:r>
-      <w:hyperlink w:history="1" r:id="rIdlblbqgohgytf5tkujuscm">
+      <w:hyperlink w:history="1" r:id="rId95wsz0g_1ucbo00w0mww6">
         <w:r>
           <w:rPr>
             <w:color w:val="EA2E00"/>
@@ -7835,7 +7835,7 @@
         </w:rPr>
         <w:t xml:space="preserve">, </w:t>
       </w:r>
-      <w:hyperlink w:history="1" r:id="rIdzkw9f8trl4priw3sa8cyz">
+      <w:hyperlink w:history="1" r:id="rId5znlz8xnjotrl5el0jts9">
         <w:r>
           <w:rPr>
             <w:color w:val="EA2E00"/>
@@ -8416,7 +8416,7 @@
             </w:tcMar>
           </w:tcPr>
           <w:p>
-            <w:hyperlink w:history="1" r:id="rIduij4dmoj3rauhfeoedfta">
+            <w:hyperlink w:history="1" r:id="rIdch9usow1jyheocbxeh9qi">
               <w:r>
                 <w:rPr>
                   <w:b/>
@@ -8537,7 +8537,7 @@
             </w:tcMar>
           </w:tcPr>
           <w:p>
-            <w:hyperlink w:history="1" r:id="rIdyk9vt1osw3hbyh6x150eq">
+            <w:hyperlink w:history="1" r:id="rIdn0gxnig9pywhxxsayo_id">
               <w:r>
                 <w:rPr>
                   <w:b/>
@@ -8658,7 +8658,7 @@
             </w:tcMar>
           </w:tcPr>
           <w:p>
-            <w:hyperlink w:history="1" r:id="rIdws_kvfm5ij5llsibhx_4e">
+            <w:hyperlink w:history="1" r:id="rIdv7sofczwm61unsgmdvib7">
               <w:r>
                 <w:rPr>
                   <w:b/>
@@ -8779,7 +8779,7 @@
             </w:tcMar>
           </w:tcPr>
           <w:p>
-            <w:hyperlink w:history="1" r:id="rIdezn2j4r4johbmupdp2cu-">
+            <w:hyperlink w:history="1" r:id="rIdudis_d2zcgobff6yxxi-t">
               <w:r>
                 <w:rPr>
                   <w:b/>
@@ -8900,7 +8900,7 @@
             </w:tcMar>
           </w:tcPr>
           <w:p>
-            <w:hyperlink w:history="1" r:id="rIdmlwau-5hmk_enn64hwyyl">
+            <w:hyperlink w:history="1" r:id="rIdrdtiysm7zk7ztmnztl1c4">
               <w:r>
                 <w:rPr>
                   <w:b/>
@@ -9021,7 +9021,7 @@
             </w:tcMar>
           </w:tcPr>
           <w:p>
-            <w:hyperlink w:history="1" r:id="rId-i4ytlop1eogrgqzdfnld">
+            <w:hyperlink w:history="1" r:id="rIderfgmmkwvfqp-4wuvq1cg">
               <w:r>
                 <w:rPr>
                   <w:b/>
@@ -9142,7 +9142,7 @@
             </w:tcMar>
           </w:tcPr>
           <w:p>
-            <w:hyperlink w:history="1" r:id="rIdlcfuvpur66vl-osugbord">
+            <w:hyperlink w:history="1" r:id="rIdsmb6hq03hlbuymodzbi2q">
               <w:r>
                 <w:rPr>
                   <w:b/>
@@ -9263,7 +9263,7 @@
             </w:tcMar>
           </w:tcPr>
           <w:p>
-            <w:hyperlink w:history="1" r:id="rId7m8r1npxg3nheatkdvpw3">
+            <w:hyperlink w:history="1" r:id="rId3nk-b0rpxslxkhpdbqqit">
               <w:r>
                 <w:rPr>
                   <w:b/>
@@ -9384,7 +9384,7 @@
             </w:tcMar>
           </w:tcPr>
           <w:p>
-            <w:hyperlink w:history="1" r:id="rIdxbekjhrahujsud5u5-xl-">
+            <w:hyperlink w:history="1" r:id="rId5q-v3vbeovomrt_8veztd">
               <w:r>
                 <w:rPr>
                   <w:b/>
@@ -9505,7 +9505,7 @@
             </w:tcMar>
           </w:tcPr>
           <w:p>
-            <w:hyperlink w:history="1" r:id="rId1nw7fhnawmfwzggs_1cvi">
+            <w:hyperlink w:history="1" r:id="rIdgrl6z6-m-f_6qspe3xfto">
               <w:r>
                 <w:rPr>
                   <w:b/>
@@ -9626,7 +9626,7 @@
             </w:tcMar>
           </w:tcPr>
           <w:p>
-            <w:hyperlink w:history="1" r:id="rIdco5kjunwbatrat0hicjwj">
+            <w:hyperlink w:history="1" r:id="rIdnlnlcnarlbu97sevomp10">
               <w:r>
                 <w:rPr>
                   <w:b/>
@@ -9747,7 +9747,7 @@
             </w:tcMar>
           </w:tcPr>
           <w:p>
-            <w:hyperlink w:history="1" r:id="rIdc3upp5zsqvt0buedutwb2">
+            <w:hyperlink w:history="1" r:id="rId6ep53en8ggrjdmjaahn_t">
               <w:r>
                 <w:rPr>
                   <w:b/>
@@ -9930,7 +9930,7 @@
         </w:rPr>
         <w:t xml:space="preserve">Via </w:t>
       </w:r>
-      <w:hyperlink w:history="1" r:id="rId0uwt6ai3zbd1mguadag4h">
+      <w:hyperlink w:history="1" r:id="rIdr2e4yzvs1dieaobekxcfe">
         <w:r>
           <w:rPr>
             <w:color w:val="EA2E00"/>
@@ -9948,7 +9948,7 @@
         </w:rPr>
         <w:t xml:space="preserve">, </w:t>
       </w:r>
-      <w:hyperlink w:history="1" r:id="rIdjndns1kwvg0a-2qzeyxgy">
+      <w:hyperlink w:history="1" r:id="rIdpuxjqhocl1pywyolpakpr">
         <w:r>
           <w:rPr>
             <w:color w:val="EA2E00"/>
@@ -9991,7 +9991,7 @@
         </w:rPr>
         <w:t xml:space="preserve">Via </w:t>
       </w:r>
-      <w:hyperlink w:history="1" r:id="rIda9rjqwojsmukg0cnzexqn">
+      <w:hyperlink w:history="1" r:id="rIdrxvp4q7bnwecnb44inrdd">
         <w:r>
           <w:rPr>
             <w:color w:val="EA2E00"/>
@@ -10009,7 +10009,7 @@
         </w:rPr>
         <w:t xml:space="preserve">, </w:t>
       </w:r>
-      <w:hyperlink w:history="1" r:id="rIdnavmj9tl81p_f-5gdnngu">
+      <w:hyperlink w:history="1" r:id="rId3a-sgevzocz6hjaopsuty">
         <w:r>
           <w:rPr>
             <w:color w:val="EA2E00"/>
@@ -10027,7 +10027,7 @@
         </w:rPr>
         <w:t xml:space="preserve">, </w:t>
       </w:r>
-      <w:hyperlink w:history="1" r:id="rIdnxzvxcfu730ezvp1vx7lw">
+      <w:hyperlink w:history="1" r:id="rIdin5mntal98txrcgtonikt">
         <w:r>
           <w:rPr>
             <w:color w:val="EA2E00"/>
@@ -10045,7 +10045,7 @@
         </w:rPr>
         <w:t xml:space="preserve">, </w:t>
       </w:r>
-      <w:hyperlink w:history="1" r:id="rIdwe_zosgbhephmsuig2i65">
+      <w:hyperlink w:history="1" r:id="rIdsi0i-akaqkbr7k0bntje2">
         <w:r>
           <w:rPr>
             <w:color w:val="EA2E00"/>
@@ -10063,7 +10063,7 @@
         </w:rPr>
         <w:t xml:space="preserve">, </w:t>
       </w:r>
-      <w:hyperlink w:history="1" r:id="rIdg7erhkwks4kconn2nrfsy">
+      <w:hyperlink w:history="1" r:id="rIdn4v30-0e1ch02yebroyoz">
         <w:r>
           <w:rPr>
             <w:color w:val="EA2E00"/>
@@ -10081,7 +10081,7 @@
         </w:rPr>
         <w:t xml:space="preserve">, </w:t>
       </w:r>
-      <w:hyperlink w:history="1" r:id="rIdpfvq1h-d0anf7bhrv1d2k">
+      <w:hyperlink w:history="1" r:id="rIdvbvqxvx0ixtogt6ujjtbs">
         <w:r>
           <w:rPr>
             <w:color w:val="EA2E00"/>
@@ -10124,7 +10124,7 @@
         </w:rPr>
         <w:t xml:space="preserve">Via </w:t>
       </w:r>
-      <w:hyperlink w:history="1" r:id="rIdhkdy1prkbk76x7aapclyr">
+      <w:hyperlink w:history="1" r:id="rId3uqfnpnlz8w0mrbqt0hxc">
         <w:r>
           <w:rPr>
             <w:color w:val="EA2E00"/>
@@ -10142,7 +10142,7 @@
         </w:rPr>
         <w:t xml:space="preserve">, </w:t>
       </w:r>
-      <w:hyperlink w:history="1" r:id="rId5wm-ym4t659nfdqtch8_2">
+      <w:hyperlink w:history="1" r:id="rIdw34a8rky0dpasojy5qggu">
         <w:r>
           <w:rPr>
             <w:color w:val="EA2E00"/>
@@ -10160,7 +10160,7 @@
         </w:rPr>
         <w:t xml:space="preserve">, </w:t>
       </w:r>
-      <w:hyperlink w:history="1" r:id="rIdimdgfd5gkqsslemcxbtz9">
+      <w:hyperlink w:history="1" r:id="rIdblpmeucvzldp82bi3lzwo">
         <w:r>
           <w:rPr>
             <w:color w:val="EA2E00"/>
@@ -10178,7 +10178,7 @@
         </w:rPr>
         <w:t xml:space="preserve">, </w:t>
       </w:r>
-      <w:hyperlink w:history="1" r:id="rIdwff6dz4qc7wvujec_-klg">
+      <w:hyperlink w:history="1" r:id="rIda_izqas0tewnpnlycprus">
         <w:r>
           <w:rPr>
             <w:color w:val="EA2E00"/>
@@ -10196,7 +10196,7 @@
         </w:rPr>
         <w:t xml:space="preserve">, </w:t>
       </w:r>
-      <w:hyperlink w:history="1" r:id="rIdnedfmvgrzsripi3fkzr1t">
+      <w:hyperlink w:history="1" r:id="rId0bqc-ibqlmemo9yjwrpsk">
         <w:r>
           <w:rPr>
             <w:color w:val="EA2E00"/>
@@ -10239,7 +10239,7 @@
         </w:rPr>
         <w:t xml:space="preserve">Via </w:t>
       </w:r>
-      <w:hyperlink w:history="1" r:id="rId-f-tsgrpoxduvyvotk3zj">
+      <w:hyperlink w:history="1" r:id="rIdtgyeca1en2xglizdxwqfo">
         <w:r>
           <w:rPr>
             <w:color w:val="EA2E00"/>
@@ -10257,7 +10257,7 @@
         </w:rPr>
         <w:t xml:space="preserve">, </w:t>
       </w:r>
-      <w:hyperlink w:history="1" r:id="rIdorxccb-h_h4x0igjeytrn">
+      <w:hyperlink w:history="1" r:id="rIdh9u_bp4bppx4nj3fykmbg">
         <w:r>
           <w:rPr>
             <w:color w:val="EA2E00"/>
@@ -10275,7 +10275,7 @@
         </w:rPr>
         <w:t xml:space="preserve">, </w:t>
       </w:r>
-      <w:hyperlink w:history="1" r:id="rIdanjbtlqmg1qwg-wr67qtz">
+      <w:hyperlink w:history="1" r:id="rIdsh1wtlexcmvpz-trkud9a">
         <w:r>
           <w:rPr>
             <w:color w:val="EA2E00"/>
@@ -10293,7 +10293,7 @@
         </w:rPr>
         <w:t xml:space="preserve">, </w:t>
       </w:r>
-      <w:hyperlink w:history="1" r:id="rIdrsrza8joqtur5b6h5xcww">
+      <w:hyperlink w:history="1" r:id="rIdmv0lwxkedp85ldof1zygj">
         <w:r>
           <w:rPr>
             <w:color w:val="EA2E00"/>
@@ -10336,7 +10336,7 @@
         </w:rPr>
         <w:t xml:space="preserve">Via </w:t>
       </w:r>
-      <w:hyperlink w:history="1" r:id="rIdknxyxnrwh3xfzfrw2peu_">
+      <w:hyperlink w:history="1" r:id="rIdzrpqc8onjhgyvssgdywta">
         <w:r>
           <w:rPr>
             <w:color w:val="EA2E00"/>
@@ -10354,7 +10354,7 @@
         </w:rPr>
         <w:t xml:space="preserve">, </w:t>
       </w:r>
-      <w:hyperlink w:history="1" r:id="rIdeal2ncmof3gcrsrusv7_5">
+      <w:hyperlink w:history="1" r:id="rIdvrgnmkabb_a7damgzve29">
         <w:r>
           <w:rPr>
             <w:color w:val="EA2E00"/>
@@ -10372,7 +10372,7 @@
         </w:rPr>
         <w:t xml:space="preserve">, </w:t>
       </w:r>
-      <w:hyperlink w:history="1" r:id="rIdtdgtp5efa-kllwnwlxbhd">
+      <w:hyperlink w:history="1" r:id="rIdwwfitb25qrv7vo2xhndux">
         <w:r>
           <w:rPr>
             <w:color w:val="EA2E00"/>
@@ -10390,7 +10390,7 @@
         </w:rPr>
         <w:t xml:space="preserve">, </w:t>
       </w:r>
-      <w:hyperlink w:history="1" r:id="rIdxn6klupuqil-hmrnxjtm5">
+      <w:hyperlink w:history="1" r:id="rIdgv7qvnr5yu3tlehr9iazn">
         <w:r>
           <w:rPr>
             <w:color w:val="EA2E00"/>
@@ -10433,7 +10433,7 @@
         </w:rPr>
         <w:t xml:space="preserve">Via </w:t>
       </w:r>
-      <w:hyperlink w:history="1" r:id="rIdowtvkxkl9_f0pnrc_qz1r">
+      <w:hyperlink w:history="1" r:id="rIdizv4dsyurafxvukpt7jf3">
         <w:r>
           <w:rPr>
             <w:color w:val="EA2E00"/>
@@ -10451,7 +10451,7 @@
         </w:rPr>
         <w:t xml:space="preserve">, </w:t>
       </w:r>
-      <w:hyperlink w:history="1" r:id="rIdikidtbxl_cmdbvjrwleoo">
+      <w:hyperlink w:history="1" r:id="rIdhc_utphoeji62amkzw0ah">
         <w:r>
           <w:rPr>
             <w:color w:val="EA2E00"/>
@@ -10469,7 +10469,7 @@
         </w:rPr>
         <w:t xml:space="preserve">, </w:t>
       </w:r>
-      <w:hyperlink w:history="1" r:id="rIdft3-ogdvohy7tljqf8vbd">
+      <w:hyperlink w:history="1" r:id="rId3xkytki9bohrnuogwbcyh">
         <w:r>
           <w:rPr>
             <w:color w:val="EA2E00"/>
@@ -10545,7 +10545,7 @@
         </w:rPr>
         <w:t xml:space="preserve">Via </w:t>
       </w:r>
-      <w:hyperlink w:history="1" r:id="rIdknggt6jddvk1s0-2iohco">
+      <w:hyperlink w:history="1" r:id="rIdcf6kyhezuqdx8ra_2rvng">
         <w:r>
           <w:rPr>
             <w:color w:val="EA2E00"/>
@@ -10563,7 +10563,7 @@
         </w:rPr>
         <w:t xml:space="preserve">, </w:t>
       </w:r>
-      <w:hyperlink w:history="1" r:id="rIdl2rqtk2_baml81p87m0hs">
+      <w:hyperlink w:history="1" r:id="rIdljljfs6pizjh3fghrpqjo">
         <w:r>
           <w:rPr>
             <w:color w:val="EA2E00"/>
@@ -10581,7 +10581,7 @@
         </w:rPr>
         <w:t xml:space="preserve">, </w:t>
       </w:r>
-      <w:hyperlink w:history="1" r:id="rIdipredgxs-nlwy1jnbvq9g">
+      <w:hyperlink w:history="1" r:id="rIdlkgb_r0__vmnnm1mhzg_6">
         <w:r>
           <w:rPr>
             <w:color w:val="EA2E00"/>
@@ -11552,7 +11552,7 @@
             </w:r>
           </w:p>
           <w:p>
-            <w:hyperlink w:history="1" r:id="rIdtudngim69xj-xqaeiaq4b">
+            <w:hyperlink w:history="1" r:id="rIdc_cpca4ffik1kopgn6w3l">
               <w:r>
                 <w:rPr>
                   <w:rStyle w:val="Hyperlink"/>
@@ -11639,7 +11639,7 @@
         <w:spacing w:after="80"/>
         <w:ind w:left="620"/>
       </w:pPr>
-      <w:hyperlink w:history="1" r:id="rIdoeuygjwojugyjzaomh3nh">
+      <w:hyperlink w:history="1" r:id="rIdap1g8hcbrqasa1kfkwbst">
         <w:r>
           <w:rPr>
             <w:sz w:val="16"/>
@@ -11675,7 +11675,7 @@
         <w:spacing w:after="80"/>
         <w:ind w:left="620"/>
       </w:pPr>
-      <w:hyperlink w:history="1" r:id="rIdkxrlxdeunuh2telntds4t">
+      <w:hyperlink w:history="1" r:id="rIdpudpbsyj6-wpmjywuvnaw">
         <w:r>
           <w:rPr>
             <w:sz w:val="16"/>
@@ -11711,7 +11711,7 @@
         <w:spacing w:after="80"/>
         <w:ind w:left="620"/>
       </w:pPr>
-      <w:hyperlink w:history="1" r:id="rIdgjnqwmbqmzhldn_mj7jgg">
+      <w:hyperlink w:history="1" r:id="rId7menswwhrlvn4tiebvyef">
         <w:r>
           <w:rPr>
             <w:sz w:val="16"/>
@@ -11747,7 +11747,7 @@
         <w:spacing w:after="80"/>
         <w:ind w:left="620"/>
       </w:pPr>
-      <w:hyperlink w:history="1" r:id="rIduhnwuyqdszochdcdps58g">
+      <w:hyperlink w:history="1" r:id="rIdhtrn63nxebopmykrihdwq">
         <w:r>
           <w:rPr>
             <w:sz w:val="16"/>
@@ -11783,7 +11783,7 @@
         <w:spacing w:after="80"/>
         <w:ind w:left="620"/>
       </w:pPr>
-      <w:hyperlink w:history="1" r:id="rIdxczxv2d-15wlcqklvnttf">
+      <w:hyperlink w:history="1" r:id="rIdhzdqmxdvfgjrb2ajvksm7">
         <w:r>
           <w:rPr>
             <w:sz w:val="16"/>
@@ -11819,7 +11819,7 @@
         <w:spacing w:after="80"/>
         <w:ind w:left="620"/>
       </w:pPr>
-      <w:hyperlink w:history="1" r:id="rIdxzu19a9d68r-nktiscr8d">
+      <w:hyperlink w:history="1" r:id="rIdidxd5mocnow2ce2z-a35t">
         <w:r>
           <w:rPr>
             <w:sz w:val="16"/>
@@ -11855,7 +11855,7 @@
         <w:spacing w:after="80"/>
         <w:ind w:left="620"/>
       </w:pPr>
-      <w:hyperlink w:history="1" r:id="rIdrmz4poqfjm0fjgycn2yh9">
+      <w:hyperlink w:history="1" r:id="rIdx2po109st0wevi67kv3xo">
         <w:r>
           <w:rPr>
             <w:sz w:val="16"/>
@@ -11899,7 +11899,7 @@
         <w:spacing w:after="80"/>
         <w:ind w:left="620"/>
       </w:pPr>
-      <w:hyperlink w:history="1" r:id="rIdw49kbs5ap16rb5-fs8djc">
+      <w:hyperlink w:history="1" r:id="rIdc3ljuyeoirbhr_thexzpa">
         <w:r>
           <w:rPr>
             <w:sz w:val="16"/>
@@ -11935,7 +11935,7 @@
         <w:spacing w:after="80"/>
         <w:ind w:left="620"/>
       </w:pPr>
-      <w:hyperlink w:history="1" r:id="rIdk8tvqeavqwz5jzsxtncpg">
+      <w:hyperlink w:history="1" r:id="rIdhghmvn-xcvzyyvpy4lwcp">
         <w:r>
           <w:rPr>
             <w:sz w:val="16"/>
@@ -11971,7 +11971,7 @@
         <w:spacing w:after="80"/>
         <w:ind w:left="620"/>
       </w:pPr>
-      <w:hyperlink w:history="1" r:id="rId9ila1ieeqqiwcztkwqenq">
+      <w:hyperlink w:history="1" r:id="rIdjjvs0qme7ctentsi5wyaj">
         <w:r>
           <w:rPr>
             <w:sz w:val="16"/>
@@ -12007,7 +12007,7 @@
         <w:spacing w:after="80"/>
         <w:ind w:left="620"/>
       </w:pPr>
-      <w:hyperlink w:history="1" r:id="rId3_v3uwggplcl-tosfbghv">
+      <w:hyperlink w:history="1" r:id="rIdohfae9umrtnn1fu989cxk">
         <w:r>
           <w:rPr>
             <w:sz w:val="16"/>
@@ -12051,7 +12051,7 @@
         <w:spacing w:after="80"/>
         <w:ind w:left="620"/>
       </w:pPr>
-      <w:hyperlink w:history="1" r:id="rIdwp96ykyro7ta2d9thlp_c">
+      <w:hyperlink w:history="1" r:id="rIdk8wkolcybkuittn3axefv">
         <w:r>
           <w:rPr>
             <w:sz w:val="16"/>
@@ -12087,7 +12087,7 @@
         <w:spacing w:after="80"/>
         <w:ind w:left="620"/>
       </w:pPr>
-      <w:hyperlink w:history="1" r:id="rIdweevw1lgtw-qgdn30ttwa">
+      <w:hyperlink w:history="1" r:id="rIdu5fe8st4koi9ogtdhrai8">
         <w:r>
           <w:rPr>
             <w:sz w:val="16"/>
@@ -12123,7 +12123,7 @@
         <w:spacing w:after="80"/>
         <w:ind w:left="620"/>
       </w:pPr>
-      <w:hyperlink w:history="1" r:id="rId-pyq8dqum0tmwfevir7xb">
+      <w:hyperlink w:history="1" r:id="rIdic7nc3-rlcpif6eevfb75">
         <w:r>
           <w:rPr>
             <w:sz w:val="16"/>
@@ -12167,7 +12167,7 @@
         <w:spacing w:after="80"/>
         <w:ind w:left="620"/>
       </w:pPr>
-      <w:hyperlink w:history="1" r:id="rId3jhlpvydzq2vinqx9uuh7">
+      <w:hyperlink w:history="1" r:id="rIdm0xsgc7a9gap4hhowqjfa">
         <w:r>
           <w:rPr>
             <w:sz w:val="16"/>
@@ -12203,7 +12203,7 @@
         <w:spacing w:after="80"/>
         <w:ind w:left="620"/>
       </w:pPr>
-      <w:hyperlink w:history="1" r:id="rIdc6nxhtdikeghtg5fsay95">
+      <w:hyperlink w:history="1" r:id="rId8oo_7m9wfwteh1ldmconl">
         <w:r>
           <w:rPr>
             <w:sz w:val="16"/>
@@ -12239,7 +12239,7 @@
         <w:spacing w:after="80"/>
         <w:ind w:left="620"/>
       </w:pPr>
-      <w:hyperlink w:history="1" r:id="rIda8eanncjpoobijx9jr0tl">
+      <w:hyperlink w:history="1" r:id="rIdwirxx6oxqfakth2zlocwp">
         <w:r>
           <w:rPr>
             <w:sz w:val="16"/>
@@ -12283,7 +12283,7 @@
         <w:spacing w:after="80"/>
         <w:ind w:left="620"/>
       </w:pPr>
-      <w:hyperlink w:history="1" r:id="rId5yy2nkzbvpcj9b5-mu3s2">
+      <w:hyperlink w:history="1" r:id="rIdcnphzg0xc8lqqrxi4ueaw">
         <w:r>
           <w:rPr>
             <w:sz w:val="16"/>
@@ -12319,7 +12319,7 @@
         <w:spacing w:after="80"/>
         <w:ind w:left="620"/>
       </w:pPr>
-      <w:hyperlink w:history="1" r:id="rId9vgb8y4fathvh8wyiisip">
+      <w:hyperlink w:history="1" r:id="rIdh9chevdhgpcoi7ufrrxkf">
         <w:r>
           <w:rPr>
             <w:sz w:val="16"/>
@@ -12363,7 +12363,7 @@
         <w:spacing w:after="80"/>
         <w:ind w:left="620"/>
       </w:pPr>
-      <w:hyperlink w:history="1" r:id="rId1jq7nng_xbkivjdwrhwyz">
+      <w:hyperlink w:history="1" r:id="rId8ne8u135f2mx8bavumwav">
         <w:r>
           <w:rPr>
             <w:sz w:val="16"/>
@@ -12399,7 +12399,7 @@
         <w:spacing w:after="80"/>
         <w:ind w:left="620"/>
       </w:pPr>
-      <w:hyperlink w:history="1" r:id="rId6y8zygdzgqlb-jfvtyzym">
+      <w:hyperlink w:history="1" r:id="rIddtc6pofcsshbojrbbwev2">
         <w:r>
           <w:rPr>
             <w:sz w:val="16"/>
@@ -12435,7 +12435,7 @@
         <w:spacing w:after="80"/>
         <w:ind w:left="620"/>
       </w:pPr>
-      <w:hyperlink w:history="1" r:id="rIdktok4u4chwduaqgz6h3il">
+      <w:hyperlink w:history="1" r:id="rIdnajigd8shvlnfz1igu3zx">
         <w:r>
           <w:rPr>
             <w:sz w:val="16"/>
@@ -12479,7 +12479,7 @@
         <w:spacing w:after="80"/>
         <w:ind w:left="620"/>
       </w:pPr>
-      <w:hyperlink w:history="1" r:id="rIdqffzd0pquxkjh_1zvhylw">
+      <w:hyperlink w:history="1" r:id="rIdnymn-mcjlhddpzkwfszde">
         <w:r>
           <w:rPr>
             <w:sz w:val="16"/>
@@ -12515,7 +12515,7 @@
         <w:spacing w:after="80"/>
         <w:ind w:left="620"/>
       </w:pPr>
-      <w:hyperlink w:history="1" r:id="rIdy_fyz5fgklw_qdpykf8nn">
+      <w:hyperlink w:history="1" r:id="rIdnfgokk9sful7tdqrrqyqi">
         <w:r>
           <w:rPr>
             <w:sz w:val="16"/>
@@ -12551,7 +12551,7 @@
         <w:spacing w:after="80"/>
         <w:ind w:left="620"/>
       </w:pPr>
-      <w:hyperlink w:history="1" r:id="rIdu5ifkd6gddxhtj7nl2lr-">
+      <w:hyperlink w:history="1" r:id="rIdqrr-ckpzyvxee96yeyo9m">
         <w:r>
           <w:rPr>
             <w:sz w:val="16"/>
@@ -12587,7 +12587,7 @@
         <w:spacing w:after="80"/>
         <w:ind w:left="620"/>
       </w:pPr>
-      <w:hyperlink w:history="1" r:id="rIdbrcyqmfu_423q-phs523d">
+      <w:hyperlink w:history="1" r:id="rIdbcfx_gq4srgen_dp2-eqp">
         <w:r>
           <w:rPr>
             <w:sz w:val="16"/>
@@ -12631,7 +12631,7 @@
         <w:spacing w:after="80"/>
         <w:ind w:left="620"/>
       </w:pPr>
-      <w:hyperlink w:history="1" r:id="rIdrk4eg33lqxgqglrexrual">
+      <w:hyperlink w:history="1" r:id="rIddjxtfvhrpe4vheih7pfmg">
         <w:r>
           <w:rPr>
             <w:sz w:val="16"/>
@@ -12667,7 +12667,7 @@
         <w:spacing w:after="80"/>
         <w:ind w:left="620"/>
       </w:pPr>
-      <w:hyperlink w:history="1" r:id="rIdc7yqzvd84fc3unb88htd4">
+      <w:hyperlink w:history="1" r:id="rIdclefzs1nlodlhuipgssoi">
         <w:r>
           <w:rPr>
             <w:sz w:val="16"/>
@@ -12703,7 +12703,7 @@
         <w:spacing w:after="80"/>
         <w:ind w:left="620"/>
       </w:pPr>
-      <w:hyperlink w:history="1" r:id="rIdcowrtjxacvtmq7e9okyu3">
+      <w:hyperlink w:history="1" r:id="rIdpsxbngm9ahgrplubnbtnx">
         <w:r>
           <w:rPr>
             <w:sz w:val="16"/>
@@ -12739,7 +12739,7 @@
         <w:spacing w:after="80"/>
         <w:ind w:left="620"/>
       </w:pPr>
-      <w:hyperlink w:history="1" r:id="rId8ds_t-t4nlkkb11t4quqk">
+      <w:hyperlink w:history="1" r:id="rIdtxeu3isr6gmttidrxnz4h">
         <w:r>
           <w:rPr>
             <w:sz w:val="16"/>
@@ -12775,7 +12775,7 @@
         <w:spacing w:after="80"/>
         <w:ind w:left="620"/>
       </w:pPr>
-      <w:hyperlink w:history="1" r:id="rIdebwkcmtl4_xvfuygkghs1">
+      <w:hyperlink w:history="1" r:id="rIdnxlwfuhmbsplfhv1yo6qu">
         <w:r>
           <w:rPr>
             <w:sz w:val="16"/>
@@ -12811,7 +12811,7 @@
         <w:spacing w:after="80"/>
         <w:ind w:left="620"/>
       </w:pPr>
-      <w:hyperlink w:history="1" r:id="rIdlazbjfcy9p8zeb9vp5kqv">
+      <w:hyperlink w:history="1" r:id="rIdf3vjukg16u2rfcdydzend">
         <w:r>
           <w:rPr>
             <w:sz w:val="16"/>
@@ -12847,7 +12847,7 @@
         <w:spacing w:after="80"/>
         <w:ind w:left="620"/>
       </w:pPr>
-      <w:hyperlink w:history="1" r:id="rIdwaahhgspncl65pohzd-py">
+      <w:hyperlink w:history="1" r:id="rId13yowvmahrus2pzgh7ewh">
         <w:r>
           <w:rPr>
             <w:sz w:val="16"/>
@@ -12909,7 +12909,7 @@
         </w:numPr>
         <w:spacing w:after="60"/>
       </w:pPr>
-      <w:hyperlink w:history="1" r:id="rIdrn-0bit9qlfu_bses8m1k">
+      <w:hyperlink w:history="1" r:id="rId7ivtzhq_thicnuax2km_i">
         <w:r>
           <w:rPr>
             <w:sz w:val="18"/>
@@ -12937,7 +12937,7 @@
         </w:numPr>
         <w:spacing w:after="60"/>
       </w:pPr>
-      <w:hyperlink w:history="1" r:id="rIdwjez10bpbh3xuzff7fp-q">
+      <w:hyperlink w:history="1" r:id="rIdhkzqfth26dcxj9tphri60">
         <w:r>
           <w:rPr>
             <w:sz w:val="18"/>
@@ -12965,7 +12965,7 @@
         </w:numPr>
         <w:spacing w:after="60"/>
       </w:pPr>
-      <w:hyperlink w:history="1" r:id="rIdrwxnckhu6moohl7qrvz01">
+      <w:hyperlink w:history="1" r:id="rId_yivhs3obzcnogv3nwifv">
         <w:r>
           <w:rPr>
             <w:sz w:val="18"/>
@@ -12993,7 +12993,7 @@
         </w:numPr>
         <w:spacing w:after="60"/>
       </w:pPr>
-      <w:hyperlink w:history="1" r:id="rIdvz0htvpt8soi7upkv9vw2">
+      <w:hyperlink w:history="1" r:id="rIdcvar2nkniwnrtxpwf4o2f">
         <w:r>
           <w:rPr>
             <w:sz w:val="18"/>
@@ -13021,7 +13021,7 @@
         </w:numPr>
         <w:spacing w:after="60"/>
       </w:pPr>
-      <w:hyperlink w:history="1" r:id="rIdblvbumwv4xwgm9rh6tm0n">
+      <w:hyperlink w:history="1" r:id="rIdqsldvfor8kg-izwramdc6">
         <w:r>
           <w:rPr>
             <w:sz w:val="18"/>
@@ -13049,7 +13049,7 @@
         </w:numPr>
         <w:spacing w:after="60"/>
       </w:pPr>
-      <w:hyperlink w:history="1" r:id="rIdjiy2__jy5hun-he7dxxdi">
+      <w:hyperlink w:history="1" r:id="rIdoy4xoq3hb8xhu84tebi2k">
         <w:r>
           <w:rPr>
             <w:sz w:val="18"/>
@@ -13077,7 +13077,7 @@
         </w:numPr>
         <w:spacing w:after="60"/>
       </w:pPr>
-      <w:hyperlink w:history="1" r:id="rIdz3z2ntw7gi8kji6b9yv5r">
+      <w:hyperlink w:history="1" r:id="rIdajmyjng6c_t9enihuh87b">
         <w:r>
           <w:rPr>
             <w:sz w:val="18"/>
@@ -13105,7 +13105,7 @@
         </w:numPr>
         <w:spacing w:after="60"/>
       </w:pPr>
-      <w:hyperlink w:history="1" r:id="rIdsr17gcr3mzot3gbkfo3cp">
+      <w:hyperlink w:history="1" r:id="rIdi4tctc3_sp43nuymp99oa">
         <w:r>
           <w:rPr>
             <w:sz w:val="18"/>
@@ -13133,7 +13133,7 @@
         </w:numPr>
         <w:spacing w:after="60"/>
       </w:pPr>
-      <w:hyperlink w:history="1" r:id="rIdc65hgaacsjylifdbheedt">
+      <w:hyperlink w:history="1" r:id="rIdfb0mgmytm814ykltu4b5d">
         <w:r>
           <w:rPr>
             <w:sz w:val="18"/>
@@ -13161,7 +13161,7 @@
         </w:numPr>
         <w:spacing w:after="60"/>
       </w:pPr>
-      <w:hyperlink w:history="1" r:id="rIddghwrsxxtjhwssyduribw">
+      <w:hyperlink w:history="1" r:id="rIdomvkp6xt-rn1j4u0terbu">
         <w:r>
           <w:rPr>
             <w:sz w:val="18"/>
@@ -13189,7 +13189,7 @@
         </w:numPr>
         <w:spacing w:after="60"/>
       </w:pPr>
-      <w:hyperlink w:history="1" r:id="rId9vcekgppftskslq53p4vy">
+      <w:hyperlink w:history="1" r:id="rId7qj8gdfyfuka7t4b0njwj">
         <w:r>
           <w:rPr>
             <w:sz w:val="18"/>
@@ -13217,7 +13217,7 @@
         </w:numPr>
         <w:spacing w:after="60"/>
       </w:pPr>
-      <w:hyperlink w:history="1" r:id="rIdr4slb9gnqlup4mw9eujna">
+      <w:hyperlink w:history="1" r:id="rIdpbepf8ldbrrrwheoboztp">
         <w:r>
           <w:rPr>
             <w:sz w:val="18"/>
@@ -13245,7 +13245,7 @@
         </w:numPr>
         <w:spacing w:after="60"/>
       </w:pPr>
-      <w:hyperlink w:history="1" r:id="rIdup58lhduv_bbmbtnqfglw">
+      <w:hyperlink w:history="1" r:id="rIdm_gwc_wlgbw1-khvbjgny">
         <w:r>
           <w:rPr>
             <w:sz w:val="18"/>
@@ -13273,7 +13273,7 @@
         </w:numPr>
         <w:spacing w:after="60"/>
       </w:pPr>
-      <w:hyperlink w:history="1" r:id="rIdou_ofg1rehy9qgu-u6ts0">
+      <w:hyperlink w:history="1" r:id="rIdgtnft5clhumqzctkbvcmr">
         <w:r>
           <w:rPr>
             <w:sz w:val="18"/>
@@ -13301,7 +13301,7 @@
         </w:numPr>
         <w:spacing w:after="60"/>
       </w:pPr>
-      <w:hyperlink w:history="1" r:id="rIdkhh7onfks8y15rnmfh652">
+      <w:hyperlink w:history="1" r:id="rId6tufgo7a0mzaijaluu27m">
         <w:r>
           <w:rPr>
             <w:sz w:val="18"/>
@@ -13329,7 +13329,7 @@
         </w:numPr>
         <w:spacing w:after="60"/>
       </w:pPr>
-      <w:hyperlink w:history="1" r:id="rIdbxkzfrnqoi1sc24r0mjsx">
+      <w:hyperlink w:history="1" r:id="rId7c3pbcjqwzzv5zkaoj5m4">
         <w:r>
           <w:rPr>
             <w:sz w:val="18"/>
@@ -13357,7 +13357,7 @@
         </w:numPr>
         <w:spacing w:after="60"/>
       </w:pPr>
-      <w:hyperlink w:history="1" r:id="rIdu4lhj2yu9rce2bvnsidcu">
+      <w:hyperlink w:history="1" r:id="rIdfokomofahuo8kaevtpidb">
         <w:r>
           <w:rPr>
             <w:sz w:val="18"/>
@@ -13385,7 +13385,7 @@
         </w:numPr>
         <w:spacing w:after="60"/>
       </w:pPr>
-      <w:hyperlink w:history="1" r:id="rIdido6qfflf6a1ayyywqwru">
+      <w:hyperlink w:history="1" r:id="rIdblqywsthmmyemgw4mqncr">
         <w:r>
           <w:rPr>
             <w:sz w:val="18"/>
@@ -13413,7 +13413,7 @@
         </w:numPr>
         <w:spacing w:after="60"/>
       </w:pPr>
-      <w:hyperlink w:history="1" r:id="rIdnhybzxoe5fnkkq0fpc2wl">
+      <w:hyperlink w:history="1" r:id="rIdwvauosxdnjvzmck7ju242">
         <w:r>
           <w:rPr>
             <w:sz w:val="18"/>
@@ -13441,7 +13441,7 @@
         </w:numPr>
         <w:spacing w:after="60"/>
       </w:pPr>
-      <w:hyperlink w:history="1" r:id="rId9nlmaqkek0v5vta56eu3z">
+      <w:hyperlink w:history="1" r:id="rIdp_n72tclg0tepuytmnggq">
         <w:r>
           <w:rPr>
             <w:sz w:val="18"/>
@@ -13469,7 +13469,7 @@
         </w:numPr>
         <w:spacing w:after="60"/>
       </w:pPr>
-      <w:hyperlink w:history="1" r:id="rIdjbbekziwk4e3su4nzopt8">
+      <w:hyperlink w:history="1" r:id="rIdihfp38pankjnmi2ezfsei">
         <w:r>
           <w:rPr>
             <w:sz w:val="18"/>
@@ -13497,7 +13497,7 @@
         </w:numPr>
         <w:spacing w:after="60"/>
       </w:pPr>
-      <w:hyperlink w:history="1" r:id="rIdaxvjypaz2lmqw15ugf7bf">
+      <w:hyperlink w:history="1" r:id="rIdggm7pdfdviddmvjt56oz3">
         <w:r>
           <w:rPr>
             <w:sz w:val="18"/>
@@ -13525,7 +13525,7 @@
         </w:numPr>
         <w:spacing w:after="60"/>
       </w:pPr>
-      <w:hyperlink w:history="1" r:id="rId8x8vu1ouhhv5kj48mhxoe">
+      <w:hyperlink w:history="1" r:id="rIdeltxzo6vtwrujqy5bzrfp">
         <w:r>
           <w:rPr>
             <w:sz w:val="18"/>
@@ -13553,7 +13553,7 @@
         </w:numPr>
         <w:spacing w:after="60"/>
       </w:pPr>
-      <w:hyperlink w:history="1" r:id="rIdh6oxia5zpqwzhyjbrv--j">
+      <w:hyperlink w:history="1" r:id="rIduwd7ujwktvxa724zmcjpi">
         <w:r>
           <w:rPr>
             <w:sz w:val="18"/>
@@ -13581,7 +13581,7 @@
         </w:numPr>
         <w:spacing w:after="60"/>
       </w:pPr>
-      <w:hyperlink w:history="1" r:id="rIdk9afy0ng3x9xvo90rhn1v">
+      <w:hyperlink w:history="1" r:id="rId24spszi6irbupnvduas5a">
         <w:r>
           <w:rPr>
             <w:sz w:val="18"/>
@@ -13609,7 +13609,7 @@
         </w:numPr>
         <w:spacing w:after="60"/>
       </w:pPr>
-      <w:hyperlink w:history="1" r:id="rId3elxglc6n6awothw3tjaz">
+      <w:hyperlink w:history="1" r:id="rIde0aaiu_cl-mz_ossvhodb">
         <w:r>
           <w:rPr>
             <w:sz w:val="18"/>
@@ -13637,7 +13637,7 @@
         </w:numPr>
         <w:spacing w:after="60"/>
       </w:pPr>
-      <w:hyperlink w:history="1" r:id="rIdn4lkkbs0avljo3k3-7fhy">
+      <w:hyperlink w:history="1" r:id="rIdrnxpojqnzevdsajutjqpa">
         <w:r>
           <w:rPr>
             <w:sz w:val="18"/>
@@ -13665,7 +13665,7 @@
         </w:numPr>
         <w:spacing w:after="60"/>
       </w:pPr>
-      <w:hyperlink w:history="1" r:id="rIdzqq7j_zdgr37or0lxpmdm">
+      <w:hyperlink w:history="1" r:id="rIdv7-g4vl4t-yei4sebzzm9">
         <w:r>
           <w:rPr>
             <w:sz w:val="18"/>
@@ -13693,7 +13693,7 @@
         </w:numPr>
         <w:spacing w:after="60"/>
       </w:pPr>
-      <w:hyperlink w:history="1" r:id="rIdkzf0jvze_1eqtfhie63ui">
+      <w:hyperlink w:history="1" r:id="rIdbbegbbuwurtgnonmhhfp_">
         <w:r>
           <w:rPr>
             <w:sz w:val="18"/>
@@ -13721,7 +13721,7 @@
         </w:numPr>
         <w:spacing w:after="60"/>
       </w:pPr>
-      <w:hyperlink w:history="1" r:id="rIdwd50oireula8n-i1cxp61">
+      <w:hyperlink w:history="1" r:id="rIdnfex26lwjdau9neaph2fo">
         <w:r>
           <w:rPr>
             <w:sz w:val="18"/>
@@ -13749,7 +13749,7 @@
         </w:numPr>
         <w:spacing w:after="60"/>
       </w:pPr>
-      <w:hyperlink w:history="1" r:id="rIdiceo3iywtt-m5a0pcriq1">
+      <w:hyperlink w:history="1" r:id="rIdsqpudiarqtpcycsf8dcen">
         <w:r>
           <w:rPr>
             <w:sz w:val="18"/>
@@ -13777,7 +13777,7 @@
         </w:numPr>
         <w:spacing w:after="60"/>
       </w:pPr>
-      <w:hyperlink w:history="1" r:id="rIdwoiuy6cuyg0xjhizpykyr">
+      <w:hyperlink w:history="1" r:id="rIddcqztdipcjqrp-zqzteyr">
         <w:r>
           <w:rPr>
             <w:sz w:val="18"/>
@@ -13805,7 +13805,7 @@
         </w:numPr>
         <w:spacing w:after="60"/>
       </w:pPr>
-      <w:hyperlink w:history="1" r:id="rIdmpjdplhnv63w1kozyljlu">
+      <w:hyperlink w:history="1" r:id="rId47hzfq4diknytzvlmzpbx">
         <w:r>
           <w:rPr>
             <w:sz w:val="18"/>
@@ -13833,7 +13833,7 @@
         </w:numPr>
         <w:spacing w:after="60"/>
       </w:pPr>
-      <w:hyperlink w:history="1" r:id="rIdtxxukoylfulmwcncxa2lw">
+      <w:hyperlink w:history="1" r:id="rIdtvaoxwvkesll9yujjdnnd">
         <w:r>
           <w:rPr>
             <w:sz w:val="18"/>
@@ -13861,7 +13861,7 @@
         </w:numPr>
         <w:spacing w:after="60"/>
       </w:pPr>
-      <w:hyperlink w:history="1" r:id="rIdwdewxpvrp-loj5ybmlbxl">
+      <w:hyperlink w:history="1" r:id="rIdtsuqmjkk_d8iz3fybmvbq">
         <w:r>
           <w:rPr>
             <w:sz w:val="18"/>
@@ -13889,7 +13889,7 @@
         </w:numPr>
         <w:spacing w:after="60"/>
       </w:pPr>
-      <w:hyperlink w:history="1" r:id="rIdwqspf-nnltzbadd7uq_i7">
+      <w:hyperlink w:history="1" r:id="rIdmw15xj2jfdvazsyrh-cnx">
         <w:r>
           <w:rPr>
             <w:sz w:val="18"/>
@@ -13917,7 +13917,7 @@
         </w:numPr>
         <w:spacing w:after="60"/>
       </w:pPr>
-      <w:hyperlink w:history="1" r:id="rIdtg-ywvan9yhuvrwd-up5y">
+      <w:hyperlink w:history="1" r:id="rId-xhuazlj7lkp8aqmkvuko">
         <w:r>
           <w:rPr>
             <w:sz w:val="18"/>
@@ -13945,7 +13945,7 @@
         </w:numPr>
         <w:spacing w:after="60"/>
       </w:pPr>
-      <w:hyperlink w:history="1" r:id="rIdyqqzeu1ag-uvd0ezdj3ov">
+      <w:hyperlink w:history="1" r:id="rIdjqw2yimkx0ddnakaxbd93">
         <w:r>
           <w:rPr>
             <w:sz w:val="18"/>
@@ -13973,7 +13973,7 @@
         </w:numPr>
         <w:spacing w:after="60"/>
       </w:pPr>
-      <w:hyperlink w:history="1" r:id="rIdxsut3ig7t4qgdqcptlzks">
+      <w:hyperlink w:history="1" r:id="rIdugrtd_djbiwzyc56juigi">
         <w:r>
           <w:rPr>
             <w:sz w:val="18"/>
@@ -14001,7 +14001,7 @@
         </w:numPr>
         <w:spacing w:after="60"/>
       </w:pPr>
-      <w:hyperlink w:history="1" r:id="rId3b6dyxvrueasrbpvru2v5">
+      <w:hyperlink w:history="1" r:id="rIdi9b070jdofdx4dmwevzop">
         <w:r>
           <w:rPr>
             <w:sz w:val="18"/>
@@ -14029,7 +14029,7 @@
         </w:numPr>
         <w:spacing w:after="60"/>
       </w:pPr>
-      <w:hyperlink w:history="1" r:id="rIdahyutco4gmies8lvktefn">
+      <w:hyperlink w:history="1" r:id="rIdzq1hr-nqcoqys9q9dbjkd">
         <w:r>
           <w:rPr>
             <w:sz w:val="18"/>
@@ -14057,7 +14057,7 @@
         </w:numPr>
         <w:spacing w:after="60"/>
       </w:pPr>
-      <w:hyperlink w:history="1" r:id="rIdr-nwipsxi3lt65i4xudyw">
+      <w:hyperlink w:history="1" r:id="rId9mpkae4nrtt_swersno_m">
         <w:r>
           <w:rPr>
             <w:sz w:val="18"/>
@@ -14085,7 +14085,7 @@
         </w:numPr>
         <w:spacing w:after="60"/>
       </w:pPr>
-      <w:hyperlink w:history="1" r:id="rIdpurkuki1afc-tghg2ss8p">
+      <w:hyperlink w:history="1" r:id="rIdses51xbz4bfwvbu_eqceh">
         <w:r>
           <w:rPr>
             <w:sz w:val="18"/>
@@ -14113,7 +14113,7 @@
         </w:numPr>
         <w:spacing w:after="60"/>
       </w:pPr>
-      <w:hyperlink w:history="1" r:id="rIdxgntpslfndvhj_pccauwf">
+      <w:hyperlink w:history="1" r:id="rIdcwryuob8ieuct2xqjk6-r">
         <w:r>
           <w:rPr>
             <w:sz w:val="18"/>
@@ -14141,7 +14141,7 @@
         </w:numPr>
         <w:spacing w:after="60"/>
       </w:pPr>
-      <w:hyperlink w:history="1" r:id="rIduknvmqhtr0mhdifkz2-3r">
+      <w:hyperlink w:history="1" r:id="rId_mssazw7dxhdyye2kkdrj">
         <w:r>
           <w:rPr>
             <w:sz w:val="18"/>
@@ -14169,7 +14169,7 @@
         </w:numPr>
         <w:spacing w:after="60"/>
       </w:pPr>
-      <w:hyperlink w:history="1" r:id="rIdywekbmgzmhvtm98nekg_e">
+      <w:hyperlink w:history="1" r:id="rIdqbsbl05ibi8xiltqlrep7">
         <w:r>
           <w:rPr>
             <w:sz w:val="18"/>
@@ -14197,7 +14197,7 @@
         </w:numPr>
         <w:spacing w:after="60"/>
       </w:pPr>
-      <w:hyperlink w:history="1" r:id="rIdmzzovvuok2aqd1qf0qxxa">
+      <w:hyperlink w:history="1" r:id="rIdkf-djr6dzswllgnnnnruv">
         <w:r>
           <w:rPr>
             <w:sz w:val="18"/>
@@ -14225,7 +14225,7 @@
         </w:numPr>
         <w:spacing w:after="60"/>
       </w:pPr>
-      <w:hyperlink w:history="1" r:id="rIdqkquuhrwdn3dnofa-3miv">
+      <w:hyperlink w:history="1" r:id="rIdtlud5keg86suzdsknynep">
         <w:r>
           <w:rPr>
             <w:sz w:val="18"/>
@@ -14253,7 +14253,7 @@
         </w:numPr>
         <w:spacing w:after="60"/>
       </w:pPr>
-      <w:hyperlink w:history="1" r:id="rIdbk2f4vxuzjqngcvz2udtm">
+      <w:hyperlink w:history="1" r:id="rIddv_tcy-ocbywmruixt-l8">
         <w:r>
           <w:rPr>
             <w:sz w:val="18"/>
@@ -14281,7 +14281,7 @@
         </w:numPr>
         <w:spacing w:after="60"/>
       </w:pPr>
-      <w:hyperlink w:history="1" r:id="rIdh8pjh7gd1fgxnfrjt0isp">
+      <w:hyperlink w:history="1" r:id="rIdgve1c5i038rnys-baw8f0">
         <w:r>
           <w:rPr>
             <w:sz w:val="18"/>
@@ -14309,7 +14309,7 @@
         </w:numPr>
         <w:spacing w:after="60"/>
       </w:pPr>
-      <w:hyperlink w:history="1" r:id="rIdrff3n6shu-mwxxc-xibcu">
+      <w:hyperlink w:history="1" r:id="rIdidgq5uhmhikzy1gtovzm8">
         <w:r>
           <w:rPr>
             <w:sz w:val="18"/>
@@ -14337,7 +14337,7 @@
         </w:numPr>
         <w:spacing w:after="60"/>
       </w:pPr>
-      <w:hyperlink w:history="1" r:id="rIdph5p3h-fcx11vospiqxpj">
+      <w:hyperlink w:history="1" r:id="rIdysuqellrx3lyks1zrsrse">
         <w:r>
           <w:rPr>
             <w:sz w:val="18"/>
@@ -14365,7 +14365,7 @@
         </w:numPr>
         <w:spacing w:after="60"/>
       </w:pPr>
-      <w:hyperlink w:history="1" r:id="rIdtvl62mn0shidbmatkzdch">
+      <w:hyperlink w:history="1" r:id="rIdpjaio95wctl6iul2jbvjt">
         <w:r>
           <w:rPr>
             <w:sz w:val="18"/>
@@ -14393,7 +14393,7 @@
         </w:numPr>
         <w:spacing w:after="60"/>
       </w:pPr>
-      <w:hyperlink w:history="1" r:id="rIdynd8varrqglvdcwrhhszh">
+      <w:hyperlink w:history="1" r:id="rIdzu2wjqgbi-4moitmvdmwe">
         <w:r>
           <w:rPr>
             <w:sz w:val="18"/>
@@ -14421,7 +14421,7 @@
         </w:numPr>
         <w:spacing w:after="60"/>
       </w:pPr>
-      <w:hyperlink w:history="1" r:id="rId1amuek5smf5kocgus68gi">
+      <w:hyperlink w:history="1" r:id="rIdamajkwhzjc6qzi1rrnbsi">
         <w:r>
           <w:rPr>
             <w:sz w:val="18"/>
@@ -14449,7 +14449,7 @@
         </w:numPr>
         <w:spacing w:after="60"/>
       </w:pPr>
-      <w:hyperlink w:history="1" r:id="rIdv2nyss2qkdvcmeondyepm">
+      <w:hyperlink w:history="1" r:id="rIdagjfnwxuam1kj5qnicvui">
         <w:r>
           <w:rPr>
             <w:sz w:val="18"/>
@@ -14477,7 +14477,7 @@
         </w:numPr>
         <w:spacing w:after="60"/>
       </w:pPr>
-      <w:hyperlink w:history="1" r:id="rIdtdkbvqt6mgadocr8fdooj">
+      <w:hyperlink w:history="1" r:id="rIdzaphcvzezmicawcmxzswa">
         <w:r>
           <w:rPr>
             <w:sz w:val="18"/>
@@ -14505,7 +14505,7 @@
         </w:numPr>
         <w:spacing w:after="60"/>
       </w:pPr>
-      <w:hyperlink w:history="1" r:id="rIdwqtnb2lutvsxqop69p73e">
+      <w:hyperlink w:history="1" r:id="rId-3prunbnl4gci0nbmmpik">
         <w:r>
           <w:rPr>
             <w:sz w:val="18"/>
@@ -14533,7 +14533,7 @@
         </w:numPr>
         <w:spacing w:after="60"/>
       </w:pPr>
-      <w:hyperlink w:history="1" r:id="rIdzxfo0mddxhrgv0oacva6n">
+      <w:hyperlink w:history="1" r:id="rIdtsjft13dl2_e040pevdwa">
         <w:r>
           <w:rPr>
             <w:sz w:val="18"/>
@@ -14561,7 +14561,7 @@
         </w:numPr>
         <w:spacing w:after="60"/>
       </w:pPr>
-      <w:hyperlink w:history="1" r:id="rIdw-imwqpd32ww7gg3aohxd">
+      <w:hyperlink w:history="1" r:id="rIdsdau4aog_wujuwjaqaeen">
         <w:r>
           <w:rPr>
             <w:sz w:val="18"/>
@@ -14589,7 +14589,7 @@
         </w:numPr>
         <w:spacing w:after="60"/>
       </w:pPr>
-      <w:hyperlink w:history="1" r:id="rIdbqisbcyf-7tdlcrn9upev">
+      <w:hyperlink w:history="1" r:id="rIdeyf0dkirbkxg1r4pqpn6v">
         <w:r>
           <w:rPr>
             <w:sz w:val="18"/>
@@ -14617,7 +14617,7 @@
         </w:numPr>
         <w:spacing w:after="60"/>
       </w:pPr>
-      <w:hyperlink w:history="1" r:id="rIdxflevnh4stwwsause9fqb">
+      <w:hyperlink w:history="1" r:id="rIdfxllotguslishmcqz2ud9">
         <w:r>
           <w:rPr>
             <w:sz w:val="18"/>
@@ -14645,7 +14645,7 @@
         </w:numPr>
         <w:spacing w:after="60"/>
       </w:pPr>
-      <w:hyperlink w:history="1" r:id="rIdytr6kpnyrwin1j7xkndra">
+      <w:hyperlink w:history="1" r:id="rId7cfamkmxburyoy3yf8zrm">
         <w:r>
           <w:rPr>
             <w:sz w:val="18"/>
@@ -14673,7 +14673,7 @@
         </w:numPr>
         <w:spacing w:after="60"/>
       </w:pPr>
-      <w:hyperlink w:history="1" r:id="rIdsqlxjx4os82lx6wfb22vr">
+      <w:hyperlink w:history="1" r:id="rIdtho6clgkofkftppxkotpe">
         <w:r>
           <w:rPr>
             <w:sz w:val="18"/>
@@ -14701,7 +14701,7 @@
         </w:numPr>
         <w:spacing w:after="60"/>
       </w:pPr>
-      <w:hyperlink w:history="1" r:id="rIdv_vjddalawrdmdr2wv0b2">
+      <w:hyperlink w:history="1" r:id="rIddn13-94o_q83udkokesme">
         <w:r>
           <w:rPr>
             <w:sz w:val="18"/>
@@ -14729,7 +14729,7 @@
         </w:numPr>
         <w:spacing w:after="60"/>
       </w:pPr>
-      <w:hyperlink w:history="1" r:id="rIdnzwa2garu8lzt1dd-b5rx">
+      <w:hyperlink w:history="1" r:id="rIdwfdu-firtw22wvpqv8lec">
         <w:r>
           <w:rPr>
             <w:sz w:val="18"/>
@@ -14757,7 +14757,7 @@
         </w:numPr>
         <w:spacing w:after="60"/>
       </w:pPr>
-      <w:hyperlink w:history="1" r:id="rId6gwb1w8rly9qzytjffsmw">
+      <w:hyperlink w:history="1" r:id="rIdjwcsunqtpzoq2d7asizmc">
         <w:r>
           <w:rPr>
             <w:sz w:val="18"/>
@@ -14785,7 +14785,7 @@
         </w:numPr>
         <w:spacing w:after="60"/>
       </w:pPr>
-      <w:hyperlink w:history="1" r:id="rId8p_1vnwtwqeaehbtn-nde">
+      <w:hyperlink w:history="1" r:id="rIdfpc3euausoqeibp0r7ggl">
         <w:r>
           <w:rPr>
             <w:sz w:val="18"/>
@@ -14813,7 +14813,7 @@
         </w:numPr>
         <w:spacing w:after="60"/>
       </w:pPr>
-      <w:hyperlink w:history="1" r:id="rIdoib3d4-ygccipawa_rmmx">
+      <w:hyperlink w:history="1" r:id="rId2vfyylqwith7jqkhma4by">
         <w:r>
           <w:rPr>
             <w:sz w:val="18"/>
@@ -14841,7 +14841,7 @@
         </w:numPr>
         <w:spacing w:after="60"/>
       </w:pPr>
-      <w:hyperlink w:history="1" r:id="rIdqzcujchcleloevh6kzjwc">
+      <w:hyperlink w:history="1" r:id="rIdd3dqnej1t4fruligijkzw">
         <w:r>
           <w:rPr>
             <w:sz w:val="18"/>
@@ -14869,7 +14869,7 @@
         </w:numPr>
         <w:spacing w:after="60"/>
       </w:pPr>
-      <w:hyperlink w:history="1" r:id="rId7bqjlwssd2f_kkn41tcag">
+      <w:hyperlink w:history="1" r:id="rIdw7ovkadwscjmfo8raw4jj">
         <w:r>
           <w:rPr>
             <w:sz w:val="18"/>
@@ -14897,7 +14897,7 @@
         </w:numPr>
         <w:spacing w:after="60"/>
       </w:pPr>
-      <w:hyperlink w:history="1" r:id="rIdemnj-czxuse1grxwclyvy">
+      <w:hyperlink w:history="1" r:id="rIds58raaapjgoanxk8ote9f">
         <w:r>
           <w:rPr>
             <w:sz w:val="18"/>
@@ -14925,7 +14925,7 @@
         </w:numPr>
         <w:spacing w:after="60"/>
       </w:pPr>
-      <w:hyperlink w:history="1" r:id="rIdj40snr-wsm7dapltes73e">
+      <w:hyperlink w:history="1" r:id="rIdwjm1pdc5fzjycrejgkkid">
         <w:r>
           <w:rPr>
             <w:sz w:val="18"/>
@@ -14953,7 +14953,7 @@
         </w:numPr>
         <w:spacing w:after="60"/>
       </w:pPr>
-      <w:hyperlink w:history="1" r:id="rIdakudnzwrnwjpkiyq8dims">
+      <w:hyperlink w:history="1" r:id="rIdxecccdehjw9hj72jyzpek">
         <w:r>
           <w:rPr>
             <w:sz w:val="18"/>
@@ -14981,7 +14981,7 @@
         </w:numPr>
         <w:spacing w:after="60"/>
       </w:pPr>
-      <w:hyperlink w:history="1" r:id="rIdvmqpaunzuyiy9v0kjwcpr">
+      <w:hyperlink w:history="1" r:id="rIdwo0rqb20gxezvnmjitlif">
         <w:r>
           <w:rPr>
             <w:sz w:val="18"/>
@@ -15009,7 +15009,7 @@
         </w:numPr>
         <w:spacing w:after="60"/>
       </w:pPr>
-      <w:hyperlink w:history="1" r:id="rIdcjdhz3nr0juobjkm3qtbw">
+      <w:hyperlink w:history="1" r:id="rId1hqy3bo_7vqncuv9puiw9">
         <w:r>
           <w:rPr>
             <w:sz w:val="18"/>
@@ -15037,7 +15037,7 @@
         </w:numPr>
         <w:spacing w:after="60"/>
       </w:pPr>
-      <w:hyperlink w:history="1" r:id="rIdqjkqzaapz-jgzpagn7kqc">
+      <w:hyperlink w:history="1" r:id="rIdtpmlogw_lg9r_awcwlxwj">
         <w:r>
           <w:rPr>
             <w:sz w:val="18"/>
@@ -15065,7 +15065,7 @@
         </w:numPr>
         <w:spacing w:after="60"/>
       </w:pPr>
-      <w:hyperlink w:history="1" r:id="rId9uxe8xf5njipr5xyraorp">
+      <w:hyperlink w:history="1" r:id="rIdty9eearsgw5jncm5p50sq">
         <w:r>
           <w:rPr>
             <w:sz w:val="18"/>
@@ -15093,7 +15093,7 @@
         </w:numPr>
         <w:spacing w:after="60"/>
       </w:pPr>
-      <w:hyperlink w:history="1" r:id="rIdf1ktfk_fi6xgx3t4tbi3u">
+      <w:hyperlink w:history="1" r:id="rIdu7f6_qpynkrhtjbq3agky">
         <w:r>
           <w:rPr>
             <w:sz w:val="18"/>
@@ -15121,7 +15121,7 @@
         </w:numPr>
         <w:spacing w:after="60"/>
       </w:pPr>
-      <w:hyperlink w:history="1" r:id="rIdczbxtcr5njk7qfudma29n">
+      <w:hyperlink w:history="1" r:id="rIdkl3wbu_zl6r_mrtz9doec">
         <w:r>
           <w:rPr>
             <w:sz w:val="18"/>
@@ -15149,7 +15149,7 @@
         </w:numPr>
         <w:spacing w:after="60"/>
       </w:pPr>
-      <w:hyperlink w:history="1" r:id="rIdawjosmmtklqnesqbozyqy">
+      <w:hyperlink w:history="1" r:id="rIdzp8jbw138nkqfakxxcg4m">
         <w:r>
           <w:rPr>
             <w:sz w:val="18"/>
@@ -15177,7 +15177,7 @@
         </w:numPr>
         <w:spacing w:after="60"/>
       </w:pPr>
-      <w:hyperlink w:history="1" r:id="rIdpfoshji3a8y0bcf4iyenc">
+      <w:hyperlink w:history="1" r:id="rIdi6jzmbpytimmxhn3rwrec">
         <w:r>
           <w:rPr>
             <w:sz w:val="18"/>
@@ -15205,7 +15205,7 @@
         </w:numPr>
         <w:spacing w:after="60"/>
       </w:pPr>
-      <w:hyperlink w:history="1" r:id="rIdrcirila4eqzxp4llpum1p">
+      <w:hyperlink w:history="1" r:id="rIdrzrbamjk8-0u7hofpf8qc">
         <w:r>
           <w:rPr>
             <w:sz w:val="18"/>

</xml_diff>

<commit_message>
feat: city crime comparison box (Eurostat NUTS3 2024 / FBI CDE) in guides; Nuremberg updated
Co-Authored-By: Claude Opus 5.5 <noreply@anthropic.com>
Claude-Session: https://claude.ai/code/session_01KbRqmNBFKCFFpD46r7T4m7
</commit_message>
<xml_diff>
--- a/new/guides/nuremberg/Nuremberg_Guide.docx
+++ b/new/guides/nuremberg/Nuremberg_Guide.docx
@@ -711,7 +711,7 @@
             </w:r>
           </w:p>
           <w:p>
-            <w:hyperlink w:history="1" r:id="rIdmtqolny0ofkgktykp1qae">
+            <w:hyperlink w:history="1" r:id="rIdqtbtyyfgpkjrj1cqd8sec">
               <w:r>
                 <w:rPr>
                   <w:rStyle w:val="Hyperlink"/>
@@ -819,7 +819,7 @@
       </w:r>
     </w:p>
     <w:p>
-      <w:hyperlink w:history="1" r:id="rIdlsxtlfi1-rxogksy-rpwn">
+      <w:hyperlink w:history="1" r:id="rIdrfl4cduuii4wm3dmoz_zy">
         <w:r>
           <w:rPr>
             <w:rStyle w:val="Hyperlink"/>
@@ -840,7 +840,7 @@
         </w:rPr>
         <w:t xml:space="preserve">Via </w:t>
       </w:r>
-      <w:hyperlink w:history="1" r:id="rIdtolgtfpe4m9yugoyomjav">
+      <w:hyperlink w:history="1" r:id="rIdtzghgs0ytrnscnpiv4pya">
         <w:r>
           <w:rPr>
             <w:color w:val="EA2E00"/>
@@ -858,7 +858,7 @@
         </w:rPr>
         <w:t xml:space="preserve">, </w:t>
       </w:r>
-      <w:hyperlink w:history="1" r:id="rIdmwssnwxcq2nvpa_-a3pqv">
+      <w:hyperlink w:history="1" r:id="rIdinj4_1opdjrwdelgudbxq">
         <w:r>
           <w:rPr>
             <w:color w:val="EA2E00"/>
@@ -876,7 +876,7 @@
         </w:rPr>
         <w:t xml:space="preserve">, </w:t>
       </w:r>
-      <w:hyperlink w:history="1" r:id="rIdwyjfzjmdngpegls0l3jw4">
+      <w:hyperlink w:history="1" r:id="rIdfouog_dpaksosvr_xaeaa">
         <w:r>
           <w:rPr>
             <w:color w:val="EA2E00"/>
@@ -894,7 +894,7 @@
         </w:rPr>
         <w:t xml:space="preserve">, </w:t>
       </w:r>
-      <w:hyperlink w:history="1" r:id="rIdwp4tgadm2iw9vbfmubffr">
+      <w:hyperlink w:history="1" r:id="rIduin0rekpbm8ja9xcbbrd9">
         <w:r>
           <w:rPr>
             <w:color w:val="EA2E00"/>
@@ -912,7 +912,7 @@
         </w:rPr>
         <w:t xml:space="preserve">, </w:t>
       </w:r>
-      <w:hyperlink w:history="1" r:id="rIdje-zsfzy49thcy9u6otds">
+      <w:hyperlink w:history="1" r:id="rIdsjzzxvgqrd58jbll9e7xk">
         <w:r>
           <w:rPr>
             <w:color w:val="EA2E00"/>
@@ -930,7 +930,7 @@
         </w:rPr>
         <w:t xml:space="preserve">, </w:t>
       </w:r>
-      <w:hyperlink w:history="1" r:id="rIdqf2g4dlsbuvtn3r813rnw">
+      <w:hyperlink w:history="1" r:id="rIdj-vioaczp8ezttthiekha">
         <w:r>
           <w:rPr>
             <w:color w:val="EA2E00"/>
@@ -948,7 +948,7 @@
         </w:rPr>
         <w:t xml:space="preserve">, </w:t>
       </w:r>
-      <w:hyperlink w:history="1" r:id="rIdfydnsjvmu8ffwk744c2_x">
+      <w:hyperlink w:history="1" r:id="rIdqnzu9ra557s8vj-5q3nhe">
         <w:r>
           <w:rPr>
             <w:color w:val="EA2E00"/>
@@ -966,7 +966,7 @@
         </w:rPr>
         <w:t xml:space="preserve">, </w:t>
       </w:r>
-      <w:hyperlink w:history="1" r:id="rIdofxqjeysieeysdgjutolm">
+      <w:hyperlink w:history="1" r:id="rIdlsve3x87lcof1orr18rue">
         <w:r>
           <w:rPr>
             <w:color w:val="EA2E00"/>
@@ -984,7 +984,7 @@
         </w:rPr>
         <w:t xml:space="preserve">, </w:t>
       </w:r>
-      <w:hyperlink w:history="1" r:id="rId7tzgxbzolr-55x0x2veck">
+      <w:hyperlink w:history="1" r:id="rIdfzxdykpuestxh19bqzjnz">
         <w:r>
           <w:rPr>
             <w:color w:val="EA2E00"/>
@@ -1002,7 +1002,7 @@
         </w:rPr>
         <w:t xml:space="preserve">, </w:t>
       </w:r>
-      <w:hyperlink w:history="1" r:id="rId3dtspxpwcvqj_zhl-rbnw">
+      <w:hyperlink w:history="1" r:id="rIdqcshkaejo0foswcoccmli">
         <w:r>
           <w:rPr>
             <w:color w:val="EA2E00"/>
@@ -1064,7 +1064,7 @@
       </w:r>
     </w:p>
     <w:p>
-      <w:hyperlink w:history="1" r:id="rIdazscd-gwazdyilnq5v6yj">
+      <w:hyperlink w:history="1" r:id="rIdrlnevznkm5p71pubvxgbi">
         <w:r>
           <w:rPr>
             <w:rStyle w:val="Hyperlink"/>
@@ -1085,7 +1085,7 @@
         </w:rPr>
         <w:t xml:space="preserve">Via </w:t>
       </w:r>
-      <w:hyperlink w:history="1" r:id="rIdogvriey68dp1hotqvt3bl">
+      <w:hyperlink w:history="1" r:id="rIdxkom1x5ktc7qroi2vyjx0">
         <w:r>
           <w:rPr>
             <w:color w:val="EA2E00"/>
@@ -1103,7 +1103,7 @@
         </w:rPr>
         <w:t xml:space="preserve">, </w:t>
       </w:r>
-      <w:hyperlink w:history="1" r:id="rIdygxoolmyhn84aaun0dptu">
+      <w:hyperlink w:history="1" r:id="rId3uclgfjgkyricextsbdnl">
         <w:r>
           <w:rPr>
             <w:color w:val="EA2E00"/>
@@ -1121,7 +1121,7 @@
         </w:rPr>
         <w:t xml:space="preserve">, </w:t>
       </w:r>
-      <w:hyperlink w:history="1" r:id="rIdh7ykerlg2usl-o6kkd1lm">
+      <w:hyperlink w:history="1" r:id="rIdrzxuju9xlk52ho23c_yj1">
         <w:r>
           <w:rPr>
             <w:color w:val="EA2E00"/>
@@ -1139,7 +1139,7 @@
         </w:rPr>
         <w:t xml:space="preserve">, </w:t>
       </w:r>
-      <w:hyperlink w:history="1" r:id="rId2n3nwky93caggf7c3dqip">
+      <w:hyperlink w:history="1" r:id="rIdnnhjd3wa8kzfa-vkildd8">
         <w:r>
           <w:rPr>
             <w:color w:val="EA2E00"/>
@@ -1157,7 +1157,7 @@
         </w:rPr>
         <w:t xml:space="preserve">, </w:t>
       </w:r>
-      <w:hyperlink w:history="1" r:id="rIdhy-1cnu4ora7sgqiwhhi_">
+      <w:hyperlink w:history="1" r:id="rIdl8kzrngf3kngfxfuckhhf">
         <w:r>
           <w:rPr>
             <w:color w:val="EA2E00"/>
@@ -1175,7 +1175,7 @@
         </w:rPr>
         <w:t xml:space="preserve">, </w:t>
       </w:r>
-      <w:hyperlink w:history="1" r:id="rIdebz04mb17blkh2dr2dqps">
+      <w:hyperlink w:history="1" r:id="rIdh8fnshdm-znw_0mdwtpxk">
         <w:r>
           <w:rPr>
             <w:color w:val="EA2E00"/>
@@ -1193,7 +1193,7 @@
         </w:rPr>
         <w:t xml:space="preserve">, </w:t>
       </w:r>
-      <w:hyperlink w:history="1" r:id="rId_8szutlw0wehb3g3i5cij">
+      <w:hyperlink w:history="1" r:id="rIdywgtqq7-bioh1wlcev4jb">
         <w:r>
           <w:rPr>
             <w:color w:val="EA2E00"/>
@@ -1211,7 +1211,7 @@
         </w:rPr>
         <w:t xml:space="preserve">, </w:t>
       </w:r>
-      <w:hyperlink w:history="1" r:id="rIdsdvgsx3hysw2ajjwowlgx">
+      <w:hyperlink w:history="1" r:id="rId0zfs5gbp-pi6n-n_leqaw">
         <w:r>
           <w:rPr>
             <w:color w:val="EA2E00"/>
@@ -1273,7 +1273,7 @@
       </w:r>
     </w:p>
     <w:p>
-      <w:hyperlink w:history="1" r:id="rIdmjks0sdbirt2_07y4slcs">
+      <w:hyperlink w:history="1" r:id="rIdsn6vikgniafbpicggvhgm">
         <w:r>
           <w:rPr>
             <w:rStyle w:val="Hyperlink"/>
@@ -1294,7 +1294,7 @@
         </w:rPr>
         <w:t xml:space="preserve">Via </w:t>
       </w:r>
-      <w:hyperlink w:history="1" r:id="rIdumdipdfdykryj_n6q5ljl">
+      <w:hyperlink w:history="1" r:id="rIdcxge_fivg5qu0zwsiiy7m">
         <w:r>
           <w:rPr>
             <w:color w:val="EA2E00"/>
@@ -1312,7 +1312,7 @@
         </w:rPr>
         <w:t xml:space="preserve">, </w:t>
       </w:r>
-      <w:hyperlink w:history="1" r:id="rIdiaqb4dweyqvvxo2dhuhc5">
+      <w:hyperlink w:history="1" r:id="rId16ytzvfix-abjptavhxdn">
         <w:r>
           <w:rPr>
             <w:color w:val="EA2E00"/>
@@ -1330,7 +1330,7 @@
         </w:rPr>
         <w:t xml:space="preserve">, </w:t>
       </w:r>
-      <w:hyperlink w:history="1" r:id="rIdgf95x-ueu2qud9tzncfly">
+      <w:hyperlink w:history="1" r:id="rIdowfrfwjjlc4dll5xmcfsf">
         <w:r>
           <w:rPr>
             <w:color w:val="EA2E00"/>
@@ -1348,7 +1348,7 @@
         </w:rPr>
         <w:t xml:space="preserve">, </w:t>
       </w:r>
-      <w:hyperlink w:history="1" r:id="rIdghnumuwiasyl6plyzksrg">
+      <w:hyperlink w:history="1" r:id="rIdrkpmwvcwxuuydn6rjge7g">
         <w:r>
           <w:rPr>
             <w:color w:val="EA2E00"/>
@@ -1366,7 +1366,7 @@
         </w:rPr>
         <w:t xml:space="preserve">, </w:t>
       </w:r>
-      <w:hyperlink w:history="1" r:id="rId7kymtw_m3el9beiden0ed">
+      <w:hyperlink w:history="1" r:id="rIdaq6kqefdi9lsusbzia3-p">
         <w:r>
           <w:rPr>
             <w:color w:val="EA2E00"/>
@@ -1384,7 +1384,7 @@
         </w:rPr>
         <w:t xml:space="preserve">, </w:t>
       </w:r>
-      <w:hyperlink w:history="1" r:id="rIdvgmfcmogtjhz7exiulmrq">
+      <w:hyperlink w:history="1" r:id="rIdyl5umrglmtpf6cjc8tq74">
         <w:r>
           <w:rPr>
             <w:color w:val="EA2E00"/>
@@ -1446,7 +1446,7 @@
       </w:r>
     </w:p>
     <w:p>
-      <w:hyperlink w:history="1" r:id="rId1u7zrg35i4i0fgoomo4wp">
+      <w:hyperlink w:history="1" r:id="rIdwtp_f_qndsgiv06mxmm9y">
         <w:r>
           <w:rPr>
             <w:rStyle w:val="Hyperlink"/>
@@ -1467,7 +1467,7 @@
         </w:rPr>
         <w:t xml:space="preserve">Via </w:t>
       </w:r>
-      <w:hyperlink w:history="1" r:id="rIdyia9qf_rr3qi6cyw25umq">
+      <w:hyperlink w:history="1" r:id="rIdeqjdbhjj7kphkwvjmft6b">
         <w:r>
           <w:rPr>
             <w:color w:val="EA2E00"/>
@@ -1485,7 +1485,7 @@
         </w:rPr>
         <w:t xml:space="preserve">, </w:t>
       </w:r>
-      <w:hyperlink w:history="1" r:id="rIdadtzesd1wa4tbuuphgfbb">
+      <w:hyperlink w:history="1" r:id="rId4ipd1mnsliljzsm2asu6t">
         <w:r>
           <w:rPr>
             <w:color w:val="EA2E00"/>
@@ -1503,7 +1503,7 @@
         </w:rPr>
         <w:t xml:space="preserve">, </w:t>
       </w:r>
-      <w:hyperlink w:history="1" r:id="rIdbtrysg-rdnzhphr_oljj8">
+      <w:hyperlink w:history="1" r:id="rIdnesj91q6nyfooqooryyfk">
         <w:r>
           <w:rPr>
             <w:color w:val="EA2E00"/>
@@ -1565,7 +1565,7 @@
       </w:r>
     </w:p>
     <w:p>
-      <w:hyperlink w:history="1" r:id="rId1ra6hyqphwwf4atorjgib">
+      <w:hyperlink w:history="1" r:id="rId9razz56ffz1mhk_ny-pex">
         <w:r>
           <w:rPr>
             <w:rStyle w:val="Hyperlink"/>
@@ -1586,7 +1586,7 @@
         </w:rPr>
         <w:t xml:space="preserve">Via </w:t>
       </w:r>
-      <w:hyperlink w:history="1" r:id="rIdyvp_b8het0k4n1isbc_ow">
+      <w:hyperlink w:history="1" r:id="rIdfyswpxhdltxpvvozvspvz">
         <w:r>
           <w:rPr>
             <w:color w:val="EA2E00"/>
@@ -1604,7 +1604,7 @@
         </w:rPr>
         <w:t xml:space="preserve">, </w:t>
       </w:r>
-      <w:hyperlink w:history="1" r:id="rIdmbrkjoqwc3syhxtqqethd">
+      <w:hyperlink w:history="1" r:id="rIda_eef47nt3dgsc7_t1vn7">
         <w:r>
           <w:rPr>
             <w:color w:val="EA2E00"/>
@@ -1622,7 +1622,7 @@
         </w:rPr>
         <w:t xml:space="preserve">, </w:t>
       </w:r>
-      <w:hyperlink w:history="1" r:id="rIdxup1ps7hjoof14w_5g1nn">
+      <w:hyperlink w:history="1" r:id="rIdnrd0vyzfvikunrdzjymcl">
         <w:r>
           <w:rPr>
             <w:color w:val="EA2E00"/>
@@ -1640,7 +1640,7 @@
         </w:rPr>
         <w:t xml:space="preserve">, </w:t>
       </w:r>
-      <w:hyperlink w:history="1" r:id="rIdl2jpuwgovqo8anut6x_gb">
+      <w:hyperlink w:history="1" r:id="rIddfxfk6yv2optplntbwend">
         <w:r>
           <w:rPr>
             <w:color w:val="EA2E00"/>
@@ -1658,7 +1658,7 @@
         </w:rPr>
         <w:t xml:space="preserve">, </w:t>
       </w:r>
-      <w:hyperlink w:history="1" r:id="rIdihl5bdk6fwvrgmopuk8na">
+      <w:hyperlink w:history="1" r:id="rIdkldrx6pufzqjarfscgsde">
         <w:r>
           <w:rPr>
             <w:color w:val="EA2E00"/>
@@ -1676,7 +1676,7 @@
         </w:rPr>
         <w:t xml:space="preserve">, </w:t>
       </w:r>
-      <w:hyperlink w:history="1" r:id="rIdbubutdefyv478fdcdxc3a">
+      <w:hyperlink w:history="1" r:id="rId5iyckqy8i3z8f8qzu7wvh">
         <w:r>
           <w:rPr>
             <w:color w:val="EA2E00"/>
@@ -1738,7 +1738,7 @@
       </w:r>
     </w:p>
     <w:p>
-      <w:hyperlink w:history="1" r:id="rIdlkpe0m0zflowimvxvtxs2">
+      <w:hyperlink w:history="1" r:id="rIde4t9gtb6rvn985gwviepa">
         <w:r>
           <w:rPr>
             <w:rStyle w:val="Hyperlink"/>
@@ -1759,7 +1759,7 @@
         </w:rPr>
         <w:t xml:space="preserve">Via </w:t>
       </w:r>
-      <w:hyperlink w:history="1" r:id="rIdo9jxr58j77u5ppz-ugutr">
+      <w:hyperlink w:history="1" r:id="rIdgt86utyfncyjchif5x4zs">
         <w:r>
           <w:rPr>
             <w:color w:val="EA2E00"/>
@@ -1777,7 +1777,7 @@
         </w:rPr>
         <w:t xml:space="preserve">, </w:t>
       </w:r>
-      <w:hyperlink w:history="1" r:id="rIdt3fqoxuyb95kvcu2xsqwn">
+      <w:hyperlink w:history="1" r:id="rIdxpp5fcit4bexvjyuirxdb">
         <w:r>
           <w:rPr>
             <w:color w:val="EA2E00"/>
@@ -1795,7 +1795,7 @@
         </w:rPr>
         <w:t xml:space="preserve">, </w:t>
       </w:r>
-      <w:hyperlink w:history="1" r:id="rId_ppcji3d8r78pgwywqgps">
+      <w:hyperlink w:history="1" r:id="rIdmudrpnbvuv8yp7uzrjnbv">
         <w:r>
           <w:rPr>
             <w:color w:val="EA2E00"/>
@@ -1865,7 +1865,7 @@
       </w:r>
     </w:p>
     <w:p>
-      <w:hyperlink w:history="1" r:id="rIdo-dej1f5m_lh86p9nrz3q">
+      <w:hyperlink w:history="1" r:id="rId_0izzj7zlx3k-midfjtoi">
         <w:r>
           <w:rPr>
             <w:rStyle w:val="Hyperlink"/>
@@ -1886,7 +1886,7 @@
         </w:rPr>
         <w:t xml:space="preserve">Via </w:t>
       </w:r>
-      <w:hyperlink w:history="1" r:id="rIdvznucdilfnpridgsw8jvc">
+      <w:hyperlink w:history="1" r:id="rId6uryk407ilxj2vwpat5ac">
         <w:r>
           <w:rPr>
             <w:color w:val="EA2E00"/>
@@ -1904,7 +1904,7 @@
         </w:rPr>
         <w:t xml:space="preserve">, </w:t>
       </w:r>
-      <w:hyperlink w:history="1" r:id="rIdokhxzzn177rh7vujqmwx1">
+      <w:hyperlink w:history="1" r:id="rIdgu_kkm_ldlcn1klytejem">
         <w:r>
           <w:rPr>
             <w:color w:val="EA2E00"/>
@@ -1922,7 +1922,7 @@
         </w:rPr>
         <w:t xml:space="preserve">, </w:t>
       </w:r>
-      <w:hyperlink w:history="1" r:id="rId49yt2imq3v0dw40trp0jb">
+      <w:hyperlink w:history="1" r:id="rId0eu4a8bczj9e1q-u45oar">
         <w:r>
           <w:rPr>
             <w:color w:val="EA2E00"/>
@@ -1940,7 +1940,7 @@
         </w:rPr>
         <w:t xml:space="preserve">, </w:t>
       </w:r>
-      <w:hyperlink w:history="1" r:id="rIdtltfekxzm6vy_scqgyoc-">
+      <w:hyperlink w:history="1" r:id="rId8ypcz9d5t3mpdmjk55qnu">
         <w:r>
           <w:rPr>
             <w:color w:val="EA2E00"/>
@@ -1958,7 +1958,7 @@
         </w:rPr>
         <w:t xml:space="preserve">, </w:t>
       </w:r>
-      <w:hyperlink w:history="1" r:id="rId_xfudn8pcjb0hxjwsvg2c">
+      <w:hyperlink w:history="1" r:id="rIdg3xfww1kog-uanajzgi3n">
         <w:r>
           <w:rPr>
             <w:color w:val="EA2E00"/>
@@ -2020,7 +2020,7 @@
       </w:r>
     </w:p>
     <w:p>
-      <w:hyperlink w:history="1" r:id="rIdihiebkf78m2581jslqnlw">
+      <w:hyperlink w:history="1" r:id="rIdi8sikt7iaahqlrrhfqe5d">
         <w:r>
           <w:rPr>
             <w:rStyle w:val="Hyperlink"/>
@@ -2041,7 +2041,7 @@
         </w:rPr>
         <w:t xml:space="preserve">Via </w:t>
       </w:r>
-      <w:hyperlink w:history="1" r:id="rIdpdrsg4afabmxli0vurtsf">
+      <w:hyperlink w:history="1" r:id="rIdyjztnpw5ggln5avibubss">
         <w:r>
           <w:rPr>
             <w:color w:val="EA2E00"/>
@@ -2059,7 +2059,7 @@
         </w:rPr>
         <w:t xml:space="preserve">, </w:t>
       </w:r>
-      <w:hyperlink w:history="1" r:id="rIderajcljj8y5mwnnutl0ua">
+      <w:hyperlink w:history="1" r:id="rId7q2frixog1b2y_jpin99t">
         <w:r>
           <w:rPr>
             <w:color w:val="EA2E00"/>
@@ -2077,7 +2077,7 @@
         </w:rPr>
         <w:t xml:space="preserve">, </w:t>
       </w:r>
-      <w:hyperlink w:history="1" r:id="rId5xjpsrnjgtszyfdmyjipp">
+      <w:hyperlink w:history="1" r:id="rIdimphltm-5ij6il2wrblpo">
         <w:r>
           <w:rPr>
             <w:color w:val="EA2E00"/>
@@ -2095,7 +2095,7 @@
         </w:rPr>
         <w:t xml:space="preserve">, </w:t>
       </w:r>
-      <w:hyperlink w:history="1" r:id="rIdfyhoxn2k4yh1dq_i6s2wx">
+      <w:hyperlink w:history="1" r:id="rIdqx6-fiqnldkhdzrdr4pgk">
         <w:r>
           <w:rPr>
             <w:color w:val="EA2E00"/>
@@ -2113,7 +2113,7 @@
         </w:rPr>
         <w:t xml:space="preserve">, </w:t>
       </w:r>
-      <w:hyperlink w:history="1" r:id="rId_xrp2gh_cj5zvmgxjr_vr">
+      <w:hyperlink w:history="1" r:id="rIdbjyopdn_qibn1-rvmb7gy">
         <w:r>
           <w:rPr>
             <w:color w:val="EA2E00"/>
@@ -2186,7 +2186,7 @@
         </w:rPr>
         <w:t xml:space="preserve">Via </w:t>
       </w:r>
-      <w:hyperlink w:history="1" r:id="rId1mw5grfm_linqsreyf0cj">
+      <w:hyperlink w:history="1" r:id="rIdasuthd1cdbesffjcg3n6s">
         <w:r>
           <w:rPr>
             <w:color w:val="EA2E00"/>
@@ -2204,7 +2204,7 @@
         </w:rPr>
         <w:t xml:space="preserve">, </w:t>
       </w:r>
-      <w:hyperlink w:history="1" r:id="rId-cmvn99gtrj5nf-vx_seh">
+      <w:hyperlink w:history="1" r:id="rIdgjo-ovjyjepjxcd_p330x">
         <w:r>
           <w:rPr>
             <w:color w:val="EA2E00"/>
@@ -2222,7 +2222,7 @@
         </w:rPr>
         <w:t xml:space="preserve">, </w:t>
       </w:r>
-      <w:hyperlink w:history="1" r:id="rIdtqggsju2rt_6kgk5u0kjg">
+      <w:hyperlink w:history="1" r:id="rId7usph-2tmjr5ya2tvhe3g">
         <w:r>
           <w:rPr>
             <w:color w:val="EA2E00"/>
@@ -2240,7 +2240,7 @@
         </w:rPr>
         <w:t xml:space="preserve">, </w:t>
       </w:r>
-      <w:hyperlink w:history="1" r:id="rIdkf2vkfnltitpn1xaipik6">
+      <w:hyperlink w:history="1" r:id="rId91_orr6l5qlg4d2tr1dgg">
         <w:r>
           <w:rPr>
             <w:color w:val="EA2E00"/>
@@ -2258,7 +2258,7 @@
         </w:rPr>
         <w:t xml:space="preserve">, </w:t>
       </w:r>
-      <w:hyperlink w:history="1" r:id="rIdgmhvgvf4xzi6y9drdyoj6">
+      <w:hyperlink w:history="1" r:id="rId85uew1xwd_aas-gvpgdi2">
         <w:r>
           <w:rPr>
             <w:color w:val="EA2E00"/>
@@ -2276,7 +2276,7 @@
         </w:rPr>
         <w:t xml:space="preserve">, </w:t>
       </w:r>
-      <w:hyperlink w:history="1" r:id="rIdnj4ofkgzv4nspvr48e-r1">
+      <w:hyperlink w:history="1" r:id="rIdshvnqfs6kxklvef5a2mnk">
         <w:r>
           <w:rPr>
             <w:color w:val="EA2E00"/>
@@ -2294,7 +2294,7 @@
         </w:rPr>
         <w:t xml:space="preserve">, </w:t>
       </w:r>
-      <w:hyperlink w:history="1" r:id="rIdwuoq3bhxosgdpzc4xstf9">
+      <w:hyperlink w:history="1" r:id="rIdzo82olxtih7kxsp-pu2-s">
         <w:r>
           <w:rPr>
             <w:color w:val="EA2E00"/>
@@ -2367,7 +2367,7 @@
         </w:rPr>
         <w:t xml:space="preserve">Via </w:t>
       </w:r>
-      <w:hyperlink w:history="1" r:id="rId8j8llikszzazbyrsgf91t">
+      <w:hyperlink w:history="1" r:id="rIdrb_4uclbkny-c8dezke-a">
         <w:r>
           <w:rPr>
             <w:color w:val="EA2E00"/>
@@ -2385,7 +2385,7 @@
         </w:rPr>
         <w:t xml:space="preserve">, </w:t>
       </w:r>
-      <w:hyperlink w:history="1" r:id="rIded_ytjep0mycccf7hm5yz">
+      <w:hyperlink w:history="1" r:id="rIduhppksymdd-_34x8iqiyo">
         <w:r>
           <w:rPr>
             <w:color w:val="EA2E00"/>
@@ -2403,7 +2403,7 @@
         </w:rPr>
         <w:t xml:space="preserve">, </w:t>
       </w:r>
-      <w:hyperlink w:history="1" r:id="rIdu99qsjvdmjgyyvlmpkryb">
+      <w:hyperlink w:history="1" r:id="rIduxslsot8yehvndd8vq9b3">
         <w:r>
           <w:rPr>
             <w:color w:val="EA2E00"/>
@@ -2421,7 +2421,7 @@
         </w:rPr>
         <w:t xml:space="preserve">, </w:t>
       </w:r>
-      <w:hyperlink w:history="1" r:id="rIdjjiskuognowkrkiq4rnsi">
+      <w:hyperlink w:history="1" r:id="rIdau6hqzntvi8trgbt8if45">
         <w:r>
           <w:rPr>
             <w:color w:val="EA2E00"/>
@@ -2439,7 +2439,7 @@
         </w:rPr>
         <w:t xml:space="preserve">, </w:t>
       </w:r>
-      <w:hyperlink w:history="1" r:id="rIdywvvp_vfswwzu18xqe308">
+      <w:hyperlink w:history="1" r:id="rId4gff9vnlx7sbp5gk92wql">
         <w:r>
           <w:rPr>
             <w:color w:val="EA2E00"/>
@@ -2457,7 +2457,7 @@
         </w:rPr>
         <w:t xml:space="preserve">, </w:t>
       </w:r>
-      <w:hyperlink w:history="1" r:id="rId2cubrz2z6s9tpodcgvoga">
+      <w:hyperlink w:history="1" r:id="rIdyo90nu2ynoof_rqy8wwia">
         <w:r>
           <w:rPr>
             <w:color w:val="EA2E00"/>
@@ -2475,7 +2475,7 @@
         </w:rPr>
         <w:t xml:space="preserve">, </w:t>
       </w:r>
-      <w:hyperlink w:history="1" r:id="rIdxqbgqobit7yjj6imcv4es">
+      <w:hyperlink w:history="1" r:id="rIdoweqfjg1lk76axlxyigxj">
         <w:r>
           <w:rPr>
             <w:color w:val="EA2E00"/>
@@ -2493,7 +2493,7 @@
         </w:rPr>
         <w:t xml:space="preserve">, </w:t>
       </w:r>
-      <w:hyperlink w:history="1" r:id="rIdndr0lq8jw-1ygsf8e-0pp">
+      <w:hyperlink w:history="1" r:id="rIdgn5zudga3oruihylntets">
         <w:r>
           <w:rPr>
             <w:color w:val="EA2E00"/>
@@ -2555,7 +2555,7 @@
       </w:r>
     </w:p>
     <w:p>
-      <w:hyperlink w:history="1" r:id="rIdsakgkboiixft8ky3y5vqn">
+      <w:hyperlink w:history="1" r:id="rId-sjlt_lxaqqxe1x6en_pq">
         <w:r>
           <w:rPr>
             <w:rStyle w:val="Hyperlink"/>
@@ -2576,7 +2576,7 @@
         </w:rPr>
         <w:t xml:space="preserve">Via </w:t>
       </w:r>
-      <w:hyperlink w:history="1" r:id="rIdd_dtk_x55zxpvanfjwb2h">
+      <w:hyperlink w:history="1" r:id="rIdnd6zvgxqmkzgbodss-iz7">
         <w:r>
           <w:rPr>
             <w:color w:val="EA2E00"/>
@@ -2594,7 +2594,7 @@
         </w:rPr>
         <w:t xml:space="preserve">, </w:t>
       </w:r>
-      <w:hyperlink w:history="1" r:id="rIdpbzunvmhu2hanvcasdjn_">
+      <w:hyperlink w:history="1" r:id="rIdqwdrxkstben0hhpnjab2p">
         <w:r>
           <w:rPr>
             <w:color w:val="EA2E00"/>
@@ -2612,7 +2612,7 @@
         </w:rPr>
         <w:t xml:space="preserve">, </w:t>
       </w:r>
-      <w:hyperlink w:history="1" r:id="rIdyji0x3m0e6z4vqu1mzcwc">
+      <w:hyperlink w:history="1" r:id="rIdt5pemmo1xzyjpi63xoxi5">
         <w:r>
           <w:rPr>
             <w:color w:val="EA2E00"/>
@@ -2685,7 +2685,7 @@
         </w:rPr>
         <w:t xml:space="preserve">Via </w:t>
       </w:r>
-      <w:hyperlink w:history="1" r:id="rIdjvlv8yqutud2d_sdfjdc8">
+      <w:hyperlink w:history="1" r:id="rIdcvu-46uh_dgun34xtzfx6">
         <w:r>
           <w:rPr>
             <w:color w:val="EA2E00"/>
@@ -2703,7 +2703,7 @@
         </w:rPr>
         <w:t xml:space="preserve">, </w:t>
       </w:r>
-      <w:hyperlink w:history="1" r:id="rIdshrjs1_1v18e5gwqkja3t">
+      <w:hyperlink w:history="1" r:id="rIdaa9n7uxanh3legwpnyxcl">
         <w:r>
           <w:rPr>
             <w:color w:val="EA2E00"/>
@@ -2776,7 +2776,7 @@
         </w:rPr>
         <w:t xml:space="preserve">Via </w:t>
       </w:r>
-      <w:hyperlink w:history="1" r:id="rIdhn_1gglmy50i2pk0gejqk">
+      <w:hyperlink w:history="1" r:id="rIdimtshngnh6t9m22bvuuqq">
         <w:r>
           <w:rPr>
             <w:color w:val="EA2E00"/>
@@ -2794,7 +2794,7 @@
         </w:rPr>
         <w:t xml:space="preserve">, </w:t>
       </w:r>
-      <w:hyperlink w:history="1" r:id="rIdsmwuipamg7nwwkxx25nwc">
+      <w:hyperlink w:history="1" r:id="rIdc29fniolzpgelqt1oqi1b">
         <w:r>
           <w:rPr>
             <w:color w:val="EA2E00"/>
@@ -2812,7 +2812,7 @@
         </w:rPr>
         <w:t xml:space="preserve">, </w:t>
       </w:r>
-      <w:hyperlink w:history="1" r:id="rIdztenwqgqii-46oo2zkvl-">
+      <w:hyperlink w:history="1" r:id="rIdbulkbdpfpqe6cjyryhv9k">
         <w:r>
           <w:rPr>
             <w:color w:val="EA2E00"/>
@@ -2830,7 +2830,7 @@
         </w:rPr>
         <w:t xml:space="preserve">, </w:t>
       </w:r>
-      <w:hyperlink w:history="1" r:id="rIddwpfbvb5umpoywd36yu_b">
+      <w:hyperlink w:history="1" r:id="rIdtul4lhmjyu0qbgyi7deta">
         <w:r>
           <w:rPr>
             <w:color w:val="EA2E00"/>
@@ -2848,7 +2848,7 @@
         </w:rPr>
         <w:t xml:space="preserve">, </w:t>
       </w:r>
-      <w:hyperlink w:history="1" r:id="rId-a7xojzcki0ctlgzhtm9i">
+      <w:hyperlink w:history="1" r:id="rIdjim_pjlb_d75_6-azlks9">
         <w:r>
           <w:rPr>
             <w:color w:val="EA2E00"/>
@@ -2899,7 +2899,7 @@
         </w:rPr>
         <w:t xml:space="preserve">Via </w:t>
       </w:r>
-      <w:hyperlink w:history="1" r:id="rId5fxced4keoyeffpj5gsuu">
+      <w:hyperlink w:history="1" r:id="rIdvftxok8zuqbjp4nwd3tl2">
         <w:r>
           <w:rPr>
             <w:color w:val="EA2E00"/>
@@ -2917,7 +2917,7 @@
         </w:rPr>
         <w:t xml:space="preserve">, </w:t>
       </w:r>
-      <w:hyperlink w:history="1" r:id="rId3wjyddvf_3ml8iazkbhyk">
+      <w:hyperlink w:history="1" r:id="rIdn4dy8hozxth-r-h55yk3p">
         <w:r>
           <w:rPr>
             <w:color w:val="EA2E00"/>
@@ -2935,7 +2935,7 @@
         </w:rPr>
         <w:t xml:space="preserve">, </w:t>
       </w:r>
-      <w:hyperlink w:history="1" r:id="rIdrgk3t_tckkkc4mv17ioli">
+      <w:hyperlink w:history="1" r:id="rIdyi-cyhkjmby-xnbqfwxcq">
         <w:r>
           <w:rPr>
             <w:color w:val="EA2E00"/>
@@ -2953,7 +2953,7 @@
         </w:rPr>
         <w:t xml:space="preserve">, </w:t>
       </w:r>
-      <w:hyperlink w:history="1" r:id="rIdk_4ngixethpj_g2txxhnl">
+      <w:hyperlink w:history="1" r:id="rIdoxiqqklpjejjzbnfv7smy">
         <w:r>
           <w:rPr>
             <w:color w:val="EA2E00"/>
@@ -2971,7 +2971,7 @@
         </w:rPr>
         <w:t xml:space="preserve">, </w:t>
       </w:r>
-      <w:hyperlink w:history="1" r:id="rIdbwotcdye2d2qpefkady4e">
+      <w:hyperlink w:history="1" r:id="rIdkgjl15mcyekdtcdkp1ilu">
         <w:r>
           <w:rPr>
             <w:color w:val="EA2E00"/>
@@ -3014,7 +3014,7 @@
         </w:rPr>
         <w:t xml:space="preserve">Via </w:t>
       </w:r>
-      <w:hyperlink w:history="1" r:id="rIdyqtfxdpsaibpwxbfv_j8m">
+      <w:hyperlink w:history="1" r:id="rId-fcdqnpuy8scq8sqmcc6a">
         <w:r>
           <w:rPr>
             <w:color w:val="EA2E00"/>
@@ -3057,7 +3057,7 @@
         </w:rPr>
         <w:t xml:space="preserve">Via </w:t>
       </w:r>
-      <w:hyperlink w:history="1" r:id="rIdrzduh1lf_xuvnrohkj-mp">
+      <w:hyperlink w:history="1" r:id="rIdovb_pqxtqj0busro2qlfn">
         <w:r>
           <w:rPr>
             <w:color w:val="EA2E00"/>
@@ -3075,7 +3075,7 @@
         </w:rPr>
         <w:t xml:space="preserve">, </w:t>
       </w:r>
-      <w:hyperlink w:history="1" r:id="rIdlzhzi2gkgmvi-sjbj1hto">
+      <w:hyperlink w:history="1" r:id="rIdl1opluevkaij8hun5xm-2">
         <w:r>
           <w:rPr>
             <w:color w:val="EA2E00"/>
@@ -3093,7 +3093,7 @@
         </w:rPr>
         <w:t xml:space="preserve">, </w:t>
       </w:r>
-      <w:hyperlink w:history="1" r:id="rId8-rocdnq-rtakf4ahbbl8">
+      <w:hyperlink w:history="1" r:id="rIdugan3cmiln4zt46uibhml">
         <w:r>
           <w:rPr>
             <w:color w:val="EA2E00"/>
@@ -3111,7 +3111,7 @@
         </w:rPr>
         <w:t xml:space="preserve">, </w:t>
       </w:r>
-      <w:hyperlink w:history="1" r:id="rIdkntxcaikvgeacju-qecmp">
+      <w:hyperlink w:history="1" r:id="rIdl9hej2sytnjimyn9yt3eu">
         <w:r>
           <w:rPr>
             <w:color w:val="EA2E00"/>
@@ -3129,7 +3129,7 @@
         </w:rPr>
         <w:t xml:space="preserve">, </w:t>
       </w:r>
-      <w:hyperlink w:history="1" r:id="rIdzgdp9oyqcoqf4yxy-t7zk">
+      <w:hyperlink w:history="1" r:id="rIdmbdplxelbedhexlwdq6rp">
         <w:r>
           <w:rPr>
             <w:color w:val="EA2E00"/>
@@ -3172,7 +3172,7 @@
         </w:rPr>
         <w:t xml:space="preserve">Via </w:t>
       </w:r>
-      <w:hyperlink w:history="1" r:id="rIdmuzjgvbcjtov8w3hkvu_z">
+      <w:hyperlink w:history="1" r:id="rId2rwhnzl2tauxv14zm7e--">
         <w:r>
           <w:rPr>
             <w:color w:val="EA2E00"/>
@@ -3190,7 +3190,7 @@
         </w:rPr>
         <w:t xml:space="preserve">, </w:t>
       </w:r>
-      <w:hyperlink w:history="1" r:id="rId8-nhnawzubjvzzvazimxs">
+      <w:hyperlink w:history="1" r:id="rIdi2ydkg-hqejt_5mh8wlxp">
         <w:r>
           <w:rPr>
             <w:color w:val="EA2E00"/>
@@ -3208,7 +3208,7 @@
         </w:rPr>
         <w:t xml:space="preserve">, </w:t>
       </w:r>
-      <w:hyperlink w:history="1" r:id="rIdz-0fqlzoef8jua2mlpd5x">
+      <w:hyperlink w:history="1" r:id="rIdb9wweybyrcaz4ypewk6-u">
         <w:r>
           <w:rPr>
             <w:color w:val="EA2E00"/>
@@ -3226,7 +3226,7 @@
         </w:rPr>
         <w:t xml:space="preserve">, </w:t>
       </w:r>
-      <w:hyperlink w:history="1" r:id="rIdy3vk-yixw3xcqiot1a_2j">
+      <w:hyperlink w:history="1" r:id="rIdjyve1pezkxwdjsidqibdt">
         <w:r>
           <w:rPr>
             <w:color w:val="EA2E00"/>
@@ -3244,7 +3244,7 @@
         </w:rPr>
         <w:t xml:space="preserve">, </w:t>
       </w:r>
-      <w:hyperlink w:history="1" r:id="rIdkugmuptpx4yd3heaihtl0">
+      <w:hyperlink w:history="1" r:id="rIdfnx9rye0ci-35siwoo_pi">
         <w:r>
           <w:rPr>
             <w:color w:val="EA2E00"/>
@@ -3262,7 +3262,7 @@
         </w:rPr>
         <w:t xml:space="preserve">, </w:t>
       </w:r>
-      <w:hyperlink w:history="1" r:id="rIdesoym3ycuerfxfsyf2inu">
+      <w:hyperlink w:history="1" r:id="rIduncgvvsic48fxpgdwoo-t">
         <w:r>
           <w:rPr>
             <w:color w:val="EA2E00"/>
@@ -3280,7 +3280,7 @@
         </w:rPr>
         <w:t xml:space="preserve">, </w:t>
       </w:r>
-      <w:hyperlink w:history="1" r:id="rIdpnjvbqqztetbilbqxxnxn">
+      <w:hyperlink w:history="1" r:id="rIdz_wxdpwe4cmrorwqhik6m">
         <w:r>
           <w:rPr>
             <w:color w:val="EA2E00"/>
@@ -3323,7 +3323,7 @@
         </w:rPr>
         <w:t xml:space="preserve">Via </w:t>
       </w:r>
-      <w:hyperlink w:history="1" r:id="rIdlimzvgpsev_mexml4sv9l">
+      <w:hyperlink w:history="1" r:id="rIdofyimc5oqznki3m0-bfl6">
         <w:r>
           <w:rPr>
             <w:color w:val="EA2E00"/>
@@ -3366,7 +3366,7 @@
         </w:rPr>
         <w:t xml:space="preserve">Via </w:t>
       </w:r>
-      <w:hyperlink w:history="1" r:id="rIdlqveq2nbqz8cqyontkf2y">
+      <w:hyperlink w:history="1" r:id="rId5evydwdvqbjpupuk3mbzj">
         <w:r>
           <w:rPr>
             <w:color w:val="EA2E00"/>
@@ -3448,7 +3448,7 @@
             </w:r>
           </w:p>
           <w:p>
-            <w:hyperlink w:history="1" r:id="rIdcjykp5ecqbd3zlp5_c6rz">
+            <w:hyperlink w:history="1" r:id="rId7p1vbt8z1jgeaaf77u7xr">
               <w:r>
                 <w:rPr>
                   <w:rStyle w:val="Hyperlink"/>
@@ -3607,6 +3607,1397 @@
         <w:pStyle w:val="Heading2"/>
       </w:pPr>
       <w:r>
+        <w:t xml:space="preserve">How Nuremberg compares with other German cities</w:t>
+      </w:r>
+    </w:p>
+    <w:p>
+      <w:pPr>
+        <w:spacing w:after="120"/>
+      </w:pPr>
+      <w:r>
+        <w:t xml:space="preserve">Police-recorded offences per 100,000 residents in 2024, using the same Eurostat measure for every city. Nuremberg ranks 2 of 8 big German cities for robbery (1 = lowest). Big cities all sit above the national average because shoppers, commuters and visitors are counted as victims but not as residents.</w:t>
+      </w:r>
+    </w:p>
+    <w:tbl>
+      <w:tblPr>
+        <w:tblW w:type="dxa" w:w="9026"/>
+        <w:tblBorders>
+          <w:top w:val="single" w:color="auto" w:sz="4"/>
+          <w:left w:val="single" w:color="auto" w:sz="4"/>
+          <w:bottom w:val="single" w:color="auto" w:sz="4"/>
+          <w:right w:val="single" w:color="auto" w:sz="4"/>
+          <w:insideH w:val="single" w:color="auto" w:sz="4"/>
+          <w:insideV w:val="single" w:color="auto" w:sz="4"/>
+        </w:tblBorders>
+      </w:tblPr>
+      <w:tblGrid>
+        <w:gridCol w:w="3400"/>
+        <w:gridCol w:w="1406"/>
+        <w:gridCol w:w="1406"/>
+        <w:gridCol w:w="1406"/>
+        <w:gridCol w:w="1406"/>
+      </w:tblGrid>
+      <w:tr>
+        <w:trPr>
+          <w:tblHeader/>
+        </w:trPr>
+        <w:tc>
+          <w:tcPr>
+            <w:tcW w:type="dxa" w:w="3400"/>
+            <w:tcBorders>
+              <w:top w:val="single" w:color="D9D2C3" w:sz="4"/>
+              <w:left w:val="single" w:color="D9D2C3" w:sz="4"/>
+              <w:bottom w:val="single" w:color="D9D2C3" w:sz="4"/>
+              <w:right w:val="single" w:color="D9D2C3" w:sz="4"/>
+            </w:tcBorders>
+            <w:shd w:fill="1A1A1A" w:color="auto" w:val="clear"/>
+            <w:tcMar>
+              <w:top w:type="dxa" w:w="80"/>
+              <w:left w:type="dxa" w:w="120"/>
+              <w:bottom w:type="dxa" w:w="80"/>
+              <w:right w:type="dxa" w:w="120"/>
+            </w:tcMar>
+          </w:tcPr>
+          <w:p>
+            <w:r>
+              <w:rPr>
+                <w:b/>
+                <w:bCs/>
+                <w:color w:val="FFFFFF"/>
+                <w:sz w:val="18"/>
+                <w:szCs w:val="18"/>
+              </w:rPr>
+            </w:r>
+          </w:p>
+        </w:tc>
+        <w:tc>
+          <w:tcPr>
+            <w:tcW w:type="dxa" w:w="1406"/>
+            <w:tcBorders>
+              <w:top w:val="single" w:color="D9D2C3" w:sz="4"/>
+              <w:left w:val="single" w:color="D9D2C3" w:sz="4"/>
+              <w:bottom w:val="single" w:color="D9D2C3" w:sz="4"/>
+              <w:right w:val="single" w:color="D9D2C3" w:sz="4"/>
+            </w:tcBorders>
+            <w:shd w:fill="1A1A1A" w:color="auto" w:val="clear"/>
+            <w:tcMar>
+              <w:top w:type="dxa" w:w="80"/>
+              <w:left w:type="dxa" w:w="120"/>
+              <w:bottom w:type="dxa" w:w="80"/>
+              <w:right w:type="dxa" w:w="120"/>
+            </w:tcMar>
+          </w:tcPr>
+          <w:p>
+            <w:r>
+              <w:rPr>
+                <w:b/>
+                <w:bCs/>
+                <w:color w:val="FFFFFF"/>
+                <w:sz w:val="18"/>
+                <w:szCs w:val="18"/>
+              </w:rPr>
+              <w:t xml:space="preserve">Theft</w:t>
+            </w:r>
+          </w:p>
+        </w:tc>
+        <w:tc>
+          <w:tcPr>
+            <w:tcW w:type="dxa" w:w="1406"/>
+            <w:tcBorders>
+              <w:top w:val="single" w:color="D9D2C3" w:sz="4"/>
+              <w:left w:val="single" w:color="D9D2C3" w:sz="4"/>
+              <w:bottom w:val="single" w:color="D9D2C3" w:sz="4"/>
+              <w:right w:val="single" w:color="D9D2C3" w:sz="4"/>
+            </w:tcBorders>
+            <w:shd w:fill="1A1A1A" w:color="auto" w:val="clear"/>
+            <w:tcMar>
+              <w:top w:type="dxa" w:w="80"/>
+              <w:left w:type="dxa" w:w="120"/>
+              <w:bottom w:type="dxa" w:w="80"/>
+              <w:right w:type="dxa" w:w="120"/>
+            </w:tcMar>
+          </w:tcPr>
+          <w:p>
+            <w:r>
+              <w:rPr>
+                <w:b/>
+                <w:bCs/>
+                <w:color w:val="FFFFFF"/>
+                <w:sz w:val="18"/>
+                <w:szCs w:val="18"/>
+              </w:rPr>
+              <w:t xml:space="preserve">Robbery</w:t>
+            </w:r>
+          </w:p>
+        </w:tc>
+        <w:tc>
+          <w:tcPr>
+            <w:tcW w:type="dxa" w:w="1406"/>
+            <w:tcBorders>
+              <w:top w:val="single" w:color="D9D2C3" w:sz="4"/>
+              <w:left w:val="single" w:color="D9D2C3" w:sz="4"/>
+              <w:bottom w:val="single" w:color="D9D2C3" w:sz="4"/>
+              <w:right w:val="single" w:color="D9D2C3" w:sz="4"/>
+            </w:tcBorders>
+            <w:shd w:fill="1A1A1A" w:color="auto" w:val="clear"/>
+            <w:tcMar>
+              <w:top w:type="dxa" w:w="80"/>
+              <w:left w:type="dxa" w:w="120"/>
+              <w:bottom w:type="dxa" w:w="80"/>
+              <w:right w:type="dxa" w:w="120"/>
+            </w:tcMar>
+          </w:tcPr>
+          <w:p>
+            <w:r>
+              <w:rPr>
+                <w:b/>
+                <w:bCs/>
+                <w:color w:val="FFFFFF"/>
+                <w:sz w:val="18"/>
+                <w:szCs w:val="18"/>
+              </w:rPr>
+              <w:t xml:space="preserve">Assault</w:t>
+            </w:r>
+          </w:p>
+        </w:tc>
+        <w:tc>
+          <w:tcPr>
+            <w:tcW w:type="dxa" w:w="1406"/>
+            <w:tcBorders>
+              <w:top w:val="single" w:color="D9D2C3" w:sz="4"/>
+              <w:left w:val="single" w:color="D9D2C3" w:sz="4"/>
+              <w:bottom w:val="single" w:color="D9D2C3" w:sz="4"/>
+              <w:right w:val="single" w:color="D9D2C3" w:sz="4"/>
+            </w:tcBorders>
+            <w:shd w:fill="1A1A1A" w:color="auto" w:val="clear"/>
+            <w:tcMar>
+              <w:top w:type="dxa" w:w="80"/>
+              <w:left w:type="dxa" w:w="120"/>
+              <w:bottom w:type="dxa" w:w="80"/>
+              <w:right w:type="dxa" w:w="120"/>
+            </w:tcMar>
+          </w:tcPr>
+          <w:p>
+            <w:r>
+              <w:rPr>
+                <w:b/>
+                <w:bCs/>
+                <w:color w:val="FFFFFF"/>
+                <w:sz w:val="18"/>
+                <w:szCs w:val="18"/>
+              </w:rPr>
+              <w:t xml:space="preserve">Burglary</w:t>
+            </w:r>
+          </w:p>
+        </w:tc>
+      </w:tr>
+      <w:tr>
+        <w:tc>
+          <w:tcPr>
+            <w:tcW w:type="dxa" w:w="3400"/>
+            <w:tcBorders>
+              <w:top w:val="single" w:color="D9D2C3" w:sz="4"/>
+              <w:left w:val="single" w:color="D9D2C3" w:sz="4"/>
+              <w:bottom w:val="single" w:color="D9D2C3" w:sz="4"/>
+              <w:right w:val="single" w:color="D9D2C3" w:sz="4"/>
+            </w:tcBorders>
+            <w:tcMar>
+              <w:top w:type="dxa" w:w="80"/>
+              <w:left w:type="dxa" w:w="120"/>
+              <w:bottom w:type="dxa" w:w="80"/>
+              <w:right w:type="dxa" w:w="120"/>
+            </w:tcMar>
+          </w:tcPr>
+          <w:p>
+            <w:r>
+              <w:rPr>
+                <w:sz w:val="18"/>
+                <w:szCs w:val="18"/>
+              </w:rPr>
+              <w:t xml:space="preserve">Munich</w:t>
+            </w:r>
+          </w:p>
+        </w:tc>
+        <w:tc>
+          <w:tcPr>
+            <w:tcW w:type="dxa" w:w="1406"/>
+            <w:tcBorders>
+              <w:top w:val="single" w:color="D9D2C3" w:sz="4"/>
+              <w:left w:val="single" w:color="D9D2C3" w:sz="4"/>
+              <w:bottom w:val="single" w:color="D9D2C3" w:sz="4"/>
+              <w:right w:val="single" w:color="D9D2C3" w:sz="4"/>
+            </w:tcBorders>
+            <w:tcMar>
+              <w:top w:type="dxa" w:w="80"/>
+              <w:left w:type="dxa" w:w="120"/>
+              <w:bottom w:type="dxa" w:w="80"/>
+              <w:right w:type="dxa" w:w="120"/>
+            </w:tcMar>
+          </w:tcPr>
+          <w:p>
+            <w:r>
+              <w:rPr>
+                <w:sz w:val="18"/>
+                <w:szCs w:val="18"/>
+              </w:rPr>
+              <w:t xml:space="preserve">1,272</w:t>
+            </w:r>
+          </w:p>
+        </w:tc>
+        <w:tc>
+          <w:tcPr>
+            <w:tcW w:type="dxa" w:w="1406"/>
+            <w:tcBorders>
+              <w:top w:val="single" w:color="D9D2C3" w:sz="4"/>
+              <w:left w:val="single" w:color="D9D2C3" w:sz="4"/>
+              <w:bottom w:val="single" w:color="D9D2C3" w:sz="4"/>
+              <w:right w:val="single" w:color="D9D2C3" w:sz="4"/>
+            </w:tcBorders>
+            <w:tcMar>
+              <w:top w:type="dxa" w:w="80"/>
+              <w:left w:type="dxa" w:w="120"/>
+              <w:bottom w:type="dxa" w:w="80"/>
+              <w:right w:type="dxa" w:w="120"/>
+            </w:tcMar>
+          </w:tcPr>
+          <w:p>
+            <w:r>
+              <w:rPr>
+                <w:sz w:val="18"/>
+                <w:szCs w:val="18"/>
+              </w:rPr>
+              <w:t xml:space="preserve">51</w:t>
+            </w:r>
+          </w:p>
+        </w:tc>
+        <w:tc>
+          <w:tcPr>
+            <w:tcW w:type="dxa" w:w="1406"/>
+            <w:tcBorders>
+              <w:top w:val="single" w:color="D9D2C3" w:sz="4"/>
+              <w:left w:val="single" w:color="D9D2C3" w:sz="4"/>
+              <w:bottom w:val="single" w:color="D9D2C3" w:sz="4"/>
+              <w:right w:val="single" w:color="D9D2C3" w:sz="4"/>
+            </w:tcBorders>
+            <w:tcMar>
+              <w:top w:type="dxa" w:w="80"/>
+              <w:left w:type="dxa" w:w="120"/>
+              <w:bottom w:type="dxa" w:w="80"/>
+              <w:right w:type="dxa" w:w="120"/>
+            </w:tcMar>
+          </w:tcPr>
+          <w:p>
+            <w:r>
+              <w:rPr>
+                <w:sz w:val="18"/>
+                <w:szCs w:val="18"/>
+              </w:rPr>
+              <w:t xml:space="preserve">806</w:t>
+            </w:r>
+          </w:p>
+        </w:tc>
+        <w:tc>
+          <w:tcPr>
+            <w:tcW w:type="dxa" w:w="1406"/>
+            <w:tcBorders>
+              <w:top w:val="single" w:color="D9D2C3" w:sz="4"/>
+              <w:left w:val="single" w:color="D9D2C3" w:sz="4"/>
+              <w:bottom w:val="single" w:color="D9D2C3" w:sz="4"/>
+              <w:right w:val="single" w:color="D9D2C3" w:sz="4"/>
+            </w:tcBorders>
+            <w:tcMar>
+              <w:top w:type="dxa" w:w="80"/>
+              <w:left w:type="dxa" w:w="120"/>
+              <w:bottom w:type="dxa" w:w="80"/>
+              <w:right w:type="dxa" w:w="120"/>
+            </w:tcMar>
+          </w:tcPr>
+          <w:p>
+            <w:r>
+              <w:rPr>
+                <w:sz w:val="18"/>
+                <w:szCs w:val="18"/>
+              </w:rPr>
+              <w:t xml:space="preserve">276</w:t>
+            </w:r>
+          </w:p>
+        </w:tc>
+      </w:tr>
+      <w:tr>
+        <w:tc>
+          <w:tcPr>
+            <w:tcW w:type="dxa" w:w="3400"/>
+            <w:tcBorders>
+              <w:top w:val="single" w:color="D9D2C3" w:sz="4"/>
+              <w:left w:val="single" w:color="D9D2C3" w:sz="4"/>
+              <w:bottom w:val="single" w:color="D9D2C3" w:sz="4"/>
+              <w:right w:val="single" w:color="D9D2C3" w:sz="4"/>
+            </w:tcBorders>
+            <w:tcMar>
+              <w:top w:type="dxa" w:w="80"/>
+              <w:left w:type="dxa" w:w="120"/>
+              <w:bottom w:type="dxa" w:w="80"/>
+              <w:right w:type="dxa" w:w="120"/>
+            </w:tcMar>
+          </w:tcPr>
+          <w:p>
+            <w:r>
+              <w:rPr>
+                <w:sz w:val="18"/>
+                <w:szCs w:val="18"/>
+              </w:rPr>
+              <w:t xml:space="preserve">Nuremberg  ◀</w:t>
+            </w:r>
+          </w:p>
+        </w:tc>
+        <w:tc>
+          <w:tcPr>
+            <w:tcW w:type="dxa" w:w="1406"/>
+            <w:tcBorders>
+              <w:top w:val="single" w:color="D9D2C3" w:sz="4"/>
+              <w:left w:val="single" w:color="D9D2C3" w:sz="4"/>
+              <w:bottom w:val="single" w:color="D9D2C3" w:sz="4"/>
+              <w:right w:val="single" w:color="D9D2C3" w:sz="4"/>
+            </w:tcBorders>
+            <w:tcMar>
+              <w:top w:type="dxa" w:w="80"/>
+              <w:left w:type="dxa" w:w="120"/>
+              <w:bottom w:type="dxa" w:w="80"/>
+              <w:right w:type="dxa" w:w="120"/>
+            </w:tcMar>
+          </w:tcPr>
+          <w:p>
+            <w:r>
+              <w:rPr>
+                <w:sz w:val="18"/>
+                <w:szCs w:val="18"/>
+              </w:rPr>
+              <w:t xml:space="preserve">1,701</w:t>
+            </w:r>
+          </w:p>
+        </w:tc>
+        <w:tc>
+          <w:tcPr>
+            <w:tcW w:type="dxa" w:w="1406"/>
+            <w:tcBorders>
+              <w:top w:val="single" w:color="D9D2C3" w:sz="4"/>
+              <w:left w:val="single" w:color="D9D2C3" w:sz="4"/>
+              <w:bottom w:val="single" w:color="D9D2C3" w:sz="4"/>
+              <w:right w:val="single" w:color="D9D2C3" w:sz="4"/>
+            </w:tcBorders>
+            <w:tcMar>
+              <w:top w:type="dxa" w:w="80"/>
+              <w:left w:type="dxa" w:w="120"/>
+              <w:bottom w:type="dxa" w:w="80"/>
+              <w:right w:type="dxa" w:w="120"/>
+            </w:tcMar>
+          </w:tcPr>
+          <w:p>
+            <w:r>
+              <w:rPr>
+                <w:sz w:val="18"/>
+                <w:szCs w:val="18"/>
+              </w:rPr>
+              <w:t xml:space="preserve">60</w:t>
+            </w:r>
+          </w:p>
+        </w:tc>
+        <w:tc>
+          <w:tcPr>
+            <w:tcW w:type="dxa" w:w="1406"/>
+            <w:tcBorders>
+              <w:top w:val="single" w:color="D9D2C3" w:sz="4"/>
+              <w:left w:val="single" w:color="D9D2C3" w:sz="4"/>
+              <w:bottom w:val="single" w:color="D9D2C3" w:sz="4"/>
+              <w:right w:val="single" w:color="D9D2C3" w:sz="4"/>
+            </w:tcBorders>
+            <w:tcMar>
+              <w:top w:type="dxa" w:w="80"/>
+              <w:left w:type="dxa" w:w="120"/>
+              <w:bottom w:type="dxa" w:w="80"/>
+              <w:right w:type="dxa" w:w="120"/>
+            </w:tcMar>
+          </w:tcPr>
+          <w:p>
+            <w:r>
+              <w:rPr>
+                <w:sz w:val="18"/>
+                <w:szCs w:val="18"/>
+              </w:rPr>
+              <w:t xml:space="preserve">889</w:t>
+            </w:r>
+          </w:p>
+        </w:tc>
+        <w:tc>
+          <w:tcPr>
+            <w:tcW w:type="dxa" w:w="1406"/>
+            <w:tcBorders>
+              <w:top w:val="single" w:color="D9D2C3" w:sz="4"/>
+              <w:left w:val="single" w:color="D9D2C3" w:sz="4"/>
+              <w:bottom w:val="single" w:color="D9D2C3" w:sz="4"/>
+              <w:right w:val="single" w:color="D9D2C3" w:sz="4"/>
+            </w:tcBorders>
+            <w:tcMar>
+              <w:top w:type="dxa" w:w="80"/>
+              <w:left w:type="dxa" w:w="120"/>
+              <w:bottom w:type="dxa" w:w="80"/>
+              <w:right w:type="dxa" w:w="120"/>
+            </w:tcMar>
+          </w:tcPr>
+          <w:p>
+            <w:r>
+              <w:rPr>
+                <w:sz w:val="18"/>
+                <w:szCs w:val="18"/>
+              </w:rPr>
+              <w:t xml:space="preserve">413</w:t>
+            </w:r>
+          </w:p>
+        </w:tc>
+      </w:tr>
+      <w:tr>
+        <w:tc>
+          <w:tcPr>
+            <w:tcW w:type="dxa" w:w="3400"/>
+            <w:tcBorders>
+              <w:top w:val="single" w:color="D9D2C3" w:sz="4"/>
+              <w:left w:val="single" w:color="D9D2C3" w:sz="4"/>
+              <w:bottom w:val="single" w:color="D9D2C3" w:sz="4"/>
+              <w:right w:val="single" w:color="D9D2C3" w:sz="4"/>
+            </w:tcBorders>
+            <w:tcMar>
+              <w:top w:type="dxa" w:w="80"/>
+              <w:left w:type="dxa" w:w="120"/>
+              <w:bottom w:type="dxa" w:w="80"/>
+              <w:right w:type="dxa" w:w="120"/>
+            </w:tcMar>
+          </w:tcPr>
+          <w:p>
+            <w:r>
+              <w:rPr>
+                <w:sz w:val="18"/>
+                <w:szCs w:val="18"/>
+              </w:rPr>
+              <w:t xml:space="preserve">Stuttgart</w:t>
+            </w:r>
+          </w:p>
+        </w:tc>
+        <w:tc>
+          <w:tcPr>
+            <w:tcW w:type="dxa" w:w="1406"/>
+            <w:tcBorders>
+              <w:top w:val="single" w:color="D9D2C3" w:sz="4"/>
+              <w:left w:val="single" w:color="D9D2C3" w:sz="4"/>
+              <w:bottom w:val="single" w:color="D9D2C3" w:sz="4"/>
+              <w:right w:val="single" w:color="D9D2C3" w:sz="4"/>
+            </w:tcBorders>
+            <w:tcMar>
+              <w:top w:type="dxa" w:w="80"/>
+              <w:left w:type="dxa" w:w="120"/>
+              <w:bottom w:type="dxa" w:w="80"/>
+              <w:right w:type="dxa" w:w="120"/>
+            </w:tcMar>
+          </w:tcPr>
+          <w:p>
+            <w:r>
+              <w:rPr>
+                <w:sz w:val="18"/>
+                <w:szCs w:val="18"/>
+              </w:rPr>
+              <w:t xml:space="preserve">1,801</w:t>
+            </w:r>
+          </w:p>
+        </w:tc>
+        <w:tc>
+          <w:tcPr>
+            <w:tcW w:type="dxa" w:w="1406"/>
+            <w:tcBorders>
+              <w:top w:val="single" w:color="D9D2C3" w:sz="4"/>
+              <w:left w:val="single" w:color="D9D2C3" w:sz="4"/>
+              <w:bottom w:val="single" w:color="D9D2C3" w:sz="4"/>
+              <w:right w:val="single" w:color="D9D2C3" w:sz="4"/>
+            </w:tcBorders>
+            <w:tcMar>
+              <w:top w:type="dxa" w:w="80"/>
+              <w:left w:type="dxa" w:w="120"/>
+              <w:bottom w:type="dxa" w:w="80"/>
+              <w:right w:type="dxa" w:w="120"/>
+            </w:tcMar>
+          </w:tcPr>
+          <w:p>
+            <w:r>
+              <w:rPr>
+                <w:sz w:val="18"/>
+                <w:szCs w:val="18"/>
+              </w:rPr>
+              <w:t xml:space="preserve">107</w:t>
+            </w:r>
+          </w:p>
+        </w:tc>
+        <w:tc>
+          <w:tcPr>
+            <w:tcW w:type="dxa" w:w="1406"/>
+            <w:tcBorders>
+              <w:top w:val="single" w:color="D9D2C3" w:sz="4"/>
+              <w:left w:val="single" w:color="D9D2C3" w:sz="4"/>
+              <w:bottom w:val="single" w:color="D9D2C3" w:sz="4"/>
+              <w:right w:val="single" w:color="D9D2C3" w:sz="4"/>
+            </w:tcBorders>
+            <w:tcMar>
+              <w:top w:type="dxa" w:w="80"/>
+              <w:left w:type="dxa" w:w="120"/>
+              <w:bottom w:type="dxa" w:w="80"/>
+              <w:right w:type="dxa" w:w="120"/>
+            </w:tcMar>
+          </w:tcPr>
+          <w:p>
+            <w:r>
+              <w:rPr>
+                <w:sz w:val="18"/>
+                <w:szCs w:val="18"/>
+              </w:rPr>
+              <w:t xml:space="preserve">1,102</w:t>
+            </w:r>
+          </w:p>
+        </w:tc>
+        <w:tc>
+          <w:tcPr>
+            <w:tcW w:type="dxa" w:w="1406"/>
+            <w:tcBorders>
+              <w:top w:val="single" w:color="D9D2C3" w:sz="4"/>
+              <w:left w:val="single" w:color="D9D2C3" w:sz="4"/>
+              <w:bottom w:val="single" w:color="D9D2C3" w:sz="4"/>
+              <w:right w:val="single" w:color="D9D2C3" w:sz="4"/>
+            </w:tcBorders>
+            <w:tcMar>
+              <w:top w:type="dxa" w:w="80"/>
+              <w:left w:type="dxa" w:w="120"/>
+              <w:bottom w:type="dxa" w:w="80"/>
+              <w:right w:type="dxa" w:w="120"/>
+            </w:tcMar>
+          </w:tcPr>
+          <w:p>
+            <w:r>
+              <w:rPr>
+                <w:sz w:val="18"/>
+                <w:szCs w:val="18"/>
+              </w:rPr>
+              <w:t xml:space="preserve">358</w:t>
+            </w:r>
+          </w:p>
+        </w:tc>
+      </w:tr>
+      <w:tr>
+        <w:tc>
+          <w:tcPr>
+            <w:tcW w:type="dxa" w:w="3400"/>
+            <w:tcBorders>
+              <w:top w:val="single" w:color="D9D2C3" w:sz="4"/>
+              <w:left w:val="single" w:color="D9D2C3" w:sz="4"/>
+              <w:bottom w:val="single" w:color="D9D2C3" w:sz="4"/>
+              <w:right w:val="single" w:color="D9D2C3" w:sz="4"/>
+            </w:tcBorders>
+            <w:tcMar>
+              <w:top w:type="dxa" w:w="80"/>
+              <w:left w:type="dxa" w:w="120"/>
+              <w:bottom w:type="dxa" w:w="80"/>
+              <w:right w:type="dxa" w:w="120"/>
+            </w:tcMar>
+          </w:tcPr>
+          <w:p>
+            <w:r>
+              <w:rPr>
+                <w:sz w:val="18"/>
+                <w:szCs w:val="18"/>
+              </w:rPr>
+              <w:t xml:space="preserve">Hamburg</w:t>
+            </w:r>
+          </w:p>
+        </w:tc>
+        <w:tc>
+          <w:tcPr>
+            <w:tcW w:type="dxa" w:w="1406"/>
+            <w:tcBorders>
+              <w:top w:val="single" w:color="D9D2C3" w:sz="4"/>
+              <w:left w:val="single" w:color="D9D2C3" w:sz="4"/>
+              <w:bottom w:val="single" w:color="D9D2C3" w:sz="4"/>
+              <w:right w:val="single" w:color="D9D2C3" w:sz="4"/>
+            </w:tcBorders>
+            <w:tcMar>
+              <w:top w:type="dxa" w:w="80"/>
+              <w:left w:type="dxa" w:w="120"/>
+              <w:bottom w:type="dxa" w:w="80"/>
+              <w:right w:type="dxa" w:w="120"/>
+            </w:tcMar>
+          </w:tcPr>
+          <w:p>
+            <w:r>
+              <w:rPr>
+                <w:sz w:val="18"/>
+                <w:szCs w:val="18"/>
+              </w:rPr>
+              <w:t xml:space="preserve">3,255</w:t>
+            </w:r>
+          </w:p>
+        </w:tc>
+        <w:tc>
+          <w:tcPr>
+            <w:tcW w:type="dxa" w:w="1406"/>
+            <w:tcBorders>
+              <w:top w:val="single" w:color="D9D2C3" w:sz="4"/>
+              <w:left w:val="single" w:color="D9D2C3" w:sz="4"/>
+              <w:bottom w:val="single" w:color="D9D2C3" w:sz="4"/>
+              <w:right w:val="single" w:color="D9D2C3" w:sz="4"/>
+            </w:tcBorders>
+            <w:tcMar>
+              <w:top w:type="dxa" w:w="80"/>
+              <w:left w:type="dxa" w:w="120"/>
+              <w:bottom w:type="dxa" w:w="80"/>
+              <w:right w:type="dxa" w:w="120"/>
+            </w:tcMar>
+          </w:tcPr>
+          <w:p>
+            <w:r>
+              <w:rPr>
+                <w:sz w:val="18"/>
+                <w:szCs w:val="18"/>
+              </w:rPr>
+              <w:t xml:space="preserve">127</w:t>
+            </w:r>
+          </w:p>
+        </w:tc>
+        <w:tc>
+          <w:tcPr>
+            <w:tcW w:type="dxa" w:w="1406"/>
+            <w:tcBorders>
+              <w:top w:val="single" w:color="D9D2C3" w:sz="4"/>
+              <w:left w:val="single" w:color="D9D2C3" w:sz="4"/>
+              <w:bottom w:val="single" w:color="D9D2C3" w:sz="4"/>
+              <w:right w:val="single" w:color="D9D2C3" w:sz="4"/>
+            </w:tcBorders>
+            <w:tcMar>
+              <w:top w:type="dxa" w:w="80"/>
+              <w:left w:type="dxa" w:w="120"/>
+              <w:bottom w:type="dxa" w:w="80"/>
+              <w:right w:type="dxa" w:w="120"/>
+            </w:tcMar>
+          </w:tcPr>
+          <w:p>
+            <w:r>
+              <w:rPr>
+                <w:sz w:val="18"/>
+                <w:szCs w:val="18"/>
+              </w:rPr>
+              <w:t xml:space="preserve">1,251</w:t>
+            </w:r>
+          </w:p>
+        </w:tc>
+        <w:tc>
+          <w:tcPr>
+            <w:tcW w:type="dxa" w:w="1406"/>
+            <w:tcBorders>
+              <w:top w:val="single" w:color="D9D2C3" w:sz="4"/>
+              <w:left w:val="single" w:color="D9D2C3" w:sz="4"/>
+              <w:bottom w:val="single" w:color="D9D2C3" w:sz="4"/>
+              <w:right w:val="single" w:color="D9D2C3" w:sz="4"/>
+            </w:tcBorders>
+            <w:tcMar>
+              <w:top w:type="dxa" w:w="80"/>
+              <w:left w:type="dxa" w:w="120"/>
+              <w:bottom w:type="dxa" w:w="80"/>
+              <w:right w:type="dxa" w:w="120"/>
+            </w:tcMar>
+          </w:tcPr>
+          <w:p>
+            <w:r>
+              <w:rPr>
+                <w:sz w:val="18"/>
+                <w:szCs w:val="18"/>
+              </w:rPr>
+              <w:t xml:space="preserve">469</w:t>
+            </w:r>
+          </w:p>
+        </w:tc>
+      </w:tr>
+      <w:tr>
+        <w:tc>
+          <w:tcPr>
+            <w:tcW w:type="dxa" w:w="3400"/>
+            <w:tcBorders>
+              <w:top w:val="single" w:color="D9D2C3" w:sz="4"/>
+              <w:left w:val="single" w:color="D9D2C3" w:sz="4"/>
+              <w:bottom w:val="single" w:color="D9D2C3" w:sz="4"/>
+              <w:right w:val="single" w:color="D9D2C3" w:sz="4"/>
+            </w:tcBorders>
+            <w:tcMar>
+              <w:top w:type="dxa" w:w="80"/>
+              <w:left w:type="dxa" w:w="120"/>
+              <w:bottom w:type="dxa" w:w="80"/>
+              <w:right w:type="dxa" w:w="120"/>
+            </w:tcMar>
+          </w:tcPr>
+          <w:p>
+            <w:r>
+              <w:rPr>
+                <w:sz w:val="18"/>
+                <w:szCs w:val="18"/>
+              </w:rPr>
+              <w:t xml:space="preserve">Düsseldorf</w:t>
+            </w:r>
+          </w:p>
+        </w:tc>
+        <w:tc>
+          <w:tcPr>
+            <w:tcW w:type="dxa" w:w="1406"/>
+            <w:tcBorders>
+              <w:top w:val="single" w:color="D9D2C3" w:sz="4"/>
+              <w:left w:val="single" w:color="D9D2C3" w:sz="4"/>
+              <w:bottom w:val="single" w:color="D9D2C3" w:sz="4"/>
+              <w:right w:val="single" w:color="D9D2C3" w:sz="4"/>
+            </w:tcBorders>
+            <w:tcMar>
+              <w:top w:type="dxa" w:w="80"/>
+              <w:left w:type="dxa" w:w="120"/>
+              <w:bottom w:type="dxa" w:w="80"/>
+              <w:right w:type="dxa" w:w="120"/>
+            </w:tcMar>
+          </w:tcPr>
+          <w:p>
+            <w:r>
+              <w:rPr>
+                <w:sz w:val="18"/>
+                <w:szCs w:val="18"/>
+              </w:rPr>
+              <w:t xml:space="preserve">3,351</w:t>
+            </w:r>
+          </w:p>
+        </w:tc>
+        <w:tc>
+          <w:tcPr>
+            <w:tcW w:type="dxa" w:w="1406"/>
+            <w:tcBorders>
+              <w:top w:val="single" w:color="D9D2C3" w:sz="4"/>
+              <w:left w:val="single" w:color="D9D2C3" w:sz="4"/>
+              <w:bottom w:val="single" w:color="D9D2C3" w:sz="4"/>
+              <w:right w:val="single" w:color="D9D2C3" w:sz="4"/>
+            </w:tcBorders>
+            <w:tcMar>
+              <w:top w:type="dxa" w:w="80"/>
+              <w:left w:type="dxa" w:w="120"/>
+              <w:bottom w:type="dxa" w:w="80"/>
+              <w:right w:type="dxa" w:w="120"/>
+            </w:tcMar>
+          </w:tcPr>
+          <w:p>
+            <w:r>
+              <w:rPr>
+                <w:sz w:val="18"/>
+                <w:szCs w:val="18"/>
+              </w:rPr>
+              <w:t xml:space="preserve">129</w:t>
+            </w:r>
+          </w:p>
+        </w:tc>
+        <w:tc>
+          <w:tcPr>
+            <w:tcW w:type="dxa" w:w="1406"/>
+            <w:tcBorders>
+              <w:top w:val="single" w:color="D9D2C3" w:sz="4"/>
+              <w:left w:val="single" w:color="D9D2C3" w:sz="4"/>
+              <w:bottom w:val="single" w:color="D9D2C3" w:sz="4"/>
+              <w:right w:val="single" w:color="D9D2C3" w:sz="4"/>
+            </w:tcBorders>
+            <w:tcMar>
+              <w:top w:type="dxa" w:w="80"/>
+              <w:left w:type="dxa" w:w="120"/>
+              <w:bottom w:type="dxa" w:w="80"/>
+              <w:right w:type="dxa" w:w="120"/>
+            </w:tcMar>
+          </w:tcPr>
+          <w:p>
+            <w:r>
+              <w:rPr>
+                <w:sz w:val="18"/>
+                <w:szCs w:val="18"/>
+              </w:rPr>
+              <w:t xml:space="preserve">1,097</w:t>
+            </w:r>
+          </w:p>
+        </w:tc>
+        <w:tc>
+          <w:tcPr>
+            <w:tcW w:type="dxa" w:w="1406"/>
+            <w:tcBorders>
+              <w:top w:val="single" w:color="D9D2C3" w:sz="4"/>
+              <w:left w:val="single" w:color="D9D2C3" w:sz="4"/>
+              <w:bottom w:val="single" w:color="D9D2C3" w:sz="4"/>
+              <w:right w:val="single" w:color="D9D2C3" w:sz="4"/>
+            </w:tcBorders>
+            <w:tcMar>
+              <w:top w:type="dxa" w:w="80"/>
+              <w:left w:type="dxa" w:w="120"/>
+              <w:bottom w:type="dxa" w:w="80"/>
+              <w:right w:type="dxa" w:w="120"/>
+            </w:tcMar>
+          </w:tcPr>
+          <w:p>
+            <w:r>
+              <w:rPr>
+                <w:sz w:val="18"/>
+                <w:szCs w:val="18"/>
+              </w:rPr>
+              <w:t xml:space="preserve">755</w:t>
+            </w:r>
+          </w:p>
+        </w:tc>
+      </w:tr>
+      <w:tr>
+        <w:tc>
+          <w:tcPr>
+            <w:tcW w:type="dxa" w:w="3400"/>
+            <w:tcBorders>
+              <w:top w:val="single" w:color="D9D2C3" w:sz="4"/>
+              <w:left w:val="single" w:color="D9D2C3" w:sz="4"/>
+              <w:bottom w:val="single" w:color="D9D2C3" w:sz="4"/>
+              <w:right w:val="single" w:color="D9D2C3" w:sz="4"/>
+            </w:tcBorders>
+            <w:tcMar>
+              <w:top w:type="dxa" w:w="80"/>
+              <w:left w:type="dxa" w:w="120"/>
+              <w:bottom w:type="dxa" w:w="80"/>
+              <w:right w:type="dxa" w:w="120"/>
+            </w:tcMar>
+          </w:tcPr>
+          <w:p>
+            <w:r>
+              <w:rPr>
+                <w:sz w:val="18"/>
+                <w:szCs w:val="18"/>
+              </w:rPr>
+              <w:t xml:space="preserve">Cologne</w:t>
+            </w:r>
+          </w:p>
+        </w:tc>
+        <w:tc>
+          <w:tcPr>
+            <w:tcW w:type="dxa" w:w="1406"/>
+            <w:tcBorders>
+              <w:top w:val="single" w:color="D9D2C3" w:sz="4"/>
+              <w:left w:val="single" w:color="D9D2C3" w:sz="4"/>
+              <w:bottom w:val="single" w:color="D9D2C3" w:sz="4"/>
+              <w:right w:val="single" w:color="D9D2C3" w:sz="4"/>
+            </w:tcBorders>
+            <w:tcMar>
+              <w:top w:type="dxa" w:w="80"/>
+              <w:left w:type="dxa" w:w="120"/>
+              <w:bottom w:type="dxa" w:w="80"/>
+              <w:right w:type="dxa" w:w="120"/>
+            </w:tcMar>
+          </w:tcPr>
+          <w:p>
+            <w:r>
+              <w:rPr>
+                <w:sz w:val="18"/>
+                <w:szCs w:val="18"/>
+              </w:rPr>
+              <w:t xml:space="preserve">3,462</w:t>
+            </w:r>
+          </w:p>
+        </w:tc>
+        <w:tc>
+          <w:tcPr>
+            <w:tcW w:type="dxa" w:w="1406"/>
+            <w:tcBorders>
+              <w:top w:val="single" w:color="D9D2C3" w:sz="4"/>
+              <w:left w:val="single" w:color="D9D2C3" w:sz="4"/>
+              <w:bottom w:val="single" w:color="D9D2C3" w:sz="4"/>
+              <w:right w:val="single" w:color="D9D2C3" w:sz="4"/>
+            </w:tcBorders>
+            <w:tcMar>
+              <w:top w:type="dxa" w:w="80"/>
+              <w:left w:type="dxa" w:w="120"/>
+              <w:bottom w:type="dxa" w:w="80"/>
+              <w:right w:type="dxa" w:w="120"/>
+            </w:tcMar>
+          </w:tcPr>
+          <w:p>
+            <w:r>
+              <w:rPr>
+                <w:sz w:val="18"/>
+                <w:szCs w:val="18"/>
+              </w:rPr>
+              <w:t xml:space="preserve">132</w:t>
+            </w:r>
+          </w:p>
+        </w:tc>
+        <w:tc>
+          <w:tcPr>
+            <w:tcW w:type="dxa" w:w="1406"/>
+            <w:tcBorders>
+              <w:top w:val="single" w:color="D9D2C3" w:sz="4"/>
+              <w:left w:val="single" w:color="D9D2C3" w:sz="4"/>
+              <w:bottom w:val="single" w:color="D9D2C3" w:sz="4"/>
+              <w:right w:val="single" w:color="D9D2C3" w:sz="4"/>
+            </w:tcBorders>
+            <w:tcMar>
+              <w:top w:type="dxa" w:w="80"/>
+              <w:left w:type="dxa" w:w="120"/>
+              <w:bottom w:type="dxa" w:w="80"/>
+              <w:right w:type="dxa" w:w="120"/>
+            </w:tcMar>
+          </w:tcPr>
+          <w:p>
+            <w:r>
+              <w:rPr>
+                <w:sz w:val="18"/>
+                <w:szCs w:val="18"/>
+              </w:rPr>
+              <w:t xml:space="preserve">1,345</w:t>
+            </w:r>
+          </w:p>
+        </w:tc>
+        <w:tc>
+          <w:tcPr>
+            <w:tcW w:type="dxa" w:w="1406"/>
+            <w:tcBorders>
+              <w:top w:val="single" w:color="D9D2C3" w:sz="4"/>
+              <w:left w:val="single" w:color="D9D2C3" w:sz="4"/>
+              <w:bottom w:val="single" w:color="D9D2C3" w:sz="4"/>
+              <w:right w:val="single" w:color="D9D2C3" w:sz="4"/>
+            </w:tcBorders>
+            <w:tcMar>
+              <w:top w:type="dxa" w:w="80"/>
+              <w:left w:type="dxa" w:w="120"/>
+              <w:bottom w:type="dxa" w:w="80"/>
+              <w:right w:type="dxa" w:w="120"/>
+            </w:tcMar>
+          </w:tcPr>
+          <w:p>
+            <w:r>
+              <w:rPr>
+                <w:sz w:val="18"/>
+                <w:szCs w:val="18"/>
+              </w:rPr>
+              <w:t xml:space="preserve">806</w:t>
+            </w:r>
+          </w:p>
+        </w:tc>
+      </w:tr>
+      <w:tr>
+        <w:tc>
+          <w:tcPr>
+            <w:tcW w:type="dxa" w:w="3400"/>
+            <w:tcBorders>
+              <w:top w:val="single" w:color="D9D2C3" w:sz="4"/>
+              <w:left w:val="single" w:color="D9D2C3" w:sz="4"/>
+              <w:bottom w:val="single" w:color="D9D2C3" w:sz="4"/>
+              <w:right w:val="single" w:color="D9D2C3" w:sz="4"/>
+            </w:tcBorders>
+            <w:tcMar>
+              <w:top w:type="dxa" w:w="80"/>
+              <w:left w:type="dxa" w:w="120"/>
+              <w:bottom w:type="dxa" w:w="80"/>
+              <w:right w:type="dxa" w:w="120"/>
+            </w:tcMar>
+          </w:tcPr>
+          <w:p>
+            <w:r>
+              <w:rPr>
+                <w:sz w:val="18"/>
+                <w:szCs w:val="18"/>
+              </w:rPr>
+              <w:t xml:space="preserve">Berlin</w:t>
+            </w:r>
+          </w:p>
+        </w:tc>
+        <w:tc>
+          <w:tcPr>
+            <w:tcW w:type="dxa" w:w="1406"/>
+            <w:tcBorders>
+              <w:top w:val="single" w:color="D9D2C3" w:sz="4"/>
+              <w:left w:val="single" w:color="D9D2C3" w:sz="4"/>
+              <w:bottom w:val="single" w:color="D9D2C3" w:sz="4"/>
+              <w:right w:val="single" w:color="D9D2C3" w:sz="4"/>
+            </w:tcBorders>
+            <w:tcMar>
+              <w:top w:type="dxa" w:w="80"/>
+              <w:left w:type="dxa" w:w="120"/>
+              <w:bottom w:type="dxa" w:w="80"/>
+              <w:right w:type="dxa" w:w="120"/>
+            </w:tcMar>
+          </w:tcPr>
+          <w:p>
+            <w:r>
+              <w:rPr>
+                <w:sz w:val="18"/>
+                <w:szCs w:val="18"/>
+              </w:rPr>
+              <w:t xml:space="preserve">3,228</w:t>
+            </w:r>
+          </w:p>
+        </w:tc>
+        <w:tc>
+          <w:tcPr>
+            <w:tcW w:type="dxa" w:w="1406"/>
+            <w:tcBorders>
+              <w:top w:val="single" w:color="D9D2C3" w:sz="4"/>
+              <w:left w:val="single" w:color="D9D2C3" w:sz="4"/>
+              <w:bottom w:val="single" w:color="D9D2C3" w:sz="4"/>
+              <w:right w:val="single" w:color="D9D2C3" w:sz="4"/>
+            </w:tcBorders>
+            <w:tcMar>
+              <w:top w:type="dxa" w:w="80"/>
+              <w:left w:type="dxa" w:w="120"/>
+              <w:bottom w:type="dxa" w:w="80"/>
+              <w:right w:type="dxa" w:w="120"/>
+            </w:tcMar>
+          </w:tcPr>
+          <w:p>
+            <w:r>
+              <w:rPr>
+                <w:sz w:val="18"/>
+                <w:szCs w:val="18"/>
+              </w:rPr>
+              <w:t xml:space="preserve">140</w:t>
+            </w:r>
+          </w:p>
+        </w:tc>
+        <w:tc>
+          <w:tcPr>
+            <w:tcW w:type="dxa" w:w="1406"/>
+            <w:tcBorders>
+              <w:top w:val="single" w:color="D9D2C3" w:sz="4"/>
+              <w:left w:val="single" w:color="D9D2C3" w:sz="4"/>
+              <w:bottom w:val="single" w:color="D9D2C3" w:sz="4"/>
+              <w:right w:val="single" w:color="D9D2C3" w:sz="4"/>
+            </w:tcBorders>
+            <w:tcMar>
+              <w:top w:type="dxa" w:w="80"/>
+              <w:left w:type="dxa" w:w="120"/>
+              <w:bottom w:type="dxa" w:w="80"/>
+              <w:right w:type="dxa" w:w="120"/>
+            </w:tcMar>
+          </w:tcPr>
+          <w:p>
+            <w:r>
+              <w:rPr>
+                <w:sz w:val="18"/>
+                <w:szCs w:val="18"/>
+              </w:rPr>
+              <w:t xml:space="preserve">1,382</w:t>
+            </w:r>
+          </w:p>
+        </w:tc>
+        <w:tc>
+          <w:tcPr>
+            <w:tcW w:type="dxa" w:w="1406"/>
+            <w:tcBorders>
+              <w:top w:val="single" w:color="D9D2C3" w:sz="4"/>
+              <w:left w:val="single" w:color="D9D2C3" w:sz="4"/>
+              <w:bottom w:val="single" w:color="D9D2C3" w:sz="4"/>
+              <w:right w:val="single" w:color="D9D2C3" w:sz="4"/>
+            </w:tcBorders>
+            <w:tcMar>
+              <w:top w:type="dxa" w:w="80"/>
+              <w:left w:type="dxa" w:w="120"/>
+              <w:bottom w:type="dxa" w:w="80"/>
+              <w:right w:type="dxa" w:w="120"/>
+            </w:tcMar>
+          </w:tcPr>
+          <w:p>
+            <w:r>
+              <w:rPr>
+                <w:sz w:val="18"/>
+                <w:szCs w:val="18"/>
+              </w:rPr>
+              <w:t xml:space="preserve">1,098</w:t>
+            </w:r>
+          </w:p>
+        </w:tc>
+      </w:tr>
+      <w:tr>
+        <w:tc>
+          <w:tcPr>
+            <w:tcW w:type="dxa" w:w="3400"/>
+            <w:tcBorders>
+              <w:top w:val="single" w:color="D9D2C3" w:sz="4"/>
+              <w:left w:val="single" w:color="D9D2C3" w:sz="4"/>
+              <w:bottom w:val="single" w:color="D9D2C3" w:sz="4"/>
+              <w:right w:val="single" w:color="D9D2C3" w:sz="4"/>
+            </w:tcBorders>
+            <w:tcMar>
+              <w:top w:type="dxa" w:w="80"/>
+              <w:left w:type="dxa" w:w="120"/>
+              <w:bottom w:type="dxa" w:w="80"/>
+              <w:right w:type="dxa" w:w="120"/>
+            </w:tcMar>
+          </w:tcPr>
+          <w:p>
+            <w:r>
+              <w:rPr>
+                <w:sz w:val="18"/>
+                <w:szCs w:val="18"/>
+              </w:rPr>
+              <w:t xml:space="preserve">Frankfurt</w:t>
+            </w:r>
+          </w:p>
+        </w:tc>
+        <w:tc>
+          <w:tcPr>
+            <w:tcW w:type="dxa" w:w="1406"/>
+            <w:tcBorders>
+              <w:top w:val="single" w:color="D9D2C3" w:sz="4"/>
+              <w:left w:val="single" w:color="D9D2C3" w:sz="4"/>
+              <w:bottom w:val="single" w:color="D9D2C3" w:sz="4"/>
+              <w:right w:val="single" w:color="D9D2C3" w:sz="4"/>
+            </w:tcBorders>
+            <w:tcMar>
+              <w:top w:type="dxa" w:w="80"/>
+              <w:left w:type="dxa" w:w="120"/>
+              <w:bottom w:type="dxa" w:w="80"/>
+              <w:right w:type="dxa" w:w="120"/>
+            </w:tcMar>
+          </w:tcPr>
+          <w:p>
+            <w:r>
+              <w:rPr>
+                <w:sz w:val="18"/>
+                <w:szCs w:val="18"/>
+              </w:rPr>
+              <w:t xml:space="preserve">2,826</w:t>
+            </w:r>
+          </w:p>
+        </w:tc>
+        <w:tc>
+          <w:tcPr>
+            <w:tcW w:type="dxa" w:w="1406"/>
+            <w:tcBorders>
+              <w:top w:val="single" w:color="D9D2C3" w:sz="4"/>
+              <w:left w:val="single" w:color="D9D2C3" w:sz="4"/>
+              <w:bottom w:val="single" w:color="D9D2C3" w:sz="4"/>
+              <w:right w:val="single" w:color="D9D2C3" w:sz="4"/>
+            </w:tcBorders>
+            <w:tcMar>
+              <w:top w:type="dxa" w:w="80"/>
+              <w:left w:type="dxa" w:w="120"/>
+              <w:bottom w:type="dxa" w:w="80"/>
+              <w:right w:type="dxa" w:w="120"/>
+            </w:tcMar>
+          </w:tcPr>
+          <w:p>
+            <w:r>
+              <w:rPr>
+                <w:sz w:val="18"/>
+                <w:szCs w:val="18"/>
+              </w:rPr>
+              <w:t xml:space="preserve">170</w:t>
+            </w:r>
+          </w:p>
+        </w:tc>
+        <w:tc>
+          <w:tcPr>
+            <w:tcW w:type="dxa" w:w="1406"/>
+            <w:tcBorders>
+              <w:top w:val="single" w:color="D9D2C3" w:sz="4"/>
+              <w:left w:val="single" w:color="D9D2C3" w:sz="4"/>
+              <w:bottom w:val="single" w:color="D9D2C3" w:sz="4"/>
+              <w:right w:val="single" w:color="D9D2C3" w:sz="4"/>
+            </w:tcBorders>
+            <w:tcMar>
+              <w:top w:type="dxa" w:w="80"/>
+              <w:left w:type="dxa" w:w="120"/>
+              <w:bottom w:type="dxa" w:w="80"/>
+              <w:right w:type="dxa" w:w="120"/>
+            </w:tcMar>
+          </w:tcPr>
+          <w:p>
+            <w:r>
+              <w:rPr>
+                <w:sz w:val="18"/>
+                <w:szCs w:val="18"/>
+              </w:rPr>
+              <w:t xml:space="preserve">1,256</w:t>
+            </w:r>
+          </w:p>
+        </w:tc>
+        <w:tc>
+          <w:tcPr>
+            <w:tcW w:type="dxa" w:w="1406"/>
+            <w:tcBorders>
+              <w:top w:val="single" w:color="D9D2C3" w:sz="4"/>
+              <w:left w:val="single" w:color="D9D2C3" w:sz="4"/>
+              <w:bottom w:val="single" w:color="D9D2C3" w:sz="4"/>
+              <w:right w:val="single" w:color="D9D2C3" w:sz="4"/>
+            </w:tcBorders>
+            <w:tcMar>
+              <w:top w:type="dxa" w:w="80"/>
+              <w:left w:type="dxa" w:w="120"/>
+              <w:bottom w:type="dxa" w:w="80"/>
+              <w:right w:type="dxa" w:w="120"/>
+            </w:tcMar>
+          </w:tcPr>
+          <w:p>
+            <w:r>
+              <w:rPr>
+                <w:sz w:val="18"/>
+                <w:szCs w:val="18"/>
+              </w:rPr>
+              <w:t xml:space="preserve">594</w:t>
+            </w:r>
+          </w:p>
+        </w:tc>
+      </w:tr>
+      <w:tr>
+        <w:tc>
+          <w:tcPr>
+            <w:tcW w:type="dxa" w:w="3400"/>
+            <w:tcBorders>
+              <w:top w:val="single" w:color="D9D2C3" w:sz="4"/>
+              <w:left w:val="single" w:color="D9D2C3" w:sz="4"/>
+              <w:bottom w:val="single" w:color="D9D2C3" w:sz="4"/>
+              <w:right w:val="single" w:color="D9D2C3" w:sz="4"/>
+            </w:tcBorders>
+            <w:tcMar>
+              <w:top w:type="dxa" w:w="80"/>
+              <w:left w:type="dxa" w:w="120"/>
+              <w:bottom w:type="dxa" w:w="80"/>
+              <w:right w:type="dxa" w:w="120"/>
+            </w:tcMar>
+          </w:tcPr>
+          <w:p>
+            <w:r>
+              <w:rPr>
+                <w:sz w:val="18"/>
+                <w:szCs w:val="18"/>
+              </w:rPr>
+              <w:t xml:space="preserve">Germany average</w:t>
+            </w:r>
+          </w:p>
+        </w:tc>
+        <w:tc>
+          <w:tcPr>
+            <w:tcW w:type="dxa" w:w="1406"/>
+            <w:tcBorders>
+              <w:top w:val="single" w:color="D9D2C3" w:sz="4"/>
+              <w:left w:val="single" w:color="D9D2C3" w:sz="4"/>
+              <w:bottom w:val="single" w:color="D9D2C3" w:sz="4"/>
+              <w:right w:val="single" w:color="D9D2C3" w:sz="4"/>
+            </w:tcBorders>
+            <w:tcMar>
+              <w:top w:type="dxa" w:w="80"/>
+              <w:left w:type="dxa" w:w="120"/>
+              <w:bottom w:type="dxa" w:w="80"/>
+              <w:right w:type="dxa" w:w="120"/>
+            </w:tcMar>
+          </w:tcPr>
+          <w:p>
+            <w:r>
+              <w:rPr>
+                <w:sz w:val="18"/>
+                <w:szCs w:val="18"/>
+              </w:rPr>
+              <w:t xml:space="preserve">1,377</w:t>
+            </w:r>
+          </w:p>
+        </w:tc>
+        <w:tc>
+          <w:tcPr>
+            <w:tcW w:type="dxa" w:w="1406"/>
+            <w:tcBorders>
+              <w:top w:val="single" w:color="D9D2C3" w:sz="4"/>
+              <w:left w:val="single" w:color="D9D2C3" w:sz="4"/>
+              <w:bottom w:val="single" w:color="D9D2C3" w:sz="4"/>
+              <w:right w:val="single" w:color="D9D2C3" w:sz="4"/>
+            </w:tcBorders>
+            <w:tcMar>
+              <w:top w:type="dxa" w:w="80"/>
+              <w:left w:type="dxa" w:w="120"/>
+              <w:bottom w:type="dxa" w:w="80"/>
+              <w:right w:type="dxa" w:w="120"/>
+            </w:tcMar>
+          </w:tcPr>
+          <w:p>
+            <w:r>
+              <w:rPr>
+                <w:sz w:val="18"/>
+                <w:szCs w:val="18"/>
+              </w:rPr>
+              <w:t xml:space="preserve">52</w:t>
+            </w:r>
+          </w:p>
+        </w:tc>
+        <w:tc>
+          <w:tcPr>
+            <w:tcW w:type="dxa" w:w="1406"/>
+            <w:tcBorders>
+              <w:top w:val="single" w:color="D9D2C3" w:sz="4"/>
+              <w:left w:val="single" w:color="D9D2C3" w:sz="4"/>
+              <w:bottom w:val="single" w:color="D9D2C3" w:sz="4"/>
+              <w:right w:val="single" w:color="D9D2C3" w:sz="4"/>
+            </w:tcBorders>
+            <w:tcMar>
+              <w:top w:type="dxa" w:w="80"/>
+              <w:left w:type="dxa" w:w="120"/>
+              <w:bottom w:type="dxa" w:w="80"/>
+              <w:right w:type="dxa" w:w="120"/>
+            </w:tcMar>
+          </w:tcPr>
+          <w:p>
+            <w:r>
+              <w:rPr>
+                <w:sz w:val="18"/>
+                <w:szCs w:val="18"/>
+              </w:rPr>
+              <w:t xml:space="preserve">750</w:t>
+            </w:r>
+          </w:p>
+        </w:tc>
+        <w:tc>
+          <w:tcPr>
+            <w:tcW w:type="dxa" w:w="1406"/>
+            <w:tcBorders>
+              <w:top w:val="single" w:color="D9D2C3" w:sz="4"/>
+              <w:left w:val="single" w:color="D9D2C3" w:sz="4"/>
+              <w:bottom w:val="single" w:color="D9D2C3" w:sz="4"/>
+              <w:right w:val="single" w:color="D9D2C3" w:sz="4"/>
+            </w:tcBorders>
+            <w:tcMar>
+              <w:top w:type="dxa" w:w="80"/>
+              <w:left w:type="dxa" w:w="120"/>
+              <w:bottom w:type="dxa" w:w="80"/>
+              <w:right w:type="dxa" w:w="120"/>
+            </w:tcMar>
+          </w:tcPr>
+          <w:p>
+            <w:r>
+              <w:rPr>
+                <w:sz w:val="18"/>
+                <w:szCs w:val="18"/>
+              </w:rPr>
+              <w:t xml:space="preserve">357</w:t>
+            </w:r>
+          </w:p>
+        </w:tc>
+      </w:tr>
+    </w:tbl>
+    <w:p>
+      <w:pPr>
+        <w:spacing w:after="120"/>
+      </w:pPr>
+      <w:r>
+        <w:rPr>
+          <w:color w:val="6A6A64"/>
+          <w:sz w:val="16"/>
+          <w:szCs w:val="16"/>
+        </w:rPr>
+        <w:t xml:space="preserve">Compare within Germany only. Countries record assault and burglary differently, so a lower number in another country does not mean it is safer. Source: Eurostat, police-recorded offences by NUTS 3 region (crim_gen_reg), 2024 (per 100,000 residents, 2024).</w:t>
+      </w:r>
+    </w:p>
+    <w:p>
+      <w:pPr>
+        <w:pStyle w:val="Heading2"/>
+      </w:pPr>
+      <w:r>
         <w:t xml:space="preserve">Areas to take extra care</w:t>
       </w:r>
     </w:p>
@@ -3713,7 +5104,7 @@
         </w:rPr>
         <w:t xml:space="preserve">Via </w:t>
       </w:r>
-      <w:hyperlink w:history="1" r:id="rIdt2inhhmxsqjmgvknj0e0e">
+      <w:hyperlink w:history="1" r:id="rId2zwsft1mppcfodxk3jixy">
         <w:r>
           <w:rPr>
             <w:color w:val="EA2E00"/>
@@ -3819,7 +5210,7 @@
         </w:rPr>
         <w:t xml:space="preserve">Via </w:t>
       </w:r>
-      <w:hyperlink w:history="1" r:id="rIdk8dxpfpwrr6g0hvd3unfi">
+      <w:hyperlink w:history="1" r:id="rIdrzix0j79blz_cn_93i0rq">
         <w:r>
           <w:rPr>
             <w:color w:val="EA2E00"/>
@@ -3837,7 +5228,7 @@
         </w:rPr>
         <w:t xml:space="preserve">, </w:t>
       </w:r>
-      <w:hyperlink w:history="1" r:id="rIdl7gygektwkwkjx9m_6ol5">
+      <w:hyperlink w:history="1" r:id="rIddc8tfpwju5wnfgfyjubg9">
         <w:r>
           <w:rPr>
             <w:color w:val="EA2E00"/>
@@ -3855,7 +5246,7 @@
         </w:rPr>
         <w:t xml:space="preserve">, </w:t>
       </w:r>
-      <w:hyperlink w:history="1" r:id="rIdc4uhim-vybyoriqhbmyoy">
+      <w:hyperlink w:history="1" r:id="rIdnitt288srxfkckvu_q93l">
         <w:r>
           <w:rPr>
             <w:color w:val="EA2E00"/>
@@ -3873,7 +5264,7 @@
         </w:rPr>
         <w:t xml:space="preserve">, </w:t>
       </w:r>
-      <w:hyperlink w:history="1" r:id="rIdar5iam5hsee2vfsba0vo8">
+      <w:hyperlink w:history="1" r:id="rIdqwqk9lap-mru-pxm05hut">
         <w:r>
           <w:rPr>
             <w:color w:val="EA2E00"/>
@@ -3891,7 +5282,7 @@
         </w:rPr>
         <w:t xml:space="preserve">, </w:t>
       </w:r>
-      <w:hyperlink w:history="1" r:id="rIdqvsacd2wa25tdd-cctafe">
+      <w:hyperlink w:history="1" r:id="rId6oioivorzjezbhjszbqa6">
         <w:r>
           <w:rPr>
             <w:color w:val="EA2E00"/>
@@ -3949,7 +5340,7 @@
         </w:rPr>
         <w:t xml:space="preserve">Via </w:t>
       </w:r>
-      <w:hyperlink w:history="1" r:id="rId-4c4fbd7oq8dxy7jva-y4">
+      <w:hyperlink w:history="1" r:id="rIdpdv6rgmucviyr_pjoodvt">
         <w:r>
           <w:rPr>
             <w:color w:val="EA2E00"/>
@@ -3967,7 +5358,7 @@
         </w:rPr>
         <w:t xml:space="preserve">, </w:t>
       </w:r>
-      <w:hyperlink w:history="1" r:id="rId2kpr2j4vosgwziffb8ber">
+      <w:hyperlink w:history="1" r:id="rId0ial2qtdnz5g4lyseww-f">
         <w:r>
           <w:rPr>
             <w:color w:val="EA2E00"/>
@@ -3985,7 +5376,7 @@
         </w:rPr>
         <w:t xml:space="preserve">, </w:t>
       </w:r>
-      <w:hyperlink w:history="1" r:id="rIdasq_4e_btx_wqbphgpghu">
+      <w:hyperlink w:history="1" r:id="rIde4qfwwnjjfydqhzbxquhd">
         <w:r>
           <w:rPr>
             <w:color w:val="EA2E00"/>
@@ -4003,7 +5394,7 @@
         </w:rPr>
         <w:t xml:space="preserve">, </w:t>
       </w:r>
-      <w:hyperlink w:history="1" r:id="rIdn9gknysbjolcjt9q2bn2y">
+      <w:hyperlink w:history="1" r:id="rIdko1lngdhoeky2agsdiwvw">
         <w:r>
           <w:rPr>
             <w:color w:val="EA2E00"/>
@@ -4021,7 +5412,7 @@
         </w:rPr>
         <w:t xml:space="preserve">, </w:t>
       </w:r>
-      <w:hyperlink w:history="1" r:id="rIdb1eblafmqswhrjartniqc">
+      <w:hyperlink w:history="1" r:id="rIdzpyw0akr1dpij80u5ujm7">
         <w:r>
           <w:rPr>
             <w:color w:val="EA2E00"/>
@@ -4079,7 +5470,7 @@
         </w:rPr>
         <w:t xml:space="preserve">Via </w:t>
       </w:r>
-      <w:hyperlink w:history="1" r:id="rIdiaoqxhqvkt960nsiyc8_l">
+      <w:hyperlink w:history="1" r:id="rIdwpivopycte1jabeqw-lyt">
         <w:r>
           <w:rPr>
             <w:color w:val="EA2E00"/>
@@ -4097,7 +5488,7 @@
         </w:rPr>
         <w:t xml:space="preserve">, </w:t>
       </w:r>
-      <w:hyperlink w:history="1" r:id="rId4flpo-srac7c9ef-23oz4">
+      <w:hyperlink w:history="1" r:id="rId08rthwetl22n3fa4ypdv0">
         <w:r>
           <w:rPr>
             <w:color w:val="EA2E00"/>
@@ -4115,7 +5506,7 @@
         </w:rPr>
         <w:t xml:space="preserve">, </w:t>
       </w:r>
-      <w:hyperlink w:history="1" r:id="rIdmsm8phz4akgsmyhupqb5f">
+      <w:hyperlink w:history="1" r:id="rIdri3jtctmhelmjzkxlsmxn">
         <w:r>
           <w:rPr>
             <w:color w:val="EA2E00"/>
@@ -4133,7 +5524,7 @@
         </w:rPr>
         <w:t xml:space="preserve">, </w:t>
       </w:r>
-      <w:hyperlink w:history="1" r:id="rIdt83olvppndht6vlh4gglt">
+      <w:hyperlink w:history="1" r:id="rIdvcrsure8rx3wrkzs7swym">
         <w:r>
           <w:rPr>
             <w:color w:val="EA2E00"/>
@@ -4197,7 +5588,7 @@
             </w:r>
           </w:p>
           <w:p>
-            <w:hyperlink w:history="1" r:id="rIdlba3sbgs4karnwa3p_gxh">
+            <w:hyperlink w:history="1" r:id="rIdpptb01qesvbwv_qo7c-wr">
               <w:r>
                 <w:rPr>
                   <w:rStyle w:val="Hyperlink"/>
@@ -4249,7 +5640,7 @@
         </w:rPr>
         <w:t xml:space="preserve">Via </w:t>
       </w:r>
-      <w:hyperlink w:history="1" r:id="rIdchgyesjtmdzia5p1xgjen">
+      <w:hyperlink w:history="1" r:id="rIdpz8put_zssctaqonrsmnd">
         <w:r>
           <w:rPr>
             <w:color w:val="EA2E00"/>
@@ -4292,7 +5683,7 @@
         </w:rPr>
         <w:t xml:space="preserve">Via </w:t>
       </w:r>
-      <w:hyperlink w:history="1" r:id="rIdvrpbts36q1xujktnckwlw">
+      <w:hyperlink w:history="1" r:id="rIdupytzck4pmbgedp0rppdh">
         <w:r>
           <w:rPr>
             <w:color w:val="EA2E00"/>
@@ -4335,7 +5726,7 @@
         </w:rPr>
         <w:t xml:space="preserve">Via </w:t>
       </w:r>
-      <w:hyperlink w:history="1" r:id="rIdpzmsnkxjmesa4y19m-pye">
+      <w:hyperlink w:history="1" r:id="rId0gbok-z7spq6om-gnfhfn">
         <w:r>
           <w:rPr>
             <w:color w:val="EA2E00"/>
@@ -4353,7 +5744,7 @@
         </w:rPr>
         <w:t xml:space="preserve">, </w:t>
       </w:r>
-      <w:hyperlink w:history="1" r:id="rIdhfunb5lqhblgoxjtb7umm">
+      <w:hyperlink w:history="1" r:id="rIdiaycxpalrddgbe2tkqrii">
         <w:r>
           <w:rPr>
             <w:color w:val="EA2E00"/>
@@ -4371,7 +5762,7 @@
         </w:rPr>
         <w:t xml:space="preserve">, </w:t>
       </w:r>
-      <w:hyperlink w:history="1" r:id="rIdqxobhjcmljilprupwbywz">
+      <w:hyperlink w:history="1" r:id="rId91udpsbmovkebjo-qlmwj">
         <w:r>
           <w:rPr>
             <w:color w:val="EA2E00"/>
@@ -4389,7 +5780,7 @@
         </w:rPr>
         <w:t xml:space="preserve">, </w:t>
       </w:r>
-      <w:hyperlink w:history="1" r:id="rIdu4xe1mtgtjkpypfwmwhuk">
+      <w:hyperlink w:history="1" r:id="rId39-pflowvxfdpmnps1sqm">
         <w:r>
           <w:rPr>
             <w:color w:val="EA2E00"/>
@@ -4407,7 +5798,7 @@
         </w:rPr>
         <w:t xml:space="preserve">, </w:t>
       </w:r>
-      <w:hyperlink w:history="1" r:id="rIdp7m5trlahveq6clokgey1">
+      <w:hyperlink w:history="1" r:id="rIdck-2ixpjepbizo2fkgeud">
         <w:r>
           <w:rPr>
             <w:color w:val="EA2E00"/>
@@ -4450,7 +5841,7 @@
         </w:rPr>
         <w:t xml:space="preserve">Via </w:t>
       </w:r>
-      <w:hyperlink w:history="1" r:id="rIdzmzyfn4eq5h6ogb9ebuad">
+      <w:hyperlink w:history="1" r:id="rId6psi1dhqftq7r2ezvf4wf">
         <w:r>
           <w:rPr>
             <w:color w:val="EA2E00"/>
@@ -4468,7 +5859,7 @@
         </w:rPr>
         <w:t xml:space="preserve">, </w:t>
       </w:r>
-      <w:hyperlink w:history="1" r:id="rId6a7gfvkquujw_zlfnh3lo">
+      <w:hyperlink w:history="1" r:id="rId0wo9ydiut4oaf_zlsqg2q">
         <w:r>
           <w:rPr>
             <w:color w:val="EA2E00"/>
@@ -4486,7 +5877,7 @@
         </w:rPr>
         <w:t xml:space="preserve">, </w:t>
       </w:r>
-      <w:hyperlink w:history="1" r:id="rIdcqnai5elgnv32ras_fcg_">
+      <w:hyperlink w:history="1" r:id="rId51rrzpygei7na1hiy_jbq">
         <w:r>
           <w:rPr>
             <w:color w:val="EA2E00"/>
@@ -4504,7 +5895,7 @@
         </w:rPr>
         <w:t xml:space="preserve">, </w:t>
       </w:r>
-      <w:hyperlink w:history="1" r:id="rIdj2fnlrkc-cbx0vrjmetlq">
+      <w:hyperlink w:history="1" r:id="rIdikxn4grl8rdo9hypv84pe">
         <w:r>
           <w:rPr>
             <w:color w:val="EA2E00"/>
@@ -4547,7 +5938,7 @@
         </w:rPr>
         <w:t xml:space="preserve">Via </w:t>
       </w:r>
-      <w:hyperlink w:history="1" r:id="rId1dwt1njyfrr_tcnoikh1-">
+      <w:hyperlink w:history="1" r:id="rId9nd_gv9d0bfdqdtu7in1a">
         <w:r>
           <w:rPr>
             <w:color w:val="EA2E00"/>
@@ -4565,7 +5956,7 @@
         </w:rPr>
         <w:t xml:space="preserve">, </w:t>
       </w:r>
-      <w:hyperlink w:history="1" r:id="rIdrwgquydoporszpirjay_b">
+      <w:hyperlink w:history="1" r:id="rIdprwy3yhvd9ow91p2r7jxg">
         <w:r>
           <w:rPr>
             <w:color w:val="EA2E00"/>
@@ -4583,7 +5974,7 @@
         </w:rPr>
         <w:t xml:space="preserve">, </w:t>
       </w:r>
-      <w:hyperlink w:history="1" r:id="rIdv1m6l-0vboqza8ys21esv">
+      <w:hyperlink w:history="1" r:id="rIdbta8oclgdii-85qvsktz7">
         <w:r>
           <w:rPr>
             <w:color w:val="EA2E00"/>
@@ -4681,7 +6072,7 @@
         </w:rPr>
         <w:t xml:space="preserve">Via </w:t>
       </w:r>
-      <w:hyperlink w:history="1" r:id="rIdf3qsdjhctyjux-ccmlclu">
+      <w:hyperlink w:history="1" r:id="rIdiz4gcmhl-ljfndqsrktox">
         <w:r>
           <w:rPr>
             <w:color w:val="EA2E00"/>
@@ -4699,7 +6090,7 @@
         </w:rPr>
         <w:t xml:space="preserve">, </w:t>
       </w:r>
-      <w:hyperlink w:history="1" r:id="rId3ndr3eti-rd9ayqvdwxmb">
+      <w:hyperlink w:history="1" r:id="rIdxfbwafq2mw8yjnfhjslsj">
         <w:r>
           <w:rPr>
             <w:color w:val="EA2E00"/>
@@ -4717,7 +6108,7 @@
         </w:rPr>
         <w:t xml:space="preserve">, </w:t>
       </w:r>
-      <w:hyperlink w:history="1" r:id="rIdos2epiarqcvcsdvnvfh1_">
+      <w:hyperlink w:history="1" r:id="rIdtq-bckspgrti-itvxwcnx">
         <w:r>
           <w:rPr>
             <w:color w:val="EA2E00"/>
@@ -4735,7 +6126,7 @@
         </w:rPr>
         <w:t xml:space="preserve">, </w:t>
       </w:r>
-      <w:hyperlink w:history="1" r:id="rIdezcsqs4lgnbxsvwkupqvo">
+      <w:hyperlink w:history="1" r:id="rIdk6i_tvrle5xoky4zrxvbg">
         <w:r>
           <w:rPr>
             <w:color w:val="EA2E00"/>
@@ -4753,7 +6144,7 @@
         </w:rPr>
         <w:t xml:space="preserve">, </w:t>
       </w:r>
-      <w:hyperlink w:history="1" r:id="rId6tzjt9omtcq_tlmcew_vl">
+      <w:hyperlink w:history="1" r:id="rIdlpppkxzfrqwoxj5mebaio">
         <w:r>
           <w:rPr>
             <w:color w:val="EA2E00"/>
@@ -4814,7 +6205,7 @@
         </w:rPr>
         <w:t xml:space="preserve">Via </w:t>
       </w:r>
-      <w:hyperlink w:history="1" r:id="rIdnmausxrwvwuud2tgveyz5">
+      <w:hyperlink w:history="1" r:id="rId-am5mqitc3i-k9ewtonfx">
         <w:r>
           <w:rPr>
             <w:color w:val="EA2E00"/>
@@ -4832,7 +6223,7 @@
         </w:rPr>
         <w:t xml:space="preserve">, </w:t>
       </w:r>
-      <w:hyperlink w:history="1" r:id="rIdqwbpqmh-grfgcluuypl7j">
+      <w:hyperlink w:history="1" r:id="rIdxey938jbx8rqnlzpzdwge">
         <w:r>
           <w:rPr>
             <w:color w:val="EA2E00"/>
@@ -4850,7 +6241,7 @@
         </w:rPr>
         <w:t xml:space="preserve">, </w:t>
       </w:r>
-      <w:hyperlink w:history="1" r:id="rId3oovrh0yjzg3mbtqrkku3">
+      <w:hyperlink w:history="1" r:id="rIdguknrm9qeiz43ny3okzjc">
         <w:r>
           <w:rPr>
             <w:color w:val="EA2E00"/>
@@ -4868,7 +6259,7 @@
         </w:rPr>
         <w:t xml:space="preserve">, </w:t>
       </w:r>
-      <w:hyperlink w:history="1" r:id="rIdqehbl7jk265kcivbznfyw">
+      <w:hyperlink w:history="1" r:id="rId40j4ijbkyzpyehof9qt08">
         <w:r>
           <w:rPr>
             <w:color w:val="EA2E00"/>
@@ -4886,7 +6277,7 @@
         </w:rPr>
         <w:t xml:space="preserve">, </w:t>
       </w:r>
-      <w:hyperlink w:history="1" r:id="rId7htoubutz5epgtiyqbi-a">
+      <w:hyperlink w:history="1" r:id="rIdjgnaoktajbig-rmkoc2dw">
         <w:r>
           <w:rPr>
             <w:color w:val="EA2E00"/>
@@ -4947,7 +6338,7 @@
         </w:rPr>
         <w:t xml:space="preserve">Via </w:t>
       </w:r>
-      <w:hyperlink w:history="1" r:id="rIdofdcckouvth4akpnnq47w">
+      <w:hyperlink w:history="1" r:id="rIdymkc7jvsvkfcefnkxb4sm">
         <w:r>
           <w:rPr>
             <w:color w:val="EA2E00"/>
@@ -4965,7 +6356,7 @@
         </w:rPr>
         <w:t xml:space="preserve">, </w:t>
       </w:r>
-      <w:hyperlink w:history="1" r:id="rId92ww297kg-eb6fdxrxua5">
+      <w:hyperlink w:history="1" r:id="rIdlbyqappwjkrvcjpqvvqir">
         <w:r>
           <w:rPr>
             <w:color w:val="EA2E00"/>
@@ -4983,7 +6374,7 @@
         </w:rPr>
         <w:t xml:space="preserve">, </w:t>
       </w:r>
-      <w:hyperlink w:history="1" r:id="rId4x0v45flizrsd4ohffovx">
+      <w:hyperlink w:history="1" r:id="rId1fxfl6q0ymyirlwucs2x8">
         <w:r>
           <w:rPr>
             <w:color w:val="EA2E00"/>
@@ -5001,7 +6392,7 @@
         </w:rPr>
         <w:t xml:space="preserve">, </w:t>
       </w:r>
-      <w:hyperlink w:history="1" r:id="rId_vd4-fhmeuyjinzffdais">
+      <w:hyperlink w:history="1" r:id="rIdplxxq98hqoyfy_eiaqkat">
         <w:r>
           <w:rPr>
             <w:color w:val="EA2E00"/>
@@ -5062,7 +6453,7 @@
         </w:rPr>
         <w:t xml:space="preserve">Via </w:t>
       </w:r>
-      <w:hyperlink w:history="1" r:id="rIdaonlbkzr5294kbuxrqm7i">
+      <w:hyperlink w:history="1" r:id="rIdz67iknmd7jbssv609ulua">
         <w:r>
           <w:rPr>
             <w:color w:val="EA2E00"/>
@@ -5080,7 +6471,7 @@
         </w:rPr>
         <w:t xml:space="preserve">, </w:t>
       </w:r>
-      <w:hyperlink w:history="1" r:id="rIdqzuxreoak56hxahne8drk">
+      <w:hyperlink w:history="1" r:id="rIdf8mtnapxzd-ecejhdkxtz">
         <w:r>
           <w:rPr>
             <w:color w:val="EA2E00"/>
@@ -5098,7 +6489,7 @@
         </w:rPr>
         <w:t xml:space="preserve">, </w:t>
       </w:r>
-      <w:hyperlink w:history="1" r:id="rIdg-oon_629-13bn7tywhfr">
+      <w:hyperlink w:history="1" r:id="rIdaspxseto63sepefi8dqot">
         <w:r>
           <w:rPr>
             <w:color w:val="EA2E00"/>
@@ -5116,7 +6507,7 @@
         </w:rPr>
         <w:t xml:space="preserve">, </w:t>
       </w:r>
-      <w:hyperlink w:history="1" r:id="rIdjlsfbdqyurlfaaocj910o">
+      <w:hyperlink w:history="1" r:id="rIdkb7kvdpvkrk2x1budwqji">
         <w:r>
           <w:rPr>
             <w:color w:val="EA2E00"/>
@@ -5177,7 +6568,7 @@
         </w:rPr>
         <w:t xml:space="preserve">Via </w:t>
       </w:r>
-      <w:hyperlink w:history="1" r:id="rIdkozlrv847eka6xiu4hrhh">
+      <w:hyperlink w:history="1" r:id="rIdyopgzlcserfwjgedzs6iq">
         <w:r>
           <w:rPr>
             <w:color w:val="EA2E00"/>
@@ -5195,7 +6586,7 @@
         </w:rPr>
         <w:t xml:space="preserve">, </w:t>
       </w:r>
-      <w:hyperlink w:history="1" r:id="rIdhadwfzqqvfqub0c_8ryao">
+      <w:hyperlink w:history="1" r:id="rIdzwsz4mimeaihw5keaglhm">
         <w:r>
           <w:rPr>
             <w:color w:val="EA2E00"/>
@@ -5213,7 +6604,7 @@
         </w:rPr>
         <w:t xml:space="preserve">, </w:t>
       </w:r>
-      <w:hyperlink w:history="1" r:id="rIdfdcrhbuhvn4ghz15lzlhv">
+      <w:hyperlink w:history="1" r:id="rIdjg4f4j7cmdv2o71u232ct">
         <w:r>
           <w:rPr>
             <w:color w:val="EA2E00"/>
@@ -5496,7 +6887,7 @@
             </w:tcMar>
           </w:tcPr>
           <w:p>
-            <w:hyperlink w:history="1" r:id="rIdfrofnfylzrsc5xbeawkg4">
+            <w:hyperlink w:history="1" r:id="rIdlgjlqlq_gtyj9cns2rllv">
               <w:r>
                 <w:rPr>
                   <w:rStyle w:val="Hyperlink"/>
@@ -5615,7 +7006,7 @@
             </w:tcMar>
           </w:tcPr>
           <w:p>
-            <w:hyperlink w:history="1" r:id="rIdpovzneou44yjjwzrkjean">
+            <w:hyperlink w:history="1" r:id="rId_wnb0ozj3c9x3xwllkiot">
               <w:r>
                 <w:rPr>
                   <w:rStyle w:val="Hyperlink"/>
@@ -5734,7 +7125,7 @@
             </w:tcMar>
           </w:tcPr>
           <w:p>
-            <w:hyperlink w:history="1" r:id="rId4b3ffyfgnk017xxnrt4mg">
+            <w:hyperlink w:history="1" r:id="rIdd0uzmqqraexdrillpeuw7">
               <w:r>
                 <w:rPr>
                   <w:rStyle w:val="Hyperlink"/>
@@ -5853,7 +7244,7 @@
             </w:tcMar>
           </w:tcPr>
           <w:p>
-            <w:hyperlink w:history="1" r:id="rIdoiy8ir87e-qumxfj78nni">
+            <w:hyperlink w:history="1" r:id="rIddsd3swj1fuxga6gzq_t29">
               <w:r>
                 <w:rPr>
                   <w:rStyle w:val="Hyperlink"/>
@@ -5923,7 +7314,7 @@
             </w:r>
           </w:p>
           <w:p>
-            <w:hyperlink w:history="1" r:id="rIdzypp_sqgx0j2yv9pssgel">
+            <w:hyperlink w:history="1" r:id="rIdakelq_mfub8iaz0zyya0g">
               <w:r>
                 <w:rPr>
                   <w:rStyle w:val="Hyperlink"/>
@@ -6014,7 +7405,7 @@
       </w:r>
     </w:p>
     <w:p>
-      <w:hyperlink w:history="1" r:id="rIdbu3c5d74mzghh5kssb3mj">
+      <w:hyperlink w:history="1" r:id="rIdfqrvchlpvn3sht3jdbb_c">
         <w:r>
           <w:rPr>
             <w:rStyle w:val="Hyperlink"/>
@@ -6035,7 +7426,7 @@
         </w:rPr>
         <w:t xml:space="preserve">Via </w:t>
       </w:r>
-      <w:hyperlink w:history="1" r:id="rId5vm6sv0j24_epy1ldcbds">
+      <w:hyperlink w:history="1" r:id="rIdrkpou3zxgptlndczi4q3j">
         <w:r>
           <w:rPr>
             <w:color w:val="EA2E00"/>
@@ -6053,7 +7444,7 @@
         </w:rPr>
         <w:t xml:space="preserve">, </w:t>
       </w:r>
-      <w:hyperlink w:history="1" r:id="rIdvhnxjea6tugpksifej7x0">
+      <w:hyperlink w:history="1" r:id="rIdwmj3k69f5ogv4pnaevzc8">
         <w:r>
           <w:rPr>
             <w:color w:val="EA2E00"/>
@@ -6071,7 +7462,7 @@
         </w:rPr>
         <w:t xml:space="preserve">, </w:t>
       </w:r>
-      <w:hyperlink w:history="1" r:id="rIdpjghtzq81nso0tlvbchus">
+      <w:hyperlink w:history="1" r:id="rIdrt36jn-jcdekpa9edacky">
         <w:r>
           <w:rPr>
             <w:color w:val="EA2E00"/>
@@ -6089,7 +7480,7 @@
         </w:rPr>
         <w:t xml:space="preserve">, </w:t>
       </w:r>
-      <w:hyperlink w:history="1" r:id="rIdeg5rhdbrdq2i14graseve">
+      <w:hyperlink w:history="1" r:id="rId4clbgyi8inbvm0jimev20">
         <w:r>
           <w:rPr>
             <w:color w:val="EA2E00"/>
@@ -6107,7 +7498,7 @@
         </w:rPr>
         <w:t xml:space="preserve">, </w:t>
       </w:r>
-      <w:hyperlink w:history="1" r:id="rIdbzhqxsgvabfuvehyewoip">
+      <w:hyperlink w:history="1" r:id="rIdhssvahyjmalmnfrb6wizw">
         <w:r>
           <w:rPr>
             <w:color w:val="EA2E00"/>
@@ -6125,7 +7516,7 @@
         </w:rPr>
         <w:t xml:space="preserve">, </w:t>
       </w:r>
-      <w:hyperlink w:history="1" r:id="rId8pkduzzhpsnenan1hqmxb">
+      <w:hyperlink w:history="1" r:id="rIdl1axknn9_n_9-c_8hvtgp">
         <w:r>
           <w:rPr>
             <w:color w:val="EA2E00"/>
@@ -6143,7 +7534,7 @@
         </w:rPr>
         <w:t xml:space="preserve">, </w:t>
       </w:r>
-      <w:hyperlink w:history="1" r:id="rIdzuo3mu6vqrhbw5wbylmht">
+      <w:hyperlink w:history="1" r:id="rId3p_quu7fv-eb6dkt46vzm">
         <w:r>
           <w:rPr>
             <w:color w:val="EA2E00"/>
@@ -6161,7 +7552,7 @@
         </w:rPr>
         <w:t xml:space="preserve">, </w:t>
       </w:r>
-      <w:hyperlink w:history="1" r:id="rIdmfowolipl2rq15qyty6jm">
+      <w:hyperlink w:history="1" r:id="rIdym8bwbe-w9o7slzi2yvbo">
         <w:r>
           <w:rPr>
             <w:color w:val="EA2E00"/>
@@ -6179,7 +7570,7 @@
         </w:rPr>
         <w:t xml:space="preserve">, </w:t>
       </w:r>
-      <w:hyperlink w:history="1" r:id="rIdpih8fmyaonnk3wozz7agx">
+      <w:hyperlink w:history="1" r:id="rId5wmoyyftdabrhc8stldrj">
         <w:r>
           <w:rPr>
             <w:color w:val="EA2E00"/>
@@ -6240,7 +7631,7 @@
       </w:r>
     </w:p>
     <w:p>
-      <w:hyperlink w:history="1" r:id="rIdoawgqgpxgzzmhi5ucofcc">
+      <w:hyperlink w:history="1" r:id="rIdaanc59wsnie4ouboshhzy">
         <w:r>
           <w:rPr>
             <w:rStyle w:val="Hyperlink"/>
@@ -6261,7 +7652,7 @@
         </w:rPr>
         <w:t xml:space="preserve">Via </w:t>
       </w:r>
-      <w:hyperlink w:history="1" r:id="rId1imaxnd6djbwuaxz04w8l">
+      <w:hyperlink w:history="1" r:id="rIdftsd9o-kn0fxnb9yd-7ae">
         <w:r>
           <w:rPr>
             <w:color w:val="EA2E00"/>
@@ -6279,7 +7670,7 @@
         </w:rPr>
         <w:t xml:space="preserve">, </w:t>
       </w:r>
-      <w:hyperlink w:history="1" r:id="rIddk_bdciguthxsiozrindp">
+      <w:hyperlink w:history="1" r:id="rIdvcgpzjmd7oacj8aka3mbn">
         <w:r>
           <w:rPr>
             <w:color w:val="EA2E00"/>
@@ -6297,7 +7688,7 @@
         </w:rPr>
         <w:t xml:space="preserve">, </w:t>
       </w:r>
-      <w:hyperlink w:history="1" r:id="rIdlsfon8dpbhjyckn2vvkyf">
+      <w:hyperlink w:history="1" r:id="rIdm9lexkmeftgmfsil1cn1y">
         <w:r>
           <w:rPr>
             <w:color w:val="EA2E00"/>
@@ -6315,7 +7706,7 @@
         </w:rPr>
         <w:t xml:space="preserve">, </w:t>
       </w:r>
-      <w:hyperlink w:history="1" r:id="rIdap2qcfp4vdwc9oig2x9u9">
+      <w:hyperlink w:history="1" r:id="rIdxwcmweph_dnpxrr7luycs">
         <w:r>
           <w:rPr>
             <w:color w:val="EA2E00"/>
@@ -6333,7 +7724,7 @@
         </w:rPr>
         <w:t xml:space="preserve">, </w:t>
       </w:r>
-      <w:hyperlink w:history="1" r:id="rIdq2eahsvjv2zcvzjonljr4">
+      <w:hyperlink w:history="1" r:id="rIdohrsfa0dfq7nbz4-igg3-">
         <w:r>
           <w:rPr>
             <w:color w:val="EA2E00"/>
@@ -6351,7 +7742,7 @@
         </w:rPr>
         <w:t xml:space="preserve">, </w:t>
       </w:r>
-      <w:hyperlink w:history="1" r:id="rIdvbh8loe7c0qtcmzbcgxxb">
+      <w:hyperlink w:history="1" r:id="rIdn2weqyqeci41_9ycxl5_h">
         <w:r>
           <w:rPr>
             <w:color w:val="EA2E00"/>
@@ -6369,7 +7760,7 @@
         </w:rPr>
         <w:t xml:space="preserve">, </w:t>
       </w:r>
-      <w:hyperlink w:history="1" r:id="rId82roikzpvvrlrr9nycjxv">
+      <w:hyperlink w:history="1" r:id="rIdeudvicnwuuj3apwjalvb-">
         <w:r>
           <w:rPr>
             <w:color w:val="EA2E00"/>
@@ -6387,7 +7778,7 @@
         </w:rPr>
         <w:t xml:space="preserve">, </w:t>
       </w:r>
-      <w:hyperlink w:history="1" r:id="rIdgxow6gefamispjx2i6n_k">
+      <w:hyperlink w:history="1" r:id="rIdufuralyoezkk-m7co-idd">
         <w:r>
           <w:rPr>
             <w:color w:val="EA2E00"/>
@@ -6448,7 +7839,7 @@
       </w:r>
     </w:p>
     <w:p>
-      <w:hyperlink w:history="1" r:id="rIdxtftvaiw_ijcoyiu1qtdb">
+      <w:hyperlink w:history="1" r:id="rIdlr049k68van-pwv-jwft7">
         <w:r>
           <w:rPr>
             <w:rStyle w:val="Hyperlink"/>
@@ -6469,7 +7860,7 @@
         </w:rPr>
         <w:t xml:space="preserve">Via </w:t>
       </w:r>
-      <w:hyperlink w:history="1" r:id="rIdcyekbrziw3awmhbi-nhma">
+      <w:hyperlink w:history="1" r:id="rIdx_4nre-oxwd7wm7xfvlfe">
         <w:r>
           <w:rPr>
             <w:color w:val="EA2E00"/>
@@ -6487,7 +7878,7 @@
         </w:rPr>
         <w:t xml:space="preserve">, </w:t>
       </w:r>
-      <w:hyperlink w:history="1" r:id="rIdw1xcoh6o1kwj0jo0gua0-">
+      <w:hyperlink w:history="1" r:id="rIdwmcvheq8ziydpuiy6ezeu">
         <w:r>
           <w:rPr>
             <w:color w:val="EA2E00"/>
@@ -6505,7 +7896,7 @@
         </w:rPr>
         <w:t xml:space="preserve">, </w:t>
       </w:r>
-      <w:hyperlink w:history="1" r:id="rIdswiby-0lushxa06yr7g4m">
+      <w:hyperlink w:history="1" r:id="rId0lzhd62hxfy_9d2uevsoh">
         <w:r>
           <w:rPr>
             <w:color w:val="EA2E00"/>
@@ -6523,7 +7914,7 @@
         </w:rPr>
         <w:t xml:space="preserve">, </w:t>
       </w:r>
-      <w:hyperlink w:history="1" r:id="rIdsem2-ls6qapqbvnb5feju">
+      <w:hyperlink w:history="1" r:id="rIddi_98mukzgoqj4szicfwx">
         <w:r>
           <w:rPr>
             <w:color w:val="EA2E00"/>
@@ -6541,7 +7932,7 @@
         </w:rPr>
         <w:t xml:space="preserve">, </w:t>
       </w:r>
-      <w:hyperlink w:history="1" r:id="rIdcegekm3fjiuz1se8wyoyr">
+      <w:hyperlink w:history="1" r:id="rId38xvrendekacdidpzs-zf">
         <w:r>
           <w:rPr>
             <w:color w:val="EA2E00"/>
@@ -6559,7 +7950,7 @@
         </w:rPr>
         <w:t xml:space="preserve">, </w:t>
       </w:r>
-      <w:hyperlink w:history="1" r:id="rIduvhqll3wni4iztbnt9pts">
+      <w:hyperlink w:history="1" r:id="rIdfjuj1vpszblkh8rikmab9">
         <w:r>
           <w:rPr>
             <w:color w:val="EA2E00"/>
@@ -6577,7 +7968,7 @@
         </w:rPr>
         <w:t xml:space="preserve">, </w:t>
       </w:r>
-      <w:hyperlink w:history="1" r:id="rIdfo8aeeqbgelk5u6xjcht9">
+      <w:hyperlink w:history="1" r:id="rId3apvosvwfvnhpbiqr-3xa">
         <w:r>
           <w:rPr>
             <w:color w:val="EA2E00"/>
@@ -6595,7 +7986,7 @@
         </w:rPr>
         <w:t xml:space="preserve">, </w:t>
       </w:r>
-      <w:hyperlink w:history="1" r:id="rIdbsibmiqupf_rtyfcewvc0">
+      <w:hyperlink w:history="1" r:id="rIdrhxm0hgx-yhse1krv7vrk">
         <w:r>
           <w:rPr>
             <w:color w:val="EA2E00"/>
@@ -6656,7 +8047,7 @@
       </w:r>
     </w:p>
     <w:p>
-      <w:hyperlink w:history="1" r:id="rIdgsiatowybbwxr8wowkqng">
+      <w:hyperlink w:history="1" r:id="rId3kk76ht3w927s8frk563h">
         <w:r>
           <w:rPr>
             <w:rStyle w:val="Hyperlink"/>
@@ -6677,7 +8068,7 @@
         </w:rPr>
         <w:t xml:space="preserve">Via </w:t>
       </w:r>
-      <w:hyperlink w:history="1" r:id="rId2orndy2khsnsnew4nhaaq">
+      <w:hyperlink w:history="1" r:id="rId0sbsomajhizvtuz4rkhc8">
         <w:r>
           <w:rPr>
             <w:color w:val="EA2E00"/>
@@ -6695,7 +8086,7 @@
         </w:rPr>
         <w:t xml:space="preserve">, </w:t>
       </w:r>
-      <w:hyperlink w:history="1" r:id="rId_zayq2fitx6nrjmoti0bd">
+      <w:hyperlink w:history="1" r:id="rIdlkqkwty0t__bhhvj4mghr">
         <w:r>
           <w:rPr>
             <w:color w:val="EA2E00"/>
@@ -6713,7 +8104,7 @@
         </w:rPr>
         <w:t xml:space="preserve">, </w:t>
       </w:r>
-      <w:hyperlink w:history="1" r:id="rIdhun1rraii4apz-ry0ydco">
+      <w:hyperlink w:history="1" r:id="rIdj9y4v5_pbvazq2nvzgnb4">
         <w:r>
           <w:rPr>
             <w:color w:val="EA2E00"/>
@@ -6731,7 +8122,7 @@
         </w:rPr>
         <w:t xml:space="preserve">, </w:t>
       </w:r>
-      <w:hyperlink w:history="1" r:id="rIdhtc92ckqptulm6tqoz2rp">
+      <w:hyperlink w:history="1" r:id="rIddxzwfparxgjmhyi8pmheh">
         <w:r>
           <w:rPr>
             <w:color w:val="EA2E00"/>
@@ -6749,7 +8140,7 @@
         </w:rPr>
         <w:t xml:space="preserve">, </w:t>
       </w:r>
-      <w:hyperlink w:history="1" r:id="rIdqcz1vx2rib-wvaaknbmby">
+      <w:hyperlink w:history="1" r:id="rIdw_ojf_kklkjlkau-_olqp">
         <w:r>
           <w:rPr>
             <w:color w:val="EA2E00"/>
@@ -6767,7 +8158,7 @@
         </w:rPr>
         <w:t xml:space="preserve">, </w:t>
       </w:r>
-      <w:hyperlink w:history="1" r:id="rIdgeh_bl2arbvjnepynvpo7">
+      <w:hyperlink w:history="1" r:id="rIdloykjljkvap3w0jofaah1">
         <w:r>
           <w:rPr>
             <w:color w:val="EA2E00"/>
@@ -6785,7 +8176,7 @@
         </w:rPr>
         <w:t xml:space="preserve">, </w:t>
       </w:r>
-      <w:hyperlink w:history="1" r:id="rIdeopcieh7mi6berc-w4tod">
+      <w:hyperlink w:history="1" r:id="rId9kocpgucp0limx23gccel">
         <w:r>
           <w:rPr>
             <w:color w:val="EA2E00"/>
@@ -6803,7 +8194,7 @@
         </w:rPr>
         <w:t xml:space="preserve">, </w:t>
       </w:r>
-      <w:hyperlink w:history="1" r:id="rIdudtpyb25kroc7ezsmxts0">
+      <w:hyperlink w:history="1" r:id="rId-1q9n6u5vmjyj0maqjklz">
         <w:r>
           <w:rPr>
             <w:color w:val="EA2E00"/>
@@ -6821,7 +8212,7 @@
         </w:rPr>
         <w:t xml:space="preserve">, </w:t>
       </w:r>
-      <w:hyperlink w:history="1" r:id="rId1dmjdejq6flxfkr9aoaxh">
+      <w:hyperlink w:history="1" r:id="rIdhieoyqk7f-rlaoatjmm0e">
         <w:r>
           <w:rPr>
             <w:color w:val="EA2E00"/>
@@ -6882,7 +8273,7 @@
       </w:r>
     </w:p>
     <w:p>
-      <w:hyperlink w:history="1" r:id="rIdmfdtppgjcljeybvdldpco">
+      <w:hyperlink w:history="1" r:id="rIds0hpjy_rnzcciffia-ux3">
         <w:r>
           <w:rPr>
             <w:rStyle w:val="Hyperlink"/>
@@ -6903,7 +8294,7 @@
         </w:rPr>
         <w:t xml:space="preserve">Via </w:t>
       </w:r>
-      <w:hyperlink w:history="1" r:id="rIddei2ulrmt3wi6kqgh_gio">
+      <w:hyperlink w:history="1" r:id="rIda83mf8nemqky3jueecdqr">
         <w:r>
           <w:rPr>
             <w:color w:val="EA2E00"/>
@@ -6921,7 +8312,7 @@
         </w:rPr>
         <w:t xml:space="preserve">, </w:t>
       </w:r>
-      <w:hyperlink w:history="1" r:id="rIdh-qlcllodoejfdbeiptcw">
+      <w:hyperlink w:history="1" r:id="rIdap0dfdznojlciq2icndyw">
         <w:r>
           <w:rPr>
             <w:color w:val="EA2E00"/>
@@ -6939,7 +8330,7 @@
         </w:rPr>
         <w:t xml:space="preserve">, </w:t>
       </w:r>
-      <w:hyperlink w:history="1" r:id="rIdwjprvchiqnmdpnvlebeor">
+      <w:hyperlink w:history="1" r:id="rId8zw5kr0dzurlqnmlzbfi7">
         <w:r>
           <w:rPr>
             <w:color w:val="EA2E00"/>
@@ -6957,7 +8348,7 @@
         </w:rPr>
         <w:t xml:space="preserve">, </w:t>
       </w:r>
-      <w:hyperlink w:history="1" r:id="rIdlwslcwcoqhojerlhrzo5w">
+      <w:hyperlink w:history="1" r:id="rIdzfzoegu0g9_xbfmw8mgzg">
         <w:r>
           <w:rPr>
             <w:color w:val="EA2E00"/>
@@ -6975,7 +8366,7 @@
         </w:rPr>
         <w:t xml:space="preserve">, </w:t>
       </w:r>
-      <w:hyperlink w:history="1" r:id="rIdc4z4pukxojce58oocf-kb">
+      <w:hyperlink w:history="1" r:id="rIdttp7uvscfmi0uqv0idpcl">
         <w:r>
           <w:rPr>
             <w:color w:val="EA2E00"/>
@@ -7036,7 +8427,7 @@
       </w:r>
     </w:p>
     <w:p>
-      <w:hyperlink w:history="1" r:id="rIdrr-2h0_8odjks9iv2cjtx">
+      <w:hyperlink w:history="1" r:id="rIdvjq3tiocweeyhenfuakej">
         <w:r>
           <w:rPr>
             <w:rStyle w:val="Hyperlink"/>
@@ -7057,7 +8448,7 @@
         </w:rPr>
         <w:t xml:space="preserve">Via </w:t>
       </w:r>
-      <w:hyperlink w:history="1" r:id="rIdtfcc38onwpp9umpquzg99">
+      <w:hyperlink w:history="1" r:id="rIdn2lagmffk-s88k4ju7_ad">
         <w:r>
           <w:rPr>
             <w:color w:val="EA2E00"/>
@@ -7075,7 +8466,7 @@
         </w:rPr>
         <w:t xml:space="preserve">, </w:t>
       </w:r>
-      <w:hyperlink w:history="1" r:id="rId3d1anrhn54qwdjnbswscg">
+      <w:hyperlink w:history="1" r:id="rIdf-vwjix6ak-rnecql8tox">
         <w:r>
           <w:rPr>
             <w:color w:val="EA2E00"/>
@@ -7093,7 +8484,7 @@
         </w:rPr>
         <w:t xml:space="preserve">, </w:t>
       </w:r>
-      <w:hyperlink w:history="1" r:id="rId0crv-mpoczvvlvbh7cq4c">
+      <w:hyperlink w:history="1" r:id="rIdvdygab1uqnoq9fq2-4qlx">
         <w:r>
           <w:rPr>
             <w:color w:val="EA2E00"/>
@@ -7111,7 +8502,7 @@
         </w:rPr>
         <w:t xml:space="preserve">, </w:t>
       </w:r>
-      <w:hyperlink w:history="1" r:id="rIdnpzxwt8bpnau_ol_rzqox">
+      <w:hyperlink w:history="1" r:id="rIdbtueiw6xju7heom97uunn">
         <w:r>
           <w:rPr>
             <w:color w:val="EA2E00"/>
@@ -7129,7 +8520,7 @@
         </w:rPr>
         <w:t xml:space="preserve">, </w:t>
       </w:r>
-      <w:hyperlink w:history="1" r:id="rIdp0glt8iquumr0u4gsj4ns">
+      <w:hyperlink w:history="1" r:id="rIdphfiftixwdcoe9uvgz14d">
         <w:r>
           <w:rPr>
             <w:color w:val="EA2E00"/>
@@ -7190,7 +8581,7 @@
       </w:r>
     </w:p>
     <w:p>
-      <w:hyperlink w:history="1" r:id="rIdzaydnonpiirmyqy7sltgq">
+      <w:hyperlink w:history="1" r:id="rIdjoygifysibb_cqiwxuqlh">
         <w:r>
           <w:rPr>
             <w:rStyle w:val="Hyperlink"/>
@@ -7211,7 +8602,7 @@
         </w:rPr>
         <w:t xml:space="preserve">Via </w:t>
       </w:r>
-      <w:hyperlink w:history="1" r:id="rId72cxv8-5jrdda-eezqggq">
+      <w:hyperlink w:history="1" r:id="rId9s2j1haycw4ipyw6ntkmk">
         <w:r>
           <w:rPr>
             <w:color w:val="EA2E00"/>
@@ -7229,7 +8620,7 @@
         </w:rPr>
         <w:t xml:space="preserve">, </w:t>
       </w:r>
-      <w:hyperlink w:history="1" r:id="rIdrjfvvmejoh2wrwvixdymc">
+      <w:hyperlink w:history="1" r:id="rIdn2isgbv7hum-7y2rjz8lh">
         <w:r>
           <w:rPr>
             <w:color w:val="EA2E00"/>
@@ -7247,7 +8638,7 @@
         </w:rPr>
         <w:t xml:space="preserve">, </w:t>
       </w:r>
-      <w:hyperlink w:history="1" r:id="rIdqlemil87uee81bwcctbbd">
+      <w:hyperlink w:history="1" r:id="rIdup-rr4jns5fipu5rvcbfb">
         <w:r>
           <w:rPr>
             <w:color w:val="EA2E00"/>
@@ -7265,7 +8656,7 @@
         </w:rPr>
         <w:t xml:space="preserve">, </w:t>
       </w:r>
-      <w:hyperlink w:history="1" r:id="rIdc0qrfazbuxyyiqxkrsomh">
+      <w:hyperlink w:history="1" r:id="rIdr1n1rc1rezi732ujtvui2">
         <w:r>
           <w:rPr>
             <w:color w:val="EA2E00"/>
@@ -7283,7 +8674,7 @@
         </w:rPr>
         <w:t xml:space="preserve">, </w:t>
       </w:r>
-      <w:hyperlink w:history="1" r:id="rIdx4b7ekd_ausvwwai-xfm3">
+      <w:hyperlink w:history="1" r:id="rIdjangnry32ycv76ssz7fi8">
         <w:r>
           <w:rPr>
             <w:color w:val="EA2E00"/>
@@ -7301,7 +8692,7 @@
         </w:rPr>
         <w:t xml:space="preserve">, </w:t>
       </w:r>
-      <w:hyperlink w:history="1" r:id="rIdv2tefbp-94qlsaxcti9dx">
+      <w:hyperlink w:history="1" r:id="rId4iheg3ioq7cjeunabevk8">
         <w:r>
           <w:rPr>
             <w:color w:val="EA2E00"/>
@@ -7362,7 +8753,7 @@
       </w:r>
     </w:p>
     <w:p>
-      <w:hyperlink w:history="1" r:id="rIdpohgwy7wyvlgejkjn7bxx">
+      <w:hyperlink w:history="1" r:id="rIdhfsvsar1arczvsppxdyyq">
         <w:r>
           <w:rPr>
             <w:rStyle w:val="Hyperlink"/>
@@ -7383,7 +8774,7 @@
         </w:rPr>
         <w:t xml:space="preserve">Via </w:t>
       </w:r>
-      <w:hyperlink w:history="1" r:id="rIdqs5c-fgyzcnzfdyll6n1c">
+      <w:hyperlink w:history="1" r:id="rIdv3y0mdxtsra72usxzw64y">
         <w:r>
           <w:rPr>
             <w:color w:val="EA2E00"/>
@@ -7401,7 +8792,7 @@
         </w:rPr>
         <w:t xml:space="preserve">, </w:t>
       </w:r>
-      <w:hyperlink w:history="1" r:id="rIdo90t6lw5tooefd_ho0zmj">
+      <w:hyperlink w:history="1" r:id="rIdmo0tbrd1oorwijuk_xybr">
         <w:r>
           <w:rPr>
             <w:color w:val="EA2E00"/>
@@ -7419,7 +8810,7 @@
         </w:rPr>
         <w:t xml:space="preserve">, </w:t>
       </w:r>
-      <w:hyperlink w:history="1" r:id="rIduxn5wujrfol3t64e5rqzv">
+      <w:hyperlink w:history="1" r:id="rIdhizhqqzvmi-wdtmtyr4t1">
         <w:r>
           <w:rPr>
             <w:color w:val="EA2E00"/>
@@ -7437,7 +8828,7 @@
         </w:rPr>
         <w:t xml:space="preserve">, </w:t>
       </w:r>
-      <w:hyperlink w:history="1" r:id="rIdlgcskggahawq_6rowauos">
+      <w:hyperlink w:history="1" r:id="rIdiu-oeautmzjgxtrnlnvqc">
         <w:r>
           <w:rPr>
             <w:color w:val="EA2E00"/>
@@ -7455,7 +8846,7 @@
         </w:rPr>
         <w:t xml:space="preserve">, </w:t>
       </w:r>
-      <w:hyperlink w:history="1" r:id="rIdtpcf9qvfwrvncwrx1hqu2">
+      <w:hyperlink w:history="1" r:id="rIdrihwj9s5d8u4pxsl9wvnh">
         <w:r>
           <w:rPr>
             <w:color w:val="EA2E00"/>
@@ -7473,7 +8864,7 @@
         </w:rPr>
         <w:t xml:space="preserve">, </w:t>
       </w:r>
-      <w:hyperlink w:history="1" r:id="rIdc2oiqgp1xabofmzhzj0e3">
+      <w:hyperlink w:history="1" r:id="rIdwlwky8rqlft8rzli2ozf9">
         <w:r>
           <w:rPr>
             <w:color w:val="EA2E00"/>
@@ -7491,7 +8882,7 @@
         </w:rPr>
         <w:t xml:space="preserve">, </w:t>
       </w:r>
-      <w:hyperlink w:history="1" r:id="rIdbh-lseojhnnhnffjmkf8n">
+      <w:hyperlink w:history="1" r:id="rId66xzn49xxqn7ucj_md123">
         <w:r>
           <w:rPr>
             <w:color w:val="EA2E00"/>
@@ -7509,7 +8900,7 @@
         </w:rPr>
         <w:t xml:space="preserve">, </w:t>
       </w:r>
-      <w:hyperlink w:history="1" r:id="rIdq6tih4wckxkcmqiublcow">
+      <w:hyperlink w:history="1" r:id="rId6l9zwbxquu3tpphdustvn">
         <w:r>
           <w:rPr>
             <w:color w:val="EA2E00"/>
@@ -7527,7 +8918,7 @@
         </w:rPr>
         <w:t xml:space="preserve">, </w:t>
       </w:r>
-      <w:hyperlink w:history="1" r:id="rIdzbiproqfbhhy1-sejf_t7">
+      <w:hyperlink w:history="1" r:id="rIdv4uveljndzagn9we3bbv1">
         <w:r>
           <w:rPr>
             <w:color w:val="EA2E00"/>
@@ -7588,7 +8979,7 @@
       </w:r>
     </w:p>
     <w:p>
-      <w:hyperlink w:history="1" r:id="rIdvmzmataacsoyi0i-xgixk">
+      <w:hyperlink w:history="1" r:id="rIdgrzczfdj41dyzl7sha2dw">
         <w:r>
           <w:rPr>
             <w:rStyle w:val="Hyperlink"/>
@@ -7609,7 +9000,7 @@
         </w:rPr>
         <w:t xml:space="preserve">Via </w:t>
       </w:r>
-      <w:hyperlink w:history="1" r:id="rIddeshjvth-zixzzldmgcnk">
+      <w:hyperlink w:history="1" r:id="rId2tthryovvflrb9c4qg_ud">
         <w:r>
           <w:rPr>
             <w:color w:val="EA2E00"/>
@@ -7627,7 +9018,7 @@
         </w:rPr>
         <w:t xml:space="preserve">, </w:t>
       </w:r>
-      <w:hyperlink w:history="1" r:id="rIdz5s2srowc4e48skc1mbvd">
+      <w:hyperlink w:history="1" r:id="rIdgpbp988uhndvpti_fqlti">
         <w:r>
           <w:rPr>
             <w:color w:val="EA2E00"/>
@@ -7645,7 +9036,7 @@
         </w:rPr>
         <w:t xml:space="preserve">, </w:t>
       </w:r>
-      <w:hyperlink w:history="1" r:id="rIdypxhffepsvvm2xgwsfmo0">
+      <w:hyperlink w:history="1" r:id="rIdfxohwiiwoghnkywgglhnu">
         <w:r>
           <w:rPr>
             <w:color w:val="EA2E00"/>
@@ -7663,7 +9054,7 @@
         </w:rPr>
         <w:t xml:space="preserve">, </w:t>
       </w:r>
-      <w:hyperlink w:history="1" r:id="rIdbvenhpt-6f46m5ss2u_qg">
+      <w:hyperlink w:history="1" r:id="rId3sqti6vuhtd1fv4lt-y9a">
         <w:r>
           <w:rPr>
             <w:color w:val="EA2E00"/>
@@ -7681,7 +9072,7 @@
         </w:rPr>
         <w:t xml:space="preserve">, </w:t>
       </w:r>
-      <w:hyperlink w:history="1" r:id="rIddkddgnevcrbhsbhmbw91v">
+      <w:hyperlink w:history="1" r:id="rIdmrolbac_o4hxzxq9d5mdx">
         <w:r>
           <w:rPr>
             <w:color w:val="EA2E00"/>
@@ -7742,7 +9133,7 @@
       </w:r>
     </w:p>
     <w:p>
-      <w:hyperlink w:history="1" r:id="rIdmnduaj69zhzu0y_6fwrwb">
+      <w:hyperlink w:history="1" r:id="rIdhhfdmhf6_liyoob8c6qta">
         <w:r>
           <w:rPr>
             <w:rStyle w:val="Hyperlink"/>
@@ -7763,7 +9154,7 @@
         </w:rPr>
         <w:t xml:space="preserve">Via </w:t>
       </w:r>
-      <w:hyperlink w:history="1" r:id="rIdklxi2nr5tfa5oe8321yoj">
+      <w:hyperlink w:history="1" r:id="rIdfv5kazwwqwq_3zj4unmvb">
         <w:r>
           <w:rPr>
             <w:color w:val="EA2E00"/>
@@ -7781,7 +9172,7 @@
         </w:rPr>
         <w:t xml:space="preserve">, </w:t>
       </w:r>
-      <w:hyperlink w:history="1" r:id="rIdgay4uzjrex7vy8zzc803n">
+      <w:hyperlink w:history="1" r:id="rId7bg9btqank8wbwgjxlzai">
         <w:r>
           <w:rPr>
             <w:color w:val="EA2E00"/>
@@ -7799,7 +9190,7 @@
         </w:rPr>
         <w:t xml:space="preserve">, </w:t>
       </w:r>
-      <w:hyperlink w:history="1" r:id="rId5mkup6lay_p6cu5_97fqz">
+      <w:hyperlink w:history="1" r:id="rId1uj3zwnkcu-igs4g9vpcg">
         <w:r>
           <w:rPr>
             <w:color w:val="EA2E00"/>
@@ -7817,7 +9208,7 @@
         </w:rPr>
         <w:t xml:space="preserve">, </w:t>
       </w:r>
-      <w:hyperlink w:history="1" r:id="rId95wsz0g_1ucbo00w0mww6">
+      <w:hyperlink w:history="1" r:id="rIddo89eu-stelkigtau_mc-">
         <w:r>
           <w:rPr>
             <w:color w:val="EA2E00"/>
@@ -7835,7 +9226,7 @@
         </w:rPr>
         <w:t xml:space="preserve">, </w:t>
       </w:r>
-      <w:hyperlink w:history="1" r:id="rId5znlz8xnjotrl5el0jts9">
+      <w:hyperlink w:history="1" r:id="rIdu_tk2m7kmsdu2xavzeydb">
         <w:r>
           <w:rPr>
             <w:color w:val="EA2E00"/>
@@ -8416,7 +9807,7 @@
             </w:tcMar>
           </w:tcPr>
           <w:p>
-            <w:hyperlink w:history="1" r:id="rIdch9usow1jyheocbxeh9qi">
+            <w:hyperlink w:history="1" r:id="rIditzscmzvzgs0lmhcyktai">
               <w:r>
                 <w:rPr>
                   <w:b/>
@@ -8537,7 +9928,7 @@
             </w:tcMar>
           </w:tcPr>
           <w:p>
-            <w:hyperlink w:history="1" r:id="rIdn0gxnig9pywhxxsayo_id">
+            <w:hyperlink w:history="1" r:id="rIdt2x9s-8nq8dsc306zbz1l">
               <w:r>
                 <w:rPr>
                   <w:b/>
@@ -8658,7 +10049,7 @@
             </w:tcMar>
           </w:tcPr>
           <w:p>
-            <w:hyperlink w:history="1" r:id="rIdv7sofczwm61unsgmdvib7">
+            <w:hyperlink w:history="1" r:id="rId-ssoz4xiffjtuolxbhr-z">
               <w:r>
                 <w:rPr>
                   <w:b/>
@@ -8779,7 +10170,7 @@
             </w:tcMar>
           </w:tcPr>
           <w:p>
-            <w:hyperlink w:history="1" r:id="rIdudis_d2zcgobff6yxxi-t">
+            <w:hyperlink w:history="1" r:id="rIdzoqv8ipcfaqii3opljtrc">
               <w:r>
                 <w:rPr>
                   <w:b/>
@@ -8900,7 +10291,7 @@
             </w:tcMar>
           </w:tcPr>
           <w:p>
-            <w:hyperlink w:history="1" r:id="rIdrdtiysm7zk7ztmnztl1c4">
+            <w:hyperlink w:history="1" r:id="rIdkuozsj3qf9dxfoeopcjcl">
               <w:r>
                 <w:rPr>
                   <w:b/>
@@ -9021,7 +10412,7 @@
             </w:tcMar>
           </w:tcPr>
           <w:p>
-            <w:hyperlink w:history="1" r:id="rIderfgmmkwvfqp-4wuvq1cg">
+            <w:hyperlink w:history="1" r:id="rIdegn91suqujp2wcppzdxr3">
               <w:r>
                 <w:rPr>
                   <w:b/>
@@ -9142,7 +10533,7 @@
             </w:tcMar>
           </w:tcPr>
           <w:p>
-            <w:hyperlink w:history="1" r:id="rIdsmb6hq03hlbuymodzbi2q">
+            <w:hyperlink w:history="1" r:id="rIdgnqqbfuvb2vrsgxujro4n">
               <w:r>
                 <w:rPr>
                   <w:b/>
@@ -9263,7 +10654,7 @@
             </w:tcMar>
           </w:tcPr>
           <w:p>
-            <w:hyperlink w:history="1" r:id="rId3nk-b0rpxslxkhpdbqqit">
+            <w:hyperlink w:history="1" r:id="rId1j2hydwgtnw9_ija4n3op">
               <w:r>
                 <w:rPr>
                   <w:b/>
@@ -9384,7 +10775,7 @@
             </w:tcMar>
           </w:tcPr>
           <w:p>
-            <w:hyperlink w:history="1" r:id="rId5q-v3vbeovomrt_8veztd">
+            <w:hyperlink w:history="1" r:id="rIdvgx3a6fvm3d9fsjj0uaro">
               <w:r>
                 <w:rPr>
                   <w:b/>
@@ -9505,7 +10896,7 @@
             </w:tcMar>
           </w:tcPr>
           <w:p>
-            <w:hyperlink w:history="1" r:id="rIdgrl6z6-m-f_6qspe3xfto">
+            <w:hyperlink w:history="1" r:id="rIdy8v2mxiezcluri-e0lqah">
               <w:r>
                 <w:rPr>
                   <w:b/>
@@ -9626,7 +11017,7 @@
             </w:tcMar>
           </w:tcPr>
           <w:p>
-            <w:hyperlink w:history="1" r:id="rIdnlnlcnarlbu97sevomp10">
+            <w:hyperlink w:history="1" r:id="rIdxbreuffkpufoogsmotgo8">
               <w:r>
                 <w:rPr>
                   <w:b/>
@@ -9747,7 +11138,7 @@
             </w:tcMar>
           </w:tcPr>
           <w:p>
-            <w:hyperlink w:history="1" r:id="rId6ep53en8ggrjdmjaahn_t">
+            <w:hyperlink w:history="1" r:id="rIdumzqfpyylsl3ikpfdgeai">
               <w:r>
                 <w:rPr>
                   <w:b/>
@@ -9930,7 +11321,7 @@
         </w:rPr>
         <w:t xml:space="preserve">Via </w:t>
       </w:r>
-      <w:hyperlink w:history="1" r:id="rIdr2e4yzvs1dieaobekxcfe">
+      <w:hyperlink w:history="1" r:id="rId0yictxinjnfztbg2nemyd">
         <w:r>
           <w:rPr>
             <w:color w:val="EA2E00"/>
@@ -9948,7 +11339,7 @@
         </w:rPr>
         <w:t xml:space="preserve">, </w:t>
       </w:r>
-      <w:hyperlink w:history="1" r:id="rIdpuxjqhocl1pywyolpakpr">
+      <w:hyperlink w:history="1" r:id="rIdqa2byh1obdjdndao6xwn1">
         <w:r>
           <w:rPr>
             <w:color w:val="EA2E00"/>
@@ -9991,7 +11382,7 @@
         </w:rPr>
         <w:t xml:space="preserve">Via </w:t>
       </w:r>
-      <w:hyperlink w:history="1" r:id="rIdrxvp4q7bnwecnb44inrdd">
+      <w:hyperlink w:history="1" r:id="rIdnutjqxzxhdmybo2-liwmc">
         <w:r>
           <w:rPr>
             <w:color w:val="EA2E00"/>
@@ -10009,7 +11400,7 @@
         </w:rPr>
         <w:t xml:space="preserve">, </w:t>
       </w:r>
-      <w:hyperlink w:history="1" r:id="rId3a-sgevzocz6hjaopsuty">
+      <w:hyperlink w:history="1" r:id="rIdnurg_f4zrvr47pzgpwlfu">
         <w:r>
           <w:rPr>
             <w:color w:val="EA2E00"/>
@@ -10027,7 +11418,7 @@
         </w:rPr>
         <w:t xml:space="preserve">, </w:t>
       </w:r>
-      <w:hyperlink w:history="1" r:id="rIdin5mntal98txrcgtonikt">
+      <w:hyperlink w:history="1" r:id="rIdhhd0hzqqu5dzjphy59b8k">
         <w:r>
           <w:rPr>
             <w:color w:val="EA2E00"/>
@@ -10045,7 +11436,7 @@
         </w:rPr>
         <w:t xml:space="preserve">, </w:t>
       </w:r>
-      <w:hyperlink w:history="1" r:id="rIdsi0i-akaqkbr7k0bntje2">
+      <w:hyperlink w:history="1" r:id="rIdq2winhofnnwcpgt6ss5bs">
         <w:r>
           <w:rPr>
             <w:color w:val="EA2E00"/>
@@ -10063,7 +11454,7 @@
         </w:rPr>
         <w:t xml:space="preserve">, </w:t>
       </w:r>
-      <w:hyperlink w:history="1" r:id="rIdn4v30-0e1ch02yebroyoz">
+      <w:hyperlink w:history="1" r:id="rIdmcdh9luouky6tbwdwqo4a">
         <w:r>
           <w:rPr>
             <w:color w:val="EA2E00"/>
@@ -10081,7 +11472,7 @@
         </w:rPr>
         <w:t xml:space="preserve">, </w:t>
       </w:r>
-      <w:hyperlink w:history="1" r:id="rIdvbvqxvx0ixtogt6ujjtbs">
+      <w:hyperlink w:history="1" r:id="rIdeevkvawbcizfxls2dvbeg">
         <w:r>
           <w:rPr>
             <w:color w:val="EA2E00"/>
@@ -10124,7 +11515,7 @@
         </w:rPr>
         <w:t xml:space="preserve">Via </w:t>
       </w:r>
-      <w:hyperlink w:history="1" r:id="rId3uqfnpnlz8w0mrbqt0hxc">
+      <w:hyperlink w:history="1" r:id="rId8ug-qbqeu8arpv9fgja7f">
         <w:r>
           <w:rPr>
             <w:color w:val="EA2E00"/>
@@ -10142,7 +11533,7 @@
         </w:rPr>
         <w:t xml:space="preserve">, </w:t>
       </w:r>
-      <w:hyperlink w:history="1" r:id="rIdw34a8rky0dpasojy5qggu">
+      <w:hyperlink w:history="1" r:id="rIdu8fj3gfpxyffozzk_grqy">
         <w:r>
           <w:rPr>
             <w:color w:val="EA2E00"/>
@@ -10160,7 +11551,7 @@
         </w:rPr>
         <w:t xml:space="preserve">, </w:t>
       </w:r>
-      <w:hyperlink w:history="1" r:id="rIdblpmeucvzldp82bi3lzwo">
+      <w:hyperlink w:history="1" r:id="rIdj8fyoghl-yr2fof2mzxmu">
         <w:r>
           <w:rPr>
             <w:color w:val="EA2E00"/>
@@ -10178,7 +11569,7 @@
         </w:rPr>
         <w:t xml:space="preserve">, </w:t>
       </w:r>
-      <w:hyperlink w:history="1" r:id="rIda_izqas0tewnpnlycprus">
+      <w:hyperlink w:history="1" r:id="rId3qlntsujmvb87hldudrdp">
         <w:r>
           <w:rPr>
             <w:color w:val="EA2E00"/>
@@ -10196,7 +11587,7 @@
         </w:rPr>
         <w:t xml:space="preserve">, </w:t>
       </w:r>
-      <w:hyperlink w:history="1" r:id="rId0bqc-ibqlmemo9yjwrpsk">
+      <w:hyperlink w:history="1" r:id="rIdgah1dlt1ylcawr03yiw18">
         <w:r>
           <w:rPr>
             <w:color w:val="EA2E00"/>
@@ -10239,7 +11630,7 @@
         </w:rPr>
         <w:t xml:space="preserve">Via </w:t>
       </w:r>
-      <w:hyperlink w:history="1" r:id="rIdtgyeca1en2xglizdxwqfo">
+      <w:hyperlink w:history="1" r:id="rIdd_w0cj9bvgnw6z1sh-0ku">
         <w:r>
           <w:rPr>
             <w:color w:val="EA2E00"/>
@@ -10257,7 +11648,7 @@
         </w:rPr>
         <w:t xml:space="preserve">, </w:t>
       </w:r>
-      <w:hyperlink w:history="1" r:id="rIdh9u_bp4bppx4nj3fykmbg">
+      <w:hyperlink w:history="1" r:id="rId5tqaw4w7wenh2nsdgxehk">
         <w:r>
           <w:rPr>
             <w:color w:val="EA2E00"/>
@@ -10275,7 +11666,7 @@
         </w:rPr>
         <w:t xml:space="preserve">, </w:t>
       </w:r>
-      <w:hyperlink w:history="1" r:id="rIdsh1wtlexcmvpz-trkud9a">
+      <w:hyperlink w:history="1" r:id="rIdzwuwj-5rxfat2fyk4cmgs">
         <w:r>
           <w:rPr>
             <w:color w:val="EA2E00"/>
@@ -10293,7 +11684,7 @@
         </w:rPr>
         <w:t xml:space="preserve">, </w:t>
       </w:r>
-      <w:hyperlink w:history="1" r:id="rIdmv0lwxkedp85ldof1zygj">
+      <w:hyperlink w:history="1" r:id="rIdjocoyq9tf4ur1lsyqnods">
         <w:r>
           <w:rPr>
             <w:color w:val="EA2E00"/>
@@ -10336,7 +11727,7 @@
         </w:rPr>
         <w:t xml:space="preserve">Via </w:t>
       </w:r>
-      <w:hyperlink w:history="1" r:id="rIdzrpqc8onjhgyvssgdywta">
+      <w:hyperlink w:history="1" r:id="rIdtmsyrafbyxfhbcpmwopfe">
         <w:r>
           <w:rPr>
             <w:color w:val="EA2E00"/>
@@ -10354,7 +11745,7 @@
         </w:rPr>
         <w:t xml:space="preserve">, </w:t>
       </w:r>
-      <w:hyperlink w:history="1" r:id="rIdvrgnmkabb_a7damgzve29">
+      <w:hyperlink w:history="1" r:id="rIdtcjchvdu0s3ytftapm4if">
         <w:r>
           <w:rPr>
             <w:color w:val="EA2E00"/>
@@ -10372,7 +11763,7 @@
         </w:rPr>
         <w:t xml:space="preserve">, </w:t>
       </w:r>
-      <w:hyperlink w:history="1" r:id="rIdwwfitb25qrv7vo2xhndux">
+      <w:hyperlink w:history="1" r:id="rIdnqf60quj3ej9de2kg4cza">
         <w:r>
           <w:rPr>
             <w:color w:val="EA2E00"/>
@@ -10390,7 +11781,7 @@
         </w:rPr>
         <w:t xml:space="preserve">, </w:t>
       </w:r>
-      <w:hyperlink w:history="1" r:id="rIdgv7qvnr5yu3tlehr9iazn">
+      <w:hyperlink w:history="1" r:id="rIdvx-lckzcl447grlyomxbc">
         <w:r>
           <w:rPr>
             <w:color w:val="EA2E00"/>
@@ -10433,7 +11824,7 @@
         </w:rPr>
         <w:t xml:space="preserve">Via </w:t>
       </w:r>
-      <w:hyperlink w:history="1" r:id="rIdizv4dsyurafxvukpt7jf3">
+      <w:hyperlink w:history="1" r:id="rIdskiyavumkh9fcfbanq6bw">
         <w:r>
           <w:rPr>
             <w:color w:val="EA2E00"/>
@@ -10451,7 +11842,7 @@
         </w:rPr>
         <w:t xml:space="preserve">, </w:t>
       </w:r>
-      <w:hyperlink w:history="1" r:id="rIdhc_utphoeji62amkzw0ah">
+      <w:hyperlink w:history="1" r:id="rIdxomohxbewypks1vbeuqun">
         <w:r>
           <w:rPr>
             <w:color w:val="EA2E00"/>
@@ -10469,7 +11860,7 @@
         </w:rPr>
         <w:t xml:space="preserve">, </w:t>
       </w:r>
-      <w:hyperlink w:history="1" r:id="rId3xkytki9bohrnuogwbcyh">
+      <w:hyperlink w:history="1" r:id="rIdh88tk3tqq-ftcmfl76z8g">
         <w:r>
           <w:rPr>
             <w:color w:val="EA2E00"/>
@@ -10545,7 +11936,7 @@
         </w:rPr>
         <w:t xml:space="preserve">Via </w:t>
       </w:r>
-      <w:hyperlink w:history="1" r:id="rIdcf6kyhezuqdx8ra_2rvng">
+      <w:hyperlink w:history="1" r:id="rIdeabcpaocvqoevc58419e_">
         <w:r>
           <w:rPr>
             <w:color w:val="EA2E00"/>
@@ -10563,7 +11954,7 @@
         </w:rPr>
         <w:t xml:space="preserve">, </w:t>
       </w:r>
-      <w:hyperlink w:history="1" r:id="rIdljljfs6pizjh3fghrpqjo">
+      <w:hyperlink w:history="1" r:id="rId6sxpbzymsa7hmgwydeljd">
         <w:r>
           <w:rPr>
             <w:color w:val="EA2E00"/>
@@ -10581,7 +11972,7 @@
         </w:rPr>
         <w:t xml:space="preserve">, </w:t>
       </w:r>
-      <w:hyperlink w:history="1" r:id="rIdlkgb_r0__vmnnm1mhzg_6">
+      <w:hyperlink w:history="1" r:id="rIdvjfwxbjgeyiertttbnmep">
         <w:r>
           <w:rPr>
             <w:color w:val="EA2E00"/>
@@ -11552,7 +12943,7 @@
             </w:r>
           </w:p>
           <w:p>
-            <w:hyperlink w:history="1" r:id="rIdc_cpca4ffik1kopgn6w3l">
+            <w:hyperlink w:history="1" r:id="rIdmnavjmqmdyvswluhumxb8">
               <w:r>
                 <w:rPr>
                   <w:rStyle w:val="Hyperlink"/>
@@ -11639,7 +13030,7 @@
         <w:spacing w:after="80"/>
         <w:ind w:left="620"/>
       </w:pPr>
-      <w:hyperlink w:history="1" r:id="rIdap1g8hcbrqasa1kfkwbst">
+      <w:hyperlink w:history="1" r:id="rIdozv894s-eklqhcveyirhg">
         <w:r>
           <w:rPr>
             <w:sz w:val="16"/>
@@ -11675,7 +13066,7 @@
         <w:spacing w:after="80"/>
         <w:ind w:left="620"/>
       </w:pPr>
-      <w:hyperlink w:history="1" r:id="rIdpudpbsyj6-wpmjywuvnaw">
+      <w:hyperlink w:history="1" r:id="rIdteitwjoy1zso5gvrudj4d">
         <w:r>
           <w:rPr>
             <w:sz w:val="16"/>
@@ -11711,7 +13102,7 @@
         <w:spacing w:after="80"/>
         <w:ind w:left="620"/>
       </w:pPr>
-      <w:hyperlink w:history="1" r:id="rId7menswwhrlvn4tiebvyef">
+      <w:hyperlink w:history="1" r:id="rIdw7ck7dspjmqctsyqbf9ew">
         <w:r>
           <w:rPr>
             <w:sz w:val="16"/>
@@ -11747,7 +13138,7 @@
         <w:spacing w:after="80"/>
         <w:ind w:left="620"/>
       </w:pPr>
-      <w:hyperlink w:history="1" r:id="rIdhtrn63nxebopmykrihdwq">
+      <w:hyperlink w:history="1" r:id="rIdsvqztjtmdxrh22wdvpd0v">
         <w:r>
           <w:rPr>
             <w:sz w:val="16"/>
@@ -11783,7 +13174,7 @@
         <w:spacing w:after="80"/>
         <w:ind w:left="620"/>
       </w:pPr>
-      <w:hyperlink w:history="1" r:id="rIdhzdqmxdvfgjrb2ajvksm7">
+      <w:hyperlink w:history="1" r:id="rIdbis88ozeiuklynfg5nskq">
         <w:r>
           <w:rPr>
             <w:sz w:val="16"/>
@@ -11819,7 +13210,7 @@
         <w:spacing w:after="80"/>
         <w:ind w:left="620"/>
       </w:pPr>
-      <w:hyperlink w:history="1" r:id="rIdidxd5mocnow2ce2z-a35t">
+      <w:hyperlink w:history="1" r:id="rIdzenoc3cotl-qbx5rog_oq">
         <w:r>
           <w:rPr>
             <w:sz w:val="16"/>
@@ -11855,7 +13246,7 @@
         <w:spacing w:after="80"/>
         <w:ind w:left="620"/>
       </w:pPr>
-      <w:hyperlink w:history="1" r:id="rIdx2po109st0wevi67kv3xo">
+      <w:hyperlink w:history="1" r:id="rIdm2kn8znonghdyzebn8kir">
         <w:r>
           <w:rPr>
             <w:sz w:val="16"/>
@@ -11899,7 +13290,7 @@
         <w:spacing w:after="80"/>
         <w:ind w:left="620"/>
       </w:pPr>
-      <w:hyperlink w:history="1" r:id="rIdc3ljuyeoirbhr_thexzpa">
+      <w:hyperlink w:history="1" r:id="rIdp06zxu7ct_sivt7szc_5t">
         <w:r>
           <w:rPr>
             <w:sz w:val="16"/>
@@ -11935,7 +13326,7 @@
         <w:spacing w:after="80"/>
         <w:ind w:left="620"/>
       </w:pPr>
-      <w:hyperlink w:history="1" r:id="rIdhghmvn-xcvzyyvpy4lwcp">
+      <w:hyperlink w:history="1" r:id="rIdhyg8ut4pxwnbty5rkd5zq">
         <w:r>
           <w:rPr>
             <w:sz w:val="16"/>
@@ -11971,7 +13362,7 @@
         <w:spacing w:after="80"/>
         <w:ind w:left="620"/>
       </w:pPr>
-      <w:hyperlink w:history="1" r:id="rIdjjvs0qme7ctentsi5wyaj">
+      <w:hyperlink w:history="1" r:id="rIdaasxjr1xckcdime4mngev">
         <w:r>
           <w:rPr>
             <w:sz w:val="16"/>
@@ -12007,7 +13398,7 @@
         <w:spacing w:after="80"/>
         <w:ind w:left="620"/>
       </w:pPr>
-      <w:hyperlink w:history="1" r:id="rIdohfae9umrtnn1fu989cxk">
+      <w:hyperlink w:history="1" r:id="rIdtkl00ym4zoq5xi_25qih-">
         <w:r>
           <w:rPr>
             <w:sz w:val="16"/>
@@ -12051,7 +13442,7 @@
         <w:spacing w:after="80"/>
         <w:ind w:left="620"/>
       </w:pPr>
-      <w:hyperlink w:history="1" r:id="rIdk8wkolcybkuittn3axefv">
+      <w:hyperlink w:history="1" r:id="rIdmd-oj5j2wii-on9ee70ni">
         <w:r>
           <w:rPr>
             <w:sz w:val="16"/>
@@ -12087,7 +13478,7 @@
         <w:spacing w:after="80"/>
         <w:ind w:left="620"/>
       </w:pPr>
-      <w:hyperlink w:history="1" r:id="rIdu5fe8st4koi9ogtdhrai8">
+      <w:hyperlink w:history="1" r:id="rIdlcxdswkzseas6-mpxpbl8">
         <w:r>
           <w:rPr>
             <w:sz w:val="16"/>
@@ -12123,7 +13514,7 @@
         <w:spacing w:after="80"/>
         <w:ind w:left="620"/>
       </w:pPr>
-      <w:hyperlink w:history="1" r:id="rIdic7nc3-rlcpif6eevfb75">
+      <w:hyperlink w:history="1" r:id="rId5qjgev0v_xety-hhuwikd">
         <w:r>
           <w:rPr>
             <w:sz w:val="16"/>
@@ -12167,7 +13558,7 @@
         <w:spacing w:after="80"/>
         <w:ind w:left="620"/>
       </w:pPr>
-      <w:hyperlink w:history="1" r:id="rIdm0xsgc7a9gap4hhowqjfa">
+      <w:hyperlink w:history="1" r:id="rId4edhl8dxffuqeice9pjhl">
         <w:r>
           <w:rPr>
             <w:sz w:val="16"/>
@@ -12203,7 +13594,7 @@
         <w:spacing w:after="80"/>
         <w:ind w:left="620"/>
       </w:pPr>
-      <w:hyperlink w:history="1" r:id="rId8oo_7m9wfwteh1ldmconl">
+      <w:hyperlink w:history="1" r:id="rIdclxa7qrujiv42evl3a66a">
         <w:r>
           <w:rPr>
             <w:sz w:val="16"/>
@@ -12239,7 +13630,7 @@
         <w:spacing w:after="80"/>
         <w:ind w:left="620"/>
       </w:pPr>
-      <w:hyperlink w:history="1" r:id="rIdwirxx6oxqfakth2zlocwp">
+      <w:hyperlink w:history="1" r:id="rId8bnffhc8w2kbudbe8cro1">
         <w:r>
           <w:rPr>
             <w:sz w:val="16"/>
@@ -12283,7 +13674,7 @@
         <w:spacing w:after="80"/>
         <w:ind w:left="620"/>
       </w:pPr>
-      <w:hyperlink w:history="1" r:id="rIdcnphzg0xc8lqqrxi4ueaw">
+      <w:hyperlink w:history="1" r:id="rIdhjwzjcujirrhlvukeozw3">
         <w:r>
           <w:rPr>
             <w:sz w:val="16"/>
@@ -12319,7 +13710,7 @@
         <w:spacing w:after="80"/>
         <w:ind w:left="620"/>
       </w:pPr>
-      <w:hyperlink w:history="1" r:id="rIdh9chevdhgpcoi7ufrrxkf">
+      <w:hyperlink w:history="1" r:id="rIdwgg5xuviszuflxhq2pjb2">
         <w:r>
           <w:rPr>
             <w:sz w:val="16"/>
@@ -12363,7 +13754,7 @@
         <w:spacing w:after="80"/>
         <w:ind w:left="620"/>
       </w:pPr>
-      <w:hyperlink w:history="1" r:id="rId8ne8u135f2mx8bavumwav">
+      <w:hyperlink w:history="1" r:id="rIdwckgzm8boj5zpywoauo0p">
         <w:r>
           <w:rPr>
             <w:sz w:val="16"/>
@@ -12399,7 +13790,7 @@
         <w:spacing w:after="80"/>
         <w:ind w:left="620"/>
       </w:pPr>
-      <w:hyperlink w:history="1" r:id="rIddtc6pofcsshbojrbbwev2">
+      <w:hyperlink w:history="1" r:id="rIdyciiznipzdukm2zwrj8jn">
         <w:r>
           <w:rPr>
             <w:sz w:val="16"/>
@@ -12435,7 +13826,7 @@
         <w:spacing w:after="80"/>
         <w:ind w:left="620"/>
       </w:pPr>
-      <w:hyperlink w:history="1" r:id="rIdnajigd8shvlnfz1igu3zx">
+      <w:hyperlink w:history="1" r:id="rId3ac7qqylp3odyspdzns7b">
         <w:r>
           <w:rPr>
             <w:sz w:val="16"/>
@@ -12479,7 +13870,7 @@
         <w:spacing w:after="80"/>
         <w:ind w:left="620"/>
       </w:pPr>
-      <w:hyperlink w:history="1" r:id="rIdnymn-mcjlhddpzkwfszde">
+      <w:hyperlink w:history="1" r:id="rIdrxcl3gxhkniieg0brc63c">
         <w:r>
           <w:rPr>
             <w:sz w:val="16"/>
@@ -12515,7 +13906,7 @@
         <w:spacing w:after="80"/>
         <w:ind w:left="620"/>
       </w:pPr>
-      <w:hyperlink w:history="1" r:id="rIdnfgokk9sful7tdqrrqyqi">
+      <w:hyperlink w:history="1" r:id="rIdnpmvyxfzxeinmdtpev00l">
         <w:r>
           <w:rPr>
             <w:sz w:val="16"/>
@@ -12551,7 +13942,7 @@
         <w:spacing w:after="80"/>
         <w:ind w:left="620"/>
       </w:pPr>
-      <w:hyperlink w:history="1" r:id="rIdqrr-ckpzyvxee96yeyo9m">
+      <w:hyperlink w:history="1" r:id="rIdz9shblqyoktplz_czhewk">
         <w:r>
           <w:rPr>
             <w:sz w:val="16"/>
@@ -12587,7 +13978,7 @@
         <w:spacing w:after="80"/>
         <w:ind w:left="620"/>
       </w:pPr>
-      <w:hyperlink w:history="1" r:id="rIdbcfx_gq4srgen_dp2-eqp">
+      <w:hyperlink w:history="1" r:id="rIdh37zbu_s4tdrsvkbifr4u">
         <w:r>
           <w:rPr>
             <w:sz w:val="16"/>
@@ -12631,7 +14022,7 @@
         <w:spacing w:after="80"/>
         <w:ind w:left="620"/>
       </w:pPr>
-      <w:hyperlink w:history="1" r:id="rIddjxtfvhrpe4vheih7pfmg">
+      <w:hyperlink w:history="1" r:id="rIdod9dptr-jdygubpx2se1y">
         <w:r>
           <w:rPr>
             <w:sz w:val="16"/>
@@ -12667,7 +14058,7 @@
         <w:spacing w:after="80"/>
         <w:ind w:left="620"/>
       </w:pPr>
-      <w:hyperlink w:history="1" r:id="rIdclefzs1nlodlhuipgssoi">
+      <w:hyperlink w:history="1" r:id="rIdd0t_e0lagjlclrq0unzew">
         <w:r>
           <w:rPr>
             <w:sz w:val="16"/>
@@ -12703,7 +14094,7 @@
         <w:spacing w:after="80"/>
         <w:ind w:left="620"/>
       </w:pPr>
-      <w:hyperlink w:history="1" r:id="rIdpsxbngm9ahgrplubnbtnx">
+      <w:hyperlink w:history="1" r:id="rIdx8xllql_iogpocyb5lg5b">
         <w:r>
           <w:rPr>
             <w:sz w:val="16"/>
@@ -12739,7 +14130,7 @@
         <w:spacing w:after="80"/>
         <w:ind w:left="620"/>
       </w:pPr>
-      <w:hyperlink w:history="1" r:id="rIdtxeu3isr6gmttidrxnz4h">
+      <w:hyperlink w:history="1" r:id="rIdha2ynoc1q_hqbzari26vn">
         <w:r>
           <w:rPr>
             <w:sz w:val="16"/>
@@ -12775,7 +14166,7 @@
         <w:spacing w:after="80"/>
         <w:ind w:left="620"/>
       </w:pPr>
-      <w:hyperlink w:history="1" r:id="rIdnxlwfuhmbsplfhv1yo6qu">
+      <w:hyperlink w:history="1" r:id="rIdaru7etbgfwhgmcsw0x0_e">
         <w:r>
           <w:rPr>
             <w:sz w:val="16"/>
@@ -12811,7 +14202,7 @@
         <w:spacing w:after="80"/>
         <w:ind w:left="620"/>
       </w:pPr>
-      <w:hyperlink w:history="1" r:id="rIdf3vjukg16u2rfcdydzend">
+      <w:hyperlink w:history="1" r:id="rId0mhxjmxjkb8v-9afvnxmk">
         <w:r>
           <w:rPr>
             <w:sz w:val="16"/>
@@ -12847,7 +14238,7 @@
         <w:spacing w:after="80"/>
         <w:ind w:left="620"/>
       </w:pPr>
-      <w:hyperlink w:history="1" r:id="rId13yowvmahrus2pzgh7ewh">
+      <w:hyperlink w:history="1" r:id="rIdj8uxegy_fug6-5lmigtpm">
         <w:r>
           <w:rPr>
             <w:sz w:val="16"/>
@@ -12909,7 +14300,7 @@
         </w:numPr>
         <w:spacing w:after="60"/>
       </w:pPr>
-      <w:hyperlink w:history="1" r:id="rId7ivtzhq_thicnuax2km_i">
+      <w:hyperlink w:history="1" r:id="rIdsyqwemcxefoykmp3rrn48">
         <w:r>
           <w:rPr>
             <w:sz w:val="18"/>
@@ -12937,7 +14328,7 @@
         </w:numPr>
         <w:spacing w:after="60"/>
       </w:pPr>
-      <w:hyperlink w:history="1" r:id="rIdhkzqfth26dcxj9tphri60">
+      <w:hyperlink w:history="1" r:id="rIdfycvtmtdvrlty2b6x9p-y">
         <w:r>
           <w:rPr>
             <w:sz w:val="18"/>
@@ -12965,7 +14356,7 @@
         </w:numPr>
         <w:spacing w:after="60"/>
       </w:pPr>
-      <w:hyperlink w:history="1" r:id="rId_yivhs3obzcnogv3nwifv">
+      <w:hyperlink w:history="1" r:id="rIdd8d8a06gnudyse__1vtey">
         <w:r>
           <w:rPr>
             <w:sz w:val="18"/>
@@ -12993,7 +14384,7 @@
         </w:numPr>
         <w:spacing w:after="60"/>
       </w:pPr>
-      <w:hyperlink w:history="1" r:id="rIdcvar2nkniwnrtxpwf4o2f">
+      <w:hyperlink w:history="1" r:id="rIdzyue_kg5rvf_kq8iogzb6">
         <w:r>
           <w:rPr>
             <w:sz w:val="18"/>
@@ -13021,7 +14412,7 @@
         </w:numPr>
         <w:spacing w:after="60"/>
       </w:pPr>
-      <w:hyperlink w:history="1" r:id="rIdqsldvfor8kg-izwramdc6">
+      <w:hyperlink w:history="1" r:id="rIdsvfilykli4qagoszyapuk">
         <w:r>
           <w:rPr>
             <w:sz w:val="18"/>
@@ -13049,7 +14440,7 @@
         </w:numPr>
         <w:spacing w:after="60"/>
       </w:pPr>
-      <w:hyperlink w:history="1" r:id="rIdoy4xoq3hb8xhu84tebi2k">
+      <w:hyperlink w:history="1" r:id="rIdwdpheumeyupyyzgwfyf0q">
         <w:r>
           <w:rPr>
             <w:sz w:val="18"/>
@@ -13077,7 +14468,7 @@
         </w:numPr>
         <w:spacing w:after="60"/>
       </w:pPr>
-      <w:hyperlink w:history="1" r:id="rIdajmyjng6c_t9enihuh87b">
+      <w:hyperlink w:history="1" r:id="rIdwdhzctw63u8byncxwlxsx">
         <w:r>
           <w:rPr>
             <w:sz w:val="18"/>
@@ -13105,7 +14496,7 @@
         </w:numPr>
         <w:spacing w:after="60"/>
       </w:pPr>
-      <w:hyperlink w:history="1" r:id="rIdi4tctc3_sp43nuymp99oa">
+      <w:hyperlink w:history="1" r:id="rIdaklmng64k_ikgfoosgx5x">
         <w:r>
           <w:rPr>
             <w:sz w:val="18"/>
@@ -13133,7 +14524,7 @@
         </w:numPr>
         <w:spacing w:after="60"/>
       </w:pPr>
-      <w:hyperlink w:history="1" r:id="rIdfb0mgmytm814ykltu4b5d">
+      <w:hyperlink w:history="1" r:id="rId5ttgow-xfsynv0nrwfxcw">
         <w:r>
           <w:rPr>
             <w:sz w:val="18"/>
@@ -13161,7 +14552,7 @@
         </w:numPr>
         <w:spacing w:after="60"/>
       </w:pPr>
-      <w:hyperlink w:history="1" r:id="rIdomvkp6xt-rn1j4u0terbu">
+      <w:hyperlink w:history="1" r:id="rIdszte1kk68vgm4mre4cwdo">
         <w:r>
           <w:rPr>
             <w:sz w:val="18"/>
@@ -13189,7 +14580,7 @@
         </w:numPr>
         <w:spacing w:after="60"/>
       </w:pPr>
-      <w:hyperlink w:history="1" r:id="rId7qj8gdfyfuka7t4b0njwj">
+      <w:hyperlink w:history="1" r:id="rIdtiert7fy7wuqbbgrmx-zg">
         <w:r>
           <w:rPr>
             <w:sz w:val="18"/>
@@ -13217,7 +14608,7 @@
         </w:numPr>
         <w:spacing w:after="60"/>
       </w:pPr>
-      <w:hyperlink w:history="1" r:id="rIdpbepf8ldbrrrwheoboztp">
+      <w:hyperlink w:history="1" r:id="rIdxkqnc8gul_epp_iew-y8g">
         <w:r>
           <w:rPr>
             <w:sz w:val="18"/>
@@ -13245,7 +14636,7 @@
         </w:numPr>
         <w:spacing w:after="60"/>
       </w:pPr>
-      <w:hyperlink w:history="1" r:id="rIdm_gwc_wlgbw1-khvbjgny">
+      <w:hyperlink w:history="1" r:id="rId2tup_rvphhwpqdodyvu8l">
         <w:r>
           <w:rPr>
             <w:sz w:val="18"/>
@@ -13273,7 +14664,7 @@
         </w:numPr>
         <w:spacing w:after="60"/>
       </w:pPr>
-      <w:hyperlink w:history="1" r:id="rIdgtnft5clhumqzctkbvcmr">
+      <w:hyperlink w:history="1" r:id="rId7pzpkvhvbj4zs2vpcsypn">
         <w:r>
           <w:rPr>
             <w:sz w:val="18"/>
@@ -13301,7 +14692,7 @@
         </w:numPr>
         <w:spacing w:after="60"/>
       </w:pPr>
-      <w:hyperlink w:history="1" r:id="rId6tufgo7a0mzaijaluu27m">
+      <w:hyperlink w:history="1" r:id="rId3dt5dxho4igbi-amavluj">
         <w:r>
           <w:rPr>
             <w:sz w:val="18"/>
@@ -13329,7 +14720,7 @@
         </w:numPr>
         <w:spacing w:after="60"/>
       </w:pPr>
-      <w:hyperlink w:history="1" r:id="rId7c3pbcjqwzzv5zkaoj5m4">
+      <w:hyperlink w:history="1" r:id="rIdrqzytc58qvf-l0qgdnd_h">
         <w:r>
           <w:rPr>
             <w:sz w:val="18"/>
@@ -13357,7 +14748,7 @@
         </w:numPr>
         <w:spacing w:after="60"/>
       </w:pPr>
-      <w:hyperlink w:history="1" r:id="rIdfokomofahuo8kaevtpidb">
+      <w:hyperlink w:history="1" r:id="rId9rfyuul7mqvwdpdosz4fw">
         <w:r>
           <w:rPr>
             <w:sz w:val="18"/>
@@ -13385,7 +14776,7 @@
         </w:numPr>
         <w:spacing w:after="60"/>
       </w:pPr>
-      <w:hyperlink w:history="1" r:id="rIdblqywsthmmyemgw4mqncr">
+      <w:hyperlink w:history="1" r:id="rIdcdm0xj7upayyrxxhnlion">
         <w:r>
           <w:rPr>
             <w:sz w:val="18"/>
@@ -13413,7 +14804,7 @@
         </w:numPr>
         <w:spacing w:after="60"/>
       </w:pPr>
-      <w:hyperlink w:history="1" r:id="rIdwvauosxdnjvzmck7ju242">
+      <w:hyperlink w:history="1" r:id="rIdz07umsvsfuxhjb8vher_p">
         <w:r>
           <w:rPr>
             <w:sz w:val="18"/>
@@ -13441,7 +14832,7 @@
         </w:numPr>
         <w:spacing w:after="60"/>
       </w:pPr>
-      <w:hyperlink w:history="1" r:id="rIdp_n72tclg0tepuytmnggq">
+      <w:hyperlink w:history="1" r:id="rIdspfjfrbzzvvlx55vcdnfu">
         <w:r>
           <w:rPr>
             <w:sz w:val="18"/>
@@ -13469,7 +14860,7 @@
         </w:numPr>
         <w:spacing w:after="60"/>
       </w:pPr>
-      <w:hyperlink w:history="1" r:id="rIdihfp38pankjnmi2ezfsei">
+      <w:hyperlink w:history="1" r:id="rIdk9z48fayl9o5zrio2g8vg">
         <w:r>
           <w:rPr>
             <w:sz w:val="18"/>
@@ -13497,7 +14888,7 @@
         </w:numPr>
         <w:spacing w:after="60"/>
       </w:pPr>
-      <w:hyperlink w:history="1" r:id="rIdggm7pdfdviddmvjt56oz3">
+      <w:hyperlink w:history="1" r:id="rIden6vdu8dgv-tlrzr2czi_">
         <w:r>
           <w:rPr>
             <w:sz w:val="18"/>
@@ -13525,7 +14916,7 @@
         </w:numPr>
         <w:spacing w:after="60"/>
       </w:pPr>
-      <w:hyperlink w:history="1" r:id="rIdeltxzo6vtwrujqy5bzrfp">
+      <w:hyperlink w:history="1" r:id="rIdkfeclprgu0po10wckr8zp">
         <w:r>
           <w:rPr>
             <w:sz w:val="18"/>
@@ -13553,7 +14944,7 @@
         </w:numPr>
         <w:spacing w:after="60"/>
       </w:pPr>
-      <w:hyperlink w:history="1" r:id="rIduwd7ujwktvxa724zmcjpi">
+      <w:hyperlink w:history="1" r:id="rIdeh4jpx-rw3gppyp05ft9g">
         <w:r>
           <w:rPr>
             <w:sz w:val="18"/>
@@ -13581,7 +14972,7 @@
         </w:numPr>
         <w:spacing w:after="60"/>
       </w:pPr>
-      <w:hyperlink w:history="1" r:id="rId24spszi6irbupnvduas5a">
+      <w:hyperlink w:history="1" r:id="rIdlopzr2keogeiaqib2woyh">
         <w:r>
           <w:rPr>
             <w:sz w:val="18"/>
@@ -13609,7 +15000,7 @@
         </w:numPr>
         <w:spacing w:after="60"/>
       </w:pPr>
-      <w:hyperlink w:history="1" r:id="rIde0aaiu_cl-mz_ossvhodb">
+      <w:hyperlink w:history="1" r:id="rIdyj9fa5omzvhuxlsohy8yp">
         <w:r>
           <w:rPr>
             <w:sz w:val="18"/>
@@ -13637,7 +15028,7 @@
         </w:numPr>
         <w:spacing w:after="60"/>
       </w:pPr>
-      <w:hyperlink w:history="1" r:id="rIdrnxpojqnzevdsajutjqpa">
+      <w:hyperlink w:history="1" r:id="rIdysqpyi_sz2oax9z9ffsqd">
         <w:r>
           <w:rPr>
             <w:sz w:val="18"/>
@@ -13665,7 +15056,7 @@
         </w:numPr>
         <w:spacing w:after="60"/>
       </w:pPr>
-      <w:hyperlink w:history="1" r:id="rIdv7-g4vl4t-yei4sebzzm9">
+      <w:hyperlink w:history="1" r:id="rIdaf4scrp6ws--xqltah48e">
         <w:r>
           <w:rPr>
             <w:sz w:val="18"/>
@@ -13693,7 +15084,7 @@
         </w:numPr>
         <w:spacing w:after="60"/>
       </w:pPr>
-      <w:hyperlink w:history="1" r:id="rIdbbegbbuwurtgnonmhhfp_">
+      <w:hyperlink w:history="1" r:id="rIduv8ewawmnk4ixzfj6nwby">
         <w:r>
           <w:rPr>
             <w:sz w:val="18"/>
@@ -13721,7 +15112,7 @@
         </w:numPr>
         <w:spacing w:after="60"/>
       </w:pPr>
-      <w:hyperlink w:history="1" r:id="rIdnfex26lwjdau9neaph2fo">
+      <w:hyperlink w:history="1" r:id="rIdrzn2w91dh5g_tseknkax4">
         <w:r>
           <w:rPr>
             <w:sz w:val="18"/>
@@ -13749,7 +15140,7 @@
         </w:numPr>
         <w:spacing w:after="60"/>
       </w:pPr>
-      <w:hyperlink w:history="1" r:id="rIdsqpudiarqtpcycsf8dcen">
+      <w:hyperlink w:history="1" r:id="rId0wjsanvihr7j12p_s6az9">
         <w:r>
           <w:rPr>
             <w:sz w:val="18"/>
@@ -13777,7 +15168,7 @@
         </w:numPr>
         <w:spacing w:after="60"/>
       </w:pPr>
-      <w:hyperlink w:history="1" r:id="rIddcqztdipcjqrp-zqzteyr">
+      <w:hyperlink w:history="1" r:id="rIdwtqgkxwzcodad69jwidvg">
         <w:r>
           <w:rPr>
             <w:sz w:val="18"/>
@@ -13805,7 +15196,7 @@
         </w:numPr>
         <w:spacing w:after="60"/>
       </w:pPr>
-      <w:hyperlink w:history="1" r:id="rId47hzfq4diknytzvlmzpbx">
+      <w:hyperlink w:history="1" r:id="rIdvtnamvkm1kgi085jtyu5t">
         <w:r>
           <w:rPr>
             <w:sz w:val="18"/>
@@ -13833,7 +15224,7 @@
         </w:numPr>
         <w:spacing w:after="60"/>
       </w:pPr>
-      <w:hyperlink w:history="1" r:id="rIdtvaoxwvkesll9yujjdnnd">
+      <w:hyperlink w:history="1" r:id="rIdfggwoaqzb3avrpvtcjsb_">
         <w:r>
           <w:rPr>
             <w:sz w:val="18"/>
@@ -13861,7 +15252,7 @@
         </w:numPr>
         <w:spacing w:after="60"/>
       </w:pPr>
-      <w:hyperlink w:history="1" r:id="rIdtsuqmjkk_d8iz3fybmvbq">
+      <w:hyperlink w:history="1" r:id="rId5vmwp6bs55v65iwinmswh">
         <w:r>
           <w:rPr>
             <w:sz w:val="18"/>
@@ -13889,7 +15280,7 @@
         </w:numPr>
         <w:spacing w:after="60"/>
       </w:pPr>
-      <w:hyperlink w:history="1" r:id="rIdmw15xj2jfdvazsyrh-cnx">
+      <w:hyperlink w:history="1" r:id="rIdzqothbvqrdlm6fck3-ues">
         <w:r>
           <w:rPr>
             <w:sz w:val="18"/>
@@ -13917,7 +15308,7 @@
         </w:numPr>
         <w:spacing w:after="60"/>
       </w:pPr>
-      <w:hyperlink w:history="1" r:id="rId-xhuazlj7lkp8aqmkvuko">
+      <w:hyperlink w:history="1" r:id="rId5x6viy8lh3ewaqkazeasx">
         <w:r>
           <w:rPr>
             <w:sz w:val="18"/>
@@ -13945,7 +15336,7 @@
         </w:numPr>
         <w:spacing w:after="60"/>
       </w:pPr>
-      <w:hyperlink w:history="1" r:id="rIdjqw2yimkx0ddnakaxbd93">
+      <w:hyperlink w:history="1" r:id="rIdbiutfrf5plmeb0lw8mvx_">
         <w:r>
           <w:rPr>
             <w:sz w:val="18"/>
@@ -13973,7 +15364,7 @@
         </w:numPr>
         <w:spacing w:after="60"/>
       </w:pPr>
-      <w:hyperlink w:history="1" r:id="rIdugrtd_djbiwzyc56juigi">
+      <w:hyperlink w:history="1" r:id="rId3yx67grascy5_nmqeoci7">
         <w:r>
           <w:rPr>
             <w:sz w:val="18"/>
@@ -14001,7 +15392,7 @@
         </w:numPr>
         <w:spacing w:after="60"/>
       </w:pPr>
-      <w:hyperlink w:history="1" r:id="rIdi9b070jdofdx4dmwevzop">
+      <w:hyperlink w:history="1" r:id="rIdkem9g3ahrcumia8rrmcjf">
         <w:r>
           <w:rPr>
             <w:sz w:val="18"/>
@@ -14029,7 +15420,7 @@
         </w:numPr>
         <w:spacing w:after="60"/>
       </w:pPr>
-      <w:hyperlink w:history="1" r:id="rIdzq1hr-nqcoqys9q9dbjkd">
+      <w:hyperlink w:history="1" r:id="rIdvbrrkwld1iby0smmz4bz1">
         <w:r>
           <w:rPr>
             <w:sz w:val="18"/>
@@ -14057,7 +15448,7 @@
         </w:numPr>
         <w:spacing w:after="60"/>
       </w:pPr>
-      <w:hyperlink w:history="1" r:id="rId9mpkae4nrtt_swersno_m">
+      <w:hyperlink w:history="1" r:id="rIdhnqxdv7hc45tyrv779fjo">
         <w:r>
           <w:rPr>
             <w:sz w:val="18"/>
@@ -14085,7 +15476,7 @@
         </w:numPr>
         <w:spacing w:after="60"/>
       </w:pPr>
-      <w:hyperlink w:history="1" r:id="rIdses51xbz4bfwvbu_eqceh">
+      <w:hyperlink w:history="1" r:id="rIdc_5sgof9l_tahuagsqlp3">
         <w:r>
           <w:rPr>
             <w:sz w:val="18"/>
@@ -14113,7 +15504,7 @@
         </w:numPr>
         <w:spacing w:after="60"/>
       </w:pPr>
-      <w:hyperlink w:history="1" r:id="rIdcwryuob8ieuct2xqjk6-r">
+      <w:hyperlink w:history="1" r:id="rIdscjwgrbvesyaeus0cy6o-">
         <w:r>
           <w:rPr>
             <w:sz w:val="18"/>
@@ -14141,7 +15532,7 @@
         </w:numPr>
         <w:spacing w:after="60"/>
       </w:pPr>
-      <w:hyperlink w:history="1" r:id="rId_mssazw7dxhdyye2kkdrj">
+      <w:hyperlink w:history="1" r:id="rId7c6-mwfpzc7htsyhdc0r4">
         <w:r>
           <w:rPr>
             <w:sz w:val="18"/>
@@ -14169,7 +15560,7 @@
         </w:numPr>
         <w:spacing w:after="60"/>
       </w:pPr>
-      <w:hyperlink w:history="1" r:id="rIdqbsbl05ibi8xiltqlrep7">
+      <w:hyperlink w:history="1" r:id="rIdzy0pa0smrpyumg-gqz53d">
         <w:r>
           <w:rPr>
             <w:sz w:val="18"/>
@@ -14197,7 +15588,7 @@
         </w:numPr>
         <w:spacing w:after="60"/>
       </w:pPr>
-      <w:hyperlink w:history="1" r:id="rIdkf-djr6dzswllgnnnnruv">
+      <w:hyperlink w:history="1" r:id="rIdamqj6ptjhhtt6h25zh9jy">
         <w:r>
           <w:rPr>
             <w:sz w:val="18"/>
@@ -14225,7 +15616,7 @@
         </w:numPr>
         <w:spacing w:after="60"/>
       </w:pPr>
-      <w:hyperlink w:history="1" r:id="rIdtlud5keg86suzdsknynep">
+      <w:hyperlink w:history="1" r:id="rIdmaorcnuyqjdw3zryxj5fo">
         <w:r>
           <w:rPr>
             <w:sz w:val="18"/>
@@ -14253,7 +15644,7 @@
         </w:numPr>
         <w:spacing w:after="60"/>
       </w:pPr>
-      <w:hyperlink w:history="1" r:id="rIddv_tcy-ocbywmruixt-l8">
+      <w:hyperlink w:history="1" r:id="rIdxbdius4brtkekjs969uvg">
         <w:r>
           <w:rPr>
             <w:sz w:val="18"/>
@@ -14281,7 +15672,7 @@
         </w:numPr>
         <w:spacing w:after="60"/>
       </w:pPr>
-      <w:hyperlink w:history="1" r:id="rIdgve1c5i038rnys-baw8f0">
+      <w:hyperlink w:history="1" r:id="rIdnqslquf2cbahwako2je3c">
         <w:r>
           <w:rPr>
             <w:sz w:val="18"/>
@@ -14309,7 +15700,7 @@
         </w:numPr>
         <w:spacing w:after="60"/>
       </w:pPr>
-      <w:hyperlink w:history="1" r:id="rIdidgq5uhmhikzy1gtovzm8">
+      <w:hyperlink w:history="1" r:id="rId4ehpnjew0icbtfwtyjbvq">
         <w:r>
           <w:rPr>
             <w:sz w:val="18"/>
@@ -14337,7 +15728,7 @@
         </w:numPr>
         <w:spacing w:after="60"/>
       </w:pPr>
-      <w:hyperlink w:history="1" r:id="rIdysuqellrx3lyks1zrsrse">
+      <w:hyperlink w:history="1" r:id="rIdo45x8zapmvjq-490wuakb">
         <w:r>
           <w:rPr>
             <w:sz w:val="18"/>
@@ -14365,7 +15756,7 @@
         </w:numPr>
         <w:spacing w:after="60"/>
       </w:pPr>
-      <w:hyperlink w:history="1" r:id="rIdpjaio95wctl6iul2jbvjt">
+      <w:hyperlink w:history="1" r:id="rIdvet01szbe8s5i6b4rsswp">
         <w:r>
           <w:rPr>
             <w:sz w:val="18"/>
@@ -14393,7 +15784,7 @@
         </w:numPr>
         <w:spacing w:after="60"/>
       </w:pPr>
-      <w:hyperlink w:history="1" r:id="rIdzu2wjqgbi-4moitmvdmwe">
+      <w:hyperlink w:history="1" r:id="rIdjeeh9jmo7fypco-bg-olb">
         <w:r>
           <w:rPr>
             <w:sz w:val="18"/>
@@ -14421,7 +15812,7 @@
         </w:numPr>
         <w:spacing w:after="60"/>
       </w:pPr>
-      <w:hyperlink w:history="1" r:id="rIdamajkwhzjc6qzi1rrnbsi">
+      <w:hyperlink w:history="1" r:id="rIdib0ucb4bzzjnth8b54q53">
         <w:r>
           <w:rPr>
             <w:sz w:val="18"/>
@@ -14449,7 +15840,7 @@
         </w:numPr>
         <w:spacing w:after="60"/>
       </w:pPr>
-      <w:hyperlink w:history="1" r:id="rIdagjfnwxuam1kj5qnicvui">
+      <w:hyperlink w:history="1" r:id="rIdd0v77y-wsecvg8kjk1hkv">
         <w:r>
           <w:rPr>
             <w:sz w:val="18"/>
@@ -14477,7 +15868,7 @@
         </w:numPr>
         <w:spacing w:after="60"/>
       </w:pPr>
-      <w:hyperlink w:history="1" r:id="rIdzaphcvzezmicawcmxzswa">
+      <w:hyperlink w:history="1" r:id="rId-js01usd4sob7ytb4vq7f">
         <w:r>
           <w:rPr>
             <w:sz w:val="18"/>
@@ -14505,7 +15896,7 @@
         </w:numPr>
         <w:spacing w:after="60"/>
       </w:pPr>
-      <w:hyperlink w:history="1" r:id="rId-3prunbnl4gci0nbmmpik">
+      <w:hyperlink w:history="1" r:id="rIdtusbeq78xtj3qbu9svwq_">
         <w:r>
           <w:rPr>
             <w:sz w:val="18"/>
@@ -14533,7 +15924,7 @@
         </w:numPr>
         <w:spacing w:after="60"/>
       </w:pPr>
-      <w:hyperlink w:history="1" r:id="rIdtsjft13dl2_e040pevdwa">
+      <w:hyperlink w:history="1" r:id="rId02zcniq6rgg-zwqxt5ymc">
         <w:r>
           <w:rPr>
             <w:sz w:val="18"/>
@@ -14561,7 +15952,7 @@
         </w:numPr>
         <w:spacing w:after="60"/>
       </w:pPr>
-      <w:hyperlink w:history="1" r:id="rIdsdau4aog_wujuwjaqaeen">
+      <w:hyperlink w:history="1" r:id="rIdlwue7jpcjd2r36p6g2hmv">
         <w:r>
           <w:rPr>
             <w:sz w:val="18"/>
@@ -14589,7 +15980,7 @@
         </w:numPr>
         <w:spacing w:after="60"/>
       </w:pPr>
-      <w:hyperlink w:history="1" r:id="rIdeyf0dkirbkxg1r4pqpn6v">
+      <w:hyperlink w:history="1" r:id="rIdtmttiloo0htan9fb5iwj6">
         <w:r>
           <w:rPr>
             <w:sz w:val="18"/>
@@ -14617,7 +16008,7 @@
         </w:numPr>
         <w:spacing w:after="60"/>
       </w:pPr>
-      <w:hyperlink w:history="1" r:id="rIdfxllotguslishmcqz2ud9">
+      <w:hyperlink w:history="1" r:id="rIdxeazixj_bxej96e3waa7h">
         <w:r>
           <w:rPr>
             <w:sz w:val="18"/>
@@ -14645,7 +16036,7 @@
         </w:numPr>
         <w:spacing w:after="60"/>
       </w:pPr>
-      <w:hyperlink w:history="1" r:id="rId7cfamkmxburyoy3yf8zrm">
+      <w:hyperlink w:history="1" r:id="rIdjlq0x4z1-imkzfcuc3ojx">
         <w:r>
           <w:rPr>
             <w:sz w:val="18"/>
@@ -14673,7 +16064,7 @@
         </w:numPr>
         <w:spacing w:after="60"/>
       </w:pPr>
-      <w:hyperlink w:history="1" r:id="rIdtho6clgkofkftppxkotpe">
+      <w:hyperlink w:history="1" r:id="rIdnmcbfmrs9jmv0o5wjh1m6">
         <w:r>
           <w:rPr>
             <w:sz w:val="18"/>
@@ -14701,7 +16092,7 @@
         </w:numPr>
         <w:spacing w:after="60"/>
       </w:pPr>
-      <w:hyperlink w:history="1" r:id="rIddn13-94o_q83udkokesme">
+      <w:hyperlink w:history="1" r:id="rIdabzacsfxigxr6ezdhovm5">
         <w:r>
           <w:rPr>
             <w:sz w:val="18"/>
@@ -14729,7 +16120,7 @@
         </w:numPr>
         <w:spacing w:after="60"/>
       </w:pPr>
-      <w:hyperlink w:history="1" r:id="rIdwfdu-firtw22wvpqv8lec">
+      <w:hyperlink w:history="1" r:id="rId0tkod-8l6xu8prfqe6tu3">
         <w:r>
           <w:rPr>
             <w:sz w:val="18"/>
@@ -14757,7 +16148,7 @@
         </w:numPr>
         <w:spacing w:after="60"/>
       </w:pPr>
-      <w:hyperlink w:history="1" r:id="rIdjwcsunqtpzoq2d7asizmc">
+      <w:hyperlink w:history="1" r:id="rIdgmx7leeg7ezojnkjfwcig">
         <w:r>
           <w:rPr>
             <w:sz w:val="18"/>
@@ -14785,7 +16176,7 @@
         </w:numPr>
         <w:spacing w:after="60"/>
       </w:pPr>
-      <w:hyperlink w:history="1" r:id="rIdfpc3euausoqeibp0r7ggl">
+      <w:hyperlink w:history="1" r:id="rIdlfypguh0sd-_0pp52qffh">
         <w:r>
           <w:rPr>
             <w:sz w:val="18"/>
@@ -14813,7 +16204,7 @@
         </w:numPr>
         <w:spacing w:after="60"/>
       </w:pPr>
-      <w:hyperlink w:history="1" r:id="rId2vfyylqwith7jqkhma4by">
+      <w:hyperlink w:history="1" r:id="rIdnoksdvyupuctwwcg0fj7z">
         <w:r>
           <w:rPr>
             <w:sz w:val="18"/>
@@ -14841,7 +16232,7 @@
         </w:numPr>
         <w:spacing w:after="60"/>
       </w:pPr>
-      <w:hyperlink w:history="1" r:id="rIdd3dqnej1t4fruligijkzw">
+      <w:hyperlink w:history="1" r:id="rId6ofij9-lgdmc9vrksjifj">
         <w:r>
           <w:rPr>
             <w:sz w:val="18"/>
@@ -14869,7 +16260,7 @@
         </w:numPr>
         <w:spacing w:after="60"/>
       </w:pPr>
-      <w:hyperlink w:history="1" r:id="rIdw7ovkadwscjmfo8raw4jj">
+      <w:hyperlink w:history="1" r:id="rIdd8c51_ghagicdzsqqlcoi">
         <w:r>
           <w:rPr>
             <w:sz w:val="18"/>
@@ -14897,7 +16288,7 @@
         </w:numPr>
         <w:spacing w:after="60"/>
       </w:pPr>
-      <w:hyperlink w:history="1" r:id="rIds58raaapjgoanxk8ote9f">
+      <w:hyperlink w:history="1" r:id="rIde2sqahdz-cylyqoggilhg">
         <w:r>
           <w:rPr>
             <w:sz w:val="18"/>
@@ -14925,7 +16316,7 @@
         </w:numPr>
         <w:spacing w:after="60"/>
       </w:pPr>
-      <w:hyperlink w:history="1" r:id="rIdwjm1pdc5fzjycrejgkkid">
+      <w:hyperlink w:history="1" r:id="rIdv5n4k34myogodvt1tpgi6">
         <w:r>
           <w:rPr>
             <w:sz w:val="18"/>
@@ -14953,7 +16344,7 @@
         </w:numPr>
         <w:spacing w:after="60"/>
       </w:pPr>
-      <w:hyperlink w:history="1" r:id="rIdxecccdehjw9hj72jyzpek">
+      <w:hyperlink w:history="1" r:id="rIdo988onrxnrodczss3cbxp">
         <w:r>
           <w:rPr>
             <w:sz w:val="18"/>
@@ -14981,7 +16372,7 @@
         </w:numPr>
         <w:spacing w:after="60"/>
       </w:pPr>
-      <w:hyperlink w:history="1" r:id="rIdwo0rqb20gxezvnmjitlif">
+      <w:hyperlink w:history="1" r:id="rIdff5nkk4s3cbdxlepba4is">
         <w:r>
           <w:rPr>
             <w:sz w:val="18"/>
@@ -15009,7 +16400,7 @@
         </w:numPr>
         <w:spacing w:after="60"/>
       </w:pPr>
-      <w:hyperlink w:history="1" r:id="rId1hqy3bo_7vqncuv9puiw9">
+      <w:hyperlink w:history="1" r:id="rIdp1zm-2qwqjjtrwptsbfbk">
         <w:r>
           <w:rPr>
             <w:sz w:val="18"/>
@@ -15037,7 +16428,7 @@
         </w:numPr>
         <w:spacing w:after="60"/>
       </w:pPr>
-      <w:hyperlink w:history="1" r:id="rIdtpmlogw_lg9r_awcwlxwj">
+      <w:hyperlink w:history="1" r:id="rId3xi46hhcebigugueiccio">
         <w:r>
           <w:rPr>
             <w:sz w:val="18"/>
@@ -15065,7 +16456,7 @@
         </w:numPr>
         <w:spacing w:after="60"/>
       </w:pPr>
-      <w:hyperlink w:history="1" r:id="rIdty9eearsgw5jncm5p50sq">
+      <w:hyperlink w:history="1" r:id="rIdglvzopvhpiunf_kdmukfe">
         <w:r>
           <w:rPr>
             <w:sz w:val="18"/>
@@ -15093,7 +16484,7 @@
         </w:numPr>
         <w:spacing w:after="60"/>
       </w:pPr>
-      <w:hyperlink w:history="1" r:id="rIdu7f6_qpynkrhtjbq3agky">
+      <w:hyperlink w:history="1" r:id="rIdpvxhg1wtgtrhpduuk8zuw">
         <w:r>
           <w:rPr>
             <w:sz w:val="18"/>
@@ -15121,7 +16512,7 @@
         </w:numPr>
         <w:spacing w:after="60"/>
       </w:pPr>
-      <w:hyperlink w:history="1" r:id="rIdkl3wbu_zl6r_mrtz9doec">
+      <w:hyperlink w:history="1" r:id="rIdjjihnsxkhzp3m4jomhyq4">
         <w:r>
           <w:rPr>
             <w:sz w:val="18"/>
@@ -15149,7 +16540,7 @@
         </w:numPr>
         <w:spacing w:after="60"/>
       </w:pPr>
-      <w:hyperlink w:history="1" r:id="rIdzp8jbw138nkqfakxxcg4m">
+      <w:hyperlink w:history="1" r:id="rIdr4q66ri1puvx-7xnmhuva">
         <w:r>
           <w:rPr>
             <w:sz w:val="18"/>
@@ -15177,7 +16568,7 @@
         </w:numPr>
         <w:spacing w:after="60"/>
       </w:pPr>
-      <w:hyperlink w:history="1" r:id="rIdi6jzmbpytimmxhn3rwrec">
+      <w:hyperlink w:history="1" r:id="rIdmpwltusmnzzmjtcvglp2f">
         <w:r>
           <w:rPr>
             <w:sz w:val="18"/>
@@ -15205,7 +16596,7 @@
         </w:numPr>
         <w:spacing w:after="60"/>
       </w:pPr>
-      <w:hyperlink w:history="1" r:id="rIdrzrbamjk8-0u7hofpf8qc">
+      <w:hyperlink w:history="1" r:id="rIdtiiuokigkesqiqbzwoiem">
         <w:r>
           <w:rPr>
             <w:sz w:val="18"/>

</xml_diff>